<commit_message>
Staging spec: section 8, every Governance Centre change logged (seed, propose, document, approve, reject, withdraw, preset, override) with supporting documents on private storage, required evidence, a history per setting, and an append-only chained audit log
Co-Authored-By: Claude Opus 5.5 <noreply@anthropic.com>
</commit_message>
<xml_diff>
--- a/docs/MAIIC_Staging_Module_Specification_v1_2026-10-15.docx
+++ b/docs/MAIIC_Staging_Module_Specification_v1_2026-10-15.docx
@@ -173,7 +173,7 @@
           <w:b w:val="0"/>
           <w:i w:val="0"/>
         </w:rPr>
-        <w:t xml:space="preserve">: each rule becomes a setting in the Governance Centre, proposed by one person and approved by another, with an effective date and a comment, like every other policy setting in the system. It also adds a </w:t>
+        <w:t xml:space="preserve">: each rule becomes a setting in the Governance Centre, proposed by one person and approved by another, with an effective date and a comment, like every other policy setting in the system. It makes every change in the Governance Centre fully logged, with room for supporting documents (section 8). It also adds a </w:t>
       </w:r>
       <w:r>
         <w:rPr>
@@ -4701,7 +4701,1120 @@
         <w:pStyle w:val="Heading2"/>
       </w:pPr>
       <w:r>
-        <w:t>8. Decisions owed</w:t>
+        <w:t>8. Every Governance Centre change logged, with its supporting documents</w:t>
+      </w:r>
+    </w:p>
+    <w:p>
+      <w:pPr>
+        <w:spacing w:after="120"/>
+        <w:jc w:val="both"/>
+      </w:pPr>
+      <w:r>
+        <w:rPr>
+          <w:b w:val="0"/>
+          <w:i w:val="0"/>
+        </w:rPr>
+        <w:t xml:space="preserve">Staging becomes governed through the Governance Centre, so the Centre's record has to be good enough for an auditor or the Reserve Bank to follow every policy choice: who proposed it, why, on what evidence, who approved or rejected it, when it took effect and what it replaced. This section covers </w:t>
+      </w:r>
+      <w:r>
+        <w:rPr>
+          <w:b/>
+          <w:i w:val="0"/>
+        </w:rPr>
+        <w:t>every setting in the Governance Centre</w:t>
+      </w:r>
+      <w:r>
+        <w:rPr>
+          <w:b w:val="0"/>
+          <w:i w:val="0"/>
+        </w:rPr>
+        <w:t>, not only the staging ones.</w:t>
+      </w:r>
+    </w:p>
+    <w:p>
+      <w:pPr>
+        <w:pStyle w:val="Heading3"/>
+      </w:pPr>
+      <w:r>
+        <w:t>8.1 What is recorded today, and what is missing</w:t>
+      </w:r>
+    </w:p>
+    <w:tbl>
+      <w:tblPr>
+        <w:tblStyle w:val="TableGrid"/>
+        <w:tblW w:type="auto" w:w="0"/>
+        <w:tblLook w:firstColumn="1" w:firstRow="1" w:lastColumn="0" w:lastRow="0" w:noHBand="0" w:noVBand="1" w:val="04A0"/>
+      </w:tblPr>
+      <w:tblGrid>
+        <w:gridCol w:w="4986"/>
+        <w:gridCol w:w="4986"/>
+      </w:tblGrid>
+      <w:tr>
+        <w:trPr>
+          <w:cantSplit/>
+          <w:tblHeader/>
+        </w:trPr>
+        <w:tc>
+          <w:tcPr>
+            <w:tcW w:type="dxa" w:w="4986"/>
+            <w:shd w:val="clear" w:color="auto" w:fill="1B2A41"/>
+          </w:tcPr>
+          <w:p>
+            <w:r>
+              <w:rPr>
+                <w:b/>
+                <w:color w:val="FFFFFF"/>
+                <w:sz w:val="17"/>
+              </w:rPr>
+            </w:r>
+            <w:r>
+              <w:rPr>
+                <w:b/>
+                <w:i w:val="0"/>
+                <w:color w:val="FFFFFF"/>
+                <w:sz w:val="17"/>
+              </w:rPr>
+              <w:t>Today</w:t>
+            </w:r>
+          </w:p>
+        </w:tc>
+        <w:tc>
+          <w:tcPr>
+            <w:tcW w:type="dxa" w:w="4986"/>
+            <w:shd w:val="clear" w:color="auto" w:fill="1B2A41"/>
+          </w:tcPr>
+          <w:p>
+            <w:r>
+              <w:rPr>
+                <w:b/>
+                <w:color w:val="FFFFFF"/>
+                <w:sz w:val="17"/>
+              </w:rPr>
+            </w:r>
+            <w:r>
+              <w:rPr>
+                <w:b/>
+                <w:i w:val="0"/>
+                <w:color w:val="FFFFFF"/>
+                <w:sz w:val="17"/>
+              </w:rPr>
+              <w:t>Gap</w:t>
+            </w:r>
+          </w:p>
+        </w:tc>
+      </w:tr>
+      <w:tr>
+        <w:trPr>
+          <w:cantSplit/>
+        </w:trPr>
+        <w:tc>
+          <w:tcPr>
+            <w:tcW w:type="dxa" w:w="4986"/>
+          </w:tcPr>
+          <w:p>
+            <w:r>
+              <w:rPr>
+                <w:b w:val="0"/>
+                <w:sz w:val="17"/>
+              </w:rPr>
+            </w:r>
+            <w:r>
+              <w:rPr>
+                <w:b w:val="0"/>
+                <w:i w:val="0"/>
+                <w:sz w:val="17"/>
+              </w:rPr>
+              <w:t>A proposal writes an audit entry ("EIR Governance Setting Proposed") with the old and new values, the effective date and the reason</w:t>
+            </w:r>
+          </w:p>
+        </w:tc>
+        <w:tc>
+          <w:tcPr>
+            <w:tcW w:type="dxa" w:w="4986"/>
+          </w:tcPr>
+          <w:p>
+            <w:r>
+              <w:rPr>
+                <w:b w:val="0"/>
+                <w:sz w:val="17"/>
+              </w:rPr>
+            </w:r>
+            <w:r>
+              <w:rPr>
+                <w:b w:val="0"/>
+                <w:i w:val="0"/>
+                <w:sz w:val="17"/>
+              </w:rPr>
+              <w:t>Only proposals and approvals are recorded. There is no reject or withdraw step: a proposal that is not wanted can only be left standing, with no record of why</w:t>
+            </w:r>
+          </w:p>
+        </w:tc>
+      </w:tr>
+      <w:tr>
+        <w:trPr>
+          <w:cantSplit/>
+        </w:trPr>
+        <w:tc>
+          <w:tcPr>
+            <w:tcW w:type="dxa" w:w="4986"/>
+          </w:tcPr>
+          <w:p>
+            <w:r>
+              <w:rPr>
+                <w:b w:val="0"/>
+                <w:sz w:val="17"/>
+              </w:rPr>
+            </w:r>
+            <w:r>
+              <w:rPr>
+                <w:b w:val="0"/>
+                <w:i w:val="0"/>
+                <w:sz w:val="17"/>
+              </w:rPr>
+              <w:t>An approval writes an audit entry ("EIR Governance Setting Approved"), and the setting it replaces is copied to the history table</w:t>
+            </w:r>
+          </w:p>
+        </w:tc>
+        <w:tc>
+          <w:tcPr>
+            <w:tcW w:type="dxa" w:w="4986"/>
+          </w:tcPr>
+          <w:p>
+            <w:r>
+              <w:rPr>
+                <w:b w:val="0"/>
+                <w:sz w:val="17"/>
+              </w:rPr>
+            </w:r>
+            <w:r>
+              <w:rPr>
+                <w:b w:val="0"/>
+                <w:i w:val="0"/>
+                <w:sz w:val="17"/>
+              </w:rPr>
+              <w:t>The reason is cut to 500 characters on the setting</w:t>
+            </w:r>
+          </w:p>
+        </w:tc>
+      </w:tr>
+      <w:tr>
+        <w:trPr>
+          <w:cantSplit/>
+        </w:trPr>
+        <w:tc>
+          <w:tcPr>
+            <w:tcW w:type="dxa" w:w="4986"/>
+          </w:tcPr>
+          <w:p>
+            <w:r>
+              <w:rPr>
+                <w:b w:val="0"/>
+                <w:sz w:val="17"/>
+              </w:rPr>
+            </w:r>
+            <w:r>
+              <w:rPr>
+                <w:b w:val="0"/>
+                <w:i w:val="0"/>
+                <w:sz w:val="17"/>
+              </w:rPr>
+              <w:t>The proposer cannot approve their own change; an administrator override is itself a governed setting</w:t>
+            </w:r>
+          </w:p>
+        </w:tc>
+        <w:tc>
+          <w:tcPr>
+            <w:tcW w:type="dxa" w:w="4986"/>
+          </w:tcPr>
+          <w:p>
+            <w:r>
+              <w:rPr>
+                <w:b w:val="0"/>
+                <w:sz w:val="17"/>
+              </w:rPr>
+            </w:r>
+            <w:r>
+              <w:rPr>
+                <w:b w:val="0"/>
+                <w:i w:val="0"/>
+                <w:sz w:val="17"/>
+              </w:rPr>
+              <w:t>The seeded defaults are written by the installation with no audit entry</w:t>
+            </w:r>
+          </w:p>
+        </w:tc>
+      </w:tr>
+      <w:tr>
+        <w:trPr>
+          <w:cantSplit/>
+        </w:trPr>
+        <w:tc>
+          <w:tcPr>
+            <w:tcW w:type="dxa" w:w="4986"/>
+          </w:tcPr>
+          <w:p>
+            <w:r>
+              <w:rPr>
+                <w:b w:val="0"/>
+                <w:sz w:val="17"/>
+              </w:rPr>
+            </w:r>
+          </w:p>
+        </w:tc>
+        <w:tc>
+          <w:tcPr>
+            <w:tcW w:type="dxa" w:w="4986"/>
+          </w:tcPr>
+          <w:p>
+            <w:r>
+              <w:rPr>
+                <w:b w:val="0"/>
+                <w:sz w:val="17"/>
+              </w:rPr>
+            </w:r>
+            <w:r>
+              <w:rPr>
+                <w:b w:val="0"/>
+                <w:i w:val="0"/>
+                <w:sz w:val="17"/>
+              </w:rPr>
+              <w:t>No document can be attached to a proposal or an approval</w:t>
+            </w:r>
+          </w:p>
+        </w:tc>
+      </w:tr>
+      <w:tr>
+        <w:trPr>
+          <w:cantSplit/>
+        </w:trPr>
+        <w:tc>
+          <w:tcPr>
+            <w:tcW w:type="dxa" w:w="4986"/>
+          </w:tcPr>
+          <w:p>
+            <w:r>
+              <w:rPr>
+                <w:b w:val="0"/>
+                <w:sz w:val="17"/>
+              </w:rPr>
+            </w:r>
+          </w:p>
+        </w:tc>
+        <w:tc>
+          <w:tcPr>
+            <w:tcW w:type="dxa" w:w="4986"/>
+          </w:tcPr>
+          <w:p>
+            <w:r>
+              <w:rPr>
+                <w:b w:val="0"/>
+                <w:sz w:val="17"/>
+              </w:rPr>
+            </w:r>
+            <w:r>
+              <w:rPr>
+                <w:b w:val="0"/>
+                <w:i w:val="0"/>
+                <w:sz w:val="17"/>
+              </w:rPr>
+              <w:t>The record is spread across the general Audit Trail screen; there is no single history per setting</w:t>
+            </w:r>
+          </w:p>
+        </w:tc>
+      </w:tr>
+      <w:tr>
+        <w:trPr>
+          <w:cantSplit/>
+        </w:trPr>
+        <w:tc>
+          <w:tcPr>
+            <w:tcW w:type="dxa" w:w="4986"/>
+          </w:tcPr>
+          <w:p>
+            <w:r>
+              <w:rPr>
+                <w:b w:val="0"/>
+                <w:sz w:val="17"/>
+              </w:rPr>
+            </w:r>
+          </w:p>
+        </w:tc>
+        <w:tc>
+          <w:tcPr>
+            <w:tcW w:type="dxa" w:w="4986"/>
+          </w:tcPr>
+          <w:p>
+            <w:r>
+              <w:rPr>
+                <w:b w:val="0"/>
+                <w:sz w:val="17"/>
+              </w:rPr>
+            </w:r>
+            <w:r>
+              <w:rPr>
+                <w:b w:val="0"/>
+                <w:i w:val="0"/>
+                <w:sz w:val="17"/>
+              </w:rPr>
+              <w:t>The audit log is an ordinary database table: a database administrator could change or delete an entry without trace</w:t>
+            </w:r>
+          </w:p>
+        </w:tc>
+      </w:tr>
+    </w:tbl>
+    <w:p/>
+    <w:p>
+      <w:pPr>
+        <w:pStyle w:val="Heading3"/>
+      </w:pPr>
+      <w:r>
+        <w:t>8.2 What every change will record</w:t>
+      </w:r>
+    </w:p>
+    <w:p>
+      <w:pPr>
+        <w:spacing w:after="120"/>
+        <w:jc w:val="both"/>
+      </w:pPr>
+      <w:r>
+        <w:rPr>
+          <w:b w:val="0"/>
+          <w:i w:val="0"/>
+        </w:rPr>
+        <w:t>Each of the following events writes one audit entry, linked to the setting and to the change it belongs to:</w:t>
+      </w:r>
+    </w:p>
+    <w:tbl>
+      <w:tblPr>
+        <w:tblStyle w:val="TableGrid"/>
+        <w:tblW w:type="auto" w:w="0"/>
+        <w:tblLook w:firstColumn="1" w:firstRow="1" w:lastColumn="0" w:lastRow="0" w:noHBand="0" w:noVBand="1" w:val="04A0"/>
+      </w:tblPr>
+      <w:tblGrid>
+        <w:gridCol w:w="4986"/>
+        <w:gridCol w:w="4986"/>
+      </w:tblGrid>
+      <w:tr>
+        <w:trPr>
+          <w:cantSplit/>
+          <w:tblHeader/>
+        </w:trPr>
+        <w:tc>
+          <w:tcPr>
+            <w:tcW w:type="dxa" w:w="4986"/>
+            <w:shd w:val="clear" w:color="auto" w:fill="1B2A41"/>
+          </w:tcPr>
+          <w:p>
+            <w:r>
+              <w:rPr>
+                <w:b/>
+                <w:color w:val="FFFFFF"/>
+                <w:sz w:val="17"/>
+              </w:rPr>
+            </w:r>
+            <w:r>
+              <w:rPr>
+                <w:b/>
+                <w:i w:val="0"/>
+                <w:color w:val="FFFFFF"/>
+                <w:sz w:val="17"/>
+              </w:rPr>
+              <w:t>Event</w:t>
+            </w:r>
+          </w:p>
+        </w:tc>
+        <w:tc>
+          <w:tcPr>
+            <w:tcW w:type="dxa" w:w="4986"/>
+            <w:shd w:val="clear" w:color="auto" w:fill="1B2A41"/>
+          </w:tcPr>
+          <w:p>
+            <w:r>
+              <w:rPr>
+                <w:b/>
+                <w:color w:val="FFFFFF"/>
+                <w:sz w:val="17"/>
+              </w:rPr>
+            </w:r>
+            <w:r>
+              <w:rPr>
+                <w:b/>
+                <w:i w:val="0"/>
+                <w:color w:val="FFFFFF"/>
+                <w:sz w:val="17"/>
+              </w:rPr>
+              <w:t>Recorded</w:t>
+            </w:r>
+          </w:p>
+        </w:tc>
+      </w:tr>
+      <w:tr>
+        <w:trPr>
+          <w:cantSplit/>
+        </w:trPr>
+        <w:tc>
+          <w:tcPr>
+            <w:tcW w:type="dxa" w:w="4986"/>
+          </w:tcPr>
+          <w:p>
+            <w:r>
+              <w:rPr>
+                <w:b w:val="0"/>
+                <w:sz w:val="17"/>
+              </w:rPr>
+            </w:r>
+            <w:r>
+              <w:rPr>
+                <w:b/>
+                <w:i w:val="0"/>
+                <w:sz w:val="17"/>
+              </w:rPr>
+              <w:t>Seeded</w:t>
+            </w:r>
+          </w:p>
+        </w:tc>
+        <w:tc>
+          <w:tcPr>
+            <w:tcW w:type="dxa" w:w="4986"/>
+          </w:tcPr>
+          <w:p>
+            <w:r>
+              <w:rPr>
+                <w:b w:val="0"/>
+                <w:sz w:val="17"/>
+              </w:rPr>
+            </w:r>
+            <w:r>
+              <w:rPr>
+                <w:b w:val="0"/>
+                <w:i w:val="0"/>
+                <w:sz w:val="17"/>
+              </w:rPr>
+              <w:t>The setting, the seeded value, its effective date, and that it was seeded by installation (not a MAIIC decision)</w:t>
+            </w:r>
+          </w:p>
+        </w:tc>
+      </w:tr>
+      <w:tr>
+        <w:trPr>
+          <w:cantSplit/>
+        </w:trPr>
+        <w:tc>
+          <w:tcPr>
+            <w:tcW w:type="dxa" w:w="4986"/>
+          </w:tcPr>
+          <w:p>
+            <w:r>
+              <w:rPr>
+                <w:b w:val="0"/>
+                <w:sz w:val="17"/>
+              </w:rPr>
+            </w:r>
+            <w:r>
+              <w:rPr>
+                <w:b/>
+                <w:i w:val="0"/>
+                <w:sz w:val="17"/>
+              </w:rPr>
+              <w:t>Proposed</w:t>
+            </w:r>
+          </w:p>
+        </w:tc>
+        <w:tc>
+          <w:tcPr>
+            <w:tcW w:type="dxa" w:w="4986"/>
+          </w:tcPr>
+          <w:p>
+            <w:r>
+              <w:rPr>
+                <w:b w:val="0"/>
+                <w:sz w:val="17"/>
+              </w:rPr>
+            </w:r>
+            <w:r>
+              <w:rPr>
+                <w:b w:val="0"/>
+                <w:i w:val="0"/>
+                <w:sz w:val="17"/>
+              </w:rPr>
+              <w:t>The proposer, the setting, the value in force and the proposed value, the effective date, the reason in full, and the documents attached</w:t>
+            </w:r>
+          </w:p>
+        </w:tc>
+      </w:tr>
+      <w:tr>
+        <w:trPr>
+          <w:cantSplit/>
+        </w:trPr>
+        <w:tc>
+          <w:tcPr>
+            <w:tcW w:type="dxa" w:w="4986"/>
+          </w:tcPr>
+          <w:p>
+            <w:r>
+              <w:rPr>
+                <w:b w:val="0"/>
+                <w:sz w:val="17"/>
+              </w:rPr>
+            </w:r>
+            <w:r>
+              <w:rPr>
+                <w:b/>
+                <w:i w:val="0"/>
+                <w:sz w:val="17"/>
+              </w:rPr>
+              <w:t>Document added or removed</w:t>
+            </w:r>
+          </w:p>
+        </w:tc>
+        <w:tc>
+          <w:tcPr>
+            <w:tcW w:type="dxa" w:w="4986"/>
+          </w:tcPr>
+          <w:p>
+            <w:r>
+              <w:rPr>
+                <w:b w:val="0"/>
+                <w:sz w:val="17"/>
+              </w:rPr>
+            </w:r>
+            <w:r>
+              <w:rPr>
+                <w:b w:val="0"/>
+                <w:i w:val="0"/>
+                <w:sz w:val="17"/>
+              </w:rPr>
+              <w:t>Who, when, the document's name, type, size and fingerprint; a removed document is kept and marked removed, never deleted</w:t>
+            </w:r>
+          </w:p>
+        </w:tc>
+      </w:tr>
+      <w:tr>
+        <w:trPr>
+          <w:cantSplit/>
+        </w:trPr>
+        <w:tc>
+          <w:tcPr>
+            <w:tcW w:type="dxa" w:w="4986"/>
+          </w:tcPr>
+          <w:p>
+            <w:r>
+              <w:rPr>
+                <w:b w:val="0"/>
+                <w:sz w:val="17"/>
+              </w:rPr>
+            </w:r>
+            <w:r>
+              <w:rPr>
+                <w:b/>
+                <w:i w:val="0"/>
+                <w:sz w:val="17"/>
+              </w:rPr>
+              <w:t>Approved</w:t>
+            </w:r>
+          </w:p>
+        </w:tc>
+        <w:tc>
+          <w:tcPr>
+            <w:tcW w:type="dxa" w:w="4986"/>
+          </w:tcPr>
+          <w:p>
+            <w:r>
+              <w:rPr>
+                <w:b w:val="0"/>
+                <w:sz w:val="17"/>
+              </w:rPr>
+            </w:r>
+            <w:r>
+              <w:rPr>
+                <w:b w:val="0"/>
+                <w:i w:val="0"/>
+                <w:sz w:val="17"/>
+              </w:rPr>
+              <w:t>The approver, the time, any comment, the documents attached at approval, and the setting the change replaces</w:t>
+            </w:r>
+          </w:p>
+        </w:tc>
+      </w:tr>
+      <w:tr>
+        <w:trPr>
+          <w:cantSplit/>
+        </w:trPr>
+        <w:tc>
+          <w:tcPr>
+            <w:tcW w:type="dxa" w:w="4986"/>
+          </w:tcPr>
+          <w:p>
+            <w:r>
+              <w:rPr>
+                <w:b w:val="0"/>
+                <w:sz w:val="17"/>
+              </w:rPr>
+            </w:r>
+            <w:r>
+              <w:rPr>
+                <w:b/>
+                <w:i w:val="0"/>
+                <w:sz w:val="17"/>
+              </w:rPr>
+              <w:t>Rejected</w:t>
+            </w:r>
+            <w:r>
+              <w:rPr>
+                <w:b w:val="0"/>
+                <w:i w:val="0"/>
+                <w:sz w:val="17"/>
+              </w:rPr>
+              <w:t xml:space="preserve"> (new)</w:t>
+            </w:r>
+          </w:p>
+        </w:tc>
+        <w:tc>
+          <w:tcPr>
+            <w:tcW w:type="dxa" w:w="4986"/>
+          </w:tcPr>
+          <w:p>
+            <w:r>
+              <w:rPr>
+                <w:b w:val="0"/>
+                <w:sz w:val="17"/>
+              </w:rPr>
+            </w:r>
+            <w:r>
+              <w:rPr>
+                <w:b w:val="0"/>
+                <w:i w:val="0"/>
+                <w:sz w:val="17"/>
+              </w:rPr>
+              <w:t>The reviewer, the time and the reason (required). The proposal stays on record as rejected</w:t>
+            </w:r>
+          </w:p>
+        </w:tc>
+      </w:tr>
+      <w:tr>
+        <w:trPr>
+          <w:cantSplit/>
+        </w:trPr>
+        <w:tc>
+          <w:tcPr>
+            <w:tcW w:type="dxa" w:w="4986"/>
+          </w:tcPr>
+          <w:p>
+            <w:r>
+              <w:rPr>
+                <w:b w:val="0"/>
+                <w:sz w:val="17"/>
+              </w:rPr>
+            </w:r>
+            <w:r>
+              <w:rPr>
+                <w:b/>
+                <w:i w:val="0"/>
+                <w:sz w:val="17"/>
+              </w:rPr>
+              <w:t>Withdrawn</w:t>
+            </w:r>
+            <w:r>
+              <w:rPr>
+                <w:b w:val="0"/>
+                <w:i w:val="0"/>
+                <w:sz w:val="17"/>
+              </w:rPr>
+              <w:t xml:space="preserve"> (new)</w:t>
+            </w:r>
+          </w:p>
+        </w:tc>
+        <w:tc>
+          <w:tcPr>
+            <w:tcW w:type="dxa" w:w="4986"/>
+          </w:tcPr>
+          <w:p>
+            <w:r>
+              <w:rPr>
+                <w:b w:val="0"/>
+                <w:sz w:val="17"/>
+              </w:rPr>
+            </w:r>
+            <w:r>
+              <w:rPr>
+                <w:b w:val="0"/>
+                <w:i w:val="0"/>
+                <w:sz w:val="17"/>
+              </w:rPr>
+              <w:t>The proposer, the time and the reason. The proposal stays on record as withdrawn</w:t>
+            </w:r>
+          </w:p>
+        </w:tc>
+      </w:tr>
+      <w:tr>
+        <w:trPr>
+          <w:cantSplit/>
+        </w:trPr>
+        <w:tc>
+          <w:tcPr>
+            <w:tcW w:type="dxa" w:w="4986"/>
+          </w:tcPr>
+          <w:p>
+            <w:r>
+              <w:rPr>
+                <w:b w:val="0"/>
+                <w:sz w:val="17"/>
+              </w:rPr>
+            </w:r>
+            <w:r>
+              <w:rPr>
+                <w:b/>
+                <w:i w:val="0"/>
+                <w:sz w:val="17"/>
+              </w:rPr>
+              <w:t>Preset applied</w:t>
+            </w:r>
+          </w:p>
+        </w:tc>
+        <w:tc>
+          <w:tcPr>
+            <w:tcW w:type="dxa" w:w="4986"/>
+          </w:tcPr>
+          <w:p>
+            <w:r>
+              <w:rPr>
+                <w:b w:val="0"/>
+                <w:sz w:val="17"/>
+              </w:rPr>
+            </w:r>
+            <w:r>
+              <w:rPr>
+                <w:b w:val="0"/>
+                <w:i w:val="0"/>
+                <w:sz w:val="17"/>
+              </w:rPr>
+              <w:t>For a preset (section 3), one entry for the preset and one for each setting it changed, all linked to the same change</w:t>
+            </w:r>
+          </w:p>
+        </w:tc>
+      </w:tr>
+      <w:tr>
+        <w:trPr>
+          <w:cantSplit/>
+        </w:trPr>
+        <w:tc>
+          <w:tcPr>
+            <w:tcW w:type="dxa" w:w="4986"/>
+          </w:tcPr>
+          <w:p>
+            <w:r>
+              <w:rPr>
+                <w:b w:val="0"/>
+                <w:sz w:val="17"/>
+              </w:rPr>
+            </w:r>
+            <w:r>
+              <w:rPr>
+                <w:b/>
+                <w:i w:val="0"/>
+                <w:sz w:val="17"/>
+              </w:rPr>
+              <w:t>Override used</w:t>
+            </w:r>
+          </w:p>
+        </w:tc>
+        <w:tc>
+          <w:tcPr>
+            <w:tcW w:type="dxa" w:w="4986"/>
+          </w:tcPr>
+          <w:p>
+            <w:r>
+              <w:rPr>
+                <w:b w:val="0"/>
+                <w:sz w:val="17"/>
+              </w:rPr>
+            </w:r>
+            <w:r>
+              <w:rPr>
+                <w:b w:val="0"/>
+                <w:i w:val="0"/>
+                <w:sz w:val="17"/>
+              </w:rPr>
+              <w:t>If an administrator approves their own proposal under the governed override, that fact, with the override setting in force</w:t>
+            </w:r>
+          </w:p>
+        </w:tc>
+      </w:tr>
+    </w:tbl>
+    <w:p/>
+    <w:p>
+      <w:pPr>
+        <w:pStyle w:val="Heading3"/>
+      </w:pPr>
+      <w:r>
+        <w:t>8.3 Supporting documents</w:t>
+      </w:r>
+    </w:p>
+    <w:p>
+      <w:pPr>
+        <w:pStyle w:val="ListBullet"/>
+        <w:jc w:val="both"/>
+      </w:pPr>
+      <w:r>
+        <w:rPr>
+          <w:b/>
+          <w:i w:val="0"/>
+        </w:rPr>
+        <w:t>Where.</w:t>
+      </w:r>
+      <w:r>
+        <w:rPr>
+          <w:b w:val="0"/>
+          <w:i w:val="0"/>
+        </w:rPr>
+        <w:t xml:space="preserve"> A proposal, an approval, a rejection and a withdrawal can each carry documents: for example a board or committee minute, a policy paper, an analysis, the comparison-run export (section 4), or correspondence with the auditors or the Reserve Bank.</w:t>
+      </w:r>
+    </w:p>
+    <w:p>
+      <w:pPr>
+        <w:pStyle w:val="ListBullet"/>
+        <w:jc w:val="both"/>
+      </w:pPr>
+      <w:r>
+        <w:rPr>
+          <w:b/>
+          <w:i w:val="0"/>
+        </w:rPr>
+        <w:t>Required evidence.</w:t>
+      </w:r>
+      <w:r>
+        <w:rPr>
+          <w:b w:val="0"/>
+          <w:i w:val="0"/>
+        </w:rPr>
+        <w:t xml:space="preserve"> Each setting can be marked as needing a document to be approved. The staging presets, </w:t>
+      </w:r>
+      <w:r>
+        <w:rPr>
+          <w:rFonts w:ascii="Consolas" w:hAnsi="Consolas"/>
+          <w:b w:val="0"/>
+          <w:i w:val="0"/>
+          <w:sz w:val="18"/>
+        </w:rPr>
+        <w:t>staging_threshold_profile</w:t>
+      </w:r>
+      <w:r>
+        <w:rPr>
+          <w:b w:val="0"/>
+          <w:i w:val="0"/>
+        </w:rPr>
+        <w:t xml:space="preserve"> and </w:t>
+      </w:r>
+      <w:r>
+        <w:rPr>
+          <w:rFonts w:ascii="Consolas" w:hAnsi="Consolas"/>
+          <w:b w:val="0"/>
+          <w:i w:val="0"/>
+          <w:sz w:val="18"/>
+        </w:rPr>
+        <w:t>stage2_threshold_medium_long</w:t>
+      </w:r>
+      <w:r>
+        <w:rPr>
+          <w:b w:val="0"/>
+          <w:i w:val="0"/>
+        </w:rPr>
+        <w:t xml:space="preserve"> (a rebuttal under IFRS 9) are marked: adopting directive-aligned staging cannot be approved without the minute or decision that adopts it.</w:t>
+      </w:r>
+    </w:p>
+    <w:p>
+      <w:pPr>
+        <w:pStyle w:val="ListBullet"/>
+        <w:jc w:val="both"/>
+      </w:pPr>
+      <w:r>
+        <w:rPr>
+          <w:b/>
+          <w:i w:val="0"/>
+        </w:rPr>
+        <w:t>Kinds of file.</w:t>
+      </w:r>
+      <w:r>
+        <w:rPr>
+          <w:b w:val="0"/>
+          <w:i w:val="0"/>
+        </w:rPr>
+        <w:t xml:space="preserve"> PDF, Word, Excel, CSV, PNG and JPEG, up to 20 MB each, with a short description and a document type (minute, policy, analysis, correspondence, other).</w:t>
+      </w:r>
+    </w:p>
+    <w:p>
+      <w:pPr>
+        <w:pStyle w:val="ListBullet"/>
+        <w:jc w:val="both"/>
+      </w:pPr>
+      <w:r>
+        <w:rPr>
+          <w:b/>
+          <w:i w:val="0"/>
+        </w:rPr>
+        <w:t>Stored safely.</w:t>
+      </w:r>
+      <w:r>
+        <w:rPr>
+          <w:b w:val="0"/>
+          <w:i w:val="0"/>
+        </w:rPr>
+        <w:t xml:space="preserve"> Files go to the system's </w:t>
+      </w:r>
+      <w:r>
+        <w:rPr>
+          <w:b/>
+          <w:i w:val="0"/>
+        </w:rPr>
+        <w:t>private</w:t>
+      </w:r>
+      <w:r>
+        <w:rPr>
+          <w:b w:val="0"/>
+          <w:i w:val="0"/>
+        </w:rPr>
+        <w:t xml:space="preserve"> storage on MAIIC's server, never to the public web folder, and can be opened only by users with the governance permission. Each file's SHA-256 fingerprint is recorded when it is uploaded and checked when it is opened, so a changed file shows. The existing </w:t>
+      </w:r>
+      <w:r>
+        <w:rPr>
+          <w:rFonts w:ascii="Consolas" w:hAnsi="Consolas"/>
+          <w:b w:val="0"/>
+          <w:i w:val="0"/>
+          <w:sz w:val="18"/>
+        </w:rPr>
+        <w:t>supporting_documents</w:t>
+      </w:r>
+      <w:r>
+        <w:rPr>
+          <w:b w:val="0"/>
+          <w:i w:val="0"/>
+        </w:rPr>
+        <w:t xml:space="preserve"> table is reused for this, with its storage set to private.</w:t>
+      </w:r>
+    </w:p>
+    <w:p>
+      <w:pPr>
+        <w:pStyle w:val="ListBullet"/>
+        <w:jc w:val="both"/>
+      </w:pPr>
+      <w:r>
+        <w:rPr>
+          <w:b/>
+          <w:i w:val="0"/>
+        </w:rPr>
+        <w:t>Kept.</w:t>
+      </w:r>
+      <w:r>
+        <w:rPr>
+          <w:b w:val="0"/>
+          <w:i w:val="0"/>
+        </w:rPr>
+        <w:t xml:space="preserve"> Documents are never deleted from a decided change. They are included in the backups (spec v4 and the integration document, storage and backup) and kept for the life of the system.</w:t>
+      </w:r>
+    </w:p>
+    <w:p>
+      <w:pPr>
+        <w:pStyle w:val="Heading3"/>
+      </w:pPr>
+      <w:r>
+        <w:t>8.4 One history per setting</w:t>
+      </w:r>
+    </w:p>
+    <w:p>
+      <w:pPr>
+        <w:spacing w:after="120"/>
+        <w:jc w:val="both"/>
+      </w:pPr>
+      <w:r>
+        <w:rPr>
+          <w:b w:val="0"/>
+          <w:i w:val="0"/>
+        </w:rPr>
+        <w:t xml:space="preserve">The Governance Centre gains a </w:t>
+      </w:r>
+      <w:r>
+        <w:rPr>
+          <w:b/>
+          <w:i w:val="0"/>
+        </w:rPr>
+        <w:t>History</w:t>
+      </w:r>
+      <w:r>
+        <w:rPr>
+          <w:b w:val="0"/>
+          <w:i w:val="0"/>
+        </w:rPr>
+        <w:t xml:space="preserve"> view for each setting: every value it has held, with its effective dates, who proposed and approved or rejected each change, the reasons, and the documents, newest first. The view can be exported to PDF and Excel, and the same history is a sheet in each month's audit workbook.</w:t>
+      </w:r>
+    </w:p>
+    <w:p>
+      <w:pPr>
+        <w:pStyle w:val="Heading3"/>
+      </w:pPr>
+      <w:r>
+        <w:t>8.5 A log that cannot be changed quietly</w:t>
+      </w:r>
+    </w:p>
+    <w:p>
+      <w:pPr>
+        <w:pStyle w:val="ListBullet"/>
+        <w:jc w:val="both"/>
+      </w:pPr>
+      <w:r>
+        <w:rPr>
+          <w:b w:val="0"/>
+          <w:i w:val="0"/>
+        </w:rPr>
+        <w:t xml:space="preserve">The governance audit entries are </w:t>
+      </w:r>
+      <w:r>
+        <w:rPr>
+          <w:b/>
+          <w:i w:val="0"/>
+        </w:rPr>
+        <w:t>append-only</w:t>
+      </w:r>
+      <w:r>
+        <w:rPr>
+          <w:b w:val="0"/>
+          <w:i w:val="0"/>
+        </w:rPr>
+        <w:t>. The system has no screen or command to edit or delete them, and the build adds a database guard so that an update or delete on these entries is refused.</w:t>
+      </w:r>
+    </w:p>
+    <w:p>
+      <w:pPr>
+        <w:pStyle w:val="ListBullet"/>
+        <w:jc w:val="both"/>
+      </w:pPr>
+      <w:r>
+        <w:rPr>
+          <w:b w:val="0"/>
+          <w:i w:val="0"/>
+        </w:rPr>
+        <w:t xml:space="preserve">Each entry carries the </w:t>
+      </w:r>
+      <w:r>
+        <w:rPr>
+          <w:b/>
+          <w:i w:val="0"/>
+        </w:rPr>
+        <w:t>fingerprint of the entry before it</w:t>
+      </w:r>
+      <w:r>
+        <w:rPr>
+          <w:b w:val="0"/>
+          <w:i w:val="0"/>
+        </w:rPr>
+        <w:t>, so the entries form a chain. A check (run with the bootstrap's verify step and on demand) recomputes the chain and names the first entry that does not follow. Anyone who changes or removes an entry directly in the database breaks the chain, and the check shows where.</w:t>
+      </w:r>
+    </w:p>
+    <w:p>
+      <w:pPr>
+        <w:pStyle w:val="Heading2"/>
+      </w:pPr>
+      <w:r>
+        <w:t>9. Decisions owed</w:t>
       </w:r>
     </w:p>
     <w:tbl>
@@ -5263,6 +6376,184 @@
           </w:p>
         </w:tc>
       </w:tr>
+      <w:tr>
+        <w:trPr>
+          <w:cantSplit/>
+        </w:trPr>
+        <w:tc>
+          <w:tcPr>
+            <w:tcW w:type="dxa" w:w="2493"/>
+          </w:tcPr>
+          <w:p>
+            <w:r>
+              <w:rPr>
+                <w:b w:val="0"/>
+                <w:sz w:val="17"/>
+              </w:rPr>
+            </w:r>
+            <w:r>
+              <w:rPr>
+                <w:b w:val="0"/>
+                <w:i w:val="0"/>
+                <w:sz w:val="17"/>
+              </w:rPr>
+              <w:t>S6</w:t>
+            </w:r>
+          </w:p>
+        </w:tc>
+        <w:tc>
+          <w:tcPr>
+            <w:tcW w:type="dxa" w:w="2493"/>
+          </w:tcPr>
+          <w:p>
+            <w:r>
+              <w:rPr>
+                <w:b w:val="0"/>
+                <w:sz w:val="17"/>
+              </w:rPr>
+            </w:r>
+            <w:r>
+              <w:rPr>
+                <w:b w:val="0"/>
+                <w:i w:val="0"/>
+                <w:sz w:val="17"/>
+              </w:rPr>
+              <w:t>Which settings require a supporting document before approval, beyond those named in section 8.3</w:t>
+            </w:r>
+          </w:p>
+        </w:tc>
+        <w:tc>
+          <w:tcPr>
+            <w:tcW w:type="dxa" w:w="2493"/>
+          </w:tcPr>
+          <w:p>
+            <w:r>
+              <w:rPr>
+                <w:b w:val="0"/>
+                <w:sz w:val="17"/>
+              </w:rPr>
+            </w:r>
+            <w:r>
+              <w:rPr>
+                <w:b w:val="0"/>
+                <w:i w:val="0"/>
+                <w:sz w:val="17"/>
+              </w:rPr>
+              <w:t>Dr Thom, with Finance</w:t>
+            </w:r>
+          </w:p>
+        </w:tc>
+        <w:tc>
+          <w:tcPr>
+            <w:tcW w:type="dxa" w:w="2493"/>
+          </w:tcPr>
+          <w:p>
+            <w:r>
+              <w:rPr>
+                <w:b w:val="0"/>
+                <w:sz w:val="17"/>
+              </w:rPr>
+            </w:r>
+            <w:r>
+              <w:rPr>
+                <w:b w:val="0"/>
+                <w:i w:val="0"/>
+                <w:sz w:val="17"/>
+              </w:rPr>
+              <w:t>Every setting that is a Phase 0 sign-off, and every staging setting</w:t>
+            </w:r>
+          </w:p>
+        </w:tc>
+      </w:tr>
+      <w:tr>
+        <w:trPr>
+          <w:cantSplit/>
+        </w:trPr>
+        <w:tc>
+          <w:tcPr>
+            <w:tcW w:type="dxa" w:w="2493"/>
+          </w:tcPr>
+          <w:p>
+            <w:r>
+              <w:rPr>
+                <w:b w:val="0"/>
+                <w:sz w:val="17"/>
+              </w:rPr>
+            </w:r>
+            <w:r>
+              <w:rPr>
+                <w:b w:val="0"/>
+                <w:i w:val="0"/>
+                <w:sz w:val="17"/>
+              </w:rPr>
+              <w:t>S7</w:t>
+            </w:r>
+          </w:p>
+        </w:tc>
+        <w:tc>
+          <w:tcPr>
+            <w:tcW w:type="dxa" w:w="2493"/>
+          </w:tcPr>
+          <w:p>
+            <w:r>
+              <w:rPr>
+                <w:b w:val="0"/>
+                <w:sz w:val="17"/>
+              </w:rPr>
+            </w:r>
+            <w:r>
+              <w:rPr>
+                <w:b w:val="0"/>
+                <w:i w:val="0"/>
+                <w:sz w:val="17"/>
+              </w:rPr>
+              <w:t>Who may view the supporting documents</w:t>
+            </w:r>
+          </w:p>
+        </w:tc>
+        <w:tc>
+          <w:tcPr>
+            <w:tcW w:type="dxa" w:w="2493"/>
+          </w:tcPr>
+          <w:p>
+            <w:r>
+              <w:rPr>
+                <w:b w:val="0"/>
+                <w:sz w:val="17"/>
+              </w:rPr>
+            </w:r>
+            <w:r>
+              <w:rPr>
+                <w:b w:val="0"/>
+                <w:i w:val="0"/>
+                <w:sz w:val="17"/>
+              </w:rPr>
+              <w:t>MAIIC ICT, with Dr Thom</w:t>
+            </w:r>
+          </w:p>
+        </w:tc>
+        <w:tc>
+          <w:tcPr>
+            <w:tcW w:type="dxa" w:w="2493"/>
+          </w:tcPr>
+          <w:p>
+            <w:r>
+              <w:rPr>
+                <w:b w:val="0"/>
+                <w:sz w:val="17"/>
+              </w:rPr>
+            </w:r>
+            <w:r>
+              <w:rPr>
+                <w:b w:val="0"/>
+                <w:i w:val="0"/>
+                <w:sz w:val="17"/>
+              </w:rPr>
+              <w:t>Users holding the governance permission, and the auditors through the auditor's pack</w:t>
+            </w:r>
+          </w:p>
+        </w:tc>
+      </w:tr>
     </w:tbl>
     <w:p/>
     <w:p>
@@ -5270,7 +6561,7 @@
         <w:pStyle w:val="Heading2"/>
       </w:pPr>
       <w:r>
-        <w:t>9. Acceptance</w:t>
+        <w:t>10. Acceptance</w:t>
       </w:r>
     </w:p>
     <w:p>
@@ -5435,10 +6726,90 @@
     </w:p>
     <w:p>
       <w:pPr>
+        <w:pStyle w:val="ListNumber"/>
+        <w:jc w:val="both"/>
+      </w:pPr>
+      <w:r>
+        <w:rPr>
+          <w:b/>
+          <w:i w:val="0"/>
+        </w:rPr>
+        <w:t>Every change logged.</w:t>
+      </w:r>
+      <w:r>
+        <w:rPr>
+          <w:b w:val="0"/>
+          <w:i w:val="0"/>
+        </w:rPr>
+        <w:t xml:space="preserve"> Seeding, proposing, adding or removing a document, approving, rejecting, withdrawing, applying a preset and using the override each write one audit entry with the fields of section 8.2, and the setting's History view shows them in order.</w:t>
+      </w:r>
+    </w:p>
+    <w:p>
+      <w:pPr>
+        <w:pStyle w:val="ListNumber"/>
+        <w:jc w:val="both"/>
+      </w:pPr>
+      <w:r>
+        <w:rPr>
+          <w:b/>
+          <w:i w:val="0"/>
+        </w:rPr>
+        <w:t>Required evidence.</w:t>
+      </w:r>
+      <w:r>
+        <w:rPr>
+          <w:b w:val="0"/>
+          <w:i w:val="0"/>
+        </w:rPr>
+        <w:t xml:space="preserve"> A staging preset or a Stage 2 rebuttal cannot be approved without at least one supporting document; the refusal names what is missing.</w:t>
+      </w:r>
+    </w:p>
+    <w:p>
+      <w:pPr>
+        <w:pStyle w:val="ListNumber"/>
+        <w:jc w:val="both"/>
+      </w:pPr>
+      <w:r>
+        <w:rPr>
+          <w:b/>
+          <w:i w:val="0"/>
+        </w:rPr>
+        <w:t>Documents safe.</w:t>
+      </w:r>
+      <w:r>
+        <w:rPr>
+          <w:b w:val="0"/>
+          <w:i w:val="0"/>
+        </w:rPr>
+        <w:t xml:space="preserve"> An uploaded document is stored outside the public web folder, cannot be opened without the governance permission, and a file altered on disk is reported as altered when opened.</w:t>
+      </w:r>
+    </w:p>
+    <w:p>
+      <w:pPr>
+        <w:pStyle w:val="ListNumber"/>
+        <w:jc w:val="both"/>
+      </w:pPr>
+      <w:r>
+        <w:rPr>
+          <w:b/>
+          <w:i w:val="0"/>
+        </w:rPr>
+        <w:t>Append-only.</w:t>
+      </w:r>
+      <w:r>
+        <w:rPr>
+          <w:b w:val="0"/>
+          <w:i w:val="0"/>
+        </w:rPr>
+        <w:t xml:space="preserve"> Editing or deleting a governance audit entry through the system is impossible, and doing it directly in the database is refused; a change made with the guard bypassed is found by the chain check, which names the first broken entry.</w:t>
+      </w:r>
+    </w:p>
+    <w:p>
+      <w:pPr>
         <w:pStyle w:val="Heading2"/>
       </w:pPr>
       <w:r>
-        <w:t>10. Build order</w:t>
+        <w:t>11. Build order</w:t>
       </w:r>
     </w:p>
     <w:tbl>
@@ -5759,7 +7130,7 @@
                 <w:i w:val="0"/>
                 <w:sz w:val="17"/>
               </w:rPr>
-              <w:t>Tests for each acceptance point; a bootstrap check</w:t>
+              <w:t>The governance change log of section 8: reject and withdraw, the seeding entries, supporting documents on private storage with fingerprints, required evidence, the History view and export, the append-only guard and the chain check</w:t>
             </w:r>
           </w:p>
         </w:tc>
@@ -5780,7 +7151,7 @@
                 <w:i w:val="0"/>
                 <w:sz w:val="17"/>
               </w:rPr>
-              <w:t>About half a day</w:t>
+              <w:t>About 2 days</w:t>
             </w:r>
           </w:p>
         </w:tc>
@@ -5827,7 +7198,7 @@
                 <w:i w:val="0"/>
                 <w:sz w:val="17"/>
               </w:rPr>
-              <w:t>Release to MAIIC's server by the release steps of the integration document (section 2.2): push, pull, migrate, bootstrap with the nine ties passing, then the comparison runs for December 2025 and September 2026</w:t>
+              <w:t>Tests for each acceptance point; a bootstrap check</w:t>
             </w:r>
           </w:p>
         </w:tc>
@@ -5848,7 +7219,7 @@
                 <w:i w:val="0"/>
                 <w:sz w:val="17"/>
               </w:rPr>
-              <w:t>With MAIIC ICT</w:t>
+              <w:t>About half a day</w:t>
             </w:r>
           </w:p>
         </w:tc>
@@ -5874,6 +7245,74 @@
                 <w:i w:val="0"/>
                 <w:sz w:val="17"/>
               </w:rPr>
+              <w:t>5</w:t>
+            </w:r>
+          </w:p>
+        </w:tc>
+        <w:tc>
+          <w:tcPr>
+            <w:tcW w:type="dxa" w:w="3324"/>
+          </w:tcPr>
+          <w:p>
+            <w:r>
+              <w:rPr>
+                <w:b w:val="0"/>
+                <w:sz w:val="17"/>
+              </w:rPr>
+            </w:r>
+            <w:r>
+              <w:rPr>
+                <w:b w:val="0"/>
+                <w:i w:val="0"/>
+                <w:sz w:val="17"/>
+              </w:rPr>
+              <w:t>Release to MAIIC's server by the release steps of the integration document (section 2.2): push, pull, migrate, bootstrap with the nine ties passing, then the comparison runs for December 2025 and September 2026</w:t>
+            </w:r>
+          </w:p>
+        </w:tc>
+        <w:tc>
+          <w:tcPr>
+            <w:tcW w:type="dxa" w:w="3324"/>
+          </w:tcPr>
+          <w:p>
+            <w:r>
+              <w:rPr>
+                <w:b w:val="0"/>
+                <w:sz w:val="17"/>
+              </w:rPr>
+            </w:r>
+            <w:r>
+              <w:rPr>
+                <w:b w:val="0"/>
+                <w:i w:val="0"/>
+                <w:sz w:val="17"/>
+              </w:rPr>
+              <w:t>With MAIIC ICT</w:t>
+            </w:r>
+          </w:p>
+        </w:tc>
+      </w:tr>
+      <w:tr>
+        <w:trPr>
+          <w:cantSplit/>
+        </w:trPr>
+        <w:tc>
+          <w:tcPr>
+            <w:tcW w:type="dxa" w:w="3324"/>
+          </w:tcPr>
+          <w:p>
+            <w:r>
+              <w:rPr>
+                <w:b w:val="0"/>
+                <w:sz w:val="17"/>
+              </w:rPr>
+            </w:r>
+            <w:r>
+              <w:rPr>
+                <w:b w:val="0"/>
+                <w:i w:val="0"/>
+                <w:sz w:val="17"/>
+              </w:rPr>
               <w:t>Later</w:t>
             </w:r>
           </w:p>
@@ -5928,7 +7367,7 @@
         <w:pStyle w:val="Heading2"/>
       </w:pPr>
       <w:r>
-        <w:t>11. Glossary</w:t>
+        <w:t>12. Glossary</w:t>
       </w:r>
     </w:p>
     <w:tbl>
@@ -6461,6 +7900,147 @@
                 <w:sz w:val="17"/>
               </w:rPr>
               <w:t>One person proposes a change and a second person approves it</w:t>
+            </w:r>
+          </w:p>
+        </w:tc>
+      </w:tr>
+      <w:tr>
+        <w:trPr>
+          <w:cantSplit/>
+        </w:trPr>
+        <w:tc>
+          <w:tcPr>
+            <w:tcW w:type="dxa" w:w="4986"/>
+          </w:tcPr>
+          <w:p>
+            <w:r>
+              <w:rPr>
+                <w:b w:val="0"/>
+                <w:sz w:val="17"/>
+              </w:rPr>
+            </w:r>
+            <w:r>
+              <w:rPr>
+                <w:b/>
+                <w:i w:val="0"/>
+                <w:sz w:val="17"/>
+              </w:rPr>
+              <w:t>Supporting document</w:t>
+            </w:r>
+          </w:p>
+        </w:tc>
+        <w:tc>
+          <w:tcPr>
+            <w:tcW w:type="dxa" w:w="4986"/>
+          </w:tcPr>
+          <w:p>
+            <w:r>
+              <w:rPr>
+                <w:b w:val="0"/>
+                <w:sz w:val="17"/>
+              </w:rPr>
+            </w:r>
+            <w:r>
+              <w:rPr>
+                <w:b w:val="0"/>
+                <w:i w:val="0"/>
+                <w:sz w:val="17"/>
+              </w:rPr>
+              <w:t>A file attached to a governance change as its evidence: a minute, a policy paper, an analysis or correspondence</w:t>
+            </w:r>
+          </w:p>
+        </w:tc>
+      </w:tr>
+      <w:tr>
+        <w:trPr>
+          <w:cantSplit/>
+        </w:trPr>
+        <w:tc>
+          <w:tcPr>
+            <w:tcW w:type="dxa" w:w="4986"/>
+          </w:tcPr>
+          <w:p>
+            <w:r>
+              <w:rPr>
+                <w:b w:val="0"/>
+                <w:sz w:val="17"/>
+              </w:rPr>
+            </w:r>
+            <w:r>
+              <w:rPr>
+                <w:b/>
+                <w:i w:val="0"/>
+                <w:sz w:val="17"/>
+              </w:rPr>
+              <w:t>Append-only</w:t>
+            </w:r>
+          </w:p>
+        </w:tc>
+        <w:tc>
+          <w:tcPr>
+            <w:tcW w:type="dxa" w:w="4986"/>
+          </w:tcPr>
+          <w:p>
+            <w:r>
+              <w:rPr>
+                <w:b w:val="0"/>
+                <w:sz w:val="17"/>
+              </w:rPr>
+            </w:r>
+            <w:r>
+              <w:rPr>
+                <w:b w:val="0"/>
+                <w:i w:val="0"/>
+                <w:sz w:val="17"/>
+              </w:rPr>
+              <w:t>A record that can be added to but never changed or deleted</w:t>
+            </w:r>
+          </w:p>
+        </w:tc>
+      </w:tr>
+      <w:tr>
+        <w:trPr>
+          <w:cantSplit/>
+        </w:trPr>
+        <w:tc>
+          <w:tcPr>
+            <w:tcW w:type="dxa" w:w="4986"/>
+          </w:tcPr>
+          <w:p>
+            <w:r>
+              <w:rPr>
+                <w:b w:val="0"/>
+                <w:sz w:val="17"/>
+              </w:rPr>
+            </w:r>
+            <w:r>
+              <w:rPr>
+                <w:b/>
+                <w:i w:val="0"/>
+                <w:sz w:val="17"/>
+              </w:rPr>
+              <w:t>Chain check</w:t>
+            </w:r>
+          </w:p>
+        </w:tc>
+        <w:tc>
+          <w:tcPr>
+            <w:tcW w:type="dxa" w:w="4986"/>
+          </w:tcPr>
+          <w:p>
+            <w:r>
+              <w:rPr>
+                <w:b w:val="0"/>
+                <w:sz w:val="17"/>
+              </w:rPr>
+            </w:r>
+            <w:r>
+              <w:rPr>
+                <w:b w:val="0"/>
+                <w:i w:val="0"/>
+                <w:sz w:val="17"/>
+              </w:rPr>
+              <w:t>A test that each audit entry still carries the fingerprint of the one before it, so that a changed or removed entry is found</w:t>
             </w:r>
           </w:p>
         </w:tc>

</xml_diff>

<commit_message>
Staging spec: section 8.6 and 8.7, every other approval workflow (about twenty) on the same audit log and document store, with required evidence per workflow, the fee rulebook's missing maker-checker, and one register of approvals; renderer keeps headings and table labels with the block after them; integration documents re-rendered
Co-Authored-By: Claude Opus 5.5 <noreply@anthropic.com>
</commit_message>
<xml_diff>
--- a/docs/MAIIC_Staging_Module_Specification_v1_2026-10-15.docx
+++ b/docs/MAIIC_Staging_Module_Specification_v1_2026-10-15.docx
@@ -173,7 +173,7 @@
           <w:b w:val="0"/>
           <w:i w:val="0"/>
         </w:rPr>
-        <w:t xml:space="preserve">: each rule becomes a setting in the Governance Centre, proposed by one person and approved by another, with an effective date and a comment, like every other policy setting in the system. It makes every change in the Governance Centre fully logged, with room for supporting documents (section 8). It also adds a </w:t>
+        <w:t xml:space="preserve">: each rule becomes a setting in the Governance Centre, proposed by one person and approved by another, with an effective date and a comment, like every other policy setting in the system. It makes every change in the Governance Centre, and every other approval in the system, fully logged, with room for supporting documents (section 8). It also adds a </w:t>
       </w:r>
       <w:r>
         <w:rPr>
@@ -4701,7 +4701,7 @@
         <w:pStyle w:val="Heading2"/>
       </w:pPr>
       <w:r>
-        <w:t>8. Every Governance Centre change logged, with its supporting documents</w:t>
+        <w:t>8. Every governed change logged, with its supporting documents</w:t>
       </w:r>
     </w:p>
     <w:p>
@@ -4714,7 +4714,7 @@
           <w:b w:val="0"/>
           <w:i w:val="0"/>
         </w:rPr>
-        <w:t xml:space="preserve">Staging becomes governed through the Governance Centre, so the Centre's record has to be good enough for an auditor or the Reserve Bank to follow every policy choice: who proposed it, why, on what evidence, who approved or rejected it, when it took effect and what it replaced. This section covers </w:t>
+        <w:t xml:space="preserve">Staging becomes governed through the Governance Centre, so the Centre's record has to be good enough for an auditor or the Reserve Bank to follow every policy choice: who proposed it, why, on what evidence, who approved or rejected it, when it took effect and what it replaced. Sections 8.1 to 8.5 cover </w:t>
       </w:r>
       <w:r>
         <w:rPr>
@@ -4728,7 +4728,21 @@
           <w:b w:val="0"/>
           <w:i w:val="0"/>
         </w:rPr>
-        <w:t>, not only the staging ones.</w:t>
+        <w:t xml:space="preserve">, not only the staging ones. Section 8.6 applies the same record to </w:t>
+      </w:r>
+      <w:r>
+        <w:rPr>
+          <w:b/>
+          <w:i w:val="0"/>
+        </w:rPr>
+        <w:t>every other approval in the system</w:t>
+      </w:r>
+      <w:r>
+        <w:rPr>
+          <w:b w:val="0"/>
+          <w:i w:val="0"/>
+        </w:rPr>
+        <w:t>: the rules, registers, models, locks and sign-offs that are proposed by one person and decided by another outside the Centre.</w:t>
       </w:r>
     </w:p>
     <w:p>
@@ -5811,6 +5825,2536 @@
     </w:p>
     <w:p>
       <w:pPr>
+        <w:pStyle w:val="Heading3"/>
+      </w:pPr>
+      <w:r>
+        <w:t>8.6 The other approvals in the system</w:t>
+      </w:r>
+    </w:p>
+    <w:p>
+      <w:pPr>
+        <w:spacing w:after="120"/>
+        <w:jc w:val="both"/>
+      </w:pPr>
+      <w:r>
+        <w:rPr>
+          <w:b w:val="0"/>
+          <w:i w:val="0"/>
+        </w:rPr>
+        <w:t>Outside the Governance Centre, about twenty other workflows decide something that changes a figure. They already have their own screens, and most already require a second person. Each now gets the same record as the Centre: the events of section 8.2, supporting documents as in section 8.3, a history, and the append-only chained log of section 8.5. The list below is from the code as at 15 October 2026.</w:t>
+      </w:r>
+    </w:p>
+    <w:p>
+      <w:pPr>
+        <w:spacing w:after="120"/>
+        <w:jc w:val="both"/>
+      </w:pPr>
+      <w:r>
+        <w:rPr>
+          <w:b/>
+          <w:i w:val="0"/>
+        </w:rPr>
+        <w:t>Policy, rules and models</w:t>
+      </w:r>
+    </w:p>
+    <w:tbl>
+      <w:tblPr>
+        <w:tblStyle w:val="TableGrid"/>
+        <w:tblW w:type="auto" w:w="0"/>
+        <w:tblLook w:firstColumn="1" w:firstRow="1" w:lastColumn="0" w:lastRow="0" w:noHBand="0" w:noVBand="1" w:val="04A0"/>
+      </w:tblPr>
+      <w:tblGrid>
+        <w:gridCol w:w="1994"/>
+        <w:gridCol w:w="1994"/>
+        <w:gridCol w:w="1994"/>
+        <w:gridCol w:w="1994"/>
+        <w:gridCol w:w="1994"/>
+      </w:tblGrid>
+      <w:tr>
+        <w:trPr>
+          <w:cantSplit/>
+          <w:tblHeader/>
+        </w:trPr>
+        <w:tc>
+          <w:tcPr>
+            <w:tcW w:type="dxa" w:w="1994"/>
+            <w:shd w:val="clear" w:color="auto" w:fill="1B2A41"/>
+          </w:tcPr>
+          <w:p>
+            <w:r>
+              <w:rPr>
+                <w:b/>
+                <w:color w:val="FFFFFF"/>
+                <w:sz w:val="17"/>
+              </w:rPr>
+            </w:r>
+            <w:r>
+              <w:rPr>
+                <w:b/>
+                <w:i w:val="0"/>
+                <w:color w:val="FFFFFF"/>
+                <w:sz w:val="17"/>
+              </w:rPr>
+              <w:t>Workflow</w:t>
+            </w:r>
+          </w:p>
+        </w:tc>
+        <w:tc>
+          <w:tcPr>
+            <w:tcW w:type="dxa" w:w="1994"/>
+            <w:shd w:val="clear" w:color="auto" w:fill="1B2A41"/>
+          </w:tcPr>
+          <w:p>
+            <w:r>
+              <w:rPr>
+                <w:b/>
+                <w:color w:val="FFFFFF"/>
+                <w:sz w:val="17"/>
+              </w:rPr>
+            </w:r>
+            <w:r>
+              <w:rPr>
+                <w:b/>
+                <w:i w:val="0"/>
+                <w:color w:val="FFFFFF"/>
+                <w:sz w:val="17"/>
+              </w:rPr>
+              <w:t>What it decides</w:t>
+            </w:r>
+          </w:p>
+        </w:tc>
+        <w:tc>
+          <w:tcPr>
+            <w:tcW w:type="dxa" w:w="1994"/>
+            <w:shd w:val="clear" w:color="auto" w:fill="1B2A41"/>
+          </w:tcPr>
+          <w:p>
+            <w:r>
+              <w:rPr>
+                <w:b/>
+                <w:color w:val="FFFFFF"/>
+                <w:sz w:val="17"/>
+              </w:rPr>
+            </w:r>
+            <w:r>
+              <w:rPr>
+                <w:b/>
+                <w:i w:val="0"/>
+                <w:color w:val="FFFFFF"/>
+                <w:sz w:val="17"/>
+              </w:rPr>
+              <w:t>Today</w:t>
+            </w:r>
+          </w:p>
+        </w:tc>
+        <w:tc>
+          <w:tcPr>
+            <w:tcW w:type="dxa" w:w="1994"/>
+            <w:shd w:val="clear" w:color="auto" w:fill="1B2A41"/>
+          </w:tcPr>
+          <w:p>
+            <w:r>
+              <w:rPr>
+                <w:b/>
+                <w:color w:val="FFFFFF"/>
+                <w:sz w:val="17"/>
+              </w:rPr>
+            </w:r>
+            <w:r>
+              <w:rPr>
+                <w:b/>
+                <w:i w:val="0"/>
+                <w:color w:val="FFFFFF"/>
+                <w:sz w:val="17"/>
+              </w:rPr>
+              <w:t>What changes</w:t>
+            </w:r>
+          </w:p>
+        </w:tc>
+        <w:tc>
+          <w:tcPr>
+            <w:tcW w:type="dxa" w:w="1994"/>
+            <w:shd w:val="clear" w:color="auto" w:fill="1B2A41"/>
+          </w:tcPr>
+          <w:p>
+            <w:r>
+              <w:rPr>
+                <w:b/>
+                <w:color w:val="FFFFFF"/>
+                <w:sz w:val="17"/>
+              </w:rPr>
+            </w:r>
+            <w:r>
+              <w:rPr>
+                <w:b/>
+                <w:i w:val="0"/>
+                <w:color w:val="FFFFFF"/>
+                <w:sz w:val="17"/>
+              </w:rPr>
+              <w:t>Evidence required to approve</w:t>
+            </w:r>
+          </w:p>
+        </w:tc>
+      </w:tr>
+      <w:tr>
+        <w:trPr>
+          <w:cantSplit/>
+        </w:trPr>
+        <w:tc>
+          <w:tcPr>
+            <w:tcW w:type="dxa" w:w="1994"/>
+          </w:tcPr>
+          <w:p>
+            <w:r>
+              <w:rPr>
+                <w:b w:val="0"/>
+                <w:sz w:val="17"/>
+              </w:rPr>
+            </w:r>
+            <w:r>
+              <w:rPr>
+                <w:b w:val="0"/>
+                <w:i w:val="0"/>
+                <w:sz w:val="17"/>
+              </w:rPr>
+              <w:t>Staging threshold rows (Staging &amp; SICR Rules)</w:t>
+            </w:r>
+          </w:p>
+        </w:tc>
+        <w:tc>
+          <w:tcPr>
+            <w:tcW w:type="dxa" w:w="1994"/>
+          </w:tcPr>
+          <w:p>
+            <w:r>
+              <w:rPr>
+                <w:b w:val="0"/>
+                <w:sz w:val="17"/>
+              </w:rPr>
+            </w:r>
+            <w:r>
+              <w:rPr>
+                <w:b w:val="0"/>
+                <w:i w:val="0"/>
+                <w:sz w:val="17"/>
+              </w:rPr>
+              <w:t>The day thresholds per facility class</w:t>
+            </w:r>
+          </w:p>
+        </w:tc>
+        <w:tc>
+          <w:tcPr>
+            <w:tcW w:type="dxa" w:w="1994"/>
+          </w:tcPr>
+          <w:p>
+            <w:r>
+              <w:rPr>
+                <w:b w:val="0"/>
+                <w:sz w:val="17"/>
+              </w:rPr>
+            </w:r>
+            <w:r>
+              <w:rPr>
+                <w:b w:val="0"/>
+                <w:i w:val="0"/>
+                <w:sz w:val="17"/>
+              </w:rPr>
+              <w:t>Propose, approve, reject; second person; logged</w:t>
+            </w:r>
+          </w:p>
+        </w:tc>
+        <w:tc>
+          <w:tcPr>
+            <w:tcW w:type="dxa" w:w="1994"/>
+          </w:tcPr>
+          <w:p>
+            <w:r>
+              <w:rPr>
+                <w:b w:val="0"/>
+                <w:sz w:val="17"/>
+              </w:rPr>
+            </w:r>
+            <w:r>
+              <w:rPr>
+                <w:b w:val="0"/>
+                <w:i w:val="0"/>
+                <w:sz w:val="17"/>
+              </w:rPr>
+              <w:t>Withdraw; documents; history</w:t>
+            </w:r>
+          </w:p>
+        </w:tc>
+        <w:tc>
+          <w:tcPr>
+            <w:tcW w:type="dxa" w:w="1994"/>
+          </w:tcPr>
+          <w:p>
+            <w:r>
+              <w:rPr>
+                <w:b w:val="0"/>
+                <w:sz w:val="17"/>
+              </w:rPr>
+            </w:r>
+            <w:r>
+              <w:rPr>
+                <w:b w:val="0"/>
+                <w:i w:val="0"/>
+                <w:sz w:val="17"/>
+              </w:rPr>
+              <w:t>Yes: the rebuttal basis for any change to a threshold</w:t>
+            </w:r>
+          </w:p>
+        </w:tc>
+      </w:tr>
+      <w:tr>
+        <w:trPr>
+          <w:cantSplit/>
+        </w:trPr>
+        <w:tc>
+          <w:tcPr>
+            <w:tcW w:type="dxa" w:w="1994"/>
+          </w:tcPr>
+          <w:p>
+            <w:r>
+              <w:rPr>
+                <w:b w:val="0"/>
+                <w:sz w:val="17"/>
+              </w:rPr>
+            </w:r>
+            <w:r>
+              <w:rPr>
+                <w:b w:val="0"/>
+                <w:i w:val="0"/>
+                <w:sz w:val="17"/>
+              </w:rPr>
+              <w:t>Qualitative SICR register</w:t>
+            </w:r>
+          </w:p>
+        </w:tc>
+        <w:tc>
+          <w:tcPr>
+            <w:tcW w:type="dxa" w:w="1994"/>
+          </w:tcPr>
+          <w:p>
+            <w:r>
+              <w:rPr>
+                <w:b w:val="0"/>
+                <w:sz w:val="17"/>
+              </w:rPr>
+            </w:r>
+            <w:r>
+              <w:rPr>
+                <w:b w:val="0"/>
+                <w:i w:val="0"/>
+                <w:sz w:val="17"/>
+              </w:rPr>
+              <w:t>A trigger that lifts a loan or customer to Stage 2 or 3</w:t>
+            </w:r>
+          </w:p>
+        </w:tc>
+        <w:tc>
+          <w:tcPr>
+            <w:tcW w:type="dxa" w:w="1994"/>
+          </w:tcPr>
+          <w:p>
+            <w:r>
+              <w:rPr>
+                <w:b w:val="0"/>
+                <w:sz w:val="17"/>
+              </w:rPr>
+            </w:r>
+            <w:r>
+              <w:rPr>
+                <w:b w:val="0"/>
+                <w:i w:val="0"/>
+                <w:sz w:val="17"/>
+              </w:rPr>
+              <w:t>Propose, approve, reject; second person; logged</w:t>
+            </w:r>
+          </w:p>
+        </w:tc>
+        <w:tc>
+          <w:tcPr>
+            <w:tcW w:type="dxa" w:w="1994"/>
+          </w:tcPr>
+          <w:p>
+            <w:r>
+              <w:rPr>
+                <w:b w:val="0"/>
+                <w:sz w:val="17"/>
+              </w:rPr>
+            </w:r>
+            <w:r>
+              <w:rPr>
+                <w:b w:val="0"/>
+                <w:i w:val="0"/>
+                <w:sz w:val="17"/>
+              </w:rPr>
+              <w:t>Withdraw; documents; history</w:t>
+            </w:r>
+          </w:p>
+        </w:tc>
+        <w:tc>
+          <w:tcPr>
+            <w:tcW w:type="dxa" w:w="1994"/>
+          </w:tcPr>
+          <w:p>
+            <w:r>
+              <w:rPr>
+                <w:b w:val="0"/>
+                <w:sz w:val="17"/>
+              </w:rPr>
+            </w:r>
+            <w:r>
+              <w:rPr>
+                <w:b w:val="0"/>
+                <w:i w:val="0"/>
+                <w:sz w:val="17"/>
+              </w:rPr>
+              <w:t>Yes: the credit report or event behind the trigger</w:t>
+            </w:r>
+          </w:p>
+        </w:tc>
+      </w:tr>
+      <w:tr>
+        <w:trPr>
+          <w:cantSplit/>
+        </w:trPr>
+        <w:tc>
+          <w:tcPr>
+            <w:tcW w:type="dxa" w:w="1994"/>
+          </w:tcPr>
+          <w:p>
+            <w:r>
+              <w:rPr>
+                <w:b w:val="0"/>
+                <w:sz w:val="17"/>
+              </w:rPr>
+            </w:r>
+            <w:r>
+              <w:rPr>
+                <w:b/>
+                <w:i w:val="0"/>
+                <w:sz w:val="17"/>
+              </w:rPr>
+              <w:t>Fee rulebook</w:t>
+            </w:r>
+            <w:r>
+              <w:rPr>
+                <w:b w:val="0"/>
+                <w:i w:val="0"/>
+                <w:sz w:val="17"/>
+              </w:rPr>
+              <w:t xml:space="preserve"> (Accounting Rules)</w:t>
+            </w:r>
+          </w:p>
+        </w:tc>
+        <w:tc>
+          <w:tcPr>
+            <w:tcW w:type="dxa" w:w="1994"/>
+          </w:tcPr>
+          <w:p>
+            <w:r>
+              <w:rPr>
+                <w:b w:val="0"/>
+                <w:sz w:val="17"/>
+              </w:rPr>
+            </w:r>
+            <w:r>
+              <w:rPr>
+                <w:b w:val="0"/>
+                <w:i w:val="0"/>
+                <w:sz w:val="17"/>
+              </w:rPr>
+              <w:t>Whether a fee type is integral to the EIR</w:t>
+            </w:r>
+          </w:p>
+        </w:tc>
+        <w:tc>
+          <w:tcPr>
+            <w:tcW w:type="dxa" w:w="1994"/>
+          </w:tcPr>
+          <w:p>
+            <w:r>
+              <w:rPr>
+                <w:b w:val="0"/>
+                <w:sz w:val="17"/>
+              </w:rPr>
+            </w:r>
+            <w:r>
+              <w:rPr>
+                <w:b w:val="0"/>
+                <w:i w:val="0"/>
+                <w:sz w:val="17"/>
+              </w:rPr>
+              <w:t xml:space="preserve">Create, edit, approve, switch on or off; logged. </w:t>
+            </w:r>
+            <w:r>
+              <w:rPr>
+                <w:b/>
+                <w:i w:val="0"/>
+                <w:sz w:val="17"/>
+              </w:rPr>
+              <w:t>The person who wrote a rule can approve it, no reason is asked, and switching a rule on or off needs no second person</w:t>
+            </w:r>
+          </w:p>
+        </w:tc>
+        <w:tc>
+          <w:tcPr>
+            <w:tcW w:type="dxa" w:w="1994"/>
+          </w:tcPr>
+          <w:p>
+            <w:r>
+              <w:rPr>
+                <w:b w:val="0"/>
+                <w:sz w:val="17"/>
+              </w:rPr>
+            </w:r>
+            <w:r>
+              <w:rPr>
+                <w:b/>
+                <w:i w:val="0"/>
+                <w:sz w:val="17"/>
+              </w:rPr>
+              <w:t>Second-person approval with a reason; reject and withdraw; switching on or off becomes a proposal like any other change</w:t>
+            </w:r>
+            <w:r>
+              <w:rPr>
+                <w:b w:val="0"/>
+                <w:i w:val="0"/>
+                <w:sz w:val="17"/>
+              </w:rPr>
+              <w:t>; documents; history</w:t>
+            </w:r>
+          </w:p>
+        </w:tc>
+        <w:tc>
+          <w:tcPr>
+            <w:tcW w:type="dxa" w:w="1994"/>
+          </w:tcPr>
+          <w:p>
+            <w:r>
+              <w:rPr>
+                <w:b w:val="0"/>
+                <w:sz w:val="17"/>
+              </w:rPr>
+            </w:r>
+            <w:r>
+              <w:rPr>
+                <w:b w:val="0"/>
+                <w:i w:val="0"/>
+                <w:sz w:val="17"/>
+              </w:rPr>
+              <w:t>Yes: the policy reference or the offer-letter evidence for the fee type</w:t>
+            </w:r>
+          </w:p>
+        </w:tc>
+      </w:tr>
+      <w:tr>
+        <w:trPr>
+          <w:cantSplit/>
+        </w:trPr>
+        <w:tc>
+          <w:tcPr>
+            <w:tcW w:type="dxa" w:w="1994"/>
+          </w:tcPr>
+          <w:p>
+            <w:r>
+              <w:rPr>
+                <w:b w:val="0"/>
+                <w:sz w:val="17"/>
+              </w:rPr>
+            </w:r>
+            <w:r>
+              <w:rPr>
+                <w:b w:val="0"/>
+                <w:i w:val="0"/>
+                <w:sz w:val="17"/>
+              </w:rPr>
+              <w:t>Fee classification review</w:t>
+            </w:r>
+          </w:p>
+        </w:tc>
+        <w:tc>
+          <w:tcPr>
+            <w:tcW w:type="dxa" w:w="1994"/>
+          </w:tcPr>
+          <w:p>
+            <w:r>
+              <w:rPr>
+                <w:b w:val="0"/>
+                <w:sz w:val="17"/>
+              </w:rPr>
+            </w:r>
+            <w:r>
+              <w:rPr>
+                <w:b w:val="0"/>
+                <w:i w:val="0"/>
+                <w:sz w:val="17"/>
+              </w:rPr>
+              <w:t>Whether each fee line enters the EIR</w:t>
+            </w:r>
+          </w:p>
+        </w:tc>
+        <w:tc>
+          <w:tcPr>
+            <w:tcW w:type="dxa" w:w="1994"/>
+          </w:tcPr>
+          <w:p>
+            <w:r>
+              <w:rPr>
+                <w:b w:val="0"/>
+                <w:sz w:val="17"/>
+              </w:rPr>
+            </w:r>
+            <w:r>
+              <w:rPr>
+                <w:b w:val="0"/>
+                <w:i w:val="0"/>
+                <w:sz w:val="17"/>
+              </w:rPr>
+              <w:t>Classify, then review by a second person; logged</w:t>
+            </w:r>
+          </w:p>
+        </w:tc>
+        <w:tc>
+          <w:tcPr>
+            <w:tcW w:type="dxa" w:w="1994"/>
+          </w:tcPr>
+          <w:p>
+            <w:r>
+              <w:rPr>
+                <w:b w:val="0"/>
+                <w:sz w:val="17"/>
+              </w:rPr>
+            </w:r>
+            <w:r>
+              <w:rPr>
+                <w:b w:val="0"/>
+                <w:i w:val="0"/>
+                <w:sz w:val="17"/>
+              </w:rPr>
+              <w:t>Reject back to the classifier with a reason; documents; history</w:t>
+            </w:r>
+          </w:p>
+        </w:tc>
+        <w:tc>
+          <w:tcPr>
+            <w:tcW w:type="dxa" w:w="1994"/>
+          </w:tcPr>
+          <w:p>
+            <w:r>
+              <w:rPr>
+                <w:b w:val="0"/>
+                <w:sz w:val="17"/>
+              </w:rPr>
+            </w:r>
+            <w:r>
+              <w:rPr>
+                <w:b w:val="0"/>
+                <w:i w:val="0"/>
+                <w:sz w:val="17"/>
+              </w:rPr>
+              <w:t>Only for a line classified against the rulebook's suggestion</w:t>
+            </w:r>
+          </w:p>
+        </w:tc>
+      </w:tr>
+      <w:tr>
+        <w:trPr>
+          <w:cantSplit/>
+        </w:trPr>
+        <w:tc>
+          <w:tcPr>
+            <w:tcW w:type="dxa" w:w="1994"/>
+          </w:tcPr>
+          <w:p>
+            <w:r>
+              <w:rPr>
+                <w:b w:val="0"/>
+                <w:sz w:val="17"/>
+              </w:rPr>
+            </w:r>
+            <w:r>
+              <w:rPr>
+                <w:b w:val="0"/>
+                <w:i w:val="0"/>
+                <w:sz w:val="17"/>
+              </w:rPr>
+              <w:t>Scenario sets</w:t>
+            </w:r>
+          </w:p>
+        </w:tc>
+        <w:tc>
+          <w:tcPr>
+            <w:tcW w:type="dxa" w:w="1994"/>
+          </w:tcPr>
+          <w:p>
+            <w:r>
+              <w:rPr>
+                <w:b w:val="0"/>
+                <w:sz w:val="17"/>
+              </w:rPr>
+            </w:r>
+            <w:r>
+              <w:rPr>
+                <w:b w:val="0"/>
+                <w:i w:val="0"/>
+                <w:sz w:val="17"/>
+              </w:rPr>
+              <w:t>The economic scenarios and their weights</w:t>
+            </w:r>
+          </w:p>
+        </w:tc>
+        <w:tc>
+          <w:tcPr>
+            <w:tcW w:type="dxa" w:w="1994"/>
+          </w:tcPr>
+          <w:p>
+            <w:r>
+              <w:rPr>
+                <w:b w:val="0"/>
+                <w:sz w:val="17"/>
+              </w:rPr>
+            </w:r>
+            <w:r>
+              <w:rPr>
+                <w:b w:val="0"/>
+                <w:i w:val="0"/>
+                <w:sz w:val="17"/>
+              </w:rPr>
+              <w:t>Propose, approve, lock; second person; logged</w:t>
+            </w:r>
+          </w:p>
+        </w:tc>
+        <w:tc>
+          <w:tcPr>
+            <w:tcW w:type="dxa" w:w="1994"/>
+          </w:tcPr>
+          <w:p>
+            <w:r>
+              <w:rPr>
+                <w:b w:val="0"/>
+                <w:sz w:val="17"/>
+              </w:rPr>
+            </w:r>
+            <w:r>
+              <w:rPr>
+                <w:b w:val="0"/>
+                <w:i w:val="0"/>
+                <w:sz w:val="17"/>
+              </w:rPr>
+              <w:t>Reject and withdraw; documents; history</w:t>
+            </w:r>
+          </w:p>
+        </w:tc>
+        <w:tc>
+          <w:tcPr>
+            <w:tcW w:type="dxa" w:w="1994"/>
+          </w:tcPr>
+          <w:p>
+            <w:r>
+              <w:rPr>
+                <w:b w:val="0"/>
+                <w:sz w:val="17"/>
+              </w:rPr>
+            </w:r>
+            <w:r>
+              <w:rPr>
+                <w:b w:val="0"/>
+                <w:i w:val="0"/>
+                <w:sz w:val="17"/>
+              </w:rPr>
+              <w:t>Yes: the calibration note (already required for a downside scenario)</w:t>
+            </w:r>
+          </w:p>
+        </w:tc>
+      </w:tr>
+      <w:tr>
+        <w:trPr>
+          <w:cantSplit/>
+        </w:trPr>
+        <w:tc>
+          <w:tcPr>
+            <w:tcW w:type="dxa" w:w="1994"/>
+          </w:tcPr>
+          <w:p>
+            <w:r>
+              <w:rPr>
+                <w:b w:val="0"/>
+                <w:sz w:val="17"/>
+              </w:rPr>
+            </w:r>
+            <w:r>
+              <w:rPr>
+                <w:b w:val="0"/>
+                <w:i w:val="0"/>
+                <w:sz w:val="17"/>
+              </w:rPr>
+              <w:t>Forward-looking overlays</w:t>
+            </w:r>
+          </w:p>
+        </w:tc>
+        <w:tc>
+          <w:tcPr>
+            <w:tcW w:type="dxa" w:w="1994"/>
+          </w:tcPr>
+          <w:p>
+            <w:r>
+              <w:rPr>
+                <w:b w:val="0"/>
+                <w:sz w:val="17"/>
+              </w:rPr>
+            </w:r>
+            <w:r>
+              <w:rPr>
+                <w:b w:val="0"/>
+                <w:i w:val="0"/>
+                <w:sz w:val="17"/>
+              </w:rPr>
+              <w:t>A management adjustment to the forward-looking result</w:t>
+            </w:r>
+          </w:p>
+        </w:tc>
+        <w:tc>
+          <w:tcPr>
+            <w:tcW w:type="dxa" w:w="1994"/>
+          </w:tcPr>
+          <w:p>
+            <w:r>
+              <w:rPr>
+                <w:b w:val="0"/>
+                <w:sz w:val="17"/>
+              </w:rPr>
+            </w:r>
+            <w:r>
+              <w:rPr>
+                <w:b w:val="0"/>
+                <w:i w:val="0"/>
+                <w:sz w:val="17"/>
+              </w:rPr>
+              <w:t>Propose, approve, reject; second person; logged</w:t>
+            </w:r>
+          </w:p>
+        </w:tc>
+        <w:tc>
+          <w:tcPr>
+            <w:tcW w:type="dxa" w:w="1994"/>
+          </w:tcPr>
+          <w:p>
+            <w:r>
+              <w:rPr>
+                <w:b w:val="0"/>
+                <w:sz w:val="17"/>
+              </w:rPr>
+            </w:r>
+            <w:r>
+              <w:rPr>
+                <w:b w:val="0"/>
+                <w:i w:val="0"/>
+                <w:sz w:val="17"/>
+              </w:rPr>
+              <w:t>Withdraw; documents; history</w:t>
+            </w:r>
+          </w:p>
+        </w:tc>
+        <w:tc>
+          <w:tcPr>
+            <w:tcW w:type="dxa" w:w="1994"/>
+          </w:tcPr>
+          <w:p>
+            <w:r>
+              <w:rPr>
+                <w:b w:val="0"/>
+                <w:sz w:val="17"/>
+              </w:rPr>
+            </w:r>
+            <w:r>
+              <w:rPr>
+                <w:b w:val="0"/>
+                <w:i w:val="0"/>
+                <w:sz w:val="17"/>
+              </w:rPr>
+              <w:t>Yes: the reason and evidence (already captured as text; now a document as well)</w:t>
+            </w:r>
+          </w:p>
+        </w:tc>
+      </w:tr>
+      <w:tr>
+        <w:trPr>
+          <w:cantSplit/>
+        </w:trPr>
+        <w:tc>
+          <w:tcPr>
+            <w:tcW w:type="dxa" w:w="1994"/>
+          </w:tcPr>
+          <w:p>
+            <w:r>
+              <w:rPr>
+                <w:b w:val="0"/>
+                <w:sz w:val="17"/>
+              </w:rPr>
+            </w:r>
+            <w:r>
+              <w:rPr>
+                <w:b w:val="0"/>
+                <w:i w:val="0"/>
+                <w:sz w:val="17"/>
+              </w:rPr>
+              <w:t>Forward-looking fits for the route</w:t>
+            </w:r>
+          </w:p>
+        </w:tc>
+        <w:tc>
+          <w:tcPr>
+            <w:tcW w:type="dxa" w:w="1994"/>
+          </w:tcPr>
+          <w:p>
+            <w:r>
+              <w:rPr>
+                <w:b w:val="0"/>
+                <w:sz w:val="17"/>
+              </w:rPr>
+            </w:r>
+            <w:r>
+              <w:rPr>
+                <w:b w:val="0"/>
+                <w:i w:val="0"/>
+                <w:sz w:val="17"/>
+              </w:rPr>
+              <w:t>Which regression drives the adjustment</w:t>
+            </w:r>
+          </w:p>
+        </w:tc>
+        <w:tc>
+          <w:tcPr>
+            <w:tcW w:type="dxa" w:w="1994"/>
+          </w:tcPr>
+          <w:p>
+            <w:r>
+              <w:rPr>
+                <w:b w:val="0"/>
+                <w:sz w:val="17"/>
+              </w:rPr>
+            </w:r>
+            <w:r>
+              <w:rPr>
+                <w:b w:val="0"/>
+                <w:i w:val="0"/>
+                <w:sz w:val="17"/>
+              </w:rPr>
+              <w:t>Propose, approve; second person; logged</w:t>
+            </w:r>
+          </w:p>
+        </w:tc>
+        <w:tc>
+          <w:tcPr>
+            <w:tcW w:type="dxa" w:w="1994"/>
+          </w:tcPr>
+          <w:p>
+            <w:r>
+              <w:rPr>
+                <w:b w:val="0"/>
+                <w:sz w:val="17"/>
+              </w:rPr>
+            </w:r>
+            <w:r>
+              <w:rPr>
+                <w:b w:val="0"/>
+                <w:i w:val="0"/>
+                <w:sz w:val="17"/>
+              </w:rPr>
+              <w:t>Reject and withdraw; documents; history</w:t>
+            </w:r>
+          </w:p>
+        </w:tc>
+        <w:tc>
+          <w:tcPr>
+            <w:tcW w:type="dxa" w:w="1994"/>
+          </w:tcPr>
+          <w:p>
+            <w:r>
+              <w:rPr>
+                <w:b w:val="0"/>
+                <w:sz w:val="17"/>
+              </w:rPr>
+            </w:r>
+            <w:r>
+              <w:rPr>
+                <w:b w:val="0"/>
+                <w:i w:val="0"/>
+                <w:sz w:val="17"/>
+              </w:rPr>
+              <w:t>Yes: the diagnostics export</w:t>
+            </w:r>
+          </w:p>
+        </w:tc>
+      </w:tr>
+      <w:tr>
+        <w:trPr>
+          <w:cantSplit/>
+        </w:trPr>
+        <w:tc>
+          <w:tcPr>
+            <w:tcW w:type="dxa" w:w="1994"/>
+          </w:tcPr>
+          <w:p>
+            <w:r>
+              <w:rPr>
+                <w:b w:val="0"/>
+                <w:sz w:val="17"/>
+              </w:rPr>
+            </w:r>
+            <w:r>
+              <w:rPr>
+                <w:b w:val="0"/>
+                <w:i w:val="0"/>
+                <w:sz w:val="17"/>
+              </w:rPr>
+              <w:t>External forward-looking models</w:t>
+            </w:r>
+          </w:p>
+        </w:tc>
+        <w:tc>
+          <w:tcPr>
+            <w:tcW w:type="dxa" w:w="1994"/>
+          </w:tcPr>
+          <w:p>
+            <w:r>
+              <w:rPr>
+                <w:b w:val="0"/>
+                <w:sz w:val="17"/>
+              </w:rPr>
+            </w:r>
+            <w:r>
+              <w:rPr>
+                <w:b w:val="0"/>
+                <w:i w:val="0"/>
+                <w:sz w:val="17"/>
+              </w:rPr>
+              <w:t>A model built outside the system</w:t>
+            </w:r>
+          </w:p>
+        </w:tc>
+        <w:tc>
+          <w:tcPr>
+            <w:tcW w:type="dxa" w:w="1994"/>
+          </w:tcPr>
+          <w:p>
+            <w:r>
+              <w:rPr>
+                <w:b w:val="0"/>
+                <w:sz w:val="17"/>
+              </w:rPr>
+            </w:r>
+            <w:r>
+              <w:rPr>
+                <w:b w:val="0"/>
+                <w:i w:val="0"/>
+                <w:sz w:val="17"/>
+              </w:rPr>
+              <w:t>Propose, approve, reject; second person; logged</w:t>
+            </w:r>
+          </w:p>
+        </w:tc>
+        <w:tc>
+          <w:tcPr>
+            <w:tcW w:type="dxa" w:w="1994"/>
+          </w:tcPr>
+          <w:p>
+            <w:r>
+              <w:rPr>
+                <w:b w:val="0"/>
+                <w:sz w:val="17"/>
+              </w:rPr>
+            </w:r>
+            <w:r>
+              <w:rPr>
+                <w:b w:val="0"/>
+                <w:i w:val="0"/>
+                <w:sz w:val="17"/>
+              </w:rPr>
+              <w:t>Withdraw; documents; history</w:t>
+            </w:r>
+          </w:p>
+        </w:tc>
+        <w:tc>
+          <w:tcPr>
+            <w:tcW w:type="dxa" w:w="1994"/>
+          </w:tcPr>
+          <w:p>
+            <w:r>
+              <w:rPr>
+                <w:b w:val="0"/>
+                <w:sz w:val="17"/>
+              </w:rPr>
+            </w:r>
+            <w:r>
+              <w:rPr>
+                <w:b w:val="0"/>
+                <w:i w:val="0"/>
+                <w:sz w:val="17"/>
+              </w:rPr>
+              <w:t>Yes: the model documentation</w:t>
+            </w:r>
+          </w:p>
+        </w:tc>
+      </w:tr>
+    </w:tbl>
+    <w:p/>
+    <w:p>
+      <w:pPr>
+        <w:spacing w:after="120"/>
+        <w:jc w:val="both"/>
+      </w:pPr>
+      <w:r>
+        <w:rPr>
+          <w:b/>
+          <w:i w:val="0"/>
+        </w:rPr>
+        <w:t>Loan-level decisions</w:t>
+      </w:r>
+    </w:p>
+    <w:tbl>
+      <w:tblPr>
+        <w:tblStyle w:val="TableGrid"/>
+        <w:tblW w:type="auto" w:w="0"/>
+        <w:tblLook w:firstColumn="1" w:firstRow="1" w:lastColumn="0" w:lastRow="0" w:noHBand="0" w:noVBand="1" w:val="04A0"/>
+      </w:tblPr>
+      <w:tblGrid>
+        <w:gridCol w:w="1994"/>
+        <w:gridCol w:w="1994"/>
+        <w:gridCol w:w="1994"/>
+        <w:gridCol w:w="1994"/>
+        <w:gridCol w:w="1994"/>
+      </w:tblGrid>
+      <w:tr>
+        <w:trPr>
+          <w:cantSplit/>
+          <w:tblHeader/>
+        </w:trPr>
+        <w:tc>
+          <w:tcPr>
+            <w:tcW w:type="dxa" w:w="1994"/>
+            <w:shd w:val="clear" w:color="auto" w:fill="1B2A41"/>
+          </w:tcPr>
+          <w:p>
+            <w:r>
+              <w:rPr>
+                <w:b/>
+                <w:color w:val="FFFFFF"/>
+                <w:sz w:val="17"/>
+              </w:rPr>
+            </w:r>
+            <w:r>
+              <w:rPr>
+                <w:b/>
+                <w:i w:val="0"/>
+                <w:color w:val="FFFFFF"/>
+                <w:sz w:val="17"/>
+              </w:rPr>
+              <w:t>Workflow</w:t>
+            </w:r>
+          </w:p>
+        </w:tc>
+        <w:tc>
+          <w:tcPr>
+            <w:tcW w:type="dxa" w:w="1994"/>
+            <w:shd w:val="clear" w:color="auto" w:fill="1B2A41"/>
+          </w:tcPr>
+          <w:p>
+            <w:r>
+              <w:rPr>
+                <w:b/>
+                <w:color w:val="FFFFFF"/>
+                <w:sz w:val="17"/>
+              </w:rPr>
+            </w:r>
+            <w:r>
+              <w:rPr>
+                <w:b/>
+                <w:i w:val="0"/>
+                <w:color w:val="FFFFFF"/>
+                <w:sz w:val="17"/>
+              </w:rPr>
+              <w:t>What it decides</w:t>
+            </w:r>
+          </w:p>
+        </w:tc>
+        <w:tc>
+          <w:tcPr>
+            <w:tcW w:type="dxa" w:w="1994"/>
+            <w:shd w:val="clear" w:color="auto" w:fill="1B2A41"/>
+          </w:tcPr>
+          <w:p>
+            <w:r>
+              <w:rPr>
+                <w:b/>
+                <w:color w:val="FFFFFF"/>
+                <w:sz w:val="17"/>
+              </w:rPr>
+            </w:r>
+            <w:r>
+              <w:rPr>
+                <w:b/>
+                <w:i w:val="0"/>
+                <w:color w:val="FFFFFF"/>
+                <w:sz w:val="17"/>
+              </w:rPr>
+              <w:t>Today</w:t>
+            </w:r>
+          </w:p>
+        </w:tc>
+        <w:tc>
+          <w:tcPr>
+            <w:tcW w:type="dxa" w:w="1994"/>
+            <w:shd w:val="clear" w:color="auto" w:fill="1B2A41"/>
+          </w:tcPr>
+          <w:p>
+            <w:r>
+              <w:rPr>
+                <w:b/>
+                <w:color w:val="FFFFFF"/>
+                <w:sz w:val="17"/>
+              </w:rPr>
+            </w:r>
+            <w:r>
+              <w:rPr>
+                <w:b/>
+                <w:i w:val="0"/>
+                <w:color w:val="FFFFFF"/>
+                <w:sz w:val="17"/>
+              </w:rPr>
+              <w:t>What changes</w:t>
+            </w:r>
+          </w:p>
+        </w:tc>
+        <w:tc>
+          <w:tcPr>
+            <w:tcW w:type="dxa" w:w="1994"/>
+            <w:shd w:val="clear" w:color="auto" w:fill="1B2A41"/>
+          </w:tcPr>
+          <w:p>
+            <w:r>
+              <w:rPr>
+                <w:b/>
+                <w:color w:val="FFFFFF"/>
+                <w:sz w:val="17"/>
+              </w:rPr>
+            </w:r>
+            <w:r>
+              <w:rPr>
+                <w:b/>
+                <w:i w:val="0"/>
+                <w:color w:val="FFFFFF"/>
+                <w:sz w:val="17"/>
+              </w:rPr>
+              <w:t>Evidence required to approve</w:t>
+            </w:r>
+          </w:p>
+        </w:tc>
+      </w:tr>
+      <w:tr>
+        <w:trPr>
+          <w:cantSplit/>
+        </w:trPr>
+        <w:tc>
+          <w:tcPr>
+            <w:tcW w:type="dxa" w:w="1994"/>
+          </w:tcPr>
+          <w:p>
+            <w:r>
+              <w:rPr>
+                <w:b w:val="0"/>
+                <w:sz w:val="17"/>
+              </w:rPr>
+            </w:r>
+            <w:r>
+              <w:rPr>
+                <w:b w:val="0"/>
+                <w:i w:val="0"/>
+                <w:sz w:val="17"/>
+              </w:rPr>
+              <w:t>Schedule approval</w:t>
+            </w:r>
+          </w:p>
+        </w:tc>
+        <w:tc>
+          <w:tcPr>
+            <w:tcW w:type="dxa" w:w="1994"/>
+          </w:tcPr>
+          <w:p>
+            <w:r>
+              <w:rPr>
+                <w:b w:val="0"/>
+                <w:sz w:val="17"/>
+              </w:rPr>
+            </w:r>
+            <w:r>
+              <w:rPr>
+                <w:b w:val="0"/>
+                <w:i w:val="0"/>
+                <w:sz w:val="17"/>
+              </w:rPr>
+              <w:t>A loan's contractual schedule for the EIR</w:t>
+            </w:r>
+          </w:p>
+        </w:tc>
+        <w:tc>
+          <w:tcPr>
+            <w:tcW w:type="dxa" w:w="1994"/>
+          </w:tcPr>
+          <w:p>
+            <w:r>
+              <w:rPr>
+                <w:b w:val="0"/>
+                <w:sz w:val="17"/>
+              </w:rPr>
+            </w:r>
+            <w:r>
+              <w:rPr>
+                <w:b w:val="0"/>
+                <w:i w:val="0"/>
+                <w:sz w:val="17"/>
+              </w:rPr>
+              <w:t>Approve; the preparer cannot approve; logged</w:t>
+            </w:r>
+          </w:p>
+        </w:tc>
+        <w:tc>
+          <w:tcPr>
+            <w:tcW w:type="dxa" w:w="1994"/>
+          </w:tcPr>
+          <w:p>
+            <w:r>
+              <w:rPr>
+                <w:b w:val="0"/>
+                <w:sz w:val="17"/>
+              </w:rPr>
+            </w:r>
+            <w:r>
+              <w:rPr>
+                <w:b w:val="0"/>
+                <w:i w:val="0"/>
+                <w:sz w:val="17"/>
+              </w:rPr>
+              <w:t>Reject with a reason; documents; history</w:t>
+            </w:r>
+          </w:p>
+        </w:tc>
+        <w:tc>
+          <w:tcPr>
+            <w:tcW w:type="dxa" w:w="1994"/>
+          </w:tcPr>
+          <w:p>
+            <w:r>
+              <w:rPr>
+                <w:b w:val="0"/>
+                <w:sz w:val="17"/>
+              </w:rPr>
+            </w:r>
+            <w:r>
+              <w:rPr>
+                <w:b w:val="0"/>
+                <w:i w:val="0"/>
+                <w:sz w:val="17"/>
+              </w:rPr>
+              <w:t>No</w:t>
+            </w:r>
+          </w:p>
+        </w:tc>
+      </w:tr>
+      <w:tr>
+        <w:trPr>
+          <w:cantSplit/>
+        </w:trPr>
+        <w:tc>
+          <w:tcPr>
+            <w:tcW w:type="dxa" w:w="1994"/>
+          </w:tcPr>
+          <w:p>
+            <w:r>
+              <w:rPr>
+                <w:b w:val="0"/>
+                <w:sz w:val="17"/>
+              </w:rPr>
+            </w:r>
+            <w:r>
+              <w:rPr>
+                <w:b w:val="0"/>
+                <w:i w:val="0"/>
+                <w:sz w:val="17"/>
+              </w:rPr>
+              <w:t>EIR lock and reopen</w:t>
+            </w:r>
+          </w:p>
+        </w:tc>
+        <w:tc>
+          <w:tcPr>
+            <w:tcW w:type="dxa" w:w="1994"/>
+          </w:tcPr>
+          <w:p>
+            <w:r>
+              <w:rPr>
+                <w:b w:val="0"/>
+                <w:sz w:val="17"/>
+              </w:rPr>
+            </w:r>
+            <w:r>
+              <w:rPr>
+                <w:b w:val="0"/>
+                <w:i w:val="0"/>
+                <w:sz w:val="17"/>
+              </w:rPr>
+              <w:t>Fixing a loan's EIR; reopening it</w:t>
+            </w:r>
+          </w:p>
+        </w:tc>
+        <w:tc>
+          <w:tcPr>
+            <w:tcW w:type="dxa" w:w="1994"/>
+          </w:tcPr>
+          <w:p>
+            <w:r>
+              <w:rPr>
+                <w:b w:val="0"/>
+                <w:sz w:val="17"/>
+              </w:rPr>
+            </w:r>
+            <w:r>
+              <w:rPr>
+                <w:b w:val="0"/>
+                <w:i w:val="0"/>
+                <w:sz w:val="17"/>
+              </w:rPr>
+              <w:t>Lock with the second-person rule or the governed override; reopen by request, approved or rejected; logged</w:t>
+            </w:r>
+          </w:p>
+        </w:tc>
+        <w:tc>
+          <w:tcPr>
+            <w:tcW w:type="dxa" w:w="1994"/>
+          </w:tcPr>
+          <w:p>
+            <w:r>
+              <w:rPr>
+                <w:b w:val="0"/>
+                <w:sz w:val="17"/>
+              </w:rPr>
+            </w:r>
+            <w:r>
+              <w:rPr>
+                <w:b w:val="0"/>
+                <w:i w:val="0"/>
+                <w:sz w:val="17"/>
+              </w:rPr>
+              <w:t>The lock written to the audit log by the service itself, not only by the screen; documents on a reopen; history</w:t>
+            </w:r>
+          </w:p>
+        </w:tc>
+        <w:tc>
+          <w:tcPr>
+            <w:tcW w:type="dxa" w:w="1994"/>
+          </w:tcPr>
+          <w:p>
+            <w:r>
+              <w:rPr>
+                <w:b w:val="0"/>
+                <w:sz w:val="17"/>
+              </w:rPr>
+            </w:r>
+            <w:r>
+              <w:rPr>
+                <w:b w:val="0"/>
+                <w:i w:val="0"/>
+                <w:sz w:val="17"/>
+              </w:rPr>
+              <w:t>Yes, for a reopen: the reason it was wrong</w:t>
+            </w:r>
+          </w:p>
+        </w:tc>
+      </w:tr>
+      <w:tr>
+        <w:trPr>
+          <w:cantSplit/>
+        </w:trPr>
+        <w:tc>
+          <w:tcPr>
+            <w:tcW w:type="dxa" w:w="1994"/>
+          </w:tcPr>
+          <w:p>
+            <w:r>
+              <w:rPr>
+                <w:b w:val="0"/>
+                <w:sz w:val="17"/>
+              </w:rPr>
+            </w:r>
+            <w:r>
+              <w:rPr>
+                <w:b w:val="0"/>
+                <w:i w:val="0"/>
+                <w:sz w:val="17"/>
+              </w:rPr>
+              <w:t>Restructure register</w:t>
+            </w:r>
+          </w:p>
+        </w:tc>
+        <w:tc>
+          <w:tcPr>
+            <w:tcW w:type="dxa" w:w="1994"/>
+          </w:tcPr>
+          <w:p>
+            <w:r>
+              <w:rPr>
+                <w:b w:val="0"/>
+                <w:sz w:val="17"/>
+              </w:rPr>
+            </w:r>
+            <w:r>
+              <w:rPr>
+                <w:b w:val="0"/>
+                <w:i w:val="0"/>
+                <w:sz w:val="17"/>
+              </w:rPr>
+              <w:t>A confirmed restructure and its modification accounting</w:t>
+            </w:r>
+          </w:p>
+        </w:tc>
+        <w:tc>
+          <w:tcPr>
+            <w:tcW w:type="dxa" w:w="1994"/>
+          </w:tcPr>
+          <w:p>
+            <w:r>
+              <w:rPr>
+                <w:b w:val="0"/>
+                <w:sz w:val="17"/>
+              </w:rPr>
+            </w:r>
+            <w:r>
+              <w:rPr>
+                <w:b w:val="0"/>
+                <w:i w:val="0"/>
+                <w:sz w:val="17"/>
+              </w:rPr>
+              <w:t>Propose, approve; second person; logged</w:t>
+            </w:r>
+          </w:p>
+        </w:tc>
+        <w:tc>
+          <w:tcPr>
+            <w:tcW w:type="dxa" w:w="1994"/>
+          </w:tcPr>
+          <w:p>
+            <w:r>
+              <w:rPr>
+                <w:b w:val="0"/>
+                <w:sz w:val="17"/>
+              </w:rPr>
+            </w:r>
+            <w:r>
+              <w:rPr>
+                <w:b w:val="0"/>
+                <w:i w:val="0"/>
+                <w:sz w:val="17"/>
+              </w:rPr>
+              <w:t>Reject and withdraw; documents; history</w:t>
+            </w:r>
+          </w:p>
+        </w:tc>
+        <w:tc>
+          <w:tcPr>
+            <w:tcW w:type="dxa" w:w="1994"/>
+          </w:tcPr>
+          <w:p>
+            <w:r>
+              <w:rPr>
+                <w:b w:val="0"/>
+                <w:sz w:val="17"/>
+              </w:rPr>
+            </w:r>
+            <w:r>
+              <w:rPr>
+                <w:b w:val="0"/>
+                <w:i w:val="0"/>
+                <w:sz w:val="17"/>
+              </w:rPr>
+              <w:t xml:space="preserve">Yes: </w:t>
+            </w:r>
+            <w:r>
+              <w:rPr>
+                <w:b/>
+                <w:i w:val="0"/>
+                <w:sz w:val="17"/>
+              </w:rPr>
+              <w:t>the Board approval the directive requires for a restructure (s.16(1))</w:t>
+            </w:r>
+          </w:p>
+        </w:tc>
+      </w:tr>
+      <w:tr>
+        <w:trPr>
+          <w:cantSplit/>
+        </w:trPr>
+        <w:tc>
+          <w:tcPr>
+            <w:tcW w:type="dxa" w:w="1994"/>
+          </w:tcPr>
+          <w:p>
+            <w:r>
+              <w:rPr>
+                <w:b w:val="0"/>
+                <w:sz w:val="17"/>
+              </w:rPr>
+            </w:r>
+            <w:r>
+              <w:rPr>
+                <w:b w:val="0"/>
+                <w:i w:val="0"/>
+                <w:sz w:val="17"/>
+              </w:rPr>
+              <w:t>Rate resets</w:t>
+            </w:r>
+          </w:p>
+        </w:tc>
+        <w:tc>
+          <w:tcPr>
+            <w:tcW w:type="dxa" w:w="1994"/>
+          </w:tcPr>
+          <w:p>
+            <w:r>
+              <w:rPr>
+                <w:b w:val="0"/>
+                <w:sz w:val="17"/>
+              </w:rPr>
+            </w:r>
+            <w:r>
+              <w:rPr>
+                <w:b w:val="0"/>
+                <w:i w:val="0"/>
+                <w:sz w:val="17"/>
+              </w:rPr>
+              <w:t>A floating-rate reset event</w:t>
+            </w:r>
+          </w:p>
+        </w:tc>
+        <w:tc>
+          <w:tcPr>
+            <w:tcW w:type="dxa" w:w="1994"/>
+          </w:tcPr>
+          <w:p>
+            <w:r>
+              <w:rPr>
+                <w:b w:val="0"/>
+                <w:sz w:val="17"/>
+              </w:rPr>
+            </w:r>
+            <w:r>
+              <w:rPr>
+                <w:b w:val="0"/>
+                <w:i w:val="0"/>
+                <w:sz w:val="17"/>
+              </w:rPr>
+              <w:t>Propose, approve; second person; logged</w:t>
+            </w:r>
+          </w:p>
+        </w:tc>
+        <w:tc>
+          <w:tcPr>
+            <w:tcW w:type="dxa" w:w="1994"/>
+          </w:tcPr>
+          <w:p>
+            <w:r>
+              <w:rPr>
+                <w:b w:val="0"/>
+                <w:sz w:val="17"/>
+              </w:rPr>
+            </w:r>
+            <w:r>
+              <w:rPr>
+                <w:b w:val="0"/>
+                <w:i w:val="0"/>
+                <w:sz w:val="17"/>
+              </w:rPr>
+              <w:t>Reject and withdraw; documents; history</w:t>
+            </w:r>
+          </w:p>
+        </w:tc>
+        <w:tc>
+          <w:tcPr>
+            <w:tcW w:type="dxa" w:w="1994"/>
+          </w:tcPr>
+          <w:p>
+            <w:r>
+              <w:rPr>
+                <w:b w:val="0"/>
+                <w:sz w:val="17"/>
+              </w:rPr>
+            </w:r>
+            <w:r>
+              <w:rPr>
+                <w:b w:val="0"/>
+                <w:i w:val="0"/>
+                <w:sz w:val="17"/>
+              </w:rPr>
+              <w:t>Yes: the prime-rate notice or the agreement</w:t>
+            </w:r>
+          </w:p>
+        </w:tc>
+      </w:tr>
+      <w:tr>
+        <w:trPr>
+          <w:cantSplit/>
+        </w:trPr>
+        <w:tc>
+          <w:tcPr>
+            <w:tcW w:type="dxa" w:w="1994"/>
+          </w:tcPr>
+          <w:p>
+            <w:r>
+              <w:rPr>
+                <w:b w:val="0"/>
+                <w:sz w:val="17"/>
+              </w:rPr>
+            </w:r>
+            <w:r>
+              <w:rPr>
+                <w:b w:val="0"/>
+                <w:i w:val="0"/>
+                <w:sz w:val="17"/>
+              </w:rPr>
+              <w:t>Write-off register</w:t>
+            </w:r>
+          </w:p>
+        </w:tc>
+        <w:tc>
+          <w:tcPr>
+            <w:tcW w:type="dxa" w:w="1994"/>
+          </w:tcPr>
+          <w:p>
+            <w:r>
+              <w:rPr>
+                <w:b w:val="0"/>
+                <w:sz w:val="17"/>
+              </w:rPr>
+            </w:r>
+            <w:r>
+              <w:rPr>
+                <w:b w:val="0"/>
+                <w:i w:val="0"/>
+                <w:sz w:val="17"/>
+              </w:rPr>
+              <w:t>Writing a loan off</w:t>
+            </w:r>
+          </w:p>
+        </w:tc>
+        <w:tc>
+          <w:tcPr>
+            <w:tcW w:type="dxa" w:w="1994"/>
+          </w:tcPr>
+          <w:p>
+            <w:r>
+              <w:rPr>
+                <w:b w:val="0"/>
+                <w:sz w:val="17"/>
+              </w:rPr>
+            </w:r>
+            <w:r>
+              <w:rPr>
+                <w:b w:val="0"/>
+                <w:i w:val="0"/>
+                <w:sz w:val="17"/>
+              </w:rPr>
+              <w:t>Propose, approve, reject; second person; logged</w:t>
+            </w:r>
+          </w:p>
+        </w:tc>
+        <w:tc>
+          <w:tcPr>
+            <w:tcW w:type="dxa" w:w="1994"/>
+          </w:tcPr>
+          <w:p>
+            <w:r>
+              <w:rPr>
+                <w:b w:val="0"/>
+                <w:sz w:val="17"/>
+              </w:rPr>
+            </w:r>
+            <w:r>
+              <w:rPr>
+                <w:b w:val="0"/>
+                <w:i w:val="0"/>
+                <w:sz w:val="17"/>
+              </w:rPr>
+              <w:t>Withdraw; documents; history</w:t>
+            </w:r>
+          </w:p>
+        </w:tc>
+        <w:tc>
+          <w:tcPr>
+            <w:tcW w:type="dxa" w:w="1994"/>
+          </w:tcPr>
+          <w:p>
+            <w:r>
+              <w:rPr>
+                <w:b w:val="0"/>
+                <w:sz w:val="17"/>
+              </w:rPr>
+            </w:r>
+            <w:r>
+              <w:rPr>
+                <w:b w:val="0"/>
+                <w:i w:val="0"/>
+                <w:sz w:val="17"/>
+              </w:rPr>
+              <w:t>Yes: the write-off approval under MAIIC's credit policy</w:t>
+            </w:r>
+          </w:p>
+        </w:tc>
+      </w:tr>
+      <w:tr>
+        <w:trPr>
+          <w:cantSplit/>
+        </w:trPr>
+        <w:tc>
+          <w:tcPr>
+            <w:tcW w:type="dxa" w:w="1994"/>
+          </w:tcPr>
+          <w:p>
+            <w:r>
+              <w:rPr>
+                <w:b w:val="0"/>
+                <w:sz w:val="17"/>
+              </w:rPr>
+            </w:r>
+            <w:r>
+              <w:rPr>
+                <w:b w:val="0"/>
+                <w:i w:val="0"/>
+                <w:sz w:val="17"/>
+              </w:rPr>
+              <w:t>Take-on build</w:t>
+            </w:r>
+          </w:p>
+        </w:tc>
+        <w:tc>
+          <w:tcPr>
+            <w:tcW w:type="dxa" w:w="1994"/>
+          </w:tcPr>
+          <w:p>
+            <w:r>
+              <w:rPr>
+                <w:b w:val="0"/>
+                <w:sz w:val="17"/>
+              </w:rPr>
+            </w:r>
+            <w:r>
+              <w:rPr>
+                <w:b w:val="0"/>
+                <w:i w:val="0"/>
+                <w:sz w:val="17"/>
+              </w:rPr>
+              <w:t>Building the take-on loans from Finance's workbook</w:t>
+            </w:r>
+          </w:p>
+        </w:tc>
+        <w:tc>
+          <w:tcPr>
+            <w:tcW w:type="dxa" w:w="1994"/>
+          </w:tcPr>
+          <w:p>
+            <w:r>
+              <w:rPr>
+                <w:b w:val="0"/>
+                <w:sz w:val="17"/>
+              </w:rPr>
+            </w:r>
+            <w:r>
+              <w:rPr>
+                <w:b w:val="0"/>
+                <w:i w:val="0"/>
+                <w:sz w:val="17"/>
+              </w:rPr>
+              <w:t>Propose, approve; second person; logged</w:t>
+            </w:r>
+          </w:p>
+        </w:tc>
+        <w:tc>
+          <w:tcPr>
+            <w:tcW w:type="dxa" w:w="1994"/>
+          </w:tcPr>
+          <w:p>
+            <w:r>
+              <w:rPr>
+                <w:b w:val="0"/>
+                <w:sz w:val="17"/>
+              </w:rPr>
+            </w:r>
+            <w:r>
+              <w:rPr>
+                <w:b w:val="0"/>
+                <w:i w:val="0"/>
+                <w:sz w:val="17"/>
+              </w:rPr>
+              <w:t>Reject and withdraw; documents (the returned workbook is attached); history</w:t>
+            </w:r>
+          </w:p>
+        </w:tc>
+        <w:tc>
+          <w:tcPr>
+            <w:tcW w:type="dxa" w:w="1994"/>
+          </w:tcPr>
+          <w:p>
+            <w:r>
+              <w:rPr>
+                <w:b w:val="0"/>
+                <w:sz w:val="17"/>
+              </w:rPr>
+            </w:r>
+            <w:r>
+              <w:rPr>
+                <w:b w:val="0"/>
+                <w:i w:val="0"/>
+                <w:sz w:val="17"/>
+              </w:rPr>
+              <w:t>Yes: the workbook version used</w:t>
+            </w:r>
+          </w:p>
+        </w:tc>
+      </w:tr>
+    </w:tbl>
+    <w:p/>
+    <w:p>
+      <w:pPr>
+        <w:spacing w:after="120"/>
+        <w:jc w:val="both"/>
+      </w:pPr>
+      <w:r>
+        <w:rPr>
+          <w:b/>
+          <w:i w:val="0"/>
+        </w:rPr>
+        <w:t>Month-end controls and sign-offs</w:t>
+      </w:r>
+    </w:p>
+    <w:tbl>
+      <w:tblPr>
+        <w:tblStyle w:val="TableGrid"/>
+        <w:tblW w:type="auto" w:w="0"/>
+        <w:tblLook w:firstColumn="1" w:firstRow="1" w:lastColumn="0" w:lastRow="0" w:noHBand="0" w:noVBand="1" w:val="04A0"/>
+      </w:tblPr>
+      <w:tblGrid>
+        <w:gridCol w:w="1994"/>
+        <w:gridCol w:w="1994"/>
+        <w:gridCol w:w="1994"/>
+        <w:gridCol w:w="1994"/>
+        <w:gridCol w:w="1994"/>
+      </w:tblGrid>
+      <w:tr>
+        <w:trPr>
+          <w:cantSplit/>
+          <w:tblHeader/>
+        </w:trPr>
+        <w:tc>
+          <w:tcPr>
+            <w:tcW w:type="dxa" w:w="1994"/>
+            <w:shd w:val="clear" w:color="auto" w:fill="1B2A41"/>
+          </w:tcPr>
+          <w:p>
+            <w:r>
+              <w:rPr>
+                <w:b/>
+                <w:color w:val="FFFFFF"/>
+                <w:sz w:val="17"/>
+              </w:rPr>
+            </w:r>
+            <w:r>
+              <w:rPr>
+                <w:b/>
+                <w:i w:val="0"/>
+                <w:color w:val="FFFFFF"/>
+                <w:sz w:val="17"/>
+              </w:rPr>
+              <w:t>Workflow</w:t>
+            </w:r>
+          </w:p>
+        </w:tc>
+        <w:tc>
+          <w:tcPr>
+            <w:tcW w:type="dxa" w:w="1994"/>
+            <w:shd w:val="clear" w:color="auto" w:fill="1B2A41"/>
+          </w:tcPr>
+          <w:p>
+            <w:r>
+              <w:rPr>
+                <w:b/>
+                <w:color w:val="FFFFFF"/>
+                <w:sz w:val="17"/>
+              </w:rPr>
+            </w:r>
+            <w:r>
+              <w:rPr>
+                <w:b/>
+                <w:i w:val="0"/>
+                <w:color w:val="FFFFFF"/>
+                <w:sz w:val="17"/>
+              </w:rPr>
+              <w:t>What it decides</w:t>
+            </w:r>
+          </w:p>
+        </w:tc>
+        <w:tc>
+          <w:tcPr>
+            <w:tcW w:type="dxa" w:w="1994"/>
+            <w:shd w:val="clear" w:color="auto" w:fill="1B2A41"/>
+          </w:tcPr>
+          <w:p>
+            <w:r>
+              <w:rPr>
+                <w:b/>
+                <w:color w:val="FFFFFF"/>
+                <w:sz w:val="17"/>
+              </w:rPr>
+            </w:r>
+            <w:r>
+              <w:rPr>
+                <w:b/>
+                <w:i w:val="0"/>
+                <w:color w:val="FFFFFF"/>
+                <w:sz w:val="17"/>
+              </w:rPr>
+              <w:t>Today</w:t>
+            </w:r>
+          </w:p>
+        </w:tc>
+        <w:tc>
+          <w:tcPr>
+            <w:tcW w:type="dxa" w:w="1994"/>
+            <w:shd w:val="clear" w:color="auto" w:fill="1B2A41"/>
+          </w:tcPr>
+          <w:p>
+            <w:r>
+              <w:rPr>
+                <w:b/>
+                <w:color w:val="FFFFFF"/>
+                <w:sz w:val="17"/>
+              </w:rPr>
+            </w:r>
+            <w:r>
+              <w:rPr>
+                <w:b/>
+                <w:i w:val="0"/>
+                <w:color w:val="FFFFFF"/>
+                <w:sz w:val="17"/>
+              </w:rPr>
+              <w:t>What changes</w:t>
+            </w:r>
+          </w:p>
+        </w:tc>
+        <w:tc>
+          <w:tcPr>
+            <w:tcW w:type="dxa" w:w="1994"/>
+            <w:shd w:val="clear" w:color="auto" w:fill="1B2A41"/>
+          </w:tcPr>
+          <w:p>
+            <w:r>
+              <w:rPr>
+                <w:b/>
+                <w:color w:val="FFFFFF"/>
+                <w:sz w:val="17"/>
+              </w:rPr>
+            </w:r>
+            <w:r>
+              <w:rPr>
+                <w:b/>
+                <w:i w:val="0"/>
+                <w:color w:val="FFFFFF"/>
+                <w:sz w:val="17"/>
+              </w:rPr>
+              <w:t>Evidence required to approve</w:t>
+            </w:r>
+          </w:p>
+        </w:tc>
+      </w:tr>
+      <w:tr>
+        <w:trPr>
+          <w:cantSplit/>
+        </w:trPr>
+        <w:tc>
+          <w:tcPr>
+            <w:tcW w:type="dxa" w:w="1994"/>
+          </w:tcPr>
+          <w:p>
+            <w:r>
+              <w:rPr>
+                <w:b w:val="0"/>
+                <w:sz w:val="17"/>
+              </w:rPr>
+            </w:r>
+            <w:r>
+              <w:rPr>
+                <w:b w:val="0"/>
+                <w:i w:val="0"/>
+                <w:sz w:val="17"/>
+              </w:rPr>
+              <w:t>Loan book build</w:t>
+            </w:r>
+          </w:p>
+        </w:tc>
+        <w:tc>
+          <w:tcPr>
+            <w:tcW w:type="dxa" w:w="1994"/>
+          </w:tcPr>
+          <w:p>
+            <w:r>
+              <w:rPr>
+                <w:b w:val="0"/>
+                <w:sz w:val="17"/>
+              </w:rPr>
+            </w:r>
+            <w:r>
+              <w:rPr>
+                <w:b w:val="0"/>
+                <w:i w:val="0"/>
+                <w:sz w:val="17"/>
+              </w:rPr>
+              <w:t>Accepting a month's built loan book</w:t>
+            </w:r>
+          </w:p>
+        </w:tc>
+        <w:tc>
+          <w:tcPr>
+            <w:tcW w:type="dxa" w:w="1994"/>
+          </w:tcPr>
+          <w:p>
+            <w:r>
+              <w:rPr>
+                <w:b w:val="0"/>
+                <w:sz w:val="17"/>
+              </w:rPr>
+            </w:r>
+            <w:r>
+              <w:rPr>
+                <w:b w:val="0"/>
+                <w:i w:val="0"/>
+                <w:sz w:val="17"/>
+              </w:rPr>
+              <w:t>Approve, reject; logged</w:t>
+            </w:r>
+          </w:p>
+        </w:tc>
+        <w:tc>
+          <w:tcPr>
+            <w:tcW w:type="dxa" w:w="1994"/>
+          </w:tcPr>
+          <w:p>
+            <w:r>
+              <w:rPr>
+                <w:b w:val="0"/>
+                <w:sz w:val="17"/>
+              </w:rPr>
+            </w:r>
+            <w:r>
+              <w:rPr>
+                <w:b w:val="0"/>
+                <w:i w:val="0"/>
+                <w:sz w:val="17"/>
+              </w:rPr>
+              <w:t>Documents; history</w:t>
+            </w:r>
+          </w:p>
+        </w:tc>
+        <w:tc>
+          <w:tcPr>
+            <w:tcW w:type="dxa" w:w="1994"/>
+          </w:tcPr>
+          <w:p>
+            <w:r>
+              <w:rPr>
+                <w:b w:val="0"/>
+                <w:sz w:val="17"/>
+              </w:rPr>
+            </w:r>
+            <w:r>
+              <w:rPr>
+                <w:b w:val="0"/>
+                <w:i w:val="0"/>
+                <w:sz w:val="17"/>
+              </w:rPr>
+              <w:t>No</w:t>
+            </w:r>
+          </w:p>
+        </w:tc>
+      </w:tr>
+      <w:tr>
+        <w:trPr>
+          <w:cantSplit/>
+        </w:trPr>
+        <w:tc>
+          <w:tcPr>
+            <w:tcW w:type="dxa" w:w="1994"/>
+          </w:tcPr>
+          <w:p>
+            <w:r>
+              <w:rPr>
+                <w:b w:val="0"/>
+                <w:sz w:val="17"/>
+              </w:rPr>
+            </w:r>
+            <w:r>
+              <w:rPr>
+                <w:b w:val="0"/>
+                <w:i w:val="0"/>
+                <w:sz w:val="17"/>
+              </w:rPr>
+              <w:t>Period lock and unlock</w:t>
+            </w:r>
+          </w:p>
+        </w:tc>
+        <w:tc>
+          <w:tcPr>
+            <w:tcW w:type="dxa" w:w="1994"/>
+          </w:tcPr>
+          <w:p>
+            <w:r>
+              <w:rPr>
+                <w:b w:val="0"/>
+                <w:sz w:val="17"/>
+              </w:rPr>
+            </w:r>
+            <w:r>
+              <w:rPr>
+                <w:b w:val="0"/>
+                <w:i w:val="0"/>
+                <w:sz w:val="17"/>
+              </w:rPr>
+              <w:t>Closing a month; reopening a closed one</w:t>
+            </w:r>
+          </w:p>
+        </w:tc>
+        <w:tc>
+          <w:tcPr>
+            <w:tcW w:type="dxa" w:w="1994"/>
+          </w:tcPr>
+          <w:p>
+            <w:r>
+              <w:rPr>
+                <w:b w:val="0"/>
+                <w:sz w:val="17"/>
+              </w:rPr>
+            </w:r>
+            <w:r>
+              <w:rPr>
+                <w:b w:val="0"/>
+                <w:i w:val="0"/>
+                <w:sz w:val="17"/>
+              </w:rPr>
+              <w:t>Lock; unlock by request, approved or rejected; second person; logged</w:t>
+            </w:r>
+          </w:p>
+        </w:tc>
+        <w:tc>
+          <w:tcPr>
+            <w:tcW w:type="dxa" w:w="1994"/>
+          </w:tcPr>
+          <w:p>
+            <w:r>
+              <w:rPr>
+                <w:b w:val="0"/>
+                <w:sz w:val="17"/>
+              </w:rPr>
+            </w:r>
+            <w:r>
+              <w:rPr>
+                <w:b w:val="0"/>
+                <w:i w:val="0"/>
+                <w:sz w:val="17"/>
+              </w:rPr>
+              <w:t>Documents on an unlock; history</w:t>
+            </w:r>
+          </w:p>
+        </w:tc>
+        <w:tc>
+          <w:tcPr>
+            <w:tcW w:type="dxa" w:w="1994"/>
+          </w:tcPr>
+          <w:p>
+            <w:r>
+              <w:rPr>
+                <w:b w:val="0"/>
+                <w:sz w:val="17"/>
+              </w:rPr>
+            </w:r>
+            <w:r>
+              <w:rPr>
+                <w:b w:val="0"/>
+                <w:i w:val="0"/>
+                <w:sz w:val="17"/>
+              </w:rPr>
+              <w:t>Yes, for an unlock: the reason and the approval to restate</w:t>
+            </w:r>
+          </w:p>
+        </w:tc>
+      </w:tr>
+      <w:tr>
+        <w:trPr>
+          <w:cantSplit/>
+        </w:trPr>
+        <w:tc>
+          <w:tcPr>
+            <w:tcW w:type="dxa" w:w="1994"/>
+          </w:tcPr>
+          <w:p>
+            <w:r>
+              <w:rPr>
+                <w:b w:val="0"/>
+                <w:sz w:val="17"/>
+              </w:rPr>
+            </w:r>
+            <w:r>
+              <w:rPr>
+                <w:b w:val="0"/>
+                <w:i w:val="0"/>
+                <w:sz w:val="17"/>
+              </w:rPr>
+              <w:t>Compliance audit sign-offs</w:t>
+            </w:r>
+          </w:p>
+        </w:tc>
+        <w:tc>
+          <w:tcPr>
+            <w:tcW w:type="dxa" w:w="1994"/>
+          </w:tcPr>
+          <w:p>
+            <w:r>
+              <w:rPr>
+                <w:b w:val="0"/>
+                <w:sz w:val="17"/>
+              </w:rPr>
+            </w:r>
+            <w:r>
+              <w:rPr>
+                <w:b w:val="0"/>
+                <w:i w:val="0"/>
+                <w:sz w:val="17"/>
+              </w:rPr>
+              <w:t>A reviewer's sign-off of an audit row</w:t>
+            </w:r>
+          </w:p>
+        </w:tc>
+        <w:tc>
+          <w:tcPr>
+            <w:tcW w:type="dxa" w:w="1994"/>
+          </w:tcPr>
+          <w:p>
+            <w:r>
+              <w:rPr>
+                <w:b w:val="0"/>
+                <w:sz w:val="17"/>
+              </w:rPr>
+            </w:r>
+            <w:r>
+              <w:rPr>
+                <w:b w:val="0"/>
+                <w:i w:val="0"/>
+                <w:sz w:val="17"/>
+              </w:rPr>
+              <w:t>Sign and approve; logged</w:t>
+            </w:r>
+          </w:p>
+        </w:tc>
+        <w:tc>
+          <w:tcPr>
+            <w:tcW w:type="dxa" w:w="1994"/>
+          </w:tcPr>
+          <w:p>
+            <w:r>
+              <w:rPr>
+                <w:b w:val="0"/>
+                <w:sz w:val="17"/>
+              </w:rPr>
+            </w:r>
+            <w:r>
+              <w:rPr>
+                <w:b w:val="0"/>
+                <w:i w:val="0"/>
+                <w:sz w:val="17"/>
+              </w:rPr>
+              <w:t>Reject with a reason; documents; history</w:t>
+            </w:r>
+          </w:p>
+        </w:tc>
+        <w:tc>
+          <w:tcPr>
+            <w:tcW w:type="dxa" w:w="1994"/>
+          </w:tcPr>
+          <w:p>
+            <w:r>
+              <w:rPr>
+                <w:b w:val="0"/>
+                <w:sz w:val="17"/>
+              </w:rPr>
+            </w:r>
+            <w:r>
+              <w:rPr>
+                <w:b w:val="0"/>
+                <w:i w:val="0"/>
+                <w:sz w:val="17"/>
+              </w:rPr>
+              <w:t>No</w:t>
+            </w:r>
+          </w:p>
+        </w:tc>
+      </w:tr>
+      <w:tr>
+        <w:trPr>
+          <w:cantSplit/>
+        </w:trPr>
+        <w:tc>
+          <w:tcPr>
+            <w:tcW w:type="dxa" w:w="1994"/>
+          </w:tcPr>
+          <w:p>
+            <w:r>
+              <w:rPr>
+                <w:b w:val="0"/>
+                <w:sz w:val="17"/>
+              </w:rPr>
+            </w:r>
+            <w:r>
+              <w:rPr>
+                <w:b w:val="0"/>
+                <w:i w:val="0"/>
+                <w:sz w:val="17"/>
+              </w:rPr>
+              <w:t>Macro data overrides</w:t>
+            </w:r>
+          </w:p>
+        </w:tc>
+        <w:tc>
+          <w:tcPr>
+            <w:tcW w:type="dxa" w:w="1994"/>
+          </w:tcPr>
+          <w:p>
+            <w:r>
+              <w:rPr>
+                <w:b w:val="0"/>
+                <w:sz w:val="17"/>
+              </w:rPr>
+            </w:r>
+            <w:r>
+              <w:rPr>
+                <w:b w:val="0"/>
+                <w:i w:val="0"/>
+                <w:sz w:val="17"/>
+              </w:rPr>
+              <w:t>A manual value replacing an imported one</w:t>
+            </w:r>
+          </w:p>
+        </w:tc>
+        <w:tc>
+          <w:tcPr>
+            <w:tcW w:type="dxa" w:w="1994"/>
+          </w:tcPr>
+          <w:p>
+            <w:r>
+              <w:rPr>
+                <w:b w:val="0"/>
+                <w:sz w:val="17"/>
+              </w:rPr>
+            </w:r>
+            <w:r>
+              <w:rPr>
+                <w:b w:val="0"/>
+                <w:i w:val="0"/>
+                <w:sz w:val="17"/>
+              </w:rPr>
+              <w:t>Entered with a reason; logged</w:t>
+            </w:r>
+          </w:p>
+        </w:tc>
+        <w:tc>
+          <w:tcPr>
+            <w:tcW w:type="dxa" w:w="1994"/>
+          </w:tcPr>
+          <w:p>
+            <w:r>
+              <w:rPr>
+                <w:b w:val="0"/>
+                <w:sz w:val="17"/>
+              </w:rPr>
+            </w:r>
+            <w:r>
+              <w:rPr>
+                <w:b w:val="0"/>
+                <w:i w:val="0"/>
+                <w:sz w:val="17"/>
+              </w:rPr>
+              <w:t>Second-person approval; documents; history</w:t>
+            </w:r>
+          </w:p>
+        </w:tc>
+        <w:tc>
+          <w:tcPr>
+            <w:tcW w:type="dxa" w:w="1994"/>
+          </w:tcPr>
+          <w:p>
+            <w:r>
+              <w:rPr>
+                <w:b w:val="0"/>
+                <w:sz w:val="17"/>
+              </w:rPr>
+            </w:r>
+            <w:r>
+              <w:rPr>
+                <w:b w:val="0"/>
+                <w:i w:val="0"/>
+                <w:sz w:val="17"/>
+              </w:rPr>
+              <w:t>Yes: the source of the value</w:t>
+            </w:r>
+          </w:p>
+        </w:tc>
+      </w:tr>
+    </w:tbl>
+    <w:p/>
+    <w:p>
+      <w:pPr>
+        <w:pStyle w:val="Heading3"/>
+      </w:pPr>
+      <w:r>
+        <w:t>8.7 One register of approvals</w:t>
+      </w:r>
+    </w:p>
+    <w:p>
+      <w:pPr>
+        <w:spacing w:after="120"/>
+        <w:jc w:val="both"/>
+      </w:pPr>
+      <w:r>
+        <w:rPr>
+          <w:b w:val="0"/>
+          <w:i w:val="0"/>
+        </w:rPr>
+        <w:t xml:space="preserve">The Governance Centre gains an </w:t>
+      </w:r>
+      <w:r>
+        <w:rPr>
+          <w:b/>
+          <w:i w:val="0"/>
+        </w:rPr>
+        <w:t>Approvals</w:t>
+      </w:r>
+      <w:r>
+        <w:rPr>
+          <w:b w:val="0"/>
+          <w:i w:val="0"/>
+        </w:rPr>
+        <w:t xml:space="preserve"> view across all of the above and the Centre's own settings: everything awaiting a decision, with who proposed it and when; and everything decided, with the decision, the reasons and the documents. It filters by workflow, person, status and date, exports to PDF and Excel, and is included in the auditor's pack. One shared document store serves every workflow, so a minute attached once can be linked to the several decisions it covers.</w:t>
+      </w:r>
+    </w:p>
+    <w:p>
+      <w:pPr>
         <w:pStyle w:val="Heading2"/>
       </w:pPr>
       <w:r>
@@ -6550,6 +9094,184 @@
                 <w:sz w:val="17"/>
               </w:rPr>
               <w:t>Users holding the governance permission, and the auditors through the auditor's pack</w:t>
+            </w:r>
+          </w:p>
+        </w:tc>
+      </w:tr>
+      <w:tr>
+        <w:trPr>
+          <w:cantSplit/>
+        </w:trPr>
+        <w:tc>
+          <w:tcPr>
+            <w:tcW w:type="dxa" w:w="2493"/>
+          </w:tcPr>
+          <w:p>
+            <w:r>
+              <w:rPr>
+                <w:b w:val="0"/>
+                <w:sz w:val="17"/>
+              </w:rPr>
+            </w:r>
+            <w:r>
+              <w:rPr>
+                <w:b w:val="0"/>
+                <w:i w:val="0"/>
+                <w:sz w:val="17"/>
+              </w:rPr>
+              <w:t>S8</w:t>
+            </w:r>
+          </w:p>
+        </w:tc>
+        <w:tc>
+          <w:tcPr>
+            <w:tcW w:type="dxa" w:w="2493"/>
+          </w:tcPr>
+          <w:p>
+            <w:r>
+              <w:rPr>
+                <w:b w:val="0"/>
+                <w:sz w:val="17"/>
+              </w:rPr>
+            </w:r>
+            <w:r>
+              <w:rPr>
+                <w:b w:val="0"/>
+                <w:i w:val="0"/>
+                <w:sz w:val="17"/>
+              </w:rPr>
+              <w:t>Which other approvals require a supporting document (section 8.6)</w:t>
+            </w:r>
+          </w:p>
+        </w:tc>
+        <w:tc>
+          <w:tcPr>
+            <w:tcW w:type="dxa" w:w="2493"/>
+          </w:tcPr>
+          <w:p>
+            <w:r>
+              <w:rPr>
+                <w:b w:val="0"/>
+                <w:sz w:val="17"/>
+              </w:rPr>
+            </w:r>
+            <w:r>
+              <w:rPr>
+                <w:b w:val="0"/>
+                <w:i w:val="0"/>
+                <w:sz w:val="17"/>
+              </w:rPr>
+              <w:t>Dr Thom, with Finance and Credit</w:t>
+            </w:r>
+          </w:p>
+        </w:tc>
+        <w:tc>
+          <w:tcPr>
+            <w:tcW w:type="dxa" w:w="2493"/>
+          </w:tcPr>
+          <w:p>
+            <w:r>
+              <w:rPr>
+                <w:b w:val="0"/>
+                <w:sz w:val="17"/>
+              </w:rPr>
+            </w:r>
+            <w:r>
+              <w:rPr>
+                <w:b w:val="0"/>
+                <w:i w:val="0"/>
+                <w:sz w:val="17"/>
+              </w:rPr>
+              <w:t>As marked in the tables of section 8.6</w:t>
+            </w:r>
+          </w:p>
+        </w:tc>
+      </w:tr>
+      <w:tr>
+        <w:trPr>
+          <w:cantSplit/>
+        </w:trPr>
+        <w:tc>
+          <w:tcPr>
+            <w:tcW w:type="dxa" w:w="2493"/>
+          </w:tcPr>
+          <w:p>
+            <w:r>
+              <w:rPr>
+                <w:b w:val="0"/>
+                <w:sz w:val="17"/>
+              </w:rPr>
+            </w:r>
+            <w:r>
+              <w:rPr>
+                <w:b w:val="0"/>
+                <w:i w:val="0"/>
+                <w:sz w:val="17"/>
+              </w:rPr>
+              <w:t>S9</w:t>
+            </w:r>
+          </w:p>
+        </w:tc>
+        <w:tc>
+          <w:tcPr>
+            <w:tcW w:type="dxa" w:w="2493"/>
+          </w:tcPr>
+          <w:p>
+            <w:r>
+              <w:rPr>
+                <w:b w:val="0"/>
+                <w:sz w:val="17"/>
+              </w:rPr>
+            </w:r>
+            <w:r>
+              <w:rPr>
+                <w:b w:val="0"/>
+                <w:i w:val="0"/>
+                <w:sz w:val="17"/>
+              </w:rPr>
+              <w:t>Whether a fee rule already approved by the person who wrote it must be approved again by a second person</w:t>
+            </w:r>
+          </w:p>
+        </w:tc>
+        <w:tc>
+          <w:tcPr>
+            <w:tcW w:type="dxa" w:w="2493"/>
+          </w:tcPr>
+          <w:p>
+            <w:r>
+              <w:rPr>
+                <w:b w:val="0"/>
+                <w:sz w:val="17"/>
+              </w:rPr>
+            </w:r>
+            <w:r>
+              <w:rPr>
+                <w:b w:val="0"/>
+                <w:i w:val="0"/>
+                <w:sz w:val="17"/>
+              </w:rPr>
+              <w:t>Dr Thom</w:t>
+            </w:r>
+          </w:p>
+        </w:tc>
+        <w:tc>
+          <w:tcPr>
+            <w:tcW w:type="dxa" w:w="2493"/>
+          </w:tcPr>
+          <w:p>
+            <w:r>
+              <w:rPr>
+                <w:b w:val="0"/>
+                <w:sz w:val="17"/>
+              </w:rPr>
+            </w:r>
+            <w:r>
+              <w:rPr>
+                <w:b w:val="0"/>
+                <w:i w:val="0"/>
+                <w:sz w:val="17"/>
+              </w:rPr>
+              <w:t>Yes: every rule the matcher uses is re-approved under maker-checker before the fee review starts</w:t>
             </w:r>
           </w:p>
         </w:tc>
@@ -6806,6 +9528,66 @@
     </w:p>
     <w:p>
       <w:pPr>
+        <w:pStyle w:val="ListNumber"/>
+        <w:jc w:val="both"/>
+      </w:pPr>
+      <w:r>
+        <w:rPr>
+          <w:b/>
+          <w:i w:val="0"/>
+        </w:rPr>
+        <w:t>Other approvals.</w:t>
+      </w:r>
+      <w:r>
+        <w:rPr>
+          <w:b w:val="0"/>
+          <w:i w:val="0"/>
+        </w:rPr>
+        <w:t xml:space="preserve"> Every workflow of section 8.6 records its proposal, decision (approve, reject or withdraw) and documents in the same log, and refuses approval without the evidence its table marks as required.</w:t>
+      </w:r>
+    </w:p>
+    <w:p>
+      <w:pPr>
+        <w:pStyle w:val="ListNumber"/>
+        <w:jc w:val="both"/>
+      </w:pPr>
+      <w:r>
+        <w:rPr>
+          <w:b/>
+          <w:i w:val="0"/>
+        </w:rPr>
+        <w:t>Fee rulebook control.</w:t>
+      </w:r>
+      <w:r>
+        <w:rPr>
+          <w:b w:val="0"/>
+          <w:i w:val="0"/>
+        </w:rPr>
+        <w:t xml:space="preserve"> The person who wrote or changed a fee rule cannot approve it; approval and switching a rule on or off need a reason and a second person; the matcher uses only rules approved that way.</w:t>
+      </w:r>
+    </w:p>
+    <w:p>
+      <w:pPr>
+        <w:pStyle w:val="ListNumber"/>
+        <w:jc w:val="both"/>
+      </w:pPr>
+      <w:r>
+        <w:rPr>
+          <w:b/>
+          <w:i w:val="0"/>
+        </w:rPr>
+        <w:t>Approvals register.</w:t>
+      </w:r>
+      <w:r>
+        <w:rPr>
+          <w:b w:val="0"/>
+          <w:i w:val="0"/>
+        </w:rPr>
+        <w:t xml:space="preserve"> The Approvals view lists every pending and decided item across all workflows and reconciles to the audit log.</w:t>
+      </w:r>
+    </w:p>
+    <w:p>
+      <w:pPr>
         <w:pStyle w:val="Heading2"/>
       </w:pPr>
       <w:r>
@@ -7130,7 +9912,7 @@
                 <w:i w:val="0"/>
                 <w:sz w:val="17"/>
               </w:rPr>
-              <w:t>The governance change log of section 8: reject and withdraw, the seeding entries, supporting documents on private storage with fingerprints, required evidence, the History view and export, the append-only guard and the chain check</w:t>
+              <w:t>The governance change log of sections 8.1 to 8.5: reject and withdraw, the seeding entries, supporting documents on private storage with fingerprints, required evidence, the History view and export, the append-only guard and the chain check</w:t>
             </w:r>
           </w:p>
         </w:tc>
@@ -7152,6 +9934,74 @@
                 <w:sz w:val="17"/>
               </w:rPr>
               <w:t>About 2 days</w:t>
+            </w:r>
+          </w:p>
+        </w:tc>
+      </w:tr>
+      <w:tr>
+        <w:trPr>
+          <w:cantSplit/>
+        </w:trPr>
+        <w:tc>
+          <w:tcPr>
+            <w:tcW w:type="dxa" w:w="3324"/>
+          </w:tcPr>
+          <w:p>
+            <w:r>
+              <w:rPr>
+                <w:b w:val="0"/>
+                <w:sz w:val="17"/>
+              </w:rPr>
+            </w:r>
+            <w:r>
+              <w:rPr>
+                <w:b w:val="0"/>
+                <w:i w:val="0"/>
+                <w:sz w:val="17"/>
+              </w:rPr>
+              <w:t>3a</w:t>
+            </w:r>
+          </w:p>
+        </w:tc>
+        <w:tc>
+          <w:tcPr>
+            <w:tcW w:type="dxa" w:w="3324"/>
+          </w:tcPr>
+          <w:p>
+            <w:r>
+              <w:rPr>
+                <w:b w:val="0"/>
+                <w:sz w:val="17"/>
+              </w:rPr>
+            </w:r>
+            <w:r>
+              <w:rPr>
+                <w:b w:val="0"/>
+                <w:i w:val="0"/>
+                <w:sz w:val="17"/>
+              </w:rPr>
+              <w:t>The other approvals of section 8.6 on the same log and document store, the fee rulebook's maker-checker first; the Approvals view of section 8.7</w:t>
+            </w:r>
+          </w:p>
+        </w:tc>
+        <w:tc>
+          <w:tcPr>
+            <w:tcW w:type="dxa" w:w="3324"/>
+          </w:tcPr>
+          <w:p>
+            <w:r>
+              <w:rPr>
+                <w:b w:val="0"/>
+                <w:sz w:val="17"/>
+              </w:rPr>
+            </w:r>
+            <w:r>
+              <w:rPr>
+                <w:b w:val="0"/>
+                <w:i w:val="0"/>
+                <w:sz w:val="17"/>
+              </w:rPr>
+              <w:t>About 2.5 days</w:t>
             </w:r>
           </w:p>
         </w:tc>

</xml_diff>

<commit_message>
Staging spec: section 8.8, the record of what each month ran on (run record with a frozen fingerprinted snapshot, run numbers on result rows, run of record at lock, no back-dating into locked months, Settings in force and What changed reports, re-performance); decision S10, acceptance 16 to 19, build step 3b
Co-Authored-By: Claude Opus 5.5 <noreply@anthropic.com>
</commit_message>
<xml_diff>
--- a/docs/MAIIC_Staging_Module_Specification_v1_2026-10-15.docx
+++ b/docs/MAIIC_Staging_Module_Specification_v1_2026-10-15.docx
@@ -8355,6 +8355,726 @@
     </w:p>
     <w:p>
       <w:pPr>
+        <w:pStyle w:val="Heading3"/>
+      </w:pPr>
+      <w:r>
+        <w:t>8.8 The record of what each month ran on</w:t>
+      </w:r>
+    </w:p>
+    <w:p>
+      <w:pPr>
+        <w:spacing w:after="120"/>
+        <w:jc w:val="both"/>
+      </w:pPr>
+      <w:r>
+        <w:rPr>
+          <w:b w:val="0"/>
+          <w:i w:val="0"/>
+        </w:rPr>
+        <w:t>An auditor looking at a month a year later needs to know exactly what that month's figures were computed with: which settings, rules, models, data and code. Today that can only be partly reconstructed:</w:t>
+      </w:r>
+    </w:p>
+    <w:p>
+      <w:pPr>
+        <w:pStyle w:val="ListBullet"/>
+        <w:jc w:val="both"/>
+      </w:pPr>
+      <w:r>
+        <w:rPr>
+          <w:b w:val="0"/>
+          <w:i w:val="0"/>
+        </w:rPr>
+        <w:t xml:space="preserve">The settings can be looked up by their effective dates, but </w:t>
+      </w:r>
+      <w:r>
+        <w:rPr>
+          <w:b/>
+          <w:i w:val="0"/>
+        </w:rPr>
+        <w:t>a setting can be back-dated into a locked month</w:t>
+      </w:r>
+      <w:r>
+        <w:rPr>
+          <w:b w:val="0"/>
+          <w:i w:val="0"/>
+        </w:rPr>
+        <w:t>. The only date rule is that a change must be later than the setting's last approved change, so a setting unchanged since installation could today be given an effective date of 1 March 2025. March 2025 stays locked and its figures do not move, but a lookup for March would now return the new value, not the one March ran on.</w:t>
+      </w:r>
+    </w:p>
+    <w:p>
+      <w:pPr>
+        <w:pStyle w:val="ListBullet"/>
+        <w:jc w:val="both"/>
+      </w:pPr>
+      <w:r>
+        <w:rPr>
+          <w:b w:val="0"/>
+          <w:i w:val="0"/>
+        </w:rPr>
+        <w:t xml:space="preserve">A month can be built and run several times before it is locked, and </w:t>
+      </w:r>
+      <w:r>
+        <w:rPr>
+          <w:b/>
+          <w:i w:val="0"/>
+        </w:rPr>
+        <w:t>nothing marks which run produced the reported figures</w:t>
+      </w:r>
+      <w:r>
+        <w:rPr>
+          <w:b w:val="0"/>
+          <w:i w:val="0"/>
+        </w:rPr>
+        <w:t>.</w:t>
+      </w:r>
+    </w:p>
+    <w:p>
+      <w:pPr>
+        <w:pStyle w:val="ListBullet"/>
+        <w:jc w:val="both"/>
+      </w:pPr>
+      <w:r>
+        <w:rPr>
+          <w:b w:val="0"/>
+          <w:i w:val="0"/>
+        </w:rPr>
+        <w:t>The figures also depend on inputs held outside the Governance Centre: the staging threshold rows, the approved fee rules, the scenario set, the overlays, the forward-looking model, the query versions, the data loads and the code. The loan book build records its data loads and the forward-looking module already snapshots its own inputs each month (</w:t>
+      </w:r>
+      <w:r>
+        <w:rPr>
+          <w:rFonts w:ascii="Consolas" w:hAnsi="Consolas"/>
+          <w:b w:val="0"/>
+          <w:i w:val="0"/>
+          <w:sz w:val="18"/>
+        </w:rPr>
+        <w:t>fli_run_snapshots</w:t>
+      </w:r>
+      <w:r>
+        <w:rPr>
+          <w:b w:val="0"/>
+          <w:i w:val="0"/>
+        </w:rPr>
+        <w:t>), but nothing brings them together.</w:t>
+      </w:r>
+    </w:p>
+    <w:p>
+      <w:pPr>
+        <w:spacing w:after="120"/>
+        <w:jc w:val="both"/>
+      </w:pPr>
+      <w:r>
+        <w:rPr>
+          <w:b w:val="0"/>
+          <w:i w:val="0"/>
+        </w:rPr>
+        <w:t>The following closes those gaps.</w:t>
+      </w:r>
+    </w:p>
+    <w:tbl>
+      <w:tblPr>
+        <w:tblStyle w:val="TableGrid"/>
+        <w:tblW w:type="auto" w:w="0"/>
+        <w:tblLook w:firstColumn="1" w:firstRow="1" w:lastColumn="0" w:lastRow="0" w:noHBand="0" w:noVBand="1" w:val="04A0"/>
+      </w:tblPr>
+      <w:tblGrid>
+        <w:gridCol w:w="3324"/>
+        <w:gridCol w:w="3324"/>
+        <w:gridCol w:w="3324"/>
+      </w:tblGrid>
+      <w:tr>
+        <w:trPr>
+          <w:cantSplit/>
+          <w:tblHeader/>
+        </w:trPr>
+        <w:tc>
+          <w:tcPr>
+            <w:tcW w:type="dxa" w:w="3324"/>
+            <w:shd w:val="clear" w:color="auto" w:fill="1B2A41"/>
+          </w:tcPr>
+          <w:p>
+            <w:r>
+              <w:rPr>
+                <w:b/>
+                <w:color w:val="FFFFFF"/>
+                <w:sz w:val="17"/>
+              </w:rPr>
+            </w:r>
+            <w:r>
+              <w:rPr>
+                <w:b/>
+                <w:i w:val="0"/>
+                <w:color w:val="FFFFFF"/>
+                <w:sz w:val="17"/>
+              </w:rPr>
+              <w:t>#</w:t>
+            </w:r>
+          </w:p>
+        </w:tc>
+        <w:tc>
+          <w:tcPr>
+            <w:tcW w:type="dxa" w:w="3324"/>
+            <w:shd w:val="clear" w:color="auto" w:fill="1B2A41"/>
+          </w:tcPr>
+          <w:p>
+            <w:r>
+              <w:rPr>
+                <w:b/>
+                <w:color w:val="FFFFFF"/>
+                <w:sz w:val="17"/>
+              </w:rPr>
+            </w:r>
+            <w:r>
+              <w:rPr>
+                <w:b/>
+                <w:i w:val="0"/>
+                <w:color w:val="FFFFFF"/>
+                <w:sz w:val="17"/>
+              </w:rPr>
+              <w:t>Change</w:t>
+            </w:r>
+          </w:p>
+        </w:tc>
+        <w:tc>
+          <w:tcPr>
+            <w:tcW w:type="dxa" w:w="3324"/>
+            <w:shd w:val="clear" w:color="auto" w:fill="1B2A41"/>
+          </w:tcPr>
+          <w:p>
+            <w:r>
+              <w:rPr>
+                <w:b/>
+                <w:color w:val="FFFFFF"/>
+                <w:sz w:val="17"/>
+              </w:rPr>
+            </w:r>
+            <w:r>
+              <w:rPr>
+                <w:b/>
+                <w:i w:val="0"/>
+                <w:color w:val="FFFFFF"/>
+                <w:sz w:val="17"/>
+              </w:rPr>
+              <w:t>What it gives the auditor</w:t>
+            </w:r>
+          </w:p>
+        </w:tc>
+      </w:tr>
+      <w:tr>
+        <w:trPr>
+          <w:cantSplit/>
+        </w:trPr>
+        <w:tc>
+          <w:tcPr>
+            <w:tcW w:type="dxa" w:w="3324"/>
+          </w:tcPr>
+          <w:p>
+            <w:r>
+              <w:rPr>
+                <w:b w:val="0"/>
+                <w:sz w:val="17"/>
+              </w:rPr>
+            </w:r>
+            <w:r>
+              <w:rPr>
+                <w:b w:val="0"/>
+                <w:i w:val="0"/>
+                <w:sz w:val="17"/>
+              </w:rPr>
+              <w:t>1</w:t>
+            </w:r>
+          </w:p>
+        </w:tc>
+        <w:tc>
+          <w:tcPr>
+            <w:tcW w:type="dxa" w:w="3324"/>
+          </w:tcPr>
+          <w:p>
+            <w:r>
+              <w:rPr>
+                <w:b w:val="0"/>
+                <w:sz w:val="17"/>
+              </w:rPr>
+            </w:r>
+            <w:r>
+              <w:rPr>
+                <w:b/>
+                <w:i w:val="0"/>
+                <w:sz w:val="17"/>
+              </w:rPr>
+              <w:t>A run record for every month-end run.</w:t>
+            </w:r>
+            <w:r>
+              <w:rPr>
+                <w:b w:val="0"/>
+                <w:i w:val="0"/>
+                <w:sz w:val="17"/>
+              </w:rPr>
+              <w:t xml:space="preserve"> Who ran it, when, the code version (the repository commit) and a </w:t>
+            </w:r>
+            <w:r>
+              <w:rPr>
+                <w:b/>
+                <w:i w:val="0"/>
+                <w:sz w:val="17"/>
+              </w:rPr>
+              <w:t>frozen snapshot of every input</w:t>
+            </w:r>
+            <w:r>
+              <w:rPr>
+                <w:b w:val="0"/>
+                <w:i w:val="0"/>
+                <w:sz w:val="17"/>
+              </w:rPr>
+              <w:t>: each Governance Centre setting with its value, effective date, proposer and approver; the staging threshold rows; the fee rules in use with their approvals; the scenario set and version; the overlays; the forward-looking model version and the forward-looking snapshot; the query register versions; the data loads with their watermarks; and the loan book build. The snapshot is fingerprinted.</w:t>
+            </w:r>
+          </w:p>
+        </w:tc>
+        <w:tc>
+          <w:tcPr>
+            <w:tcW w:type="dxa" w:w="3324"/>
+          </w:tcPr>
+          <w:p>
+            <w:r>
+              <w:rPr>
+                <w:b w:val="0"/>
+                <w:sz w:val="17"/>
+              </w:rPr>
+            </w:r>
+            <w:r>
+              <w:rPr>
+                <w:b w:val="0"/>
+                <w:i w:val="0"/>
+                <w:sz w:val="17"/>
+              </w:rPr>
+              <w:t>Exactly what the month ran on, in one place, as it was at the time</w:t>
+            </w:r>
+          </w:p>
+        </w:tc>
+      </w:tr>
+      <w:tr>
+        <w:trPr>
+          <w:cantSplit/>
+        </w:trPr>
+        <w:tc>
+          <w:tcPr>
+            <w:tcW w:type="dxa" w:w="3324"/>
+          </w:tcPr>
+          <w:p>
+            <w:r>
+              <w:rPr>
+                <w:b w:val="0"/>
+                <w:sz w:val="17"/>
+              </w:rPr>
+            </w:r>
+            <w:r>
+              <w:rPr>
+                <w:b w:val="0"/>
+                <w:i w:val="0"/>
+                <w:sz w:val="17"/>
+              </w:rPr>
+              <w:t>2</w:t>
+            </w:r>
+          </w:p>
+        </w:tc>
+        <w:tc>
+          <w:tcPr>
+            <w:tcW w:type="dxa" w:w="3324"/>
+          </w:tcPr>
+          <w:p>
+            <w:r>
+              <w:rPr>
+                <w:b w:val="0"/>
+                <w:sz w:val="17"/>
+              </w:rPr>
+            </w:r>
+            <w:r>
+              <w:rPr>
+                <w:b/>
+                <w:i w:val="0"/>
+                <w:sz w:val="17"/>
+              </w:rPr>
+              <w:t>Every result row carries its run number.</w:t>
+            </w:r>
+            <w:r>
+              <w:rPr>
+                <w:b w:val="0"/>
+                <w:i w:val="0"/>
+                <w:sz w:val="17"/>
+              </w:rPr>
+              <w:t xml:space="preserve"> Loan book, stage, PD, LGD, ECL, revenue and Mega Farm rows record the run that wrote them.</w:t>
+            </w:r>
+          </w:p>
+        </w:tc>
+        <w:tc>
+          <w:tcPr>
+            <w:tcW w:type="dxa" w:w="3324"/>
+          </w:tcPr>
+          <w:p>
+            <w:r>
+              <w:rPr>
+                <w:b w:val="0"/>
+                <w:sz w:val="17"/>
+              </w:rPr>
+            </w:r>
+            <w:r>
+              <w:rPr>
+                <w:b w:val="0"/>
+                <w:i w:val="0"/>
+                <w:sz w:val="17"/>
+              </w:rPr>
+              <w:t>A trace from any loan's figure to its run and that run's snapshot</w:t>
+            </w:r>
+          </w:p>
+        </w:tc>
+      </w:tr>
+      <w:tr>
+        <w:trPr>
+          <w:cantSplit/>
+        </w:trPr>
+        <w:tc>
+          <w:tcPr>
+            <w:tcW w:type="dxa" w:w="3324"/>
+          </w:tcPr>
+          <w:p>
+            <w:r>
+              <w:rPr>
+                <w:b w:val="0"/>
+                <w:sz w:val="17"/>
+              </w:rPr>
+            </w:r>
+            <w:r>
+              <w:rPr>
+                <w:b w:val="0"/>
+                <w:i w:val="0"/>
+                <w:sz w:val="17"/>
+              </w:rPr>
+              <w:t>3</w:t>
+            </w:r>
+          </w:p>
+        </w:tc>
+        <w:tc>
+          <w:tcPr>
+            <w:tcW w:type="dxa" w:w="3324"/>
+          </w:tcPr>
+          <w:p>
+            <w:r>
+              <w:rPr>
+                <w:b w:val="0"/>
+                <w:sz w:val="17"/>
+              </w:rPr>
+            </w:r>
+            <w:r>
+              <w:rPr>
+                <w:b/>
+                <w:i w:val="0"/>
+                <w:sz w:val="17"/>
+              </w:rPr>
+              <w:t>The lock names the run of record.</w:t>
+            </w:r>
+            <w:r>
+              <w:rPr>
+                <w:b w:val="0"/>
+                <w:i w:val="0"/>
+                <w:sz w:val="17"/>
+              </w:rPr>
+              <w:t xml:space="preserve"> Locking a month records which run produced the reported figures. Earlier runs of the month are kept and marked superseded.</w:t>
+            </w:r>
+          </w:p>
+        </w:tc>
+        <w:tc>
+          <w:tcPr>
+            <w:tcW w:type="dxa" w:w="3324"/>
+          </w:tcPr>
+          <w:p>
+            <w:r>
+              <w:rPr>
+                <w:b w:val="0"/>
+                <w:sz w:val="17"/>
+              </w:rPr>
+            </w:r>
+            <w:r>
+              <w:rPr>
+                <w:b w:val="0"/>
+                <w:i w:val="0"/>
+                <w:sz w:val="17"/>
+              </w:rPr>
+              <w:t>No doubt about which run the reported figures came from</w:t>
+            </w:r>
+          </w:p>
+        </w:tc>
+      </w:tr>
+      <w:tr>
+        <w:trPr>
+          <w:cantSplit/>
+        </w:trPr>
+        <w:tc>
+          <w:tcPr>
+            <w:tcW w:type="dxa" w:w="3324"/>
+          </w:tcPr>
+          <w:p>
+            <w:r>
+              <w:rPr>
+                <w:b w:val="0"/>
+                <w:sz w:val="17"/>
+              </w:rPr>
+            </w:r>
+            <w:r>
+              <w:rPr>
+                <w:b w:val="0"/>
+                <w:i w:val="0"/>
+                <w:sz w:val="17"/>
+              </w:rPr>
+              <w:t>4</w:t>
+            </w:r>
+          </w:p>
+        </w:tc>
+        <w:tc>
+          <w:tcPr>
+            <w:tcW w:type="dxa" w:w="3324"/>
+          </w:tcPr>
+          <w:p>
+            <w:r>
+              <w:rPr>
+                <w:b w:val="0"/>
+                <w:sz w:val="17"/>
+              </w:rPr>
+            </w:r>
+            <w:r>
+              <w:rPr>
+                <w:b/>
+                <w:i w:val="0"/>
+                <w:sz w:val="17"/>
+              </w:rPr>
+              <w:t>No back-dating into a locked month.</w:t>
+            </w:r>
+            <w:r>
+              <w:rPr>
+                <w:b w:val="0"/>
+                <w:i w:val="0"/>
+                <w:sz w:val="17"/>
+              </w:rPr>
+              <w:t xml:space="preserve"> A change to any governed setting or rule cannot take effect inside a locked month unless it goes through the reopen-and-restate approval (section 8.6, period lock and unlock) with its documents.</w:t>
+            </w:r>
+          </w:p>
+        </w:tc>
+        <w:tc>
+          <w:tcPr>
+            <w:tcW w:type="dxa" w:w="3324"/>
+          </w:tcPr>
+          <w:p>
+            <w:r>
+              <w:rPr>
+                <w:b w:val="0"/>
+                <w:sz w:val="17"/>
+              </w:rPr>
+            </w:r>
+            <w:r>
+              <w:rPr>
+                <w:b w:val="0"/>
+                <w:i w:val="0"/>
+                <w:sz w:val="17"/>
+              </w:rPr>
+              <w:t>The settings looked up for a locked month can never change</w:t>
+            </w:r>
+          </w:p>
+        </w:tc>
+      </w:tr>
+      <w:tr>
+        <w:trPr>
+          <w:cantSplit/>
+        </w:trPr>
+        <w:tc>
+          <w:tcPr>
+            <w:tcW w:type="dxa" w:w="3324"/>
+          </w:tcPr>
+          <w:p>
+            <w:r>
+              <w:rPr>
+                <w:b w:val="0"/>
+                <w:sz w:val="17"/>
+              </w:rPr>
+            </w:r>
+            <w:r>
+              <w:rPr>
+                <w:b w:val="0"/>
+                <w:i w:val="0"/>
+                <w:sz w:val="17"/>
+              </w:rPr>
+              <w:t>5</w:t>
+            </w:r>
+          </w:p>
+        </w:tc>
+        <w:tc>
+          <w:tcPr>
+            <w:tcW w:type="dxa" w:w="3324"/>
+          </w:tcPr>
+          <w:p>
+            <w:r>
+              <w:rPr>
+                <w:b w:val="0"/>
+                <w:sz w:val="17"/>
+              </w:rPr>
+            </w:r>
+            <w:r>
+              <w:rPr>
+                <w:b/>
+                <w:i w:val="0"/>
+                <w:sz w:val="17"/>
+              </w:rPr>
+              <w:t>"Settings in force" and "What changed".</w:t>
+            </w:r>
+            <w:r>
+              <w:rPr>
+                <w:b w:val="0"/>
+                <w:i w:val="0"/>
+                <w:sz w:val="17"/>
+              </w:rPr>
+              <w:t xml:space="preserve"> For any month, a report of everything in its run record; and a comparison of two months showing every setting, rule, model, data load and code change between them. Both export to PDF and Excel and are sheets in the month's audit workbook and the auditor's pack.</w:t>
+            </w:r>
+          </w:p>
+        </w:tc>
+        <w:tc>
+          <w:tcPr>
+            <w:tcW w:type="dxa" w:w="3324"/>
+          </w:tcPr>
+          <w:p>
+            <w:r>
+              <w:rPr>
+                <w:b w:val="0"/>
+                <w:sz w:val="17"/>
+              </w:rPr>
+            </w:r>
+            <w:r>
+              <w:rPr>
+                <w:b w:val="0"/>
+                <w:i w:val="0"/>
+                <w:sz w:val="17"/>
+              </w:rPr>
+              <w:t>The auditor reads the record instead of reconstructing it</w:t>
+            </w:r>
+          </w:p>
+        </w:tc>
+      </w:tr>
+      <w:tr>
+        <w:trPr>
+          <w:cantSplit/>
+        </w:trPr>
+        <w:tc>
+          <w:tcPr>
+            <w:tcW w:type="dxa" w:w="3324"/>
+          </w:tcPr>
+          <w:p>
+            <w:r>
+              <w:rPr>
+                <w:b w:val="0"/>
+                <w:sz w:val="17"/>
+              </w:rPr>
+            </w:r>
+            <w:r>
+              <w:rPr>
+                <w:b w:val="0"/>
+                <w:i w:val="0"/>
+                <w:sz w:val="17"/>
+              </w:rPr>
+              <w:t>6</w:t>
+            </w:r>
+          </w:p>
+        </w:tc>
+        <w:tc>
+          <w:tcPr>
+            <w:tcW w:type="dxa" w:w="3324"/>
+          </w:tcPr>
+          <w:p>
+            <w:r>
+              <w:rPr>
+                <w:b w:val="0"/>
+                <w:sz w:val="17"/>
+              </w:rPr>
+            </w:r>
+            <w:r>
+              <w:rPr>
+                <w:b/>
+                <w:i w:val="0"/>
+                <w:sz w:val="17"/>
+              </w:rPr>
+              <w:t>Re-performance.</w:t>
+            </w:r>
+            <w:r>
+              <w:rPr>
+                <w:b w:val="0"/>
+                <w:i w:val="0"/>
+                <w:sz w:val="17"/>
+              </w:rPr>
+              <w:t xml:space="preserve"> A locked month can be re-run from its frozen snapshot into a separate workspace, with the comparison-run machinery of section 4, and the result checked against the stored figures, loan by loan.</w:t>
+            </w:r>
+          </w:p>
+        </w:tc>
+        <w:tc>
+          <w:tcPr>
+            <w:tcW w:type="dxa" w:w="3324"/>
+          </w:tcPr>
+          <w:p>
+            <w:r>
+              <w:rPr>
+                <w:b w:val="0"/>
+                <w:sz w:val="17"/>
+              </w:rPr>
+            </w:r>
+            <w:r>
+              <w:rPr>
+                <w:b w:val="0"/>
+                <w:i w:val="0"/>
+                <w:sz w:val="17"/>
+              </w:rPr>
+              <w:t>Proof that the reported figures can be reproduced, not only stated</w:t>
+            </w:r>
+          </w:p>
+        </w:tc>
+      </w:tr>
+    </w:tbl>
+    <w:p/>
+    <w:p>
+      <w:pPr>
+        <w:spacing w:after="120"/>
+        <w:jc w:val="both"/>
+      </w:pPr>
+      <w:r>
+        <w:rPr>
+          <w:b/>
+          <w:i w:val="0"/>
+        </w:rPr>
+        <w:t>Where this applies.</w:t>
+      </w:r>
+      <w:r>
+        <w:rPr>
+          <w:b w:val="0"/>
+          <w:i w:val="0"/>
+        </w:rPr>
+        <w:t xml:space="preserve"> Every engine of the month-end (build, staging, PD and LGD, ECL, forward-looking route, scenarios, Mega Farm, revenue, reports) writes into the one run record of the month-end job. A run outside the month-end job (an engine run by hand on a screen) gets a run record of its own, marked as such, and can never be the run of record.</w:t>
+      </w:r>
+    </w:p>
+    <w:p>
+      <w:pPr>
+        <w:spacing w:after="120"/>
+        <w:jc w:val="both"/>
+      </w:pPr>
+      <w:r>
+        <w:rPr>
+          <w:b/>
+          <w:i w:val="0"/>
+        </w:rPr>
+        <w:t>The bootstrap.</w:t>
+      </w:r>
+      <w:r>
+        <w:rPr>
+          <w:b w:val="0"/>
+          <w:i w:val="0"/>
+        </w:rPr>
+        <w:t xml:space="preserve"> Each bootstrap run also writes run records, labelled as bootstrap runs, so the regression check can compare a rebuilt month with the record of the previous rebuild.</w:t>
+      </w:r>
+    </w:p>
+    <w:p>
+      <w:pPr>
         <w:pStyle w:val="Heading2"/>
       </w:pPr>
       <w:r>
@@ -9272,6 +9992,95 @@
                 <w:sz w:val="17"/>
               </w:rPr>
               <w:t>Yes: every rule the matcher uses is re-approved under maker-checker before the fee review starts</w:t>
+            </w:r>
+          </w:p>
+        </w:tc>
+      </w:tr>
+      <w:tr>
+        <w:trPr>
+          <w:cantSplit/>
+        </w:trPr>
+        <w:tc>
+          <w:tcPr>
+            <w:tcW w:type="dxa" w:w="2493"/>
+          </w:tcPr>
+          <w:p>
+            <w:r>
+              <w:rPr>
+                <w:b w:val="0"/>
+                <w:sz w:val="17"/>
+              </w:rPr>
+            </w:r>
+            <w:r>
+              <w:rPr>
+                <w:b w:val="0"/>
+                <w:i w:val="0"/>
+                <w:sz w:val="17"/>
+              </w:rPr>
+              <w:t>S10</w:t>
+            </w:r>
+          </w:p>
+        </w:tc>
+        <w:tc>
+          <w:tcPr>
+            <w:tcW w:type="dxa" w:w="2493"/>
+          </w:tcPr>
+          <w:p>
+            <w:r>
+              <w:rPr>
+                <w:b w:val="0"/>
+                <w:sz w:val="17"/>
+              </w:rPr>
+            </w:r>
+            <w:r>
+              <w:rPr>
+                <w:b w:val="0"/>
+                <w:i w:val="0"/>
+                <w:sz w:val="17"/>
+              </w:rPr>
+              <w:t>Whether to apply the no-back-dating rule (section 8.8, item 4) ahead of the rest of this build</w:t>
+            </w:r>
+          </w:p>
+        </w:tc>
+        <w:tc>
+          <w:tcPr>
+            <w:tcW w:type="dxa" w:w="2493"/>
+          </w:tcPr>
+          <w:p>
+            <w:r>
+              <w:rPr>
+                <w:b w:val="0"/>
+                <w:sz w:val="17"/>
+              </w:rPr>
+            </w:r>
+            <w:r>
+              <w:rPr>
+                <w:b w:val="0"/>
+                <w:i w:val="0"/>
+                <w:sz w:val="17"/>
+              </w:rPr>
+              <w:t>Dr Thom</w:t>
+            </w:r>
+          </w:p>
+        </w:tc>
+        <w:tc>
+          <w:tcPr>
+            <w:tcW w:type="dxa" w:w="2493"/>
+          </w:tcPr>
+          <w:p>
+            <w:r>
+              <w:rPr>
+                <w:b w:val="0"/>
+                <w:sz w:val="17"/>
+              </w:rPr>
+            </w:r>
+            <w:r>
+              <w:rPr>
+                <w:b w:val="0"/>
+                <w:i w:val="0"/>
+                <w:sz w:val="17"/>
+              </w:rPr>
+              <w:t>Yes: it is a small change and protects the locked months now</w:t>
             </w:r>
           </w:p>
         </w:tc>
@@ -9588,6 +10397,86 @@
     </w:p>
     <w:p>
       <w:pPr>
+        <w:pStyle w:val="ListNumber"/>
+        <w:jc w:val="both"/>
+      </w:pPr>
+      <w:r>
+        <w:rPr>
+          <w:b/>
+          <w:i w:val="0"/>
+        </w:rPr>
+        <w:t>Run record.</w:t>
+      </w:r>
+      <w:r>
+        <w:rPr>
+          <w:b w:val="0"/>
+          <w:i w:val="0"/>
+        </w:rPr>
+        <w:t xml:space="preserve"> Every month-end run writes a run record with the frozen snapshot of section 8.8; its fingerprint verifies; every result row of the month carries the run number.</w:t>
+      </w:r>
+    </w:p>
+    <w:p>
+      <w:pPr>
+        <w:pStyle w:val="ListNumber"/>
+        <w:jc w:val="both"/>
+      </w:pPr>
+      <w:r>
+        <w:rPr>
+          <w:b/>
+          <w:i w:val="0"/>
+        </w:rPr>
+        <w:t>Run of record.</w:t>
+      </w:r>
+      <w:r>
+        <w:rPr>
+          <w:b w:val="0"/>
+          <w:i w:val="0"/>
+        </w:rPr>
+        <w:t xml:space="preserve"> Locking a month names the run whose figures were reported; a later rebuild of an unlocked month supersedes earlier runs and keeps them.</w:t>
+      </w:r>
+    </w:p>
+    <w:p>
+      <w:pPr>
+        <w:pStyle w:val="ListNumber"/>
+        <w:jc w:val="both"/>
+      </w:pPr>
+      <w:r>
+        <w:rPr>
+          <w:b/>
+          <w:i w:val="0"/>
+        </w:rPr>
+        <w:t>No back-dating.</w:t>
+      </w:r>
+      <w:r>
+        <w:rPr>
+          <w:b w:val="0"/>
+          <w:i w:val="0"/>
+        </w:rPr>
+        <w:t xml:space="preserve"> A setting or rule change with an effective date inside a locked month is refused unless approved through reopen-and-restate with documents.</w:t>
+      </w:r>
+    </w:p>
+    <w:p>
+      <w:pPr>
+        <w:pStyle w:val="ListNumber"/>
+        <w:jc w:val="both"/>
+      </w:pPr>
+      <w:r>
+        <w:rPr>
+          <w:b/>
+          <w:i w:val="0"/>
+        </w:rPr>
+        <w:t>Re-performance.</w:t>
+      </w:r>
+      <w:r>
+        <w:rPr>
+          <w:b w:val="0"/>
+          <w:i w:val="0"/>
+        </w:rPr>
+        <w:t xml:space="preserve"> Re-running a locked month from its snapshot reproduces its stored stages, ECL and revenue loan by loan, or names each difference.</w:t>
+      </w:r>
+    </w:p>
+    <w:p>
+      <w:pPr>
         <w:pStyle w:val="Heading2"/>
       </w:pPr>
       <w:r>
@@ -10002,6 +10891,74 @@
                 <w:sz w:val="17"/>
               </w:rPr>
               <w:t>About 2.5 days</w:t>
+            </w:r>
+          </w:p>
+        </w:tc>
+      </w:tr>
+      <w:tr>
+        <w:trPr>
+          <w:cantSplit/>
+        </w:trPr>
+        <w:tc>
+          <w:tcPr>
+            <w:tcW w:type="dxa" w:w="3324"/>
+          </w:tcPr>
+          <w:p>
+            <w:r>
+              <w:rPr>
+                <w:b w:val="0"/>
+                <w:sz w:val="17"/>
+              </w:rPr>
+            </w:r>
+            <w:r>
+              <w:rPr>
+                <w:b w:val="0"/>
+                <w:i w:val="0"/>
+                <w:sz w:val="17"/>
+              </w:rPr>
+              <w:t>3b</w:t>
+            </w:r>
+          </w:p>
+        </w:tc>
+        <w:tc>
+          <w:tcPr>
+            <w:tcW w:type="dxa" w:w="3324"/>
+          </w:tcPr>
+          <w:p>
+            <w:r>
+              <w:rPr>
+                <w:b w:val="0"/>
+                <w:sz w:val="17"/>
+              </w:rPr>
+            </w:r>
+            <w:r>
+              <w:rPr>
+                <w:b w:val="0"/>
+                <w:i w:val="0"/>
+                <w:sz w:val="17"/>
+              </w:rPr>
+              <w:t>The run record of section 8.8: snapshot, run numbers on result rows, run of record at lock, the no-back-dating rule, the Settings in force and What changed reports, re-performance</w:t>
+            </w:r>
+          </w:p>
+        </w:tc>
+        <w:tc>
+          <w:tcPr>
+            <w:tcW w:type="dxa" w:w="3324"/>
+          </w:tcPr>
+          <w:p>
+            <w:r>
+              <w:rPr>
+                <w:b w:val="0"/>
+                <w:sz w:val="17"/>
+              </w:rPr>
+            </w:r>
+            <w:r>
+              <w:rPr>
+                <w:b w:val="0"/>
+                <w:i w:val="0"/>
+                <w:sz w:val="17"/>
+              </w:rPr>
+              <w:t>About 2 days</w:t>
             </w:r>
           </w:p>
         </w:tc>
@@ -10844,6 +11801,147 @@
                 <w:sz w:val="17"/>
               </w:rPr>
               <w:t>A record that can be added to but never changed or deleted</w:t>
+            </w:r>
+          </w:p>
+        </w:tc>
+      </w:tr>
+      <w:tr>
+        <w:trPr>
+          <w:cantSplit/>
+        </w:trPr>
+        <w:tc>
+          <w:tcPr>
+            <w:tcW w:type="dxa" w:w="4986"/>
+          </w:tcPr>
+          <w:p>
+            <w:r>
+              <w:rPr>
+                <w:b w:val="0"/>
+                <w:sz w:val="17"/>
+              </w:rPr>
+            </w:r>
+            <w:r>
+              <w:rPr>
+                <w:b/>
+                <w:i w:val="0"/>
+                <w:sz w:val="17"/>
+              </w:rPr>
+              <w:t>Run record</w:t>
+            </w:r>
+          </w:p>
+        </w:tc>
+        <w:tc>
+          <w:tcPr>
+            <w:tcW w:type="dxa" w:w="4986"/>
+          </w:tcPr>
+          <w:p>
+            <w:r>
+              <w:rPr>
+                <w:b w:val="0"/>
+                <w:sz w:val="17"/>
+              </w:rPr>
+            </w:r>
+            <w:r>
+              <w:rPr>
+                <w:b w:val="0"/>
+                <w:i w:val="0"/>
+                <w:sz w:val="17"/>
+              </w:rPr>
+              <w:t>The frozen record of everything one month-end run used: settings, rules, models, data loads and code</w:t>
+            </w:r>
+          </w:p>
+        </w:tc>
+      </w:tr>
+      <w:tr>
+        <w:trPr>
+          <w:cantSplit/>
+        </w:trPr>
+        <w:tc>
+          <w:tcPr>
+            <w:tcW w:type="dxa" w:w="4986"/>
+          </w:tcPr>
+          <w:p>
+            <w:r>
+              <w:rPr>
+                <w:b w:val="0"/>
+                <w:sz w:val="17"/>
+              </w:rPr>
+            </w:r>
+            <w:r>
+              <w:rPr>
+                <w:b/>
+                <w:i w:val="0"/>
+                <w:sz w:val="17"/>
+              </w:rPr>
+              <w:t>Run of record</w:t>
+            </w:r>
+          </w:p>
+        </w:tc>
+        <w:tc>
+          <w:tcPr>
+            <w:tcW w:type="dxa" w:w="4986"/>
+          </w:tcPr>
+          <w:p>
+            <w:r>
+              <w:rPr>
+                <w:b w:val="0"/>
+                <w:sz w:val="17"/>
+              </w:rPr>
+            </w:r>
+            <w:r>
+              <w:rPr>
+                <w:b w:val="0"/>
+                <w:i w:val="0"/>
+                <w:sz w:val="17"/>
+              </w:rPr>
+              <w:t>The run whose figures were reported for a month, named when the month is locked</w:t>
+            </w:r>
+          </w:p>
+        </w:tc>
+      </w:tr>
+      <w:tr>
+        <w:trPr>
+          <w:cantSplit/>
+        </w:trPr>
+        <w:tc>
+          <w:tcPr>
+            <w:tcW w:type="dxa" w:w="4986"/>
+          </w:tcPr>
+          <w:p>
+            <w:r>
+              <w:rPr>
+                <w:b w:val="0"/>
+                <w:sz w:val="17"/>
+              </w:rPr>
+            </w:r>
+            <w:r>
+              <w:rPr>
+                <w:b/>
+                <w:i w:val="0"/>
+                <w:sz w:val="17"/>
+              </w:rPr>
+              <w:t>Re-performance</w:t>
+            </w:r>
+          </w:p>
+        </w:tc>
+        <w:tc>
+          <w:tcPr>
+            <w:tcW w:type="dxa" w:w="4986"/>
+          </w:tcPr>
+          <w:p>
+            <w:r>
+              <w:rPr>
+                <w:b w:val="0"/>
+                <w:sz w:val="17"/>
+              </w:rPr>
+            </w:r>
+            <w:r>
+              <w:rPr>
+                <w:b w:val="0"/>
+                <w:i w:val="0"/>
+                <w:sz w:val="17"/>
+              </w:rPr>
+              <w:t>Re-running a locked month from its run record to show the reported figures can be reproduced</w:t>
             </w:r>
           </w:p>
         </w:tc>

</xml_diff>

<commit_message>
Staging spec: build order in four phases (protect locked months; governed staging; fee rulebook control; the governance and audit record), each released and bootstrap-checked before the next
Co-Authored-By: Claude Opus 5.5 <noreply@anthropic.com>
</commit_message>
<xml_diff>
--- a/docs/MAIIC_Staging_Module_Specification_v1_2026-10-15.docx
+++ b/docs/MAIIC_Staging_Module_Specification_v1_2026-10-15.docx
@@ -10483,6 +10483,19 @@
         <w:t>11. Build order</w:t>
       </w:r>
     </w:p>
+    <w:p>
+      <w:pPr>
+        <w:spacing w:after="120"/>
+        <w:jc w:val="both"/>
+      </w:pPr>
+      <w:r>
+        <w:rPr>
+          <w:b w:val="0"/>
+          <w:i w:val="0"/>
+        </w:rPr>
+        <w:t>The work is done in four phases, so that the parts that protect the locked months and unblock decisions arrive first. Each phase is tested, released to MAIIC's server by the release steps of the integration document (section 2.2: push, pull, migrate, bootstrap with the nine ties passing) and only then followed by the next. The sizes are Dupleix's estimates of the build, before release.</w:t>
+      </w:r>
+    </w:p>
     <w:tbl>
       <w:tblPr>
         <w:tblStyle w:val="TableGrid"/>
@@ -10490,9 +10503,11 @@
         <w:tblLook w:firstColumn="1" w:firstRow="1" w:lastColumn="0" w:lastRow="0" w:noHBand="0" w:noVBand="1" w:val="04A0"/>
       </w:tblPr>
       <w:tblGrid>
-        <w:gridCol w:w="3324"/>
-        <w:gridCol w:w="3324"/>
-        <w:gridCol w:w="3324"/>
+        <w:gridCol w:w="1994"/>
+        <w:gridCol w:w="1994"/>
+        <w:gridCol w:w="1994"/>
+        <w:gridCol w:w="1994"/>
+        <w:gridCol w:w="1994"/>
       </w:tblGrid>
       <w:tr>
         <w:trPr>
@@ -10501,7 +10516,7 @@
         </w:trPr>
         <w:tc>
           <w:tcPr>
-            <w:tcW w:type="dxa" w:w="3324"/>
+            <w:tcW w:type="dxa" w:w="1994"/>
             <w:shd w:val="clear" w:color="auto" w:fill="1B2A41"/>
           </w:tcPr>
           <w:p>
@@ -10519,13 +10534,13 @@
                 <w:color w:val="FFFFFF"/>
                 <w:sz w:val="17"/>
               </w:rPr>
-              <w:t>Step</w:t>
-            </w:r>
-          </w:p>
-        </w:tc>
-        <w:tc>
-          <w:tcPr>
-            <w:tcW w:type="dxa" w:w="3324"/>
+              <w:t>Phase</w:t>
+            </w:r>
+          </w:p>
+        </w:tc>
+        <w:tc>
+          <w:tcPr>
+            <w:tcW w:type="dxa" w:w="1994"/>
             <w:shd w:val="clear" w:color="auto" w:fill="1B2A41"/>
           </w:tcPr>
           <w:p>
@@ -10549,7 +10564,55 @@
         </w:tc>
         <w:tc>
           <w:tcPr>
-            <w:tcW w:type="dxa" w:w="3324"/>
+            <w:tcW w:type="dxa" w:w="1994"/>
+            <w:shd w:val="clear" w:color="auto" w:fill="1B2A41"/>
+          </w:tcPr>
+          <w:p>
+            <w:r>
+              <w:rPr>
+                <w:b/>
+                <w:color w:val="FFFFFF"/>
+                <w:sz w:val="17"/>
+              </w:rPr>
+            </w:r>
+            <w:r>
+              <w:rPr>
+                <w:b/>
+                <w:i w:val="0"/>
+                <w:color w:val="FFFFFF"/>
+                <w:sz w:val="17"/>
+              </w:rPr>
+              <w:t>Sections</w:t>
+            </w:r>
+          </w:p>
+        </w:tc>
+        <w:tc>
+          <w:tcPr>
+            <w:tcW w:type="dxa" w:w="1994"/>
+            <w:shd w:val="clear" w:color="auto" w:fill="1B2A41"/>
+          </w:tcPr>
+          <w:p>
+            <w:r>
+              <w:rPr>
+                <w:b/>
+                <w:color w:val="FFFFFF"/>
+                <w:sz w:val="17"/>
+              </w:rPr>
+            </w:r>
+            <w:r>
+              <w:rPr>
+                <w:b/>
+                <w:i w:val="0"/>
+                <w:color w:val="FFFFFF"/>
+                <w:sz w:val="17"/>
+              </w:rPr>
+              <w:t>Acceptance</w:t>
+            </w:r>
+          </w:p>
+        </w:tc>
+        <w:tc>
+          <w:tcPr>
+            <w:tcW w:type="dxa" w:w="1994"/>
             <w:shd w:val="clear" w:color="auto" w:fill="1B2A41"/>
           </w:tcPr>
           <w:p>
@@ -10578,115 +10641,106 @@
         </w:trPr>
         <w:tc>
           <w:tcPr>
-            <w:tcW w:type="dxa" w:w="3324"/>
-          </w:tcPr>
-          <w:p>
-            <w:r>
-              <w:rPr>
-                <w:b w:val="0"/>
-                <w:sz w:val="17"/>
-              </w:rPr>
-            </w:r>
-            <w:r>
-              <w:rPr>
-                <w:b w:val="0"/>
-                <w:i w:val="0"/>
-                <w:sz w:val="17"/>
-              </w:rPr>
-              <w:t>1</w:t>
-            </w:r>
-          </w:p>
-        </w:tc>
-        <w:tc>
-          <w:tcPr>
-            <w:tcW w:type="dxa" w:w="3324"/>
-          </w:tcPr>
-          <w:p>
-            <w:r>
-              <w:rPr>
-                <w:b w:val="0"/>
-                <w:sz w:val="17"/>
-              </w:rPr>
-            </w:r>
-            <w:r>
-              <w:rPr>
-                <w:b w:val="0"/>
-                <w:i w:val="0"/>
-                <w:sz w:val="17"/>
-              </w:rPr>
-              <w:t xml:space="preserve">The settings, the presets and their seeding; </w:t>
-            </w:r>
-            <w:r>
-              <w:rPr>
-                <w:rFonts w:ascii="Consolas" w:hAnsi="Consolas"/>
-                <w:b w:val="0"/>
-                <w:i w:val="0"/>
-                <w:sz w:val="17"/>
-              </w:rPr>
-              <w:t>StagingService</w:t>
-            </w:r>
-            <w:r>
-              <w:rPr>
-                <w:b w:val="0"/>
-                <w:i w:val="0"/>
-                <w:sz w:val="17"/>
-              </w:rPr>
-              <w:t xml:space="preserve"> reading them; </w:t>
-            </w:r>
-            <w:r>
-              <w:rPr>
-                <w:rFonts w:ascii="Consolas" w:hAnsi="Consolas"/>
-                <w:b w:val="0"/>
-                <w:i w:val="0"/>
-                <w:sz w:val="17"/>
-              </w:rPr>
-              <w:t>staging_dpd</w:t>
-            </w:r>
-            <w:r>
-              <w:rPr>
-                <w:b w:val="0"/>
-                <w:i w:val="0"/>
-                <w:sz w:val="17"/>
-              </w:rPr>
-              <w:t xml:space="preserve"> beside </w:t>
-            </w:r>
-            <w:r>
-              <w:rPr>
-                <w:rFonts w:ascii="Consolas" w:hAnsi="Consolas"/>
-                <w:b w:val="0"/>
-                <w:i w:val="0"/>
-                <w:sz w:val="17"/>
-              </w:rPr>
-              <w:t>overdue_days</w:t>
-            </w:r>
-            <w:r>
-              <w:rPr>
-                <w:b w:val="0"/>
-                <w:i w:val="0"/>
-                <w:sz w:val="17"/>
-              </w:rPr>
-              <w:t xml:space="preserve"> in the build</w:t>
-            </w:r>
-          </w:p>
-        </w:tc>
-        <w:tc>
-          <w:tcPr>
-            <w:tcW w:type="dxa" w:w="3324"/>
-          </w:tcPr>
-          <w:p>
-            <w:r>
-              <w:rPr>
-                <w:b w:val="0"/>
-                <w:sz w:val="17"/>
-              </w:rPr>
-            </w:r>
-            <w:r>
-              <w:rPr>
-                <w:b w:val="0"/>
-                <w:i w:val="0"/>
-                <w:sz w:val="17"/>
-              </w:rPr>
-              <w:t>About 1.5 days</w:t>
+            <w:tcW w:type="dxa" w:w="1994"/>
+          </w:tcPr>
+          <w:p>
+            <w:r>
+              <w:rPr>
+                <w:b w:val="0"/>
+                <w:sz w:val="17"/>
+              </w:rPr>
+            </w:r>
+            <w:r>
+              <w:rPr>
+                <w:b/>
+                <w:i w:val="0"/>
+                <w:sz w:val="17"/>
+              </w:rPr>
+              <w:t>1. Protect the locked months</w:t>
+            </w:r>
+          </w:p>
+        </w:tc>
+        <w:tc>
+          <w:tcPr>
+            <w:tcW w:type="dxa" w:w="1994"/>
+          </w:tcPr>
+          <w:p>
+            <w:r>
+              <w:rPr>
+                <w:b w:val="0"/>
+                <w:sz w:val="17"/>
+              </w:rPr>
+            </w:r>
+            <w:r>
+              <w:rPr>
+                <w:b w:val="0"/>
+                <w:i w:val="0"/>
+                <w:sz w:val="17"/>
+              </w:rPr>
+              <w:t>The no-back-dating rule: no change to a governed setting or rule takes effect inside a locked month except through reopen-and-restate with documents (decision S10)</w:t>
+            </w:r>
+          </w:p>
+        </w:tc>
+        <w:tc>
+          <w:tcPr>
+            <w:tcW w:type="dxa" w:w="1994"/>
+          </w:tcPr>
+          <w:p>
+            <w:r>
+              <w:rPr>
+                <w:b w:val="0"/>
+                <w:sz w:val="17"/>
+              </w:rPr>
+            </w:r>
+            <w:r>
+              <w:rPr>
+                <w:b w:val="0"/>
+                <w:i w:val="0"/>
+                <w:sz w:val="17"/>
+              </w:rPr>
+              <w:t>8.8, item 4</w:t>
+            </w:r>
+          </w:p>
+        </w:tc>
+        <w:tc>
+          <w:tcPr>
+            <w:tcW w:type="dxa" w:w="1994"/>
+          </w:tcPr>
+          <w:p>
+            <w:r>
+              <w:rPr>
+                <w:b w:val="0"/>
+                <w:sz w:val="17"/>
+              </w:rPr>
+            </w:r>
+            <w:r>
+              <w:rPr>
+                <w:b w:val="0"/>
+                <w:i w:val="0"/>
+                <w:sz w:val="17"/>
+              </w:rPr>
+              <w:t>18</w:t>
+            </w:r>
+          </w:p>
+        </w:tc>
+        <w:tc>
+          <w:tcPr>
+            <w:tcW w:type="dxa" w:w="1994"/>
+          </w:tcPr>
+          <w:p>
+            <w:r>
+              <w:rPr>
+                <w:b w:val="0"/>
+                <w:sz w:val="17"/>
+              </w:rPr>
+            </w:r>
+            <w:r>
+              <w:rPr>
+                <w:b w:val="0"/>
+                <w:i w:val="0"/>
+                <w:sz w:val="17"/>
+              </w:rPr>
+              <w:t>About half a day</w:t>
             </w:r>
           </w:p>
         </w:tc>
@@ -10697,64 +10751,157 @@
         </w:trPr>
         <w:tc>
           <w:tcPr>
-            <w:tcW w:type="dxa" w:w="3324"/>
-          </w:tcPr>
-          <w:p>
-            <w:r>
-              <w:rPr>
-                <w:b w:val="0"/>
-                <w:sz w:val="17"/>
-              </w:rPr>
-            </w:r>
-            <w:r>
-              <w:rPr>
-                <w:b w:val="0"/>
-                <w:i w:val="0"/>
-                <w:sz w:val="17"/>
-              </w:rPr>
-              <w:t>2</w:t>
-            </w:r>
-          </w:p>
-        </w:tc>
-        <w:tc>
-          <w:tcPr>
-            <w:tcW w:type="dxa" w:w="3324"/>
-          </w:tcPr>
-          <w:p>
-            <w:r>
-              <w:rPr>
-                <w:b w:val="0"/>
-                <w:sz w:val="17"/>
-              </w:rPr>
-            </w:r>
-            <w:r>
-              <w:rPr>
-                <w:b w:val="0"/>
-                <w:i w:val="0"/>
-                <w:sz w:val="17"/>
-              </w:rPr>
-              <w:t>The comparison run: tables, command, panel, export, audit-workbook sheet</w:t>
-            </w:r>
-          </w:p>
-        </w:tc>
-        <w:tc>
-          <w:tcPr>
-            <w:tcW w:type="dxa" w:w="3324"/>
-          </w:tcPr>
-          <w:p>
-            <w:r>
-              <w:rPr>
-                <w:b w:val="0"/>
-                <w:sz w:val="17"/>
-              </w:rPr>
-            </w:r>
-            <w:r>
-              <w:rPr>
-                <w:b w:val="0"/>
-                <w:i w:val="0"/>
-                <w:sz w:val="17"/>
-              </w:rPr>
-              <w:t>About 1 day</w:t>
+            <w:tcW w:type="dxa" w:w="1994"/>
+          </w:tcPr>
+          <w:p>
+            <w:r>
+              <w:rPr>
+                <w:b w:val="0"/>
+                <w:sz w:val="17"/>
+              </w:rPr>
+            </w:r>
+            <w:r>
+              <w:rPr>
+                <w:b/>
+                <w:i w:val="0"/>
+                <w:sz w:val="17"/>
+              </w:rPr>
+              <w:t>2. Governed staging</w:t>
+            </w:r>
+          </w:p>
+        </w:tc>
+        <w:tc>
+          <w:tcPr>
+            <w:tcW w:type="dxa" w:w="1994"/>
+          </w:tcPr>
+          <w:p>
+            <w:r>
+              <w:rPr>
+                <w:b w:val="0"/>
+                <w:sz w:val="17"/>
+              </w:rPr>
+            </w:r>
+            <w:r>
+              <w:rPr>
+                <w:b w:val="0"/>
+                <w:i w:val="0"/>
+                <w:sz w:val="17"/>
+              </w:rPr>
+              <w:t xml:space="preserve">The settings, the presets and their seeding, with single-ladder staging as the default; </w:t>
+            </w:r>
+            <w:r>
+              <w:rPr>
+                <w:rFonts w:ascii="Consolas" w:hAnsi="Consolas"/>
+                <w:b w:val="0"/>
+                <w:i w:val="0"/>
+                <w:sz w:val="17"/>
+              </w:rPr>
+              <w:t>StagingService</w:t>
+            </w:r>
+            <w:r>
+              <w:rPr>
+                <w:b w:val="0"/>
+                <w:i w:val="0"/>
+                <w:sz w:val="17"/>
+              </w:rPr>
+              <w:t xml:space="preserve"> reading every rule from the settings; </w:t>
+            </w:r>
+            <w:r>
+              <w:rPr>
+                <w:rFonts w:ascii="Consolas" w:hAnsi="Consolas"/>
+                <w:b w:val="0"/>
+                <w:i w:val="0"/>
+                <w:sz w:val="17"/>
+              </w:rPr>
+              <w:t>staging_dpd</w:t>
+            </w:r>
+            <w:r>
+              <w:rPr>
+                <w:b w:val="0"/>
+                <w:i w:val="0"/>
+                <w:sz w:val="17"/>
+              </w:rPr>
+              <w:t xml:space="preserve"> beside </w:t>
+            </w:r>
+            <w:r>
+              <w:rPr>
+                <w:rFonts w:ascii="Consolas" w:hAnsi="Consolas"/>
+                <w:b w:val="0"/>
+                <w:i w:val="0"/>
+                <w:sz w:val="17"/>
+              </w:rPr>
+              <w:t>overdue_days</w:t>
+            </w:r>
+            <w:r>
+              <w:rPr>
+                <w:b w:val="0"/>
+                <w:i w:val="0"/>
+                <w:sz w:val="17"/>
+              </w:rPr>
+              <w:t>; the comparison run with its tables, command, panel, export and audit-workbook sheet; then the comparison runs for December 2025 and September 2026 on MAIIC's server</w:t>
+            </w:r>
+          </w:p>
+        </w:tc>
+        <w:tc>
+          <w:tcPr>
+            <w:tcW w:type="dxa" w:w="1994"/>
+          </w:tcPr>
+          <w:p>
+            <w:r>
+              <w:rPr>
+                <w:b w:val="0"/>
+                <w:sz w:val="17"/>
+              </w:rPr>
+            </w:r>
+            <w:r>
+              <w:rPr>
+                <w:b w:val="0"/>
+                <w:i w:val="0"/>
+                <w:sz w:val="17"/>
+              </w:rPr>
+              <w:t>3, 4, 5, 6, 7</w:t>
+            </w:r>
+          </w:p>
+        </w:tc>
+        <w:tc>
+          <w:tcPr>
+            <w:tcW w:type="dxa" w:w="1994"/>
+          </w:tcPr>
+          <w:p>
+            <w:r>
+              <w:rPr>
+                <w:b w:val="0"/>
+                <w:sz w:val="17"/>
+              </w:rPr>
+            </w:r>
+            <w:r>
+              <w:rPr>
+                <w:b w:val="0"/>
+                <w:i w:val="0"/>
+                <w:sz w:val="17"/>
+              </w:rPr>
+              <w:t>1 to 8</w:t>
+            </w:r>
+          </w:p>
+        </w:tc>
+        <w:tc>
+          <w:tcPr>
+            <w:tcW w:type="dxa" w:w="1994"/>
+          </w:tcPr>
+          <w:p>
+            <w:r>
+              <w:rPr>
+                <w:b w:val="0"/>
+                <w:sz w:val="17"/>
+              </w:rPr>
+            </w:r>
+            <w:r>
+              <w:rPr>
+                <w:b w:val="0"/>
+                <w:i w:val="0"/>
+                <w:sz w:val="17"/>
+              </w:rPr>
+              <w:t>About 3 days</w:t>
             </w:r>
           </w:p>
         </w:tc>
@@ -10765,64 +10912,106 @@
         </w:trPr>
         <w:tc>
           <w:tcPr>
-            <w:tcW w:type="dxa" w:w="3324"/>
-          </w:tcPr>
-          <w:p>
-            <w:r>
-              <w:rPr>
-                <w:b w:val="0"/>
-                <w:sz w:val="17"/>
-              </w:rPr>
-            </w:r>
-            <w:r>
-              <w:rPr>
-                <w:b w:val="0"/>
-                <w:i w:val="0"/>
-                <w:sz w:val="17"/>
-              </w:rPr>
-              <w:t>3</w:t>
-            </w:r>
-          </w:p>
-        </w:tc>
-        <w:tc>
-          <w:tcPr>
-            <w:tcW w:type="dxa" w:w="3324"/>
-          </w:tcPr>
-          <w:p>
-            <w:r>
-              <w:rPr>
-                <w:b w:val="0"/>
-                <w:sz w:val="17"/>
-              </w:rPr>
-            </w:r>
-            <w:r>
-              <w:rPr>
-                <w:b w:val="0"/>
-                <w:i w:val="0"/>
-                <w:sz w:val="17"/>
-              </w:rPr>
-              <w:t>The governance change log of sections 8.1 to 8.5: reject and withdraw, the seeding entries, supporting documents on private storage with fingerprints, required evidence, the History view and export, the append-only guard and the chain check</w:t>
-            </w:r>
-          </w:p>
-        </w:tc>
-        <w:tc>
-          <w:tcPr>
-            <w:tcW w:type="dxa" w:w="3324"/>
-          </w:tcPr>
-          <w:p>
-            <w:r>
-              <w:rPr>
-                <w:b w:val="0"/>
-                <w:sz w:val="17"/>
-              </w:rPr>
-            </w:r>
-            <w:r>
-              <w:rPr>
-                <w:b w:val="0"/>
-                <w:i w:val="0"/>
-                <w:sz w:val="17"/>
-              </w:rPr>
-              <w:t>About 2 days</w:t>
+            <w:tcW w:type="dxa" w:w="1994"/>
+          </w:tcPr>
+          <w:p>
+            <w:r>
+              <w:rPr>
+                <w:b w:val="0"/>
+                <w:sz w:val="17"/>
+              </w:rPr>
+            </w:r>
+            <w:r>
+              <w:rPr>
+                <w:b/>
+                <w:i w:val="0"/>
+                <w:sz w:val="17"/>
+              </w:rPr>
+              <w:t>3. Fee rulebook control</w:t>
+            </w:r>
+          </w:p>
+        </w:tc>
+        <w:tc>
+          <w:tcPr>
+            <w:tcW w:type="dxa" w:w="1994"/>
+          </w:tcPr>
+          <w:p>
+            <w:r>
+              <w:rPr>
+                <w:b w:val="0"/>
+                <w:sz w:val="17"/>
+              </w:rPr>
+            </w:r>
+            <w:r>
+              <w:rPr>
+                <w:b w:val="0"/>
+                <w:i w:val="0"/>
+                <w:sz w:val="17"/>
+              </w:rPr>
+              <w:t>Second-person approval with a reason, reject and withdraw, switching a rule on or off as a proposal; then the re-approval of every rule the matcher uses (decision S9), so that the fee review can start on controlled rules</w:t>
+            </w:r>
+          </w:p>
+        </w:tc>
+        <w:tc>
+          <w:tcPr>
+            <w:tcW w:type="dxa" w:w="1994"/>
+          </w:tcPr>
+          <w:p>
+            <w:r>
+              <w:rPr>
+                <w:b w:val="0"/>
+                <w:sz w:val="17"/>
+              </w:rPr>
+            </w:r>
+            <w:r>
+              <w:rPr>
+                <w:b w:val="0"/>
+                <w:i w:val="0"/>
+                <w:sz w:val="17"/>
+              </w:rPr>
+              <w:t>8.6 (fee rulebook)</w:t>
+            </w:r>
+          </w:p>
+        </w:tc>
+        <w:tc>
+          <w:tcPr>
+            <w:tcW w:type="dxa" w:w="1994"/>
+          </w:tcPr>
+          <w:p>
+            <w:r>
+              <w:rPr>
+                <w:b w:val="0"/>
+                <w:sz w:val="17"/>
+              </w:rPr>
+            </w:r>
+            <w:r>
+              <w:rPr>
+                <w:b w:val="0"/>
+                <w:i w:val="0"/>
+                <w:sz w:val="17"/>
+              </w:rPr>
+              <w:t>14</w:t>
+            </w:r>
+          </w:p>
+        </w:tc>
+        <w:tc>
+          <w:tcPr>
+            <w:tcW w:type="dxa" w:w="1994"/>
+          </w:tcPr>
+          <w:p>
+            <w:r>
+              <w:rPr>
+                <w:b w:val="0"/>
+                <w:sz w:val="17"/>
+              </w:rPr>
+            </w:r>
+            <w:r>
+              <w:rPr>
+                <w:b w:val="0"/>
+                <w:i w:val="0"/>
+                <w:sz w:val="17"/>
+              </w:rPr>
+              <w:t>About half a day</w:t>
             </w:r>
           </w:p>
         </w:tc>
@@ -10833,64 +11022,106 @@
         </w:trPr>
         <w:tc>
           <w:tcPr>
-            <w:tcW w:type="dxa" w:w="3324"/>
-          </w:tcPr>
-          <w:p>
-            <w:r>
-              <w:rPr>
-                <w:b w:val="0"/>
-                <w:sz w:val="17"/>
-              </w:rPr>
-            </w:r>
-            <w:r>
-              <w:rPr>
-                <w:b w:val="0"/>
-                <w:i w:val="0"/>
-                <w:sz w:val="17"/>
-              </w:rPr>
-              <w:t>3a</w:t>
-            </w:r>
-          </w:p>
-        </w:tc>
-        <w:tc>
-          <w:tcPr>
-            <w:tcW w:type="dxa" w:w="3324"/>
-          </w:tcPr>
-          <w:p>
-            <w:r>
-              <w:rPr>
-                <w:b w:val="0"/>
-                <w:sz w:val="17"/>
-              </w:rPr>
-            </w:r>
-            <w:r>
-              <w:rPr>
-                <w:b w:val="0"/>
-                <w:i w:val="0"/>
-                <w:sz w:val="17"/>
-              </w:rPr>
-              <w:t>The other approvals of section 8.6 on the same log and document store, the fee rulebook's maker-checker first; the Approvals view of section 8.7</w:t>
-            </w:r>
-          </w:p>
-        </w:tc>
-        <w:tc>
-          <w:tcPr>
-            <w:tcW w:type="dxa" w:w="3324"/>
-          </w:tcPr>
-          <w:p>
-            <w:r>
-              <w:rPr>
-                <w:b w:val="0"/>
-                <w:sz w:val="17"/>
-              </w:rPr>
-            </w:r>
-            <w:r>
-              <w:rPr>
-                <w:b w:val="0"/>
-                <w:i w:val="0"/>
-                <w:sz w:val="17"/>
-              </w:rPr>
-              <w:t>About 2.5 days</w:t>
+            <w:tcW w:type="dxa" w:w="1994"/>
+          </w:tcPr>
+          <w:p>
+            <w:r>
+              <w:rPr>
+                <w:b w:val="0"/>
+                <w:sz w:val="17"/>
+              </w:rPr>
+            </w:r>
+            <w:r>
+              <w:rPr>
+                <w:b/>
+                <w:i w:val="0"/>
+                <w:sz w:val="17"/>
+              </w:rPr>
+              <w:t>4. The governance and audit record</w:t>
+            </w:r>
+          </w:p>
+        </w:tc>
+        <w:tc>
+          <w:tcPr>
+            <w:tcW w:type="dxa" w:w="1994"/>
+          </w:tcPr>
+          <w:p>
+            <w:r>
+              <w:rPr>
+                <w:b w:val="0"/>
+                <w:sz w:val="17"/>
+              </w:rPr>
+            </w:r>
+            <w:r>
+              <w:rPr>
+                <w:b w:val="0"/>
+                <w:i w:val="0"/>
+                <w:sz w:val="17"/>
+              </w:rPr>
+              <w:t>The Governance Centre change log (reject and withdraw, seeding entries, supporting documents on private storage, required evidence, history view, append-only chained log); the other approvals on the same log and document store, and the Approvals view; the run record, run numbers on result rows, run of record at lock, the two reports and re-performance</w:t>
+            </w:r>
+          </w:p>
+        </w:tc>
+        <w:tc>
+          <w:tcPr>
+            <w:tcW w:type="dxa" w:w="1994"/>
+          </w:tcPr>
+          <w:p>
+            <w:r>
+              <w:rPr>
+                <w:b w:val="0"/>
+                <w:sz w:val="17"/>
+              </w:rPr>
+            </w:r>
+            <w:r>
+              <w:rPr>
+                <w:b w:val="0"/>
+                <w:i w:val="0"/>
+                <w:sz w:val="17"/>
+              </w:rPr>
+              <w:t>8.1 to 8.5, 8.6, 8.7, 8.8</w:t>
+            </w:r>
+          </w:p>
+        </w:tc>
+        <w:tc>
+          <w:tcPr>
+            <w:tcW w:type="dxa" w:w="1994"/>
+          </w:tcPr>
+          <w:p>
+            <w:r>
+              <w:rPr>
+                <w:b w:val="0"/>
+                <w:sz w:val="17"/>
+              </w:rPr>
+            </w:r>
+            <w:r>
+              <w:rPr>
+                <w:b w:val="0"/>
+                <w:i w:val="0"/>
+                <w:sz w:val="17"/>
+              </w:rPr>
+              <w:t>9 to 13, 15 to 17, 19</w:t>
+            </w:r>
+          </w:p>
+        </w:tc>
+        <w:tc>
+          <w:tcPr>
+            <w:tcW w:type="dxa" w:w="1994"/>
+          </w:tcPr>
+          <w:p>
+            <w:r>
+              <w:rPr>
+                <w:b w:val="0"/>
+                <w:sz w:val="17"/>
+              </w:rPr>
+            </w:r>
+            <w:r>
+              <w:rPr>
+                <w:b w:val="0"/>
+                <w:i w:val="0"/>
+                <w:sz w:val="17"/>
+              </w:rPr>
+              <w:t>About 5.5 days</w:t>
             </w:r>
           </w:p>
         </w:tc>
@@ -10901,211 +11132,7 @@
         </w:trPr>
         <w:tc>
           <w:tcPr>
-            <w:tcW w:type="dxa" w:w="3324"/>
-          </w:tcPr>
-          <w:p>
-            <w:r>
-              <w:rPr>
-                <w:b w:val="0"/>
-                <w:sz w:val="17"/>
-              </w:rPr>
-            </w:r>
-            <w:r>
-              <w:rPr>
-                <w:b w:val="0"/>
-                <w:i w:val="0"/>
-                <w:sz w:val="17"/>
-              </w:rPr>
-              <w:t>3b</w:t>
-            </w:r>
-          </w:p>
-        </w:tc>
-        <w:tc>
-          <w:tcPr>
-            <w:tcW w:type="dxa" w:w="3324"/>
-          </w:tcPr>
-          <w:p>
-            <w:r>
-              <w:rPr>
-                <w:b w:val="0"/>
-                <w:sz w:val="17"/>
-              </w:rPr>
-            </w:r>
-            <w:r>
-              <w:rPr>
-                <w:b w:val="0"/>
-                <w:i w:val="0"/>
-                <w:sz w:val="17"/>
-              </w:rPr>
-              <w:t>The run record of section 8.8: snapshot, run numbers on result rows, run of record at lock, the no-back-dating rule, the Settings in force and What changed reports, re-performance</w:t>
-            </w:r>
-          </w:p>
-        </w:tc>
-        <w:tc>
-          <w:tcPr>
-            <w:tcW w:type="dxa" w:w="3324"/>
-          </w:tcPr>
-          <w:p>
-            <w:r>
-              <w:rPr>
-                <w:b w:val="0"/>
-                <w:sz w:val="17"/>
-              </w:rPr>
-            </w:r>
-            <w:r>
-              <w:rPr>
-                <w:b w:val="0"/>
-                <w:i w:val="0"/>
-                <w:sz w:val="17"/>
-              </w:rPr>
-              <w:t>About 2 days</w:t>
-            </w:r>
-          </w:p>
-        </w:tc>
-      </w:tr>
-      <w:tr>
-        <w:trPr>
-          <w:cantSplit/>
-        </w:trPr>
-        <w:tc>
-          <w:tcPr>
-            <w:tcW w:type="dxa" w:w="3324"/>
-          </w:tcPr>
-          <w:p>
-            <w:r>
-              <w:rPr>
-                <w:b w:val="0"/>
-                <w:sz w:val="17"/>
-              </w:rPr>
-            </w:r>
-            <w:r>
-              <w:rPr>
-                <w:b w:val="0"/>
-                <w:i w:val="0"/>
-                <w:sz w:val="17"/>
-              </w:rPr>
-              <w:t>4</w:t>
-            </w:r>
-          </w:p>
-        </w:tc>
-        <w:tc>
-          <w:tcPr>
-            <w:tcW w:type="dxa" w:w="3324"/>
-          </w:tcPr>
-          <w:p>
-            <w:r>
-              <w:rPr>
-                <w:b w:val="0"/>
-                <w:sz w:val="17"/>
-              </w:rPr>
-            </w:r>
-            <w:r>
-              <w:rPr>
-                <w:b w:val="0"/>
-                <w:i w:val="0"/>
-                <w:sz w:val="17"/>
-              </w:rPr>
-              <w:t>Tests for each acceptance point; a bootstrap check</w:t>
-            </w:r>
-          </w:p>
-        </w:tc>
-        <w:tc>
-          <w:tcPr>
-            <w:tcW w:type="dxa" w:w="3324"/>
-          </w:tcPr>
-          <w:p>
-            <w:r>
-              <w:rPr>
-                <w:b w:val="0"/>
-                <w:sz w:val="17"/>
-              </w:rPr>
-            </w:r>
-            <w:r>
-              <w:rPr>
-                <w:b w:val="0"/>
-                <w:i w:val="0"/>
-                <w:sz w:val="17"/>
-              </w:rPr>
-              <w:t>About half a day</w:t>
-            </w:r>
-          </w:p>
-        </w:tc>
-      </w:tr>
-      <w:tr>
-        <w:trPr>
-          <w:cantSplit/>
-        </w:trPr>
-        <w:tc>
-          <w:tcPr>
-            <w:tcW w:type="dxa" w:w="3324"/>
-          </w:tcPr>
-          <w:p>
-            <w:r>
-              <w:rPr>
-                <w:b w:val="0"/>
-                <w:sz w:val="17"/>
-              </w:rPr>
-            </w:r>
-            <w:r>
-              <w:rPr>
-                <w:b w:val="0"/>
-                <w:i w:val="0"/>
-                <w:sz w:val="17"/>
-              </w:rPr>
-              <w:t>5</w:t>
-            </w:r>
-          </w:p>
-        </w:tc>
-        <w:tc>
-          <w:tcPr>
-            <w:tcW w:type="dxa" w:w="3324"/>
-          </w:tcPr>
-          <w:p>
-            <w:r>
-              <w:rPr>
-                <w:b w:val="0"/>
-                <w:sz w:val="17"/>
-              </w:rPr>
-            </w:r>
-            <w:r>
-              <w:rPr>
-                <w:b w:val="0"/>
-                <w:i w:val="0"/>
-                <w:sz w:val="17"/>
-              </w:rPr>
-              <w:t>Release to MAIIC's server by the release steps of the integration document (section 2.2): push, pull, migrate, bootstrap with the nine ties passing, then the comparison runs for December 2025 and September 2026</w:t>
-            </w:r>
-          </w:p>
-        </w:tc>
-        <w:tc>
-          <w:tcPr>
-            <w:tcW w:type="dxa" w:w="3324"/>
-          </w:tcPr>
-          <w:p>
-            <w:r>
-              <w:rPr>
-                <w:b w:val="0"/>
-                <w:sz w:val="17"/>
-              </w:rPr>
-            </w:r>
-            <w:r>
-              <w:rPr>
-                <w:b w:val="0"/>
-                <w:i w:val="0"/>
-                <w:sz w:val="17"/>
-              </w:rPr>
-              <w:t>With MAIIC ICT</w:t>
-            </w:r>
-          </w:p>
-        </w:tc>
-      </w:tr>
-      <w:tr>
-        <w:trPr>
-          <w:cantSplit/>
-        </w:trPr>
-        <w:tc>
-          <w:tcPr>
-            <w:tcW w:type="dxa" w:w="3324"/>
+            <w:tcW w:type="dxa" w:w="1994"/>
           </w:tcPr>
           <w:p>
             <w:r>
@@ -11126,7 +11153,7 @@
         </w:tc>
         <w:tc>
           <w:tcPr>
-            <w:tcW w:type="dxa" w:w="3324"/>
+            <w:tcW w:type="dxa" w:w="1994"/>
           </w:tcPr>
           <w:p>
             <w:r>
@@ -11147,7 +11174,41 @@
         </w:tc>
         <w:tc>
           <w:tcPr>
-            <w:tcW w:type="dxa" w:w="3324"/>
+            <w:tcW w:type="dxa" w:w="1994"/>
+          </w:tcPr>
+          <w:p>
+            <w:r>
+              <w:rPr>
+                <w:b w:val="0"/>
+                <w:sz w:val="17"/>
+              </w:rPr>
+            </w:r>
+            <w:r>
+              <w:rPr>
+                <w:b w:val="0"/>
+                <w:i w:val="0"/>
+                <w:sz w:val="17"/>
+              </w:rPr>
+              <w:t>3</w:t>
+            </w:r>
+          </w:p>
+        </w:tc>
+        <w:tc>
+          <w:tcPr>
+            <w:tcW w:type="dxa" w:w="1994"/>
+          </w:tcPr>
+          <w:p>
+            <w:r>
+              <w:rPr>
+                <w:b w:val="0"/>
+                <w:sz w:val="17"/>
+              </w:rPr>
+            </w:r>
+          </w:p>
+        </w:tc>
+        <w:tc>
+          <w:tcPr>
+            <w:tcW w:type="dxa" w:w="1994"/>
           </w:tcPr>
           <w:p>
             <w:r>
@@ -11169,6 +11230,19 @@
       </w:tr>
     </w:tbl>
     <w:p/>
+    <w:p>
+      <w:pPr>
+        <w:spacing w:after="120"/>
+        <w:jc w:val="both"/>
+      </w:pPr>
+      <w:r>
+        <w:rPr>
+          <w:b w:val="0"/>
+          <w:i w:val="0"/>
+        </w:rPr>
+        <w:t>The total is about 9.5 days of build, as before; the order brings the protection of locked months, governed staging and the controlled fee rulebook into the first four days. Not included: the time to resolve the bootstrap's slow final steps seen on 15 October 2026, which must be fixed before the first release, since each release depends on the bootstrap passing on MAIIC's server.</w:t>
+      </w:r>
+    </w:p>
     <w:p>
       <w:pPr>
         <w:pStyle w:val="Heading2"/>

</xml_diff>

<commit_message>
Staging spec: section 8.9, UAT mode (one maker-checker check for every workflow, production guard, UAT seeding, self-approval label, banner, self-approvals report, handover); decision S11, acceptance 20 to 23; phase 1 now carries UAT mode
Co-Authored-By: Claude Opus 5.5 <noreply@anthropic.com>
</commit_message>
<xml_diff>
--- a/docs/MAIIC_Staging_Module_Specification_v1_2026-10-15.docx
+++ b/docs/MAIIC_Staging_Module_Specification_v1_2026-10-15.docx
@@ -9075,6 +9075,788 @@
     </w:p>
     <w:p>
       <w:pPr>
+        <w:pStyle w:val="Heading3"/>
+      </w:pPr>
+      <w:r>
+        <w:t>8.9 UAT mode: maker-checker relaxed for administrators, safely</w:t>
+      </w:r>
+    </w:p>
+    <w:p>
+      <w:pPr>
+        <w:spacing w:after="120"/>
+        <w:jc w:val="both"/>
+      </w:pPr>
+      <w:r>
+        <w:rPr>
+          <w:b w:val="0"/>
+          <w:i w:val="0"/>
+        </w:rPr>
+        <w:t>During user acceptance testing one administrator needs to move through the workflows without waiting for a second person each time, and at handover the two-person rule must be fully back on. The system already has the switch, but only part of the system honours it and nothing makes it safe to use.</w:t>
+      </w:r>
+    </w:p>
+    <w:p>
+      <w:pPr>
+        <w:spacing w:after="120"/>
+        <w:jc w:val="both"/>
+      </w:pPr>
+      <w:r>
+        <w:rPr>
+          <w:b/>
+          <w:i w:val="0"/>
+        </w:rPr>
+        <w:t>What exists today.</w:t>
+      </w:r>
+      <w:r>
+        <w:rPr>
+          <w:b w:val="0"/>
+          <w:i w:val="0"/>
+        </w:rPr>
+        <w:t xml:space="preserve"> The governed setting </w:t>
+      </w:r>
+      <w:r>
+        <w:rPr>
+          <w:rFonts w:ascii="Consolas" w:hAnsi="Consolas"/>
+          <w:b w:val="0"/>
+          <w:i w:val="0"/>
+          <w:sz w:val="18"/>
+        </w:rPr>
+        <w:t>maker_checker_admin_override</w:t>
+      </w:r>
+      <w:r>
+        <w:rPr>
+          <w:b w:val="0"/>
+          <w:i w:val="0"/>
+        </w:rPr>
+        <w:t xml:space="preserve"> (</w:t>
+      </w:r>
+      <w:r>
+        <w:rPr>
+          <w:b w:val="0"/>
+          <w:i/>
+        </w:rPr>
+        <w:t>Not allowed</w:t>
+      </w:r>
+      <w:r>
+        <w:rPr>
+          <w:b w:val="0"/>
+          <w:i w:val="0"/>
+        </w:rPr>
+        <w:t xml:space="preserve">, the default, or </w:t>
+      </w:r>
+      <w:r>
+        <w:rPr>
+          <w:b w:val="0"/>
+          <w:i/>
+        </w:rPr>
+        <w:t>Allowed for administrators</w:t>
+      </w:r>
+      <w:r>
+        <w:rPr>
+          <w:b w:val="0"/>
+          <w:i w:val="0"/>
+        </w:rPr>
+        <w:t>) lets a user with the admin role approve their own proposal. Six workflows honour it: Governance Centre settings, the EIR lock, fee classification review, SICR triggers, rate resets and the restructure register. The other workflows of section 8.6 refuse a self-approval whatever the setting says, and the fee rulebook has no maker-checker at all until phase 3. The bootstrap approves its own steps under the label "System Bootstrap (automated data-readiness, not a MAIIC approval)", so checking the month-end results needs no human approvals; the override matters only for testing the screens and workflows themselves.</w:t>
+      </w:r>
+    </w:p>
+    <w:p>
+      <w:pPr>
+        <w:spacing w:after="120"/>
+        <w:jc w:val="both"/>
+      </w:pPr>
+      <w:r>
+        <w:rPr>
+          <w:b/>
+          <w:i w:val="0"/>
+        </w:rPr>
+        <w:t>What is missing.</w:t>
+      </w:r>
+      <w:r>
+        <w:rPr>
+          <w:b w:val="0"/>
+          <w:i w:val="0"/>
+        </w:rPr>
+        <w:t xml:space="preserve"> Switching the override on is itself a governed change and needs a second person the first time. Nothing stops it being left on in production. A self-approval is not marked as one. Nothing on screen shows that the two-person rule is relaxed.</w:t>
+      </w:r>
+    </w:p>
+    <w:p>
+      <w:pPr>
+        <w:spacing w:after="120"/>
+        <w:jc w:val="both"/>
+      </w:pPr>
+      <w:r>
+        <w:rPr>
+          <w:b/>
+          <w:i w:val="0"/>
+        </w:rPr>
+        <w:t>What UAT mode adds:</w:t>
+      </w:r>
+    </w:p>
+    <w:tbl>
+      <w:tblPr>
+        <w:tblStyle w:val="TableGrid"/>
+        <w:tblW w:type="auto" w:w="0"/>
+        <w:tblLook w:firstColumn="1" w:firstRow="1" w:lastColumn="0" w:lastRow="0" w:noHBand="0" w:noVBand="1" w:val="04A0"/>
+      </w:tblPr>
+      <w:tblGrid>
+        <w:gridCol w:w="3324"/>
+        <w:gridCol w:w="3324"/>
+        <w:gridCol w:w="3324"/>
+      </w:tblGrid>
+      <w:tr>
+        <w:trPr>
+          <w:cantSplit/>
+          <w:tblHeader/>
+        </w:trPr>
+        <w:tc>
+          <w:tcPr>
+            <w:tcW w:type="dxa" w:w="3324"/>
+            <w:shd w:val="clear" w:color="auto" w:fill="1B2A41"/>
+          </w:tcPr>
+          <w:p>
+            <w:r>
+              <w:rPr>
+                <w:b/>
+                <w:color w:val="FFFFFF"/>
+                <w:sz w:val="17"/>
+              </w:rPr>
+            </w:r>
+            <w:r>
+              <w:rPr>
+                <w:b/>
+                <w:i w:val="0"/>
+                <w:color w:val="FFFFFF"/>
+                <w:sz w:val="17"/>
+              </w:rPr>
+              <w:t>#</w:t>
+            </w:r>
+          </w:p>
+        </w:tc>
+        <w:tc>
+          <w:tcPr>
+            <w:tcW w:type="dxa" w:w="3324"/>
+            <w:shd w:val="clear" w:color="auto" w:fill="1B2A41"/>
+          </w:tcPr>
+          <w:p>
+            <w:r>
+              <w:rPr>
+                <w:b/>
+                <w:color w:val="FFFFFF"/>
+                <w:sz w:val="17"/>
+              </w:rPr>
+            </w:r>
+            <w:r>
+              <w:rPr>
+                <w:b/>
+                <w:i w:val="0"/>
+                <w:color w:val="FFFFFF"/>
+                <w:sz w:val="17"/>
+              </w:rPr>
+              <w:t>Piece</w:t>
+            </w:r>
+          </w:p>
+        </w:tc>
+        <w:tc>
+          <w:tcPr>
+            <w:tcW w:type="dxa" w:w="3324"/>
+            <w:shd w:val="clear" w:color="auto" w:fill="1B2A41"/>
+          </w:tcPr>
+          <w:p>
+            <w:r>
+              <w:rPr>
+                <w:b/>
+                <w:color w:val="FFFFFF"/>
+                <w:sz w:val="17"/>
+              </w:rPr>
+            </w:r>
+            <w:r>
+              <w:rPr>
+                <w:b/>
+                <w:i w:val="0"/>
+                <w:color w:val="FFFFFF"/>
+                <w:sz w:val="17"/>
+              </w:rPr>
+              <w:t>Why</w:t>
+            </w:r>
+          </w:p>
+        </w:tc>
+      </w:tr>
+      <w:tr>
+        <w:trPr>
+          <w:cantSplit/>
+        </w:trPr>
+        <w:tc>
+          <w:tcPr>
+            <w:tcW w:type="dxa" w:w="3324"/>
+          </w:tcPr>
+          <w:p>
+            <w:r>
+              <w:rPr>
+                <w:b w:val="0"/>
+                <w:sz w:val="17"/>
+              </w:rPr>
+            </w:r>
+            <w:r>
+              <w:rPr>
+                <w:b w:val="0"/>
+                <w:i w:val="0"/>
+                <w:sz w:val="17"/>
+              </w:rPr>
+              <w:t>1</w:t>
+            </w:r>
+          </w:p>
+        </w:tc>
+        <w:tc>
+          <w:tcPr>
+            <w:tcW w:type="dxa" w:w="3324"/>
+          </w:tcPr>
+          <w:p>
+            <w:r>
+              <w:rPr>
+                <w:b w:val="0"/>
+                <w:sz w:val="17"/>
+              </w:rPr>
+            </w:r>
+            <w:r>
+              <w:rPr>
+                <w:b/>
+                <w:i w:val="0"/>
+                <w:sz w:val="17"/>
+              </w:rPr>
+              <w:t>One maker-checker check for every workflow.</w:t>
+            </w:r>
+            <w:r>
+              <w:rPr>
+                <w:b w:val="0"/>
+                <w:i w:val="0"/>
+                <w:sz w:val="17"/>
+              </w:rPr>
+              <w:t xml:space="preserve"> The Governance Centre and every workflow of section 8.6 use one shared check, and each honours the override in the same way</w:t>
+            </w:r>
+          </w:p>
+        </w:tc>
+        <w:tc>
+          <w:tcPr>
+            <w:tcW w:type="dxa" w:w="3324"/>
+          </w:tcPr>
+          <w:p>
+            <w:r>
+              <w:rPr>
+                <w:b w:val="0"/>
+                <w:sz w:val="17"/>
+              </w:rPr>
+            </w:r>
+            <w:r>
+              <w:rPr>
+                <w:b w:val="0"/>
+                <w:i w:val="0"/>
+                <w:sz w:val="17"/>
+              </w:rPr>
+              <w:t>Today 6 of about 20 honour it</w:t>
+            </w:r>
+          </w:p>
+        </w:tc>
+      </w:tr>
+      <w:tr>
+        <w:trPr>
+          <w:cantSplit/>
+        </w:trPr>
+        <w:tc>
+          <w:tcPr>
+            <w:tcW w:type="dxa" w:w="3324"/>
+          </w:tcPr>
+          <w:p>
+            <w:r>
+              <w:rPr>
+                <w:b w:val="0"/>
+                <w:sz w:val="17"/>
+              </w:rPr>
+            </w:r>
+            <w:r>
+              <w:rPr>
+                <w:b w:val="0"/>
+                <w:i w:val="0"/>
+                <w:sz w:val="17"/>
+              </w:rPr>
+              <w:t>2</w:t>
+            </w:r>
+          </w:p>
+        </w:tc>
+        <w:tc>
+          <w:tcPr>
+            <w:tcW w:type="dxa" w:w="3324"/>
+          </w:tcPr>
+          <w:p>
+            <w:r>
+              <w:rPr>
+                <w:b w:val="0"/>
+                <w:sz w:val="17"/>
+              </w:rPr>
+            </w:r>
+            <w:r>
+              <w:rPr>
+                <w:b/>
+                <w:i w:val="0"/>
+                <w:sz w:val="17"/>
+              </w:rPr>
+              <w:t>A server guard.</w:t>
+            </w:r>
+            <w:r>
+              <w:rPr>
+                <w:b w:val="0"/>
+                <w:i w:val="0"/>
+                <w:sz w:val="17"/>
+              </w:rPr>
+              <w:t xml:space="preserve"> The override can work only when the server's environment file declares a non-production environment (for example </w:t>
+            </w:r>
+            <w:r>
+              <w:rPr>
+                <w:rFonts w:ascii="Consolas" w:hAnsi="Consolas"/>
+                <w:b w:val="0"/>
+                <w:i w:val="0"/>
+                <w:sz w:val="17"/>
+              </w:rPr>
+              <w:t>APP_ENV=uat</w:t>
+            </w:r>
+            <w:r>
+              <w:rPr>
+                <w:b w:val="0"/>
+                <w:i w:val="0"/>
+                <w:sz w:val="17"/>
+              </w:rPr>
+              <w:t xml:space="preserve">) </w:t>
+            </w:r>
+            <w:r>
+              <w:rPr>
+                <w:b/>
+                <w:i w:val="0"/>
+                <w:sz w:val="17"/>
+              </w:rPr>
+              <w:t>and</w:t>
+            </w:r>
+            <w:r>
+              <w:rPr>
+                <w:b w:val="0"/>
+                <w:i w:val="0"/>
+                <w:sz w:val="17"/>
+              </w:rPr>
+              <w:t xml:space="preserve"> the governed setting allows it. Under a production environment it is refused whatever the setting says, and the option cannot be approved there</w:t>
+            </w:r>
+          </w:p>
+        </w:tc>
+        <w:tc>
+          <w:tcPr>
+            <w:tcW w:type="dxa" w:w="3324"/>
+          </w:tcPr>
+          <w:p>
+            <w:r>
+              <w:rPr>
+                <w:b w:val="0"/>
+                <w:sz w:val="17"/>
+              </w:rPr>
+            </w:r>
+            <w:r>
+              <w:rPr>
+                <w:b w:val="0"/>
+                <w:i w:val="0"/>
+                <w:sz w:val="17"/>
+              </w:rPr>
+              <w:t>It cannot be left on, or switched on, in production</w:t>
+            </w:r>
+          </w:p>
+        </w:tc>
+      </w:tr>
+      <w:tr>
+        <w:trPr>
+          <w:cantSplit/>
+        </w:trPr>
+        <w:tc>
+          <w:tcPr>
+            <w:tcW w:type="dxa" w:w="3324"/>
+          </w:tcPr>
+          <w:p>
+            <w:r>
+              <w:rPr>
+                <w:b w:val="0"/>
+                <w:sz w:val="17"/>
+              </w:rPr>
+            </w:r>
+            <w:r>
+              <w:rPr>
+                <w:b w:val="0"/>
+                <w:i w:val="0"/>
+                <w:sz w:val="17"/>
+              </w:rPr>
+              <w:t>3</w:t>
+            </w:r>
+          </w:p>
+        </w:tc>
+        <w:tc>
+          <w:tcPr>
+            <w:tcW w:type="dxa" w:w="3324"/>
+          </w:tcPr>
+          <w:p>
+            <w:r>
+              <w:rPr>
+                <w:b w:val="0"/>
+                <w:sz w:val="17"/>
+              </w:rPr>
+            </w:r>
+            <w:r>
+              <w:rPr>
+                <w:b/>
+                <w:i w:val="0"/>
+                <w:sz w:val="17"/>
+              </w:rPr>
+              <w:t>Seeded in UAT.</w:t>
+            </w:r>
+            <w:r>
+              <w:rPr>
+                <w:b w:val="0"/>
+                <w:i w:val="0"/>
+                <w:sz w:val="17"/>
+              </w:rPr>
+              <w:t xml:space="preserve"> Installing the UAT environment seeds the override as allowed, labelled as seeded for UAT, so no second person is needed to start</w:t>
+            </w:r>
+          </w:p>
+        </w:tc>
+        <w:tc>
+          <w:tcPr>
+            <w:tcW w:type="dxa" w:w="3324"/>
+          </w:tcPr>
+          <w:p>
+            <w:r>
+              <w:rPr>
+                <w:b w:val="0"/>
+                <w:sz w:val="17"/>
+              </w:rPr>
+            </w:r>
+            <w:r>
+              <w:rPr>
+                <w:b w:val="0"/>
+                <w:i w:val="0"/>
+                <w:sz w:val="17"/>
+              </w:rPr>
+              <w:t>Removes the first-switch problem</w:t>
+            </w:r>
+          </w:p>
+        </w:tc>
+      </w:tr>
+      <w:tr>
+        <w:trPr>
+          <w:cantSplit/>
+        </w:trPr>
+        <w:tc>
+          <w:tcPr>
+            <w:tcW w:type="dxa" w:w="3324"/>
+          </w:tcPr>
+          <w:p>
+            <w:r>
+              <w:rPr>
+                <w:b w:val="0"/>
+                <w:sz w:val="17"/>
+              </w:rPr>
+            </w:r>
+            <w:r>
+              <w:rPr>
+                <w:b w:val="0"/>
+                <w:i w:val="0"/>
+                <w:sz w:val="17"/>
+              </w:rPr>
+              <w:t>4</w:t>
+            </w:r>
+          </w:p>
+        </w:tc>
+        <w:tc>
+          <w:tcPr>
+            <w:tcW w:type="dxa" w:w="3324"/>
+          </w:tcPr>
+          <w:p>
+            <w:r>
+              <w:rPr>
+                <w:b w:val="0"/>
+                <w:sz w:val="17"/>
+              </w:rPr>
+            </w:r>
+            <w:r>
+              <w:rPr>
+                <w:b/>
+                <w:i w:val="0"/>
+                <w:sz w:val="17"/>
+              </w:rPr>
+              <w:t>Every self-approval labelled.</w:t>
+            </w:r>
+            <w:r>
+              <w:rPr>
+                <w:b w:val="0"/>
+                <w:i w:val="0"/>
+                <w:sz w:val="17"/>
+              </w:rPr>
+              <w:t xml:space="preserve"> The record and the audit entry say "UAT self-approval (administrator override)", with the override setting in force (the "Override used" event of section 8.2)</w:t>
+            </w:r>
+          </w:p>
+        </w:tc>
+        <w:tc>
+          <w:tcPr>
+            <w:tcW w:type="dxa" w:w="3324"/>
+          </w:tcPr>
+          <w:p>
+            <w:r>
+              <w:rPr>
+                <w:b w:val="0"/>
+                <w:sz w:val="17"/>
+              </w:rPr>
+            </w:r>
+            <w:r>
+              <w:rPr>
+                <w:b w:val="0"/>
+                <w:i w:val="0"/>
+                <w:sz w:val="17"/>
+              </w:rPr>
+              <w:t>A test approval can always be told from a real one</w:t>
+            </w:r>
+          </w:p>
+        </w:tc>
+      </w:tr>
+      <w:tr>
+        <w:trPr>
+          <w:cantSplit/>
+        </w:trPr>
+        <w:tc>
+          <w:tcPr>
+            <w:tcW w:type="dxa" w:w="3324"/>
+          </w:tcPr>
+          <w:p>
+            <w:r>
+              <w:rPr>
+                <w:b w:val="0"/>
+                <w:sz w:val="17"/>
+              </w:rPr>
+            </w:r>
+            <w:r>
+              <w:rPr>
+                <w:b w:val="0"/>
+                <w:i w:val="0"/>
+                <w:sz w:val="17"/>
+              </w:rPr>
+              <w:t>5</w:t>
+            </w:r>
+          </w:p>
+        </w:tc>
+        <w:tc>
+          <w:tcPr>
+            <w:tcW w:type="dxa" w:w="3324"/>
+          </w:tcPr>
+          <w:p>
+            <w:r>
+              <w:rPr>
+                <w:b w:val="0"/>
+                <w:sz w:val="17"/>
+              </w:rPr>
+            </w:r>
+            <w:r>
+              <w:rPr>
+                <w:b/>
+                <w:i w:val="0"/>
+                <w:sz w:val="17"/>
+              </w:rPr>
+              <w:t>A banner on every screen</w:t>
+            </w:r>
+            <w:r>
+              <w:rPr>
+                <w:b w:val="0"/>
+                <w:i w:val="0"/>
+                <w:sz w:val="17"/>
+              </w:rPr>
+              <w:t xml:space="preserve"> while the override is in force: </w:t>
+            </w:r>
+            <w:r>
+              <w:rPr>
+                <w:b w:val="0"/>
+                <w:i/>
+                <w:sz w:val="17"/>
+              </w:rPr>
+              <w:t>"UAT mode: maker-checker relaxed for administrators"</w:t>
+            </w:r>
+          </w:p>
+        </w:tc>
+        <w:tc>
+          <w:tcPr>
+            <w:tcW w:type="dxa" w:w="3324"/>
+          </w:tcPr>
+          <w:p>
+            <w:r>
+              <w:rPr>
+                <w:b w:val="0"/>
+                <w:sz w:val="17"/>
+              </w:rPr>
+            </w:r>
+            <w:r>
+              <w:rPr>
+                <w:b w:val="0"/>
+                <w:i w:val="0"/>
+                <w:sz w:val="17"/>
+              </w:rPr>
+              <w:t>Nobody mistakes UAT for live use</w:t>
+            </w:r>
+          </w:p>
+        </w:tc>
+      </w:tr>
+      <w:tr>
+        <w:trPr>
+          <w:cantSplit/>
+        </w:trPr>
+        <w:tc>
+          <w:tcPr>
+            <w:tcW w:type="dxa" w:w="3324"/>
+          </w:tcPr>
+          <w:p>
+            <w:r>
+              <w:rPr>
+                <w:b w:val="0"/>
+                <w:sz w:val="17"/>
+              </w:rPr>
+            </w:r>
+            <w:r>
+              <w:rPr>
+                <w:b w:val="0"/>
+                <w:i w:val="0"/>
+                <w:sz w:val="17"/>
+              </w:rPr>
+              <w:t>6</w:t>
+            </w:r>
+          </w:p>
+        </w:tc>
+        <w:tc>
+          <w:tcPr>
+            <w:tcW w:type="dxa" w:w="3324"/>
+          </w:tcPr>
+          <w:p>
+            <w:r>
+              <w:rPr>
+                <w:b w:val="0"/>
+                <w:sz w:val="17"/>
+              </w:rPr>
+            </w:r>
+            <w:r>
+              <w:rPr>
+                <w:b/>
+                <w:i w:val="0"/>
+                <w:sz w:val="17"/>
+              </w:rPr>
+              <w:t>A self-approvals report</w:t>
+            </w:r>
+            <w:r>
+              <w:rPr>
+                <w:b w:val="0"/>
+                <w:i w:val="0"/>
+                <w:sz w:val="17"/>
+              </w:rPr>
+              <w:t xml:space="preserve"> of everything decided under the override, by workflow, person and date, exportable</w:t>
+            </w:r>
+          </w:p>
+        </w:tc>
+        <w:tc>
+          <w:tcPr>
+            <w:tcW w:type="dxa" w:w="3324"/>
+          </w:tcPr>
+          <w:p>
+            <w:r>
+              <w:rPr>
+                <w:b w:val="0"/>
+                <w:sz w:val="17"/>
+              </w:rPr>
+            </w:r>
+            <w:r>
+              <w:rPr>
+                <w:b w:val="0"/>
+                <w:i w:val="0"/>
+                <w:sz w:val="17"/>
+              </w:rPr>
+              <w:t>Shows at handover exactly what was approved without a second person</w:t>
+            </w:r>
+          </w:p>
+        </w:tc>
+      </w:tr>
+      <w:tr>
+        <w:trPr>
+          <w:cantSplit/>
+        </w:trPr>
+        <w:tc>
+          <w:tcPr>
+            <w:tcW w:type="dxa" w:w="3324"/>
+          </w:tcPr>
+          <w:p>
+            <w:r>
+              <w:rPr>
+                <w:b w:val="0"/>
+                <w:sz w:val="17"/>
+              </w:rPr>
+            </w:r>
+            <w:r>
+              <w:rPr>
+                <w:b w:val="0"/>
+                <w:i w:val="0"/>
+                <w:sz w:val="17"/>
+              </w:rPr>
+              <w:t>7</w:t>
+            </w:r>
+          </w:p>
+        </w:tc>
+        <w:tc>
+          <w:tcPr>
+            <w:tcW w:type="dxa" w:w="3324"/>
+          </w:tcPr>
+          <w:p>
+            <w:r>
+              <w:rPr>
+                <w:b w:val="0"/>
+                <w:sz w:val="17"/>
+              </w:rPr>
+            </w:r>
+            <w:r>
+              <w:rPr>
+                <w:b/>
+                <w:i w:val="0"/>
+                <w:sz w:val="17"/>
+              </w:rPr>
+              <w:t>Handover.</w:t>
+            </w:r>
+            <w:r>
+              <w:rPr>
+                <w:b w:val="0"/>
+                <w:i w:val="0"/>
+                <w:sz w:val="17"/>
+              </w:rPr>
+              <w:t xml:space="preserve"> The production database starts clean, so UAT approvals never carry into it. If a UAT database were ever promoted to production, every item on the self-approvals report must be re-approved by two people first. Switching the override off is an ordinary governed change with a second person, recorded with the handover sign-off and its documents</w:t>
+            </w:r>
+          </w:p>
+        </w:tc>
+        <w:tc>
+          <w:tcPr>
+            <w:tcW w:type="dxa" w:w="3324"/>
+          </w:tcPr>
+          <w:p>
+            <w:r>
+              <w:rPr>
+                <w:b w:val="0"/>
+                <w:sz w:val="17"/>
+              </w:rPr>
+            </w:r>
+            <w:r>
+              <w:rPr>
+                <w:b w:val="0"/>
+                <w:i w:val="0"/>
+                <w:sz w:val="17"/>
+              </w:rPr>
+              <w:t>The two-person rule is fully on from the first day of live use</w:t>
+            </w:r>
+          </w:p>
+        </w:tc>
+      </w:tr>
+    </w:tbl>
+    <w:p/>
+    <w:p>
+      <w:pPr>
         <w:pStyle w:val="Heading2"/>
       </w:pPr>
       <w:r>
@@ -10081,6 +10863,95 @@
                 <w:sz w:val="17"/>
               </w:rPr>
               <w:t>Yes: it is a small change and protects the locked months now</w:t>
+            </w:r>
+          </w:p>
+        </w:tc>
+      </w:tr>
+      <w:tr>
+        <w:trPr>
+          <w:cantSplit/>
+        </w:trPr>
+        <w:tc>
+          <w:tcPr>
+            <w:tcW w:type="dxa" w:w="2493"/>
+          </w:tcPr>
+          <w:p>
+            <w:r>
+              <w:rPr>
+                <w:b w:val="0"/>
+                <w:sz w:val="17"/>
+              </w:rPr>
+            </w:r>
+            <w:r>
+              <w:rPr>
+                <w:b w:val="0"/>
+                <w:i w:val="0"/>
+                <w:sz w:val="17"/>
+              </w:rPr>
+              <w:t>S11</w:t>
+            </w:r>
+          </w:p>
+        </w:tc>
+        <w:tc>
+          <w:tcPr>
+            <w:tcW w:type="dxa" w:w="2493"/>
+          </w:tcPr>
+          <w:p>
+            <w:r>
+              <w:rPr>
+                <w:b w:val="0"/>
+                <w:sz w:val="17"/>
+              </w:rPr>
+            </w:r>
+            <w:r>
+              <w:rPr>
+                <w:b w:val="0"/>
+                <w:i w:val="0"/>
+                <w:sz w:val="17"/>
+              </w:rPr>
+              <w:t>Which environments may use UAT mode, and who switches it off at handover</w:t>
+            </w:r>
+          </w:p>
+        </w:tc>
+        <w:tc>
+          <w:tcPr>
+            <w:tcW w:type="dxa" w:w="2493"/>
+          </w:tcPr>
+          <w:p>
+            <w:r>
+              <w:rPr>
+                <w:b w:val="0"/>
+                <w:sz w:val="17"/>
+              </w:rPr>
+            </w:r>
+            <w:r>
+              <w:rPr>
+                <w:b w:val="0"/>
+                <w:i w:val="0"/>
+                <w:sz w:val="17"/>
+              </w:rPr>
+              <w:t>MAIIC ICT, with Dr Thom</w:t>
+            </w:r>
+          </w:p>
+        </w:tc>
+        <w:tc>
+          <w:tcPr>
+            <w:tcW w:type="dxa" w:w="2493"/>
+          </w:tcPr>
+          <w:p>
+            <w:r>
+              <w:rPr>
+                <w:b w:val="0"/>
+                <w:sz w:val="17"/>
+              </w:rPr>
+            </w:r>
+            <w:r>
+              <w:rPr>
+                <w:b w:val="0"/>
+                <w:i w:val="0"/>
+                <w:sz w:val="17"/>
+              </w:rPr>
+              <w:t>The UAT environment only; the handover sign-off records the switch-off, approved by a second person</w:t>
             </w:r>
           </w:p>
         </w:tc>
@@ -10477,6 +11348,86 @@
     </w:p>
     <w:p>
       <w:pPr>
+        <w:pStyle w:val="ListNumber"/>
+        <w:jc w:val="both"/>
+      </w:pPr>
+      <w:r>
+        <w:rPr>
+          <w:b/>
+          <w:i w:val="0"/>
+        </w:rPr>
+        <w:t>One check.</w:t>
+      </w:r>
+      <w:r>
+        <w:rPr>
+          <w:b w:val="0"/>
+          <w:i w:val="0"/>
+        </w:rPr>
+        <w:t xml:space="preserve"> Every workflow of section 8.6 and the Governance Centre honour the override through the same check; with the override not allowed, every one refuses a self-approval.</w:t>
+      </w:r>
+    </w:p>
+    <w:p>
+      <w:pPr>
+        <w:pStyle w:val="ListNumber"/>
+        <w:jc w:val="both"/>
+      </w:pPr>
+      <w:r>
+        <w:rPr>
+          <w:b/>
+          <w:i w:val="0"/>
+        </w:rPr>
+        <w:t>Production guard.</w:t>
+      </w:r>
+      <w:r>
+        <w:rPr>
+          <w:b w:val="0"/>
+          <w:i w:val="0"/>
+        </w:rPr>
+        <w:t xml:space="preserve"> Under a production environment a self-approval is refused even with the setting allowed, and the allowing option cannot be approved.</w:t>
+      </w:r>
+    </w:p>
+    <w:p>
+      <w:pPr>
+        <w:pStyle w:val="ListNumber"/>
+        <w:jc w:val="both"/>
+      </w:pPr>
+      <w:r>
+        <w:rPr>
+          <w:b/>
+          <w:i w:val="0"/>
+        </w:rPr>
+        <w:t>Labelled.</w:t>
+      </w:r>
+      <w:r>
+        <w:rPr>
+          <w:b w:val="0"/>
+          <w:i w:val="0"/>
+        </w:rPr>
+        <w:t xml:space="preserve"> Every approval made under the override carries the UAT self-approval label on the record and in the audit log, and appears on the self-approvals report; the banner shows on every screen while the override is in force.</w:t>
+      </w:r>
+    </w:p>
+    <w:p>
+      <w:pPr>
+        <w:pStyle w:val="ListNumber"/>
+        <w:jc w:val="both"/>
+      </w:pPr>
+      <w:r>
+        <w:rPr>
+          <w:b/>
+          <w:i w:val="0"/>
+        </w:rPr>
+        <w:t>Handover.</w:t>
+      </w:r>
+      <w:r>
+        <w:rPr>
+          <w:b w:val="0"/>
+          <w:i w:val="0"/>
+        </w:rPr>
+        <w:t xml:space="preserve"> Switching the override off needs a second person; afterwards every workflow refuses a self-approval.</w:t>
+      </w:r>
+    </w:p>
+    <w:p>
+      <w:pPr>
         <w:pStyle w:val="Heading2"/>
       </w:pPr>
       <w:r>
@@ -10656,7 +11607,7 @@
                 <w:i w:val="0"/>
                 <w:sz w:val="17"/>
               </w:rPr>
-              <w:t>1. Protect the locked months</w:t>
+              <w:t>1. Protect the locked months, and UAT mode</w:t>
             </w:r>
           </w:p>
         </w:tc>
@@ -10677,7 +11628,7 @@
                 <w:i w:val="0"/>
                 <w:sz w:val="17"/>
               </w:rPr>
-              <w:t>The no-back-dating rule: no change to a governed setting or rule takes effect inside a locked month except through reopen-and-restate with documents (decision S10)</w:t>
+              <w:t>The no-back-dating rule: no change to a governed setting or rule takes effect inside a locked month except through reopen-and-restate with documents (decision S10). UAT mode: one maker-checker check for every workflow, the production guard, the UAT seeding, the self-approval label, the banner and the self-approvals report (decision S11). Both touch the governance service and share one release</w:t>
             </w:r>
           </w:p>
         </w:tc>
@@ -10698,7 +11649,7 @@
                 <w:i w:val="0"/>
                 <w:sz w:val="17"/>
               </w:rPr>
-              <w:t>8.8, item 4</w:t>
+              <w:t>8.8 item 4, 8.9</w:t>
             </w:r>
           </w:p>
         </w:tc>
@@ -10719,7 +11670,7 @@
                 <w:i w:val="0"/>
                 <w:sz w:val="17"/>
               </w:rPr>
-              <w:t>18</w:t>
+              <w:t>18, 20 to 23</w:t>
             </w:r>
           </w:p>
         </w:tc>
@@ -10740,7 +11691,7 @@
                 <w:i w:val="0"/>
                 <w:sz w:val="17"/>
               </w:rPr>
-              <w:t>About half a day</w:t>
+              <w:t>About 2 to 2.5 days</w:t>
             </w:r>
           </w:p>
         </w:tc>
@@ -11240,7 +12191,7 @@
           <w:b w:val="0"/>
           <w:i w:val="0"/>
         </w:rPr>
-        <w:t>The total is about 9.5 days of build, as before; the order brings the protection of locked months, governed staging and the controlled fee rulebook into the first four days. Not included: the time to resolve the bootstrap's slow final steps seen on 15 October 2026, which must be fixed before the first release, since each release depends on the bootstrap passing on MAIIC's server.</w:t>
+        <w:t>The total is about 11 to 11.5 days of build. The first phase now also brings UAT mode, so that testing can run on MAIIC's server without waiting for a second person on each step; the first three phases, about 6 days, bring the protection of locked months, UAT mode, governed staging and the controlled fee rulebook. The fee rulebook joins the shared maker-checker check of UAT mode when phase 3 gives it maker-checker. Not included: the time to resolve the bootstrap's slow final steps seen on 15 October 2026, which must be fixed before the first release, since each release depends on the bootstrap passing on MAIIC's server.</w:t>
       </w:r>
     </w:p>
     <w:p>
@@ -11969,6 +12920,53 @@
                 <w:sz w:val="17"/>
               </w:rPr>
               <w:t>The run whose figures were reported for a month, named when the month is locked</w:t>
+            </w:r>
+          </w:p>
+        </w:tc>
+      </w:tr>
+      <w:tr>
+        <w:trPr>
+          <w:cantSplit/>
+        </w:trPr>
+        <w:tc>
+          <w:tcPr>
+            <w:tcW w:type="dxa" w:w="4986"/>
+          </w:tcPr>
+          <w:p>
+            <w:r>
+              <w:rPr>
+                <w:b w:val="0"/>
+                <w:sz w:val="17"/>
+              </w:rPr>
+            </w:r>
+            <w:r>
+              <w:rPr>
+                <w:b/>
+                <w:i w:val="0"/>
+                <w:sz w:val="17"/>
+              </w:rPr>
+              <w:t>UAT mode</w:t>
+            </w:r>
+          </w:p>
+        </w:tc>
+        <w:tc>
+          <w:tcPr>
+            <w:tcW w:type="dxa" w:w="4986"/>
+          </w:tcPr>
+          <w:p>
+            <w:r>
+              <w:rPr>
+                <w:b w:val="0"/>
+                <w:sz w:val="17"/>
+              </w:rPr>
+            </w:r>
+            <w:r>
+              <w:rPr>
+                <w:b w:val="0"/>
+                <w:i w:val="0"/>
+                <w:sz w:val="17"/>
+              </w:rPr>
+              <w:t>The non-production setting in which administrators may approve their own proposals, every such approval labelled and reported, never possible in production</w:t>
             </w:r>
           </w:p>
         </w:tc>

</xml_diff>

<commit_message>
Staging spec: section 11.1, the build runs on its own branch (staging-governance), with a confirmation at the start and end of each of eleven sections, and merges once when the complete build is confirmed
Co-Authored-By: Claude Opus 5.5 <noreply@anthropic.com>
</commit_message>
<xml_diff>
--- a/docs/MAIIC_Staging_Module_Specification_v1_2026-10-15.docx
+++ b/docs/MAIIC_Staging_Module_Specification_v1_2026-10-15.docx
@@ -11444,7 +11444,7 @@
           <w:b w:val="0"/>
           <w:i w:val="0"/>
         </w:rPr>
-        <w:t>The work is done in four phases, so that the parts that protect the locked months and unblock decisions arrive first. Each phase is tested, released to MAIIC's server by the release steps of the integration document (section 2.2: push, pull, migrate, bootstrap with the nine ties passing) and only then followed by the next. The sizes are Dupleix's estimates of the build, before release.</w:t>
+        <w:t>The work is done in four phases, in the order below, so that the parts that protect the locked months and unblock decisions are built first. The whole build is done on its own branch and merged once, when every section is complete and confirmed (section 11.1). The sizes are Dupleix's estimates of the build.</w:t>
       </w:r>
     </w:p>
     <w:tbl>
@@ -11789,7 +11789,7 @@
                 <w:i w:val="0"/>
                 <w:sz w:val="17"/>
               </w:rPr>
-              <w:t>; the comparison run with its tables, command, panel, export and audit-workbook sheet; then the comparison runs for December 2025 and September 2026 on MAIIC's server</w:t>
+              <w:t>; the comparison run with its tables, command, panel, export and audit-workbook sheet; then the comparison runs for December 2025 and September 2026 on the branch's bootstrap database</w:t>
             </w:r>
           </w:p>
         </w:tc>
@@ -12191,7 +12191,1310 @@
           <w:b w:val="0"/>
           <w:i w:val="0"/>
         </w:rPr>
-        <w:t>The total is about 11 to 11.5 days of build. The first phase now also brings UAT mode, so that testing can run on MAIIC's server without waiting for a second person on each step; the first three phases, about 6 days, bring the protection of locked months, UAT mode, governed staging and the controlled fee rulebook. The fee rulebook joins the shared maker-checker check of UAT mode when phase 3 gives it maker-checker. Not included: the time to resolve the bootstrap's slow final steps seen on 15 October 2026, which must be fixed before the first release, since each release depends on the bootstrap passing on MAIIC's server.</w:t>
+        <w:t>The total is about 11 to 11.5 days of build. The first phase also brings UAT mode, so that once the build is released, testing on MAIIC's server can run without waiting for a second person on each step; the first three phases, about 6 days, bring the protection of locked months, UAT mode, governed staging and the controlled fee rulebook. The fee rulebook joins the shared maker-checker check of UAT mode when phase 3 gives it maker-checker. Not included: the time to resolve the bootstrap's slow final steps seen on 15 October 2026, which must be fixed before the merge, since the merge and the release depend on the bootstrap passing.</w:t>
+      </w:r>
+    </w:p>
+    <w:p>
+      <w:pPr>
+        <w:pStyle w:val="Heading3"/>
+      </w:pPr>
+      <w:r>
+        <w:t>11.1 How the build is run: one branch, a confirmation at the start and end of each section</w:t>
+      </w:r>
+    </w:p>
+    <w:p>
+      <w:pPr>
+        <w:spacing w:after="120"/>
+        <w:jc w:val="both"/>
+      </w:pPr>
+      <w:r>
+        <w:rPr>
+          <w:b/>
+          <w:i w:val="0"/>
+        </w:rPr>
+        <w:t>One branch.</w:t>
+      </w:r>
+      <w:r>
+        <w:rPr>
+          <w:b w:val="0"/>
+          <w:i w:val="0"/>
+        </w:rPr>
+        <w:t xml:space="preserve"> The whole build is done on a branch of its own, </w:t>
+      </w:r>
+      <w:r>
+        <w:rPr>
+          <w:rFonts w:ascii="Consolas" w:hAnsi="Consolas"/>
+          <w:b w:val="0"/>
+          <w:i w:val="0"/>
+          <w:sz w:val="18"/>
+        </w:rPr>
+        <w:t>staging-governance</w:t>
+      </w:r>
+      <w:r>
+        <w:rPr>
+          <w:b w:val="0"/>
+          <w:i w:val="0"/>
+        </w:rPr>
+        <w:t>, taken from the main development branch (</w:t>
+      </w:r>
+      <w:r>
+        <w:rPr>
+          <w:rFonts w:ascii="Consolas" w:hAnsi="Consolas"/>
+          <w:b w:val="0"/>
+          <w:i w:val="0"/>
+          <w:sz w:val="18"/>
+        </w:rPr>
+        <w:t>eir_revenue_recognition</w:t>
+      </w:r>
+      <w:r>
+        <w:rPr>
+          <w:b w:val="0"/>
+          <w:i w:val="0"/>
+        </w:rPr>
+        <w:t xml:space="preserve">) when the build starts. Nothing from it reaches the main branch, </w:t>
+      </w:r>
+      <w:r>
+        <w:rPr>
+          <w:rFonts w:ascii="Consolas" w:hAnsi="Consolas"/>
+          <w:b w:val="0"/>
+          <w:i w:val="0"/>
+          <w:sz w:val="18"/>
+        </w:rPr>
+        <w:t>master</w:t>
+      </w:r>
+      <w:r>
+        <w:rPr>
+          <w:b w:val="0"/>
+          <w:i w:val="0"/>
+        </w:rPr>
+        <w:t xml:space="preserve"> or MAIIC's server until the complete build is finished, tested and confirmed. The branch is pushed to the repository after each section so that the work is backed up and visible, but it is not merged. It is brought up to date with the main branch (rebased) at the start of each section, so that colleagues' work in the same files is taken in as it happens and the final merge is clean.</w:t>
+      </w:r>
+    </w:p>
+    <w:p>
+      <w:pPr>
+        <w:spacing w:after="120"/>
+        <w:jc w:val="both"/>
+      </w:pPr>
+      <w:r>
+        <w:rPr>
+          <w:b/>
+          <w:i w:val="0"/>
+        </w:rPr>
+        <w:t>A confirmation before each section starts.</w:t>
+      </w:r>
+      <w:r>
+        <w:rPr>
+          <w:b w:val="0"/>
+          <w:i w:val="0"/>
+        </w:rPr>
+        <w:t xml:space="preserve"> Before work on a section begins, Dupleix states what the section will build, the files it will change, the tests it will add and its estimated size, and waits for Edward's confirmation to start. A section can be deferred, reordered or narrowed at this point.</w:t>
+      </w:r>
+    </w:p>
+    <w:p>
+      <w:pPr>
+        <w:spacing w:after="120"/>
+        <w:jc w:val="both"/>
+      </w:pPr>
+      <w:r>
+        <w:rPr>
+          <w:b/>
+          <w:i w:val="0"/>
+        </w:rPr>
+        <w:t>A confirmation when each section ends.</w:t>
+      </w:r>
+      <w:r>
+        <w:rPr>
+          <w:b w:val="0"/>
+          <w:i w:val="0"/>
+        </w:rPr>
+        <w:t xml:space="preserve"> When a section is built, Dupleix reports what was built, the commits, the tests and their results, the bootstrap result on the branch (the nine golden ties), and anything found along the way that changes the plan, and waits for Edward's confirmation that the section is complete. Only then does the next section start. A section that is not confirmed is reworked on the branch.</w:t>
+      </w:r>
+    </w:p>
+    <w:p>
+      <w:pPr>
+        <w:spacing w:after="120"/>
+        <w:jc w:val="both"/>
+      </w:pPr>
+      <w:r>
+        <w:rPr>
+          <w:b/>
+          <w:i w:val="0"/>
+        </w:rPr>
+        <w:t>The sections, in order.</w:t>
+      </w:r>
+      <w:r>
+        <w:rPr>
+          <w:b w:val="0"/>
+          <w:i w:val="0"/>
+        </w:rPr>
+        <w:t xml:space="preserve"> Each row is one start-and-end confirmation:</w:t>
+      </w:r>
+    </w:p>
+    <w:tbl>
+      <w:tblPr>
+        <w:tblStyle w:val="TableGrid"/>
+        <w:tblW w:type="auto" w:w="0"/>
+        <w:tblLook w:firstColumn="1" w:firstRow="1" w:lastColumn="0" w:lastRow="0" w:noHBand="0" w:noVBand="1" w:val="04A0"/>
+      </w:tblPr>
+      <w:tblGrid>
+        <w:gridCol w:w="2493"/>
+        <w:gridCol w:w="2493"/>
+        <w:gridCol w:w="2493"/>
+        <w:gridCol w:w="2493"/>
+      </w:tblGrid>
+      <w:tr>
+        <w:trPr>
+          <w:cantSplit/>
+          <w:tblHeader/>
+        </w:trPr>
+        <w:tc>
+          <w:tcPr>
+            <w:tcW w:type="dxa" w:w="2493"/>
+            <w:shd w:val="clear" w:color="auto" w:fill="1B2A41"/>
+          </w:tcPr>
+          <w:p>
+            <w:r>
+              <w:rPr>
+                <w:b/>
+                <w:color w:val="FFFFFF"/>
+                <w:sz w:val="17"/>
+              </w:rPr>
+            </w:r>
+            <w:r>
+              <w:rPr>
+                <w:b/>
+                <w:i w:val="0"/>
+                <w:color w:val="FFFFFF"/>
+                <w:sz w:val="17"/>
+              </w:rPr>
+              <w:t>#</w:t>
+            </w:r>
+          </w:p>
+        </w:tc>
+        <w:tc>
+          <w:tcPr>
+            <w:tcW w:type="dxa" w:w="2493"/>
+            <w:shd w:val="clear" w:color="auto" w:fill="1B2A41"/>
+          </w:tcPr>
+          <w:p>
+            <w:r>
+              <w:rPr>
+                <w:b/>
+                <w:color w:val="FFFFFF"/>
+                <w:sz w:val="17"/>
+              </w:rPr>
+            </w:r>
+            <w:r>
+              <w:rPr>
+                <w:b/>
+                <w:i w:val="0"/>
+                <w:color w:val="FFFFFF"/>
+                <w:sz w:val="17"/>
+              </w:rPr>
+              <w:t>Section</w:t>
+            </w:r>
+          </w:p>
+        </w:tc>
+        <w:tc>
+          <w:tcPr>
+            <w:tcW w:type="dxa" w:w="2493"/>
+            <w:shd w:val="clear" w:color="auto" w:fill="1B2A41"/>
+          </w:tcPr>
+          <w:p>
+            <w:r>
+              <w:rPr>
+                <w:b/>
+                <w:color w:val="FFFFFF"/>
+                <w:sz w:val="17"/>
+              </w:rPr>
+            </w:r>
+            <w:r>
+              <w:rPr>
+                <w:b/>
+                <w:i w:val="0"/>
+                <w:color w:val="FFFFFF"/>
+                <w:sz w:val="17"/>
+              </w:rPr>
+              <w:t>Phase</w:t>
+            </w:r>
+          </w:p>
+        </w:tc>
+        <w:tc>
+          <w:tcPr>
+            <w:tcW w:type="dxa" w:w="2493"/>
+            <w:shd w:val="clear" w:color="auto" w:fill="1B2A41"/>
+          </w:tcPr>
+          <w:p>
+            <w:r>
+              <w:rPr>
+                <w:b/>
+                <w:color w:val="FFFFFF"/>
+                <w:sz w:val="17"/>
+              </w:rPr>
+            </w:r>
+            <w:r>
+              <w:rPr>
+                <w:b/>
+                <w:i w:val="0"/>
+                <w:color w:val="FFFFFF"/>
+                <w:sz w:val="17"/>
+              </w:rPr>
+              <w:t>Acceptance tests closed</w:t>
+            </w:r>
+          </w:p>
+        </w:tc>
+      </w:tr>
+      <w:tr>
+        <w:trPr>
+          <w:cantSplit/>
+        </w:trPr>
+        <w:tc>
+          <w:tcPr>
+            <w:tcW w:type="dxa" w:w="2493"/>
+          </w:tcPr>
+          <w:p>
+            <w:r>
+              <w:rPr>
+                <w:b w:val="0"/>
+                <w:sz w:val="17"/>
+              </w:rPr>
+            </w:r>
+            <w:r>
+              <w:rPr>
+                <w:b w:val="0"/>
+                <w:i w:val="0"/>
+                <w:sz w:val="17"/>
+              </w:rPr>
+              <w:t>1</w:t>
+            </w:r>
+          </w:p>
+        </w:tc>
+        <w:tc>
+          <w:tcPr>
+            <w:tcW w:type="dxa" w:w="2493"/>
+          </w:tcPr>
+          <w:p>
+            <w:r>
+              <w:rPr>
+                <w:b w:val="0"/>
+                <w:sz w:val="17"/>
+              </w:rPr>
+            </w:r>
+            <w:r>
+              <w:rPr>
+                <w:b w:val="0"/>
+                <w:i w:val="0"/>
+                <w:sz w:val="17"/>
+              </w:rPr>
+              <w:t>8.8 item 4: no back-dating into a locked month</w:t>
+            </w:r>
+          </w:p>
+        </w:tc>
+        <w:tc>
+          <w:tcPr>
+            <w:tcW w:type="dxa" w:w="2493"/>
+          </w:tcPr>
+          <w:p>
+            <w:r>
+              <w:rPr>
+                <w:b w:val="0"/>
+                <w:sz w:val="17"/>
+              </w:rPr>
+            </w:r>
+            <w:r>
+              <w:rPr>
+                <w:b w:val="0"/>
+                <w:i w:val="0"/>
+                <w:sz w:val="17"/>
+              </w:rPr>
+              <w:t>1</w:t>
+            </w:r>
+          </w:p>
+        </w:tc>
+        <w:tc>
+          <w:tcPr>
+            <w:tcW w:type="dxa" w:w="2493"/>
+          </w:tcPr>
+          <w:p>
+            <w:r>
+              <w:rPr>
+                <w:b w:val="0"/>
+                <w:sz w:val="17"/>
+              </w:rPr>
+            </w:r>
+            <w:r>
+              <w:rPr>
+                <w:b w:val="0"/>
+                <w:i w:val="0"/>
+                <w:sz w:val="17"/>
+              </w:rPr>
+              <w:t>18</w:t>
+            </w:r>
+          </w:p>
+        </w:tc>
+      </w:tr>
+      <w:tr>
+        <w:trPr>
+          <w:cantSplit/>
+        </w:trPr>
+        <w:tc>
+          <w:tcPr>
+            <w:tcW w:type="dxa" w:w="2493"/>
+          </w:tcPr>
+          <w:p>
+            <w:r>
+              <w:rPr>
+                <w:b w:val="0"/>
+                <w:sz w:val="17"/>
+              </w:rPr>
+            </w:r>
+            <w:r>
+              <w:rPr>
+                <w:b w:val="0"/>
+                <w:i w:val="0"/>
+                <w:sz w:val="17"/>
+              </w:rPr>
+              <w:t>2</w:t>
+            </w:r>
+          </w:p>
+        </w:tc>
+        <w:tc>
+          <w:tcPr>
+            <w:tcW w:type="dxa" w:w="2493"/>
+          </w:tcPr>
+          <w:p>
+            <w:r>
+              <w:rPr>
+                <w:b w:val="0"/>
+                <w:sz w:val="17"/>
+              </w:rPr>
+            </w:r>
+            <w:r>
+              <w:rPr>
+                <w:b w:val="0"/>
+                <w:i w:val="0"/>
+                <w:sz w:val="17"/>
+              </w:rPr>
+              <w:t>8.9: UAT mode</w:t>
+            </w:r>
+          </w:p>
+        </w:tc>
+        <w:tc>
+          <w:tcPr>
+            <w:tcW w:type="dxa" w:w="2493"/>
+          </w:tcPr>
+          <w:p>
+            <w:r>
+              <w:rPr>
+                <w:b w:val="0"/>
+                <w:sz w:val="17"/>
+              </w:rPr>
+            </w:r>
+            <w:r>
+              <w:rPr>
+                <w:b w:val="0"/>
+                <w:i w:val="0"/>
+                <w:sz w:val="17"/>
+              </w:rPr>
+              <w:t>1</w:t>
+            </w:r>
+          </w:p>
+        </w:tc>
+        <w:tc>
+          <w:tcPr>
+            <w:tcW w:type="dxa" w:w="2493"/>
+          </w:tcPr>
+          <w:p>
+            <w:r>
+              <w:rPr>
+                <w:b w:val="0"/>
+                <w:sz w:val="17"/>
+              </w:rPr>
+            </w:r>
+            <w:r>
+              <w:rPr>
+                <w:b w:val="0"/>
+                <w:i w:val="0"/>
+                <w:sz w:val="17"/>
+              </w:rPr>
+              <w:t>20 to 23</w:t>
+            </w:r>
+          </w:p>
+        </w:tc>
+      </w:tr>
+      <w:tr>
+        <w:trPr>
+          <w:cantSplit/>
+        </w:trPr>
+        <w:tc>
+          <w:tcPr>
+            <w:tcW w:type="dxa" w:w="2493"/>
+          </w:tcPr>
+          <w:p>
+            <w:r>
+              <w:rPr>
+                <w:b w:val="0"/>
+                <w:sz w:val="17"/>
+              </w:rPr>
+            </w:r>
+            <w:r>
+              <w:rPr>
+                <w:b w:val="0"/>
+                <w:i w:val="0"/>
+                <w:sz w:val="17"/>
+              </w:rPr>
+              <w:t>3</w:t>
+            </w:r>
+          </w:p>
+        </w:tc>
+        <w:tc>
+          <w:tcPr>
+            <w:tcW w:type="dxa" w:w="2493"/>
+          </w:tcPr>
+          <w:p>
+            <w:r>
+              <w:rPr>
+                <w:b w:val="0"/>
+                <w:sz w:val="17"/>
+              </w:rPr>
+            </w:r>
+            <w:r>
+              <w:rPr>
+                <w:b w:val="0"/>
+                <w:i w:val="0"/>
+                <w:sz w:val="17"/>
+              </w:rPr>
+              <w:t>3: the settings and presets</w:t>
+            </w:r>
+          </w:p>
+        </w:tc>
+        <w:tc>
+          <w:tcPr>
+            <w:tcW w:type="dxa" w:w="2493"/>
+          </w:tcPr>
+          <w:p>
+            <w:r>
+              <w:rPr>
+                <w:b w:val="0"/>
+                <w:sz w:val="17"/>
+              </w:rPr>
+            </w:r>
+            <w:r>
+              <w:rPr>
+                <w:b w:val="0"/>
+                <w:i w:val="0"/>
+                <w:sz w:val="17"/>
+              </w:rPr>
+              <w:t>2</w:t>
+            </w:r>
+          </w:p>
+        </w:tc>
+        <w:tc>
+          <w:tcPr>
+            <w:tcW w:type="dxa" w:w="2493"/>
+          </w:tcPr>
+          <w:p>
+            <w:r>
+              <w:rPr>
+                <w:b w:val="0"/>
+                <w:sz w:val="17"/>
+              </w:rPr>
+            </w:r>
+            <w:r>
+              <w:rPr>
+                <w:b w:val="0"/>
+                <w:i w:val="0"/>
+                <w:sz w:val="17"/>
+              </w:rPr>
+              <w:t>1 to 3, 7</w:t>
+            </w:r>
+          </w:p>
+        </w:tc>
+      </w:tr>
+      <w:tr>
+        <w:trPr>
+          <w:cantSplit/>
+        </w:trPr>
+        <w:tc>
+          <w:tcPr>
+            <w:tcW w:type="dxa" w:w="2493"/>
+          </w:tcPr>
+          <w:p>
+            <w:r>
+              <w:rPr>
+                <w:b w:val="0"/>
+                <w:sz w:val="17"/>
+              </w:rPr>
+            </w:r>
+            <w:r>
+              <w:rPr>
+                <w:b w:val="0"/>
+                <w:i w:val="0"/>
+                <w:sz w:val="17"/>
+              </w:rPr>
+              <w:t>4</w:t>
+            </w:r>
+          </w:p>
+        </w:tc>
+        <w:tc>
+          <w:tcPr>
+            <w:tcW w:type="dxa" w:w="2493"/>
+          </w:tcPr>
+          <w:p>
+            <w:r>
+              <w:rPr>
+                <w:b w:val="0"/>
+                <w:sz w:val="17"/>
+              </w:rPr>
+            </w:r>
+            <w:r>
+              <w:rPr>
+                <w:b w:val="0"/>
+                <w:i w:val="0"/>
+                <w:sz w:val="17"/>
+              </w:rPr>
+              <w:t>5: the separate staging day count, the RBM return on the directive's count</w:t>
+            </w:r>
+          </w:p>
+        </w:tc>
+        <w:tc>
+          <w:tcPr>
+            <w:tcW w:type="dxa" w:w="2493"/>
+          </w:tcPr>
+          <w:p>
+            <w:r>
+              <w:rPr>
+                <w:b w:val="0"/>
+                <w:sz w:val="17"/>
+              </w:rPr>
+            </w:r>
+            <w:r>
+              <w:rPr>
+                <w:b w:val="0"/>
+                <w:i w:val="0"/>
+                <w:sz w:val="17"/>
+              </w:rPr>
+              <w:t>2</w:t>
+            </w:r>
+          </w:p>
+        </w:tc>
+        <w:tc>
+          <w:tcPr>
+            <w:tcW w:type="dxa" w:w="2493"/>
+          </w:tcPr>
+          <w:p>
+            <w:r>
+              <w:rPr>
+                <w:b w:val="0"/>
+                <w:sz w:val="17"/>
+              </w:rPr>
+            </w:r>
+            <w:r>
+              <w:rPr>
+                <w:b w:val="0"/>
+                <w:i w:val="0"/>
+                <w:sz w:val="17"/>
+              </w:rPr>
+              <w:t>6</w:t>
+            </w:r>
+          </w:p>
+        </w:tc>
+      </w:tr>
+      <w:tr>
+        <w:trPr>
+          <w:cantSplit/>
+        </w:trPr>
+        <w:tc>
+          <w:tcPr>
+            <w:tcW w:type="dxa" w:w="2493"/>
+          </w:tcPr>
+          <w:p>
+            <w:r>
+              <w:rPr>
+                <w:b w:val="0"/>
+                <w:sz w:val="17"/>
+              </w:rPr>
+            </w:r>
+            <w:r>
+              <w:rPr>
+                <w:b w:val="0"/>
+                <w:i w:val="0"/>
+                <w:sz w:val="17"/>
+              </w:rPr>
+              <w:t>5</w:t>
+            </w:r>
+          </w:p>
+        </w:tc>
+        <w:tc>
+          <w:tcPr>
+            <w:tcW w:type="dxa" w:w="2493"/>
+          </w:tcPr>
+          <w:p>
+            <w:r>
+              <w:rPr>
+                <w:b w:val="0"/>
+                <w:sz w:val="17"/>
+              </w:rPr>
+            </w:r>
+            <w:r>
+              <w:rPr>
+                <w:b w:val="0"/>
+                <w:i w:val="0"/>
+                <w:sz w:val="17"/>
+              </w:rPr>
+              <w:t>4: the staging comparison run</w:t>
+            </w:r>
+          </w:p>
+        </w:tc>
+        <w:tc>
+          <w:tcPr>
+            <w:tcW w:type="dxa" w:w="2493"/>
+          </w:tcPr>
+          <w:p>
+            <w:r>
+              <w:rPr>
+                <w:b w:val="0"/>
+                <w:sz w:val="17"/>
+              </w:rPr>
+            </w:r>
+            <w:r>
+              <w:rPr>
+                <w:b w:val="0"/>
+                <w:i w:val="0"/>
+                <w:sz w:val="17"/>
+              </w:rPr>
+              <w:t>2</w:t>
+            </w:r>
+          </w:p>
+        </w:tc>
+        <w:tc>
+          <w:tcPr>
+            <w:tcW w:type="dxa" w:w="2493"/>
+          </w:tcPr>
+          <w:p>
+            <w:r>
+              <w:rPr>
+                <w:b w:val="0"/>
+                <w:sz w:val="17"/>
+              </w:rPr>
+            </w:r>
+            <w:r>
+              <w:rPr>
+                <w:b w:val="0"/>
+                <w:i w:val="0"/>
+                <w:sz w:val="17"/>
+              </w:rPr>
+              <w:t>4, 5</w:t>
+            </w:r>
+          </w:p>
+        </w:tc>
+      </w:tr>
+      <w:tr>
+        <w:trPr>
+          <w:cantSplit/>
+        </w:trPr>
+        <w:tc>
+          <w:tcPr>
+            <w:tcW w:type="dxa" w:w="2493"/>
+          </w:tcPr>
+          <w:p>
+            <w:r>
+              <w:rPr>
+                <w:b w:val="0"/>
+                <w:sz w:val="17"/>
+              </w:rPr>
+            </w:r>
+            <w:r>
+              <w:rPr>
+                <w:b w:val="0"/>
+                <w:i w:val="0"/>
+                <w:sz w:val="17"/>
+              </w:rPr>
+              <w:t>6</w:t>
+            </w:r>
+          </w:p>
+        </w:tc>
+        <w:tc>
+          <w:tcPr>
+            <w:tcW w:type="dxa" w:w="2493"/>
+          </w:tcPr>
+          <w:p>
+            <w:r>
+              <w:rPr>
+                <w:b w:val="0"/>
+                <w:sz w:val="17"/>
+              </w:rPr>
+            </w:r>
+            <w:r>
+              <w:rPr>
+                <w:b w:val="0"/>
+                <w:i w:val="0"/>
+                <w:sz w:val="17"/>
+              </w:rPr>
+              <w:t>8.6: fee rulebook control</w:t>
+            </w:r>
+          </w:p>
+        </w:tc>
+        <w:tc>
+          <w:tcPr>
+            <w:tcW w:type="dxa" w:w="2493"/>
+          </w:tcPr>
+          <w:p>
+            <w:r>
+              <w:rPr>
+                <w:b w:val="0"/>
+                <w:sz w:val="17"/>
+              </w:rPr>
+            </w:r>
+            <w:r>
+              <w:rPr>
+                <w:b w:val="0"/>
+                <w:i w:val="0"/>
+                <w:sz w:val="17"/>
+              </w:rPr>
+              <w:t>3</w:t>
+            </w:r>
+          </w:p>
+        </w:tc>
+        <w:tc>
+          <w:tcPr>
+            <w:tcW w:type="dxa" w:w="2493"/>
+          </w:tcPr>
+          <w:p>
+            <w:r>
+              <w:rPr>
+                <w:b w:val="0"/>
+                <w:sz w:val="17"/>
+              </w:rPr>
+            </w:r>
+            <w:r>
+              <w:rPr>
+                <w:b w:val="0"/>
+                <w:i w:val="0"/>
+                <w:sz w:val="17"/>
+              </w:rPr>
+              <w:t>14</w:t>
+            </w:r>
+          </w:p>
+        </w:tc>
+      </w:tr>
+      <w:tr>
+        <w:trPr>
+          <w:cantSplit/>
+        </w:trPr>
+        <w:tc>
+          <w:tcPr>
+            <w:tcW w:type="dxa" w:w="2493"/>
+          </w:tcPr>
+          <w:p>
+            <w:r>
+              <w:rPr>
+                <w:b w:val="0"/>
+                <w:sz w:val="17"/>
+              </w:rPr>
+            </w:r>
+            <w:r>
+              <w:rPr>
+                <w:b w:val="0"/>
+                <w:i w:val="0"/>
+                <w:sz w:val="17"/>
+              </w:rPr>
+              <w:t>7</w:t>
+            </w:r>
+          </w:p>
+        </w:tc>
+        <w:tc>
+          <w:tcPr>
+            <w:tcW w:type="dxa" w:w="2493"/>
+          </w:tcPr>
+          <w:p>
+            <w:r>
+              <w:rPr>
+                <w:b w:val="0"/>
+                <w:sz w:val="17"/>
+              </w:rPr>
+            </w:r>
+            <w:r>
+              <w:rPr>
+                <w:b w:val="0"/>
+                <w:i w:val="0"/>
+                <w:sz w:val="17"/>
+              </w:rPr>
+              <w:t>8.1 to 8.5: the Governance Centre change log</w:t>
+            </w:r>
+          </w:p>
+        </w:tc>
+        <w:tc>
+          <w:tcPr>
+            <w:tcW w:type="dxa" w:w="2493"/>
+          </w:tcPr>
+          <w:p>
+            <w:r>
+              <w:rPr>
+                <w:b w:val="0"/>
+                <w:sz w:val="17"/>
+              </w:rPr>
+            </w:r>
+            <w:r>
+              <w:rPr>
+                <w:b w:val="0"/>
+                <w:i w:val="0"/>
+                <w:sz w:val="17"/>
+              </w:rPr>
+              <w:t>4</w:t>
+            </w:r>
+          </w:p>
+        </w:tc>
+        <w:tc>
+          <w:tcPr>
+            <w:tcW w:type="dxa" w:w="2493"/>
+          </w:tcPr>
+          <w:p>
+            <w:r>
+              <w:rPr>
+                <w:b w:val="0"/>
+                <w:sz w:val="17"/>
+              </w:rPr>
+            </w:r>
+            <w:r>
+              <w:rPr>
+                <w:b w:val="0"/>
+                <w:i w:val="0"/>
+                <w:sz w:val="17"/>
+              </w:rPr>
+              <w:t>9 to 12</w:t>
+            </w:r>
+          </w:p>
+        </w:tc>
+      </w:tr>
+      <w:tr>
+        <w:trPr>
+          <w:cantSplit/>
+        </w:trPr>
+        <w:tc>
+          <w:tcPr>
+            <w:tcW w:type="dxa" w:w="2493"/>
+          </w:tcPr>
+          <w:p>
+            <w:r>
+              <w:rPr>
+                <w:b w:val="0"/>
+                <w:sz w:val="17"/>
+              </w:rPr>
+            </w:r>
+            <w:r>
+              <w:rPr>
+                <w:b w:val="0"/>
+                <w:i w:val="0"/>
+                <w:sz w:val="17"/>
+              </w:rPr>
+              <w:t>8</w:t>
+            </w:r>
+          </w:p>
+        </w:tc>
+        <w:tc>
+          <w:tcPr>
+            <w:tcW w:type="dxa" w:w="2493"/>
+          </w:tcPr>
+          <w:p>
+            <w:r>
+              <w:rPr>
+                <w:b w:val="0"/>
+                <w:sz w:val="17"/>
+              </w:rPr>
+            </w:r>
+            <w:r>
+              <w:rPr>
+                <w:b w:val="0"/>
+                <w:i w:val="0"/>
+                <w:sz w:val="17"/>
+              </w:rPr>
+              <w:t>8.6: the other approvals</w:t>
+            </w:r>
+          </w:p>
+        </w:tc>
+        <w:tc>
+          <w:tcPr>
+            <w:tcW w:type="dxa" w:w="2493"/>
+          </w:tcPr>
+          <w:p>
+            <w:r>
+              <w:rPr>
+                <w:b w:val="0"/>
+                <w:sz w:val="17"/>
+              </w:rPr>
+            </w:r>
+            <w:r>
+              <w:rPr>
+                <w:b w:val="0"/>
+                <w:i w:val="0"/>
+                <w:sz w:val="17"/>
+              </w:rPr>
+              <w:t>4</w:t>
+            </w:r>
+          </w:p>
+        </w:tc>
+        <w:tc>
+          <w:tcPr>
+            <w:tcW w:type="dxa" w:w="2493"/>
+          </w:tcPr>
+          <w:p>
+            <w:r>
+              <w:rPr>
+                <w:b w:val="0"/>
+                <w:sz w:val="17"/>
+              </w:rPr>
+            </w:r>
+            <w:r>
+              <w:rPr>
+                <w:b w:val="0"/>
+                <w:i w:val="0"/>
+                <w:sz w:val="17"/>
+              </w:rPr>
+              <w:t>13</w:t>
+            </w:r>
+          </w:p>
+        </w:tc>
+      </w:tr>
+      <w:tr>
+        <w:trPr>
+          <w:cantSplit/>
+        </w:trPr>
+        <w:tc>
+          <w:tcPr>
+            <w:tcW w:type="dxa" w:w="2493"/>
+          </w:tcPr>
+          <w:p>
+            <w:r>
+              <w:rPr>
+                <w:b w:val="0"/>
+                <w:sz w:val="17"/>
+              </w:rPr>
+            </w:r>
+            <w:r>
+              <w:rPr>
+                <w:b w:val="0"/>
+                <w:i w:val="0"/>
+                <w:sz w:val="17"/>
+              </w:rPr>
+              <w:t>9</w:t>
+            </w:r>
+          </w:p>
+        </w:tc>
+        <w:tc>
+          <w:tcPr>
+            <w:tcW w:type="dxa" w:w="2493"/>
+          </w:tcPr>
+          <w:p>
+            <w:r>
+              <w:rPr>
+                <w:b w:val="0"/>
+                <w:sz w:val="17"/>
+              </w:rPr>
+            </w:r>
+            <w:r>
+              <w:rPr>
+                <w:b w:val="0"/>
+                <w:i w:val="0"/>
+                <w:sz w:val="17"/>
+              </w:rPr>
+              <w:t>8.7: the register of approvals</w:t>
+            </w:r>
+          </w:p>
+        </w:tc>
+        <w:tc>
+          <w:tcPr>
+            <w:tcW w:type="dxa" w:w="2493"/>
+          </w:tcPr>
+          <w:p>
+            <w:r>
+              <w:rPr>
+                <w:b w:val="0"/>
+                <w:sz w:val="17"/>
+              </w:rPr>
+            </w:r>
+            <w:r>
+              <w:rPr>
+                <w:b w:val="0"/>
+                <w:i w:val="0"/>
+                <w:sz w:val="17"/>
+              </w:rPr>
+              <w:t>4</w:t>
+            </w:r>
+          </w:p>
+        </w:tc>
+        <w:tc>
+          <w:tcPr>
+            <w:tcW w:type="dxa" w:w="2493"/>
+          </w:tcPr>
+          <w:p>
+            <w:r>
+              <w:rPr>
+                <w:b w:val="0"/>
+                <w:sz w:val="17"/>
+              </w:rPr>
+            </w:r>
+            <w:r>
+              <w:rPr>
+                <w:b w:val="0"/>
+                <w:i w:val="0"/>
+                <w:sz w:val="17"/>
+              </w:rPr>
+              <w:t>15</w:t>
+            </w:r>
+          </w:p>
+        </w:tc>
+      </w:tr>
+      <w:tr>
+        <w:trPr>
+          <w:cantSplit/>
+        </w:trPr>
+        <w:tc>
+          <w:tcPr>
+            <w:tcW w:type="dxa" w:w="2493"/>
+          </w:tcPr>
+          <w:p>
+            <w:r>
+              <w:rPr>
+                <w:b w:val="0"/>
+                <w:sz w:val="17"/>
+              </w:rPr>
+            </w:r>
+            <w:r>
+              <w:rPr>
+                <w:b w:val="0"/>
+                <w:i w:val="0"/>
+                <w:sz w:val="17"/>
+              </w:rPr>
+              <w:t>10</w:t>
+            </w:r>
+          </w:p>
+        </w:tc>
+        <w:tc>
+          <w:tcPr>
+            <w:tcW w:type="dxa" w:w="2493"/>
+          </w:tcPr>
+          <w:p>
+            <w:r>
+              <w:rPr>
+                <w:b w:val="0"/>
+                <w:sz w:val="17"/>
+              </w:rPr>
+            </w:r>
+            <w:r>
+              <w:rPr>
+                <w:b w:val="0"/>
+                <w:i w:val="0"/>
+                <w:sz w:val="17"/>
+              </w:rPr>
+              <w:t>8.8: the run record</w:t>
+            </w:r>
+          </w:p>
+        </w:tc>
+        <w:tc>
+          <w:tcPr>
+            <w:tcW w:type="dxa" w:w="2493"/>
+          </w:tcPr>
+          <w:p>
+            <w:r>
+              <w:rPr>
+                <w:b w:val="0"/>
+                <w:sz w:val="17"/>
+              </w:rPr>
+            </w:r>
+            <w:r>
+              <w:rPr>
+                <w:b w:val="0"/>
+                <w:i w:val="0"/>
+                <w:sz w:val="17"/>
+              </w:rPr>
+              <w:t>4</w:t>
+            </w:r>
+          </w:p>
+        </w:tc>
+        <w:tc>
+          <w:tcPr>
+            <w:tcW w:type="dxa" w:w="2493"/>
+          </w:tcPr>
+          <w:p>
+            <w:r>
+              <w:rPr>
+                <w:b w:val="0"/>
+                <w:sz w:val="17"/>
+              </w:rPr>
+            </w:r>
+            <w:r>
+              <w:rPr>
+                <w:b w:val="0"/>
+                <w:i w:val="0"/>
+                <w:sz w:val="17"/>
+              </w:rPr>
+              <w:t>16, 17, 19</w:t>
+            </w:r>
+          </w:p>
+        </w:tc>
+      </w:tr>
+      <w:tr>
+        <w:trPr>
+          <w:cantSplit/>
+        </w:trPr>
+        <w:tc>
+          <w:tcPr>
+            <w:tcW w:type="dxa" w:w="2493"/>
+          </w:tcPr>
+          <w:p>
+            <w:r>
+              <w:rPr>
+                <w:b w:val="0"/>
+                <w:sz w:val="17"/>
+              </w:rPr>
+            </w:r>
+            <w:r>
+              <w:rPr>
+                <w:b w:val="0"/>
+                <w:i w:val="0"/>
+                <w:sz w:val="17"/>
+              </w:rPr>
+              <w:t>11</w:t>
+            </w:r>
+          </w:p>
+        </w:tc>
+        <w:tc>
+          <w:tcPr>
+            <w:tcW w:type="dxa" w:w="2493"/>
+          </w:tcPr>
+          <w:p>
+            <w:r>
+              <w:rPr>
+                <w:b w:val="0"/>
+                <w:sz w:val="17"/>
+              </w:rPr>
+            </w:r>
+            <w:r>
+              <w:rPr>
+                <w:b w:val="0"/>
+                <w:i w:val="0"/>
+                <w:sz w:val="17"/>
+              </w:rPr>
+              <w:t>The complete build: all 23 acceptance tests, the full test suite and a bootstrap on a fresh database with the nine ties passing</w:t>
+            </w:r>
+          </w:p>
+        </w:tc>
+        <w:tc>
+          <w:tcPr>
+            <w:tcW w:type="dxa" w:w="2493"/>
+          </w:tcPr>
+          <w:p>
+            <w:r>
+              <w:rPr>
+                <w:b w:val="0"/>
+                <w:sz w:val="17"/>
+              </w:rPr>
+            </w:r>
+            <w:r>
+              <w:rPr>
+                <w:b w:val="0"/>
+                <w:i w:val="0"/>
+                <w:sz w:val="17"/>
+              </w:rPr>
+              <w:t>All</w:t>
+            </w:r>
+          </w:p>
+        </w:tc>
+        <w:tc>
+          <w:tcPr>
+            <w:tcW w:type="dxa" w:w="2493"/>
+          </w:tcPr>
+          <w:p>
+            <w:r>
+              <w:rPr>
+                <w:b w:val="0"/>
+                <w:sz w:val="17"/>
+              </w:rPr>
+            </w:r>
+            <w:r>
+              <w:rPr>
+                <w:b w:val="0"/>
+                <w:i w:val="0"/>
+                <w:sz w:val="17"/>
+              </w:rPr>
+              <w:t>8 and all</w:t>
+            </w:r>
+          </w:p>
+        </w:tc>
+      </w:tr>
+    </w:tbl>
+    <w:p/>
+    <w:p>
+      <w:pPr>
+        <w:spacing w:after="120"/>
+        <w:jc w:val="both"/>
+      </w:pPr>
+      <w:r>
+        <w:rPr>
+          <w:b/>
+          <w:i w:val="0"/>
+        </w:rPr>
+        <w:t>The merge.</w:t>
+      </w:r>
+      <w:r>
+        <w:rPr>
+          <w:b w:val="0"/>
+          <w:i w:val="0"/>
+        </w:rPr>
+        <w:t xml:space="preserve"> When section 11 is confirmed, the branch is rebased onto the main branch one last time, the full tests and the bootstrap are run again, and the complete build is merged into </w:t>
+      </w:r>
+      <w:r>
+        <w:rPr>
+          <w:rFonts w:ascii="Consolas" w:hAnsi="Consolas"/>
+          <w:b w:val="0"/>
+          <w:i w:val="0"/>
+          <w:sz w:val="18"/>
+        </w:rPr>
+        <w:t>eir_revenue_recognition</w:t>
+      </w:r>
+      <w:r>
+        <w:rPr>
+          <w:b w:val="0"/>
+          <w:i w:val="0"/>
+        </w:rPr>
+        <w:t xml:space="preserve"> and </w:t>
+      </w:r>
+      <w:r>
+        <w:rPr>
+          <w:rFonts w:ascii="Consolas" w:hAnsi="Consolas"/>
+          <w:b w:val="0"/>
+          <w:i w:val="0"/>
+          <w:sz w:val="18"/>
+        </w:rPr>
+        <w:t>master</w:t>
+      </w:r>
+      <w:r>
+        <w:rPr>
+          <w:b w:val="0"/>
+          <w:i w:val="0"/>
+        </w:rPr>
+        <w:t xml:space="preserve"> in one step, with a merge note listing every section, its confirmation and the decisions (section 9) it rests on. It is then released to MAIIC's server once, by the release steps of the integration document (section 2.2: push, pull, migrate, bootstrap with the nine ties passing).</w:t>
+      </w:r>
+    </w:p>
+    <w:p>
+      <w:pPr>
+        <w:spacing w:after="120"/>
+        <w:jc w:val="both"/>
+      </w:pPr>
+      <w:r>
+        <w:rPr>
+          <w:b/>
+          <w:i w:val="0"/>
+        </w:rPr>
+        <w:t>What this means for the order.</w:t>
+      </w:r>
+      <w:r>
+        <w:rPr>
+          <w:b w:val="0"/>
+          <w:i w:val="0"/>
+        </w:rPr>
+        <w:t xml:space="preserve"> Because nothing is merged until the end, the protections of phase 1 (no back-dating, UAT mode) and the fee rulebook control of phase 3 reach MAIIC's server with the complete build, not earlier. If one of them is needed sooner, it can be taken out of the branch as its own small merge, with Edward's confirmation, and the rest of the build continues on the branch.</w:t>
       </w:r>
     </w:p>
     <w:p>

</xml_diff>

<commit_message>
Staging spec: section 11.1 revised, one branch with a confirmation at the start and end of each section and a merge and release at the end of each phase (M1 to M4)
Co-Authored-By: Claude Opus 5.5 <noreply@anthropic.com>
</commit_message>
<xml_diff>
--- a/docs/MAIIC_Staging_Module_Specification_v1_2026-10-15.docx
+++ b/docs/MAIIC_Staging_Module_Specification_v1_2026-10-15.docx
@@ -11444,7 +11444,7 @@
           <w:b w:val="0"/>
           <w:i w:val="0"/>
         </w:rPr>
-        <w:t>The work is done in four phases, in the order below, so that the parts that protect the locked months and unblock decisions are built first. The whole build is done on its own branch and merged once, when every section is complete and confirmed (section 11.1). The sizes are Dupleix's estimates of the build.</w:t>
+        <w:t>The work is done in four phases, in the order below, so that the parts that protect the locked months and unblock decisions are built first. The build is done on its own branch, and each phase is merged and released when all its sections are complete and confirmed (section 11.1). The sizes are Dupleix's estimates of the build.</w:t>
       </w:r>
     </w:p>
     <w:tbl>
@@ -11789,7 +11789,7 @@
                 <w:i w:val="0"/>
                 <w:sz w:val="17"/>
               </w:rPr>
-              <w:t>; the comparison run with its tables, command, panel, export and audit-workbook sheet; then the comparison runs for December 2025 and September 2026 on the branch's bootstrap database</w:t>
+              <w:t>; the comparison run with its tables, command, panel, export and audit-workbook sheet; then, after the phase is merged and released, the comparison runs for December 2025 and September 2026 on MAIIC's server</w:t>
             </w:r>
           </w:p>
         </w:tc>
@@ -12191,7 +12191,7 @@
           <w:b w:val="0"/>
           <w:i w:val="0"/>
         </w:rPr>
-        <w:t>The total is about 11 to 11.5 days of build. The first phase also brings UAT mode, so that once the build is released, testing on MAIIC's server can run without waiting for a second person on each step; the first three phases, about 6 days, bring the protection of locked months, UAT mode, governed staging and the controlled fee rulebook. The fee rulebook joins the shared maker-checker check of UAT mode when phase 3 gives it maker-checker. Not included: the time to resolve the bootstrap's slow final steps seen on 15 October 2026, which must be fixed before the merge, since the merge and the release depend on the bootstrap passing.</w:t>
+        <w:t>The total is about 11 to 11.5 days of build. The first phase also brings UAT mode, so that once phase 1 is released, testing on MAIIC's server can run without waiting for a second person on each step; the first three phases, about 6 days, bring the protection of locked months, UAT mode, governed staging and the controlled fee rulebook. The fee rulebook joins the shared maker-checker check of UAT mode when phase 3 gives it maker-checker. Not included: the time to resolve the bootstrap's slow final steps seen on 15 October 2026, which must be fixed before the first merge, since every merge and release depends on the bootstrap passing.</w:t>
       </w:r>
     </w:p>
     <w:p>
@@ -12199,7 +12199,7 @@
         <w:pStyle w:val="Heading3"/>
       </w:pPr>
       <w:r>
-        <w:t>11.1 How the build is run: one branch, a confirmation at the start and end of each section</w:t>
+        <w:t>11.1 How the build is run: one branch, a confirmation at the start and end of each section, a merge at the end of each phase</w:t>
       </w:r>
     </w:p>
     <w:p>
@@ -12219,7 +12219,7 @@
           <w:b w:val="0"/>
           <w:i w:val="0"/>
         </w:rPr>
-        <w:t xml:space="preserve"> The whole build is done on a branch of its own, </w:t>
+        <w:t xml:space="preserve"> The build is done on a branch of its own, </w:t>
       </w:r>
       <w:r>
         <w:rPr>
@@ -12251,23 +12251,7 @@
           <w:b w:val="0"/>
           <w:i w:val="0"/>
         </w:rPr>
-        <w:t xml:space="preserve">) when the build starts. Nothing from it reaches the main branch, </w:t>
-      </w:r>
-      <w:r>
-        <w:rPr>
-          <w:rFonts w:ascii="Consolas" w:hAnsi="Consolas"/>
-          <w:b w:val="0"/>
-          <w:i w:val="0"/>
-          <w:sz w:val="18"/>
-        </w:rPr>
-        <w:t>master</w:t>
-      </w:r>
-      <w:r>
-        <w:rPr>
-          <w:b w:val="0"/>
-          <w:i w:val="0"/>
-        </w:rPr>
-        <w:t xml:space="preserve"> or MAIIC's server until the complete build is finished, tested and confirmed. The branch is pushed to the repository after each section so that the work is backed up and visible, but it is not merged. It is brought up to date with the main branch (rebased) at the start of each section, so that colleagues' work in the same files is taken in as it happens and the final merge is clean.</w:t>
+        <w:t>) when the build starts. The branch is pushed to the repository after each section so that the work is backed up and visible. It is brought up to date with the main branch (rebased) at the start of each section, so that colleagues' work in the same files is taken in as it happens and each merge is clean.</w:t>
       </w:r>
     </w:p>
     <w:p>
@@ -12320,1129 +12304,14 @@
           <w:b/>
           <w:i w:val="0"/>
         </w:rPr>
-        <w:t>The sections, in order.</w:t>
+        <w:t>A merge at the end of each phase.</w:t>
       </w:r>
       <w:r>
         <w:rPr>
           <w:b w:val="0"/>
           <w:i w:val="0"/>
         </w:rPr>
-        <w:t xml:space="preserve"> Each row is one start-and-end confirmation:</w:t>
-      </w:r>
-    </w:p>
-    <w:tbl>
-      <w:tblPr>
-        <w:tblStyle w:val="TableGrid"/>
-        <w:tblW w:type="auto" w:w="0"/>
-        <w:tblLook w:firstColumn="1" w:firstRow="1" w:lastColumn="0" w:lastRow="0" w:noHBand="0" w:noVBand="1" w:val="04A0"/>
-      </w:tblPr>
-      <w:tblGrid>
-        <w:gridCol w:w="2493"/>
-        <w:gridCol w:w="2493"/>
-        <w:gridCol w:w="2493"/>
-        <w:gridCol w:w="2493"/>
-      </w:tblGrid>
-      <w:tr>
-        <w:trPr>
-          <w:cantSplit/>
-          <w:tblHeader/>
-        </w:trPr>
-        <w:tc>
-          <w:tcPr>
-            <w:tcW w:type="dxa" w:w="2493"/>
-            <w:shd w:val="clear" w:color="auto" w:fill="1B2A41"/>
-          </w:tcPr>
-          <w:p>
-            <w:r>
-              <w:rPr>
-                <w:b/>
-                <w:color w:val="FFFFFF"/>
-                <w:sz w:val="17"/>
-              </w:rPr>
-            </w:r>
-            <w:r>
-              <w:rPr>
-                <w:b/>
-                <w:i w:val="0"/>
-                <w:color w:val="FFFFFF"/>
-                <w:sz w:val="17"/>
-              </w:rPr>
-              <w:t>#</w:t>
-            </w:r>
-          </w:p>
-        </w:tc>
-        <w:tc>
-          <w:tcPr>
-            <w:tcW w:type="dxa" w:w="2493"/>
-            <w:shd w:val="clear" w:color="auto" w:fill="1B2A41"/>
-          </w:tcPr>
-          <w:p>
-            <w:r>
-              <w:rPr>
-                <w:b/>
-                <w:color w:val="FFFFFF"/>
-                <w:sz w:val="17"/>
-              </w:rPr>
-            </w:r>
-            <w:r>
-              <w:rPr>
-                <w:b/>
-                <w:i w:val="0"/>
-                <w:color w:val="FFFFFF"/>
-                <w:sz w:val="17"/>
-              </w:rPr>
-              <w:t>Section</w:t>
-            </w:r>
-          </w:p>
-        </w:tc>
-        <w:tc>
-          <w:tcPr>
-            <w:tcW w:type="dxa" w:w="2493"/>
-            <w:shd w:val="clear" w:color="auto" w:fill="1B2A41"/>
-          </w:tcPr>
-          <w:p>
-            <w:r>
-              <w:rPr>
-                <w:b/>
-                <w:color w:val="FFFFFF"/>
-                <w:sz w:val="17"/>
-              </w:rPr>
-            </w:r>
-            <w:r>
-              <w:rPr>
-                <w:b/>
-                <w:i w:val="0"/>
-                <w:color w:val="FFFFFF"/>
-                <w:sz w:val="17"/>
-              </w:rPr>
-              <w:t>Phase</w:t>
-            </w:r>
-          </w:p>
-        </w:tc>
-        <w:tc>
-          <w:tcPr>
-            <w:tcW w:type="dxa" w:w="2493"/>
-            <w:shd w:val="clear" w:color="auto" w:fill="1B2A41"/>
-          </w:tcPr>
-          <w:p>
-            <w:r>
-              <w:rPr>
-                <w:b/>
-                <w:color w:val="FFFFFF"/>
-                <w:sz w:val="17"/>
-              </w:rPr>
-            </w:r>
-            <w:r>
-              <w:rPr>
-                <w:b/>
-                <w:i w:val="0"/>
-                <w:color w:val="FFFFFF"/>
-                <w:sz w:val="17"/>
-              </w:rPr>
-              <w:t>Acceptance tests closed</w:t>
-            </w:r>
-          </w:p>
-        </w:tc>
-      </w:tr>
-      <w:tr>
-        <w:trPr>
-          <w:cantSplit/>
-        </w:trPr>
-        <w:tc>
-          <w:tcPr>
-            <w:tcW w:type="dxa" w:w="2493"/>
-          </w:tcPr>
-          <w:p>
-            <w:r>
-              <w:rPr>
-                <w:b w:val="0"/>
-                <w:sz w:val="17"/>
-              </w:rPr>
-            </w:r>
-            <w:r>
-              <w:rPr>
-                <w:b w:val="0"/>
-                <w:i w:val="0"/>
-                <w:sz w:val="17"/>
-              </w:rPr>
-              <w:t>1</w:t>
-            </w:r>
-          </w:p>
-        </w:tc>
-        <w:tc>
-          <w:tcPr>
-            <w:tcW w:type="dxa" w:w="2493"/>
-          </w:tcPr>
-          <w:p>
-            <w:r>
-              <w:rPr>
-                <w:b w:val="0"/>
-                <w:sz w:val="17"/>
-              </w:rPr>
-            </w:r>
-            <w:r>
-              <w:rPr>
-                <w:b w:val="0"/>
-                <w:i w:val="0"/>
-                <w:sz w:val="17"/>
-              </w:rPr>
-              <w:t>8.8 item 4: no back-dating into a locked month</w:t>
-            </w:r>
-          </w:p>
-        </w:tc>
-        <w:tc>
-          <w:tcPr>
-            <w:tcW w:type="dxa" w:w="2493"/>
-          </w:tcPr>
-          <w:p>
-            <w:r>
-              <w:rPr>
-                <w:b w:val="0"/>
-                <w:sz w:val="17"/>
-              </w:rPr>
-            </w:r>
-            <w:r>
-              <w:rPr>
-                <w:b w:val="0"/>
-                <w:i w:val="0"/>
-                <w:sz w:val="17"/>
-              </w:rPr>
-              <w:t>1</w:t>
-            </w:r>
-          </w:p>
-        </w:tc>
-        <w:tc>
-          <w:tcPr>
-            <w:tcW w:type="dxa" w:w="2493"/>
-          </w:tcPr>
-          <w:p>
-            <w:r>
-              <w:rPr>
-                <w:b w:val="0"/>
-                <w:sz w:val="17"/>
-              </w:rPr>
-            </w:r>
-            <w:r>
-              <w:rPr>
-                <w:b w:val="0"/>
-                <w:i w:val="0"/>
-                <w:sz w:val="17"/>
-              </w:rPr>
-              <w:t>18</w:t>
-            </w:r>
-          </w:p>
-        </w:tc>
-      </w:tr>
-      <w:tr>
-        <w:trPr>
-          <w:cantSplit/>
-        </w:trPr>
-        <w:tc>
-          <w:tcPr>
-            <w:tcW w:type="dxa" w:w="2493"/>
-          </w:tcPr>
-          <w:p>
-            <w:r>
-              <w:rPr>
-                <w:b w:val="0"/>
-                <w:sz w:val="17"/>
-              </w:rPr>
-            </w:r>
-            <w:r>
-              <w:rPr>
-                <w:b w:val="0"/>
-                <w:i w:val="0"/>
-                <w:sz w:val="17"/>
-              </w:rPr>
-              <w:t>2</w:t>
-            </w:r>
-          </w:p>
-        </w:tc>
-        <w:tc>
-          <w:tcPr>
-            <w:tcW w:type="dxa" w:w="2493"/>
-          </w:tcPr>
-          <w:p>
-            <w:r>
-              <w:rPr>
-                <w:b w:val="0"/>
-                <w:sz w:val="17"/>
-              </w:rPr>
-            </w:r>
-            <w:r>
-              <w:rPr>
-                <w:b w:val="0"/>
-                <w:i w:val="0"/>
-                <w:sz w:val="17"/>
-              </w:rPr>
-              <w:t>8.9: UAT mode</w:t>
-            </w:r>
-          </w:p>
-        </w:tc>
-        <w:tc>
-          <w:tcPr>
-            <w:tcW w:type="dxa" w:w="2493"/>
-          </w:tcPr>
-          <w:p>
-            <w:r>
-              <w:rPr>
-                <w:b w:val="0"/>
-                <w:sz w:val="17"/>
-              </w:rPr>
-            </w:r>
-            <w:r>
-              <w:rPr>
-                <w:b w:val="0"/>
-                <w:i w:val="0"/>
-                <w:sz w:val="17"/>
-              </w:rPr>
-              <w:t>1</w:t>
-            </w:r>
-          </w:p>
-        </w:tc>
-        <w:tc>
-          <w:tcPr>
-            <w:tcW w:type="dxa" w:w="2493"/>
-          </w:tcPr>
-          <w:p>
-            <w:r>
-              <w:rPr>
-                <w:b w:val="0"/>
-                <w:sz w:val="17"/>
-              </w:rPr>
-            </w:r>
-            <w:r>
-              <w:rPr>
-                <w:b w:val="0"/>
-                <w:i w:val="0"/>
-                <w:sz w:val="17"/>
-              </w:rPr>
-              <w:t>20 to 23</w:t>
-            </w:r>
-          </w:p>
-        </w:tc>
-      </w:tr>
-      <w:tr>
-        <w:trPr>
-          <w:cantSplit/>
-        </w:trPr>
-        <w:tc>
-          <w:tcPr>
-            <w:tcW w:type="dxa" w:w="2493"/>
-          </w:tcPr>
-          <w:p>
-            <w:r>
-              <w:rPr>
-                <w:b w:val="0"/>
-                <w:sz w:val="17"/>
-              </w:rPr>
-            </w:r>
-            <w:r>
-              <w:rPr>
-                <w:b w:val="0"/>
-                <w:i w:val="0"/>
-                <w:sz w:val="17"/>
-              </w:rPr>
-              <w:t>3</w:t>
-            </w:r>
-          </w:p>
-        </w:tc>
-        <w:tc>
-          <w:tcPr>
-            <w:tcW w:type="dxa" w:w="2493"/>
-          </w:tcPr>
-          <w:p>
-            <w:r>
-              <w:rPr>
-                <w:b w:val="0"/>
-                <w:sz w:val="17"/>
-              </w:rPr>
-            </w:r>
-            <w:r>
-              <w:rPr>
-                <w:b w:val="0"/>
-                <w:i w:val="0"/>
-                <w:sz w:val="17"/>
-              </w:rPr>
-              <w:t>3: the settings and presets</w:t>
-            </w:r>
-          </w:p>
-        </w:tc>
-        <w:tc>
-          <w:tcPr>
-            <w:tcW w:type="dxa" w:w="2493"/>
-          </w:tcPr>
-          <w:p>
-            <w:r>
-              <w:rPr>
-                <w:b w:val="0"/>
-                <w:sz w:val="17"/>
-              </w:rPr>
-            </w:r>
-            <w:r>
-              <w:rPr>
-                <w:b w:val="0"/>
-                <w:i w:val="0"/>
-                <w:sz w:val="17"/>
-              </w:rPr>
-              <w:t>2</w:t>
-            </w:r>
-          </w:p>
-        </w:tc>
-        <w:tc>
-          <w:tcPr>
-            <w:tcW w:type="dxa" w:w="2493"/>
-          </w:tcPr>
-          <w:p>
-            <w:r>
-              <w:rPr>
-                <w:b w:val="0"/>
-                <w:sz w:val="17"/>
-              </w:rPr>
-            </w:r>
-            <w:r>
-              <w:rPr>
-                <w:b w:val="0"/>
-                <w:i w:val="0"/>
-                <w:sz w:val="17"/>
-              </w:rPr>
-              <w:t>1 to 3, 7</w:t>
-            </w:r>
-          </w:p>
-        </w:tc>
-      </w:tr>
-      <w:tr>
-        <w:trPr>
-          <w:cantSplit/>
-        </w:trPr>
-        <w:tc>
-          <w:tcPr>
-            <w:tcW w:type="dxa" w:w="2493"/>
-          </w:tcPr>
-          <w:p>
-            <w:r>
-              <w:rPr>
-                <w:b w:val="0"/>
-                <w:sz w:val="17"/>
-              </w:rPr>
-            </w:r>
-            <w:r>
-              <w:rPr>
-                <w:b w:val="0"/>
-                <w:i w:val="0"/>
-                <w:sz w:val="17"/>
-              </w:rPr>
-              <w:t>4</w:t>
-            </w:r>
-          </w:p>
-        </w:tc>
-        <w:tc>
-          <w:tcPr>
-            <w:tcW w:type="dxa" w:w="2493"/>
-          </w:tcPr>
-          <w:p>
-            <w:r>
-              <w:rPr>
-                <w:b w:val="0"/>
-                <w:sz w:val="17"/>
-              </w:rPr>
-            </w:r>
-            <w:r>
-              <w:rPr>
-                <w:b w:val="0"/>
-                <w:i w:val="0"/>
-                <w:sz w:val="17"/>
-              </w:rPr>
-              <w:t>5: the separate staging day count, the RBM return on the directive's count</w:t>
-            </w:r>
-          </w:p>
-        </w:tc>
-        <w:tc>
-          <w:tcPr>
-            <w:tcW w:type="dxa" w:w="2493"/>
-          </w:tcPr>
-          <w:p>
-            <w:r>
-              <w:rPr>
-                <w:b w:val="0"/>
-                <w:sz w:val="17"/>
-              </w:rPr>
-            </w:r>
-            <w:r>
-              <w:rPr>
-                <w:b w:val="0"/>
-                <w:i w:val="0"/>
-                <w:sz w:val="17"/>
-              </w:rPr>
-              <w:t>2</w:t>
-            </w:r>
-          </w:p>
-        </w:tc>
-        <w:tc>
-          <w:tcPr>
-            <w:tcW w:type="dxa" w:w="2493"/>
-          </w:tcPr>
-          <w:p>
-            <w:r>
-              <w:rPr>
-                <w:b w:val="0"/>
-                <w:sz w:val="17"/>
-              </w:rPr>
-            </w:r>
-            <w:r>
-              <w:rPr>
-                <w:b w:val="0"/>
-                <w:i w:val="0"/>
-                <w:sz w:val="17"/>
-              </w:rPr>
-              <w:t>6</w:t>
-            </w:r>
-          </w:p>
-        </w:tc>
-      </w:tr>
-      <w:tr>
-        <w:trPr>
-          <w:cantSplit/>
-        </w:trPr>
-        <w:tc>
-          <w:tcPr>
-            <w:tcW w:type="dxa" w:w="2493"/>
-          </w:tcPr>
-          <w:p>
-            <w:r>
-              <w:rPr>
-                <w:b w:val="0"/>
-                <w:sz w:val="17"/>
-              </w:rPr>
-            </w:r>
-            <w:r>
-              <w:rPr>
-                <w:b w:val="0"/>
-                <w:i w:val="0"/>
-                <w:sz w:val="17"/>
-              </w:rPr>
-              <w:t>5</w:t>
-            </w:r>
-          </w:p>
-        </w:tc>
-        <w:tc>
-          <w:tcPr>
-            <w:tcW w:type="dxa" w:w="2493"/>
-          </w:tcPr>
-          <w:p>
-            <w:r>
-              <w:rPr>
-                <w:b w:val="0"/>
-                <w:sz w:val="17"/>
-              </w:rPr>
-            </w:r>
-            <w:r>
-              <w:rPr>
-                <w:b w:val="0"/>
-                <w:i w:val="0"/>
-                <w:sz w:val="17"/>
-              </w:rPr>
-              <w:t>4: the staging comparison run</w:t>
-            </w:r>
-          </w:p>
-        </w:tc>
-        <w:tc>
-          <w:tcPr>
-            <w:tcW w:type="dxa" w:w="2493"/>
-          </w:tcPr>
-          <w:p>
-            <w:r>
-              <w:rPr>
-                <w:b w:val="0"/>
-                <w:sz w:val="17"/>
-              </w:rPr>
-            </w:r>
-            <w:r>
-              <w:rPr>
-                <w:b w:val="0"/>
-                <w:i w:val="0"/>
-                <w:sz w:val="17"/>
-              </w:rPr>
-              <w:t>2</w:t>
-            </w:r>
-          </w:p>
-        </w:tc>
-        <w:tc>
-          <w:tcPr>
-            <w:tcW w:type="dxa" w:w="2493"/>
-          </w:tcPr>
-          <w:p>
-            <w:r>
-              <w:rPr>
-                <w:b w:val="0"/>
-                <w:sz w:val="17"/>
-              </w:rPr>
-            </w:r>
-            <w:r>
-              <w:rPr>
-                <w:b w:val="0"/>
-                <w:i w:val="0"/>
-                <w:sz w:val="17"/>
-              </w:rPr>
-              <w:t>4, 5</w:t>
-            </w:r>
-          </w:p>
-        </w:tc>
-      </w:tr>
-      <w:tr>
-        <w:trPr>
-          <w:cantSplit/>
-        </w:trPr>
-        <w:tc>
-          <w:tcPr>
-            <w:tcW w:type="dxa" w:w="2493"/>
-          </w:tcPr>
-          <w:p>
-            <w:r>
-              <w:rPr>
-                <w:b w:val="0"/>
-                <w:sz w:val="17"/>
-              </w:rPr>
-            </w:r>
-            <w:r>
-              <w:rPr>
-                <w:b w:val="0"/>
-                <w:i w:val="0"/>
-                <w:sz w:val="17"/>
-              </w:rPr>
-              <w:t>6</w:t>
-            </w:r>
-          </w:p>
-        </w:tc>
-        <w:tc>
-          <w:tcPr>
-            <w:tcW w:type="dxa" w:w="2493"/>
-          </w:tcPr>
-          <w:p>
-            <w:r>
-              <w:rPr>
-                <w:b w:val="0"/>
-                <w:sz w:val="17"/>
-              </w:rPr>
-            </w:r>
-            <w:r>
-              <w:rPr>
-                <w:b w:val="0"/>
-                <w:i w:val="0"/>
-                <w:sz w:val="17"/>
-              </w:rPr>
-              <w:t>8.6: fee rulebook control</w:t>
-            </w:r>
-          </w:p>
-        </w:tc>
-        <w:tc>
-          <w:tcPr>
-            <w:tcW w:type="dxa" w:w="2493"/>
-          </w:tcPr>
-          <w:p>
-            <w:r>
-              <w:rPr>
-                <w:b w:val="0"/>
-                <w:sz w:val="17"/>
-              </w:rPr>
-            </w:r>
-            <w:r>
-              <w:rPr>
-                <w:b w:val="0"/>
-                <w:i w:val="0"/>
-                <w:sz w:val="17"/>
-              </w:rPr>
-              <w:t>3</w:t>
-            </w:r>
-          </w:p>
-        </w:tc>
-        <w:tc>
-          <w:tcPr>
-            <w:tcW w:type="dxa" w:w="2493"/>
-          </w:tcPr>
-          <w:p>
-            <w:r>
-              <w:rPr>
-                <w:b w:val="0"/>
-                <w:sz w:val="17"/>
-              </w:rPr>
-            </w:r>
-            <w:r>
-              <w:rPr>
-                <w:b w:val="0"/>
-                <w:i w:val="0"/>
-                <w:sz w:val="17"/>
-              </w:rPr>
-              <w:t>14</w:t>
-            </w:r>
-          </w:p>
-        </w:tc>
-      </w:tr>
-      <w:tr>
-        <w:trPr>
-          <w:cantSplit/>
-        </w:trPr>
-        <w:tc>
-          <w:tcPr>
-            <w:tcW w:type="dxa" w:w="2493"/>
-          </w:tcPr>
-          <w:p>
-            <w:r>
-              <w:rPr>
-                <w:b w:val="0"/>
-                <w:sz w:val="17"/>
-              </w:rPr>
-            </w:r>
-            <w:r>
-              <w:rPr>
-                <w:b w:val="0"/>
-                <w:i w:val="0"/>
-                <w:sz w:val="17"/>
-              </w:rPr>
-              <w:t>7</w:t>
-            </w:r>
-          </w:p>
-        </w:tc>
-        <w:tc>
-          <w:tcPr>
-            <w:tcW w:type="dxa" w:w="2493"/>
-          </w:tcPr>
-          <w:p>
-            <w:r>
-              <w:rPr>
-                <w:b w:val="0"/>
-                <w:sz w:val="17"/>
-              </w:rPr>
-            </w:r>
-            <w:r>
-              <w:rPr>
-                <w:b w:val="0"/>
-                <w:i w:val="0"/>
-                <w:sz w:val="17"/>
-              </w:rPr>
-              <w:t>8.1 to 8.5: the Governance Centre change log</w:t>
-            </w:r>
-          </w:p>
-        </w:tc>
-        <w:tc>
-          <w:tcPr>
-            <w:tcW w:type="dxa" w:w="2493"/>
-          </w:tcPr>
-          <w:p>
-            <w:r>
-              <w:rPr>
-                <w:b w:val="0"/>
-                <w:sz w:val="17"/>
-              </w:rPr>
-            </w:r>
-            <w:r>
-              <w:rPr>
-                <w:b w:val="0"/>
-                <w:i w:val="0"/>
-                <w:sz w:val="17"/>
-              </w:rPr>
-              <w:t>4</w:t>
-            </w:r>
-          </w:p>
-        </w:tc>
-        <w:tc>
-          <w:tcPr>
-            <w:tcW w:type="dxa" w:w="2493"/>
-          </w:tcPr>
-          <w:p>
-            <w:r>
-              <w:rPr>
-                <w:b w:val="0"/>
-                <w:sz w:val="17"/>
-              </w:rPr>
-            </w:r>
-            <w:r>
-              <w:rPr>
-                <w:b w:val="0"/>
-                <w:i w:val="0"/>
-                <w:sz w:val="17"/>
-              </w:rPr>
-              <w:t>9 to 12</w:t>
-            </w:r>
-          </w:p>
-        </w:tc>
-      </w:tr>
-      <w:tr>
-        <w:trPr>
-          <w:cantSplit/>
-        </w:trPr>
-        <w:tc>
-          <w:tcPr>
-            <w:tcW w:type="dxa" w:w="2493"/>
-          </w:tcPr>
-          <w:p>
-            <w:r>
-              <w:rPr>
-                <w:b w:val="0"/>
-                <w:sz w:val="17"/>
-              </w:rPr>
-            </w:r>
-            <w:r>
-              <w:rPr>
-                <w:b w:val="0"/>
-                <w:i w:val="0"/>
-                <w:sz w:val="17"/>
-              </w:rPr>
-              <w:t>8</w:t>
-            </w:r>
-          </w:p>
-        </w:tc>
-        <w:tc>
-          <w:tcPr>
-            <w:tcW w:type="dxa" w:w="2493"/>
-          </w:tcPr>
-          <w:p>
-            <w:r>
-              <w:rPr>
-                <w:b w:val="0"/>
-                <w:sz w:val="17"/>
-              </w:rPr>
-            </w:r>
-            <w:r>
-              <w:rPr>
-                <w:b w:val="0"/>
-                <w:i w:val="0"/>
-                <w:sz w:val="17"/>
-              </w:rPr>
-              <w:t>8.6: the other approvals</w:t>
-            </w:r>
-          </w:p>
-        </w:tc>
-        <w:tc>
-          <w:tcPr>
-            <w:tcW w:type="dxa" w:w="2493"/>
-          </w:tcPr>
-          <w:p>
-            <w:r>
-              <w:rPr>
-                <w:b w:val="0"/>
-                <w:sz w:val="17"/>
-              </w:rPr>
-            </w:r>
-            <w:r>
-              <w:rPr>
-                <w:b w:val="0"/>
-                <w:i w:val="0"/>
-                <w:sz w:val="17"/>
-              </w:rPr>
-              <w:t>4</w:t>
-            </w:r>
-          </w:p>
-        </w:tc>
-        <w:tc>
-          <w:tcPr>
-            <w:tcW w:type="dxa" w:w="2493"/>
-          </w:tcPr>
-          <w:p>
-            <w:r>
-              <w:rPr>
-                <w:b w:val="0"/>
-                <w:sz w:val="17"/>
-              </w:rPr>
-            </w:r>
-            <w:r>
-              <w:rPr>
-                <w:b w:val="0"/>
-                <w:i w:val="0"/>
-                <w:sz w:val="17"/>
-              </w:rPr>
-              <w:t>13</w:t>
-            </w:r>
-          </w:p>
-        </w:tc>
-      </w:tr>
-      <w:tr>
-        <w:trPr>
-          <w:cantSplit/>
-        </w:trPr>
-        <w:tc>
-          <w:tcPr>
-            <w:tcW w:type="dxa" w:w="2493"/>
-          </w:tcPr>
-          <w:p>
-            <w:r>
-              <w:rPr>
-                <w:b w:val="0"/>
-                <w:sz w:val="17"/>
-              </w:rPr>
-            </w:r>
-            <w:r>
-              <w:rPr>
-                <w:b w:val="0"/>
-                <w:i w:val="0"/>
-                <w:sz w:val="17"/>
-              </w:rPr>
-              <w:t>9</w:t>
-            </w:r>
-          </w:p>
-        </w:tc>
-        <w:tc>
-          <w:tcPr>
-            <w:tcW w:type="dxa" w:w="2493"/>
-          </w:tcPr>
-          <w:p>
-            <w:r>
-              <w:rPr>
-                <w:b w:val="0"/>
-                <w:sz w:val="17"/>
-              </w:rPr>
-            </w:r>
-            <w:r>
-              <w:rPr>
-                <w:b w:val="0"/>
-                <w:i w:val="0"/>
-                <w:sz w:val="17"/>
-              </w:rPr>
-              <w:t>8.7: the register of approvals</w:t>
-            </w:r>
-          </w:p>
-        </w:tc>
-        <w:tc>
-          <w:tcPr>
-            <w:tcW w:type="dxa" w:w="2493"/>
-          </w:tcPr>
-          <w:p>
-            <w:r>
-              <w:rPr>
-                <w:b w:val="0"/>
-                <w:sz w:val="17"/>
-              </w:rPr>
-            </w:r>
-            <w:r>
-              <w:rPr>
-                <w:b w:val="0"/>
-                <w:i w:val="0"/>
-                <w:sz w:val="17"/>
-              </w:rPr>
-              <w:t>4</w:t>
-            </w:r>
-          </w:p>
-        </w:tc>
-        <w:tc>
-          <w:tcPr>
-            <w:tcW w:type="dxa" w:w="2493"/>
-          </w:tcPr>
-          <w:p>
-            <w:r>
-              <w:rPr>
-                <w:b w:val="0"/>
-                <w:sz w:val="17"/>
-              </w:rPr>
-            </w:r>
-            <w:r>
-              <w:rPr>
-                <w:b w:val="0"/>
-                <w:i w:val="0"/>
-                <w:sz w:val="17"/>
-              </w:rPr>
-              <w:t>15</w:t>
-            </w:r>
-          </w:p>
-        </w:tc>
-      </w:tr>
-      <w:tr>
-        <w:trPr>
-          <w:cantSplit/>
-        </w:trPr>
-        <w:tc>
-          <w:tcPr>
-            <w:tcW w:type="dxa" w:w="2493"/>
-          </w:tcPr>
-          <w:p>
-            <w:r>
-              <w:rPr>
-                <w:b w:val="0"/>
-                <w:sz w:val="17"/>
-              </w:rPr>
-            </w:r>
-            <w:r>
-              <w:rPr>
-                <w:b w:val="0"/>
-                <w:i w:val="0"/>
-                <w:sz w:val="17"/>
-              </w:rPr>
-              <w:t>10</w:t>
-            </w:r>
-          </w:p>
-        </w:tc>
-        <w:tc>
-          <w:tcPr>
-            <w:tcW w:type="dxa" w:w="2493"/>
-          </w:tcPr>
-          <w:p>
-            <w:r>
-              <w:rPr>
-                <w:b w:val="0"/>
-                <w:sz w:val="17"/>
-              </w:rPr>
-            </w:r>
-            <w:r>
-              <w:rPr>
-                <w:b w:val="0"/>
-                <w:i w:val="0"/>
-                <w:sz w:val="17"/>
-              </w:rPr>
-              <w:t>8.8: the run record</w:t>
-            </w:r>
-          </w:p>
-        </w:tc>
-        <w:tc>
-          <w:tcPr>
-            <w:tcW w:type="dxa" w:w="2493"/>
-          </w:tcPr>
-          <w:p>
-            <w:r>
-              <w:rPr>
-                <w:b w:val="0"/>
-                <w:sz w:val="17"/>
-              </w:rPr>
-            </w:r>
-            <w:r>
-              <w:rPr>
-                <w:b w:val="0"/>
-                <w:i w:val="0"/>
-                <w:sz w:val="17"/>
-              </w:rPr>
-              <w:t>4</w:t>
-            </w:r>
-          </w:p>
-        </w:tc>
-        <w:tc>
-          <w:tcPr>
-            <w:tcW w:type="dxa" w:w="2493"/>
-          </w:tcPr>
-          <w:p>
-            <w:r>
-              <w:rPr>
-                <w:b w:val="0"/>
-                <w:sz w:val="17"/>
-              </w:rPr>
-            </w:r>
-            <w:r>
-              <w:rPr>
-                <w:b w:val="0"/>
-                <w:i w:val="0"/>
-                <w:sz w:val="17"/>
-              </w:rPr>
-              <w:t>16, 17, 19</w:t>
-            </w:r>
-          </w:p>
-        </w:tc>
-      </w:tr>
-      <w:tr>
-        <w:trPr>
-          <w:cantSplit/>
-        </w:trPr>
-        <w:tc>
-          <w:tcPr>
-            <w:tcW w:type="dxa" w:w="2493"/>
-          </w:tcPr>
-          <w:p>
-            <w:r>
-              <w:rPr>
-                <w:b w:val="0"/>
-                <w:sz w:val="17"/>
-              </w:rPr>
-            </w:r>
-            <w:r>
-              <w:rPr>
-                <w:b w:val="0"/>
-                <w:i w:val="0"/>
-                <w:sz w:val="17"/>
-              </w:rPr>
-              <w:t>11</w:t>
-            </w:r>
-          </w:p>
-        </w:tc>
-        <w:tc>
-          <w:tcPr>
-            <w:tcW w:type="dxa" w:w="2493"/>
-          </w:tcPr>
-          <w:p>
-            <w:r>
-              <w:rPr>
-                <w:b w:val="0"/>
-                <w:sz w:val="17"/>
-              </w:rPr>
-            </w:r>
-            <w:r>
-              <w:rPr>
-                <w:b w:val="0"/>
-                <w:i w:val="0"/>
-                <w:sz w:val="17"/>
-              </w:rPr>
-              <w:t>The complete build: all 23 acceptance tests, the full test suite and a bootstrap on a fresh database with the nine ties passing</w:t>
-            </w:r>
-          </w:p>
-        </w:tc>
-        <w:tc>
-          <w:tcPr>
-            <w:tcW w:type="dxa" w:w="2493"/>
-          </w:tcPr>
-          <w:p>
-            <w:r>
-              <w:rPr>
-                <w:b w:val="0"/>
-                <w:sz w:val="17"/>
-              </w:rPr>
-            </w:r>
-            <w:r>
-              <w:rPr>
-                <w:b w:val="0"/>
-                <w:i w:val="0"/>
-                <w:sz w:val="17"/>
-              </w:rPr>
-              <w:t>All</w:t>
-            </w:r>
-          </w:p>
-        </w:tc>
-        <w:tc>
-          <w:tcPr>
-            <w:tcW w:type="dxa" w:w="2493"/>
-          </w:tcPr>
-          <w:p>
-            <w:r>
-              <w:rPr>
-                <w:b w:val="0"/>
-                <w:sz w:val="17"/>
-              </w:rPr>
-            </w:r>
-            <w:r>
-              <w:rPr>
-                <w:b w:val="0"/>
-                <w:i w:val="0"/>
-                <w:sz w:val="17"/>
-              </w:rPr>
-              <w:t>8 and all</w:t>
-            </w:r>
-          </w:p>
-        </w:tc>
-      </w:tr>
-    </w:tbl>
-    <w:p/>
-    <w:p>
-      <w:pPr>
-        <w:spacing w:after="120"/>
-        <w:jc w:val="both"/>
-      </w:pPr>
-      <w:r>
-        <w:rPr>
-          <w:b/>
-          <w:i w:val="0"/>
-        </w:rPr>
-        <w:t>The merge.</w:t>
-      </w:r>
-      <w:r>
-        <w:rPr>
-          <w:b w:val="0"/>
-          <w:i w:val="0"/>
-        </w:rPr>
-        <w:t xml:space="preserve"> When section 11 is confirmed, the branch is rebased onto the main branch one last time, the full tests and the bootstrap are run again, and the complete build is merged into </w:t>
+        <w:t xml:space="preserve"> When every section of a phase is confirmed, the branch is rebased onto the main branch, the full test suite and a bootstrap on a fresh database are run (the nine ties must pass), and the phase is merged into </w:t>
       </w:r>
       <w:r>
         <w:rPr>
@@ -13474,7 +12343,7 @@
           <w:b w:val="0"/>
           <w:i w:val="0"/>
         </w:rPr>
-        <w:t xml:space="preserve"> in one step, with a merge note listing every section, its confirmation and the decisions (section 9) it rests on. It is then released to MAIIC's server once, by the release steps of the integration document (section 2.2: push, pull, migrate, bootstrap with the nine ties passing).</w:t>
+        <w:t xml:space="preserve"> with a merge note listing its sections, their confirmations and the decisions (section 9) they rest on. The phase is then released to MAIIC's server by the release steps of the integration document (section 2.2: push, pull, migrate, bootstrap with the nine ties passing). The next phase continues on the same branch, rebased onto the merged main branch.</w:t>
       </w:r>
     </w:p>
     <w:p>
@@ -13487,14 +12356,1412 @@
           <w:b/>
           <w:i w:val="0"/>
         </w:rPr>
-        <w:t>What this means for the order.</w:t>
+        <w:t>The sections and merges, in order.</w:t>
       </w:r>
       <w:r>
         <w:rPr>
           <w:b w:val="0"/>
           <w:i w:val="0"/>
         </w:rPr>
-        <w:t xml:space="preserve"> Because nothing is merged until the end, the protections of phase 1 (no back-dating, UAT mode) and the fee rulebook control of phase 3 reach MAIIC's server with the complete build, not earlier. If one of them is needed sooner, it can be taken out of the branch as its own small merge, with Edward's confirmation, and the rest of the build continues on the branch.</w:t>
+        <w:t xml:space="preserve"> Each section row is one start-and-end confirmation; each merge row is one merge and release:</w:t>
+      </w:r>
+    </w:p>
+    <w:tbl>
+      <w:tblPr>
+        <w:tblStyle w:val="TableGrid"/>
+        <w:tblW w:type="auto" w:w="0"/>
+        <w:tblLook w:firstColumn="1" w:firstRow="1" w:lastColumn="0" w:lastRow="0" w:noHBand="0" w:noVBand="1" w:val="04A0"/>
+      </w:tblPr>
+      <w:tblGrid>
+        <w:gridCol w:w="2493"/>
+        <w:gridCol w:w="2493"/>
+        <w:gridCol w:w="2493"/>
+        <w:gridCol w:w="2493"/>
+      </w:tblGrid>
+      <w:tr>
+        <w:trPr>
+          <w:cantSplit/>
+          <w:tblHeader/>
+        </w:trPr>
+        <w:tc>
+          <w:tcPr>
+            <w:tcW w:type="dxa" w:w="2493"/>
+            <w:shd w:val="clear" w:color="auto" w:fill="1B2A41"/>
+          </w:tcPr>
+          <w:p>
+            <w:r>
+              <w:rPr>
+                <w:b/>
+                <w:color w:val="FFFFFF"/>
+                <w:sz w:val="17"/>
+              </w:rPr>
+            </w:r>
+            <w:r>
+              <w:rPr>
+                <w:b/>
+                <w:i w:val="0"/>
+                <w:color w:val="FFFFFF"/>
+                <w:sz w:val="17"/>
+              </w:rPr>
+              <w:t>#</w:t>
+            </w:r>
+          </w:p>
+        </w:tc>
+        <w:tc>
+          <w:tcPr>
+            <w:tcW w:type="dxa" w:w="2493"/>
+            <w:shd w:val="clear" w:color="auto" w:fill="1B2A41"/>
+          </w:tcPr>
+          <w:p>
+            <w:r>
+              <w:rPr>
+                <w:b/>
+                <w:color w:val="FFFFFF"/>
+                <w:sz w:val="17"/>
+              </w:rPr>
+            </w:r>
+            <w:r>
+              <w:rPr>
+                <w:b/>
+                <w:i w:val="0"/>
+                <w:color w:val="FFFFFF"/>
+                <w:sz w:val="17"/>
+              </w:rPr>
+              <w:t>Section</w:t>
+            </w:r>
+          </w:p>
+        </w:tc>
+        <w:tc>
+          <w:tcPr>
+            <w:tcW w:type="dxa" w:w="2493"/>
+            <w:shd w:val="clear" w:color="auto" w:fill="1B2A41"/>
+          </w:tcPr>
+          <w:p>
+            <w:r>
+              <w:rPr>
+                <w:b/>
+                <w:color w:val="FFFFFF"/>
+                <w:sz w:val="17"/>
+              </w:rPr>
+            </w:r>
+            <w:r>
+              <w:rPr>
+                <w:b/>
+                <w:i w:val="0"/>
+                <w:color w:val="FFFFFF"/>
+                <w:sz w:val="17"/>
+              </w:rPr>
+              <w:t>Phase</w:t>
+            </w:r>
+          </w:p>
+        </w:tc>
+        <w:tc>
+          <w:tcPr>
+            <w:tcW w:type="dxa" w:w="2493"/>
+            <w:shd w:val="clear" w:color="auto" w:fill="1B2A41"/>
+          </w:tcPr>
+          <w:p>
+            <w:r>
+              <w:rPr>
+                <w:b/>
+                <w:color w:val="FFFFFF"/>
+                <w:sz w:val="17"/>
+              </w:rPr>
+            </w:r>
+            <w:r>
+              <w:rPr>
+                <w:b/>
+                <w:i w:val="0"/>
+                <w:color w:val="FFFFFF"/>
+                <w:sz w:val="17"/>
+              </w:rPr>
+              <w:t>Acceptance tests closed</w:t>
+            </w:r>
+          </w:p>
+        </w:tc>
+      </w:tr>
+      <w:tr>
+        <w:trPr>
+          <w:cantSplit/>
+        </w:trPr>
+        <w:tc>
+          <w:tcPr>
+            <w:tcW w:type="dxa" w:w="2493"/>
+          </w:tcPr>
+          <w:p>
+            <w:r>
+              <w:rPr>
+                <w:b w:val="0"/>
+                <w:sz w:val="17"/>
+              </w:rPr>
+            </w:r>
+            <w:r>
+              <w:rPr>
+                <w:b w:val="0"/>
+                <w:i w:val="0"/>
+                <w:sz w:val="17"/>
+              </w:rPr>
+              <w:t>1</w:t>
+            </w:r>
+          </w:p>
+        </w:tc>
+        <w:tc>
+          <w:tcPr>
+            <w:tcW w:type="dxa" w:w="2493"/>
+          </w:tcPr>
+          <w:p>
+            <w:r>
+              <w:rPr>
+                <w:b w:val="0"/>
+                <w:sz w:val="17"/>
+              </w:rPr>
+            </w:r>
+            <w:r>
+              <w:rPr>
+                <w:b w:val="0"/>
+                <w:i w:val="0"/>
+                <w:sz w:val="17"/>
+              </w:rPr>
+              <w:t>8.8 item 4: no back-dating into a locked month</w:t>
+            </w:r>
+          </w:p>
+        </w:tc>
+        <w:tc>
+          <w:tcPr>
+            <w:tcW w:type="dxa" w:w="2493"/>
+          </w:tcPr>
+          <w:p>
+            <w:r>
+              <w:rPr>
+                <w:b w:val="0"/>
+                <w:sz w:val="17"/>
+              </w:rPr>
+            </w:r>
+            <w:r>
+              <w:rPr>
+                <w:b w:val="0"/>
+                <w:i w:val="0"/>
+                <w:sz w:val="17"/>
+              </w:rPr>
+              <w:t>1</w:t>
+            </w:r>
+          </w:p>
+        </w:tc>
+        <w:tc>
+          <w:tcPr>
+            <w:tcW w:type="dxa" w:w="2493"/>
+          </w:tcPr>
+          <w:p>
+            <w:r>
+              <w:rPr>
+                <w:b w:val="0"/>
+                <w:sz w:val="17"/>
+              </w:rPr>
+            </w:r>
+            <w:r>
+              <w:rPr>
+                <w:b w:val="0"/>
+                <w:i w:val="0"/>
+                <w:sz w:val="17"/>
+              </w:rPr>
+              <w:t>18</w:t>
+            </w:r>
+          </w:p>
+        </w:tc>
+      </w:tr>
+      <w:tr>
+        <w:trPr>
+          <w:cantSplit/>
+        </w:trPr>
+        <w:tc>
+          <w:tcPr>
+            <w:tcW w:type="dxa" w:w="2493"/>
+          </w:tcPr>
+          <w:p>
+            <w:r>
+              <w:rPr>
+                <w:b w:val="0"/>
+                <w:sz w:val="17"/>
+              </w:rPr>
+            </w:r>
+            <w:r>
+              <w:rPr>
+                <w:b w:val="0"/>
+                <w:i w:val="0"/>
+                <w:sz w:val="17"/>
+              </w:rPr>
+              <w:t>2</w:t>
+            </w:r>
+          </w:p>
+        </w:tc>
+        <w:tc>
+          <w:tcPr>
+            <w:tcW w:type="dxa" w:w="2493"/>
+          </w:tcPr>
+          <w:p>
+            <w:r>
+              <w:rPr>
+                <w:b w:val="0"/>
+                <w:sz w:val="17"/>
+              </w:rPr>
+            </w:r>
+            <w:r>
+              <w:rPr>
+                <w:b w:val="0"/>
+                <w:i w:val="0"/>
+                <w:sz w:val="17"/>
+              </w:rPr>
+              <w:t>8.9: UAT mode</w:t>
+            </w:r>
+          </w:p>
+        </w:tc>
+        <w:tc>
+          <w:tcPr>
+            <w:tcW w:type="dxa" w:w="2493"/>
+          </w:tcPr>
+          <w:p>
+            <w:r>
+              <w:rPr>
+                <w:b w:val="0"/>
+                <w:sz w:val="17"/>
+              </w:rPr>
+            </w:r>
+            <w:r>
+              <w:rPr>
+                <w:b w:val="0"/>
+                <w:i w:val="0"/>
+                <w:sz w:val="17"/>
+              </w:rPr>
+              <w:t>1</w:t>
+            </w:r>
+          </w:p>
+        </w:tc>
+        <w:tc>
+          <w:tcPr>
+            <w:tcW w:type="dxa" w:w="2493"/>
+          </w:tcPr>
+          <w:p>
+            <w:r>
+              <w:rPr>
+                <w:b w:val="0"/>
+                <w:sz w:val="17"/>
+              </w:rPr>
+            </w:r>
+            <w:r>
+              <w:rPr>
+                <w:b w:val="0"/>
+                <w:i w:val="0"/>
+                <w:sz w:val="17"/>
+              </w:rPr>
+              <w:t>20 to 23</w:t>
+            </w:r>
+          </w:p>
+        </w:tc>
+      </w:tr>
+      <w:tr>
+        <w:trPr>
+          <w:cantSplit/>
+        </w:trPr>
+        <w:tc>
+          <w:tcPr>
+            <w:tcW w:type="dxa" w:w="2493"/>
+          </w:tcPr>
+          <w:p>
+            <w:r>
+              <w:rPr>
+                <w:b w:val="0"/>
+                <w:sz w:val="17"/>
+              </w:rPr>
+            </w:r>
+            <w:r>
+              <w:rPr>
+                <w:b/>
+                <w:i w:val="0"/>
+                <w:sz w:val="17"/>
+              </w:rPr>
+              <w:t>M1</w:t>
+            </w:r>
+          </w:p>
+        </w:tc>
+        <w:tc>
+          <w:tcPr>
+            <w:tcW w:type="dxa" w:w="2493"/>
+          </w:tcPr>
+          <w:p>
+            <w:r>
+              <w:rPr>
+                <w:b w:val="0"/>
+                <w:sz w:val="17"/>
+              </w:rPr>
+            </w:r>
+            <w:r>
+              <w:rPr>
+                <w:b/>
+                <w:i w:val="0"/>
+                <w:sz w:val="17"/>
+              </w:rPr>
+              <w:t>Merge and release phase 1</w:t>
+            </w:r>
+          </w:p>
+        </w:tc>
+        <w:tc>
+          <w:tcPr>
+            <w:tcW w:type="dxa" w:w="2493"/>
+          </w:tcPr>
+          <w:p>
+            <w:r>
+              <w:rPr>
+                <w:b w:val="0"/>
+                <w:sz w:val="17"/>
+              </w:rPr>
+            </w:r>
+            <w:r>
+              <w:rPr>
+                <w:b w:val="0"/>
+                <w:i w:val="0"/>
+                <w:sz w:val="17"/>
+              </w:rPr>
+              <w:t>1</w:t>
+            </w:r>
+          </w:p>
+        </w:tc>
+        <w:tc>
+          <w:tcPr>
+            <w:tcW w:type="dxa" w:w="2493"/>
+          </w:tcPr>
+          <w:p>
+            <w:r>
+              <w:rPr>
+                <w:b w:val="0"/>
+                <w:sz w:val="17"/>
+              </w:rPr>
+            </w:r>
+            <w:r>
+              <w:rPr>
+                <w:b w:val="0"/>
+                <w:i w:val="0"/>
+                <w:sz w:val="17"/>
+              </w:rPr>
+              <w:t>18, 20 to 23 re-run on the merged code</w:t>
+            </w:r>
+          </w:p>
+        </w:tc>
+      </w:tr>
+      <w:tr>
+        <w:trPr>
+          <w:cantSplit/>
+        </w:trPr>
+        <w:tc>
+          <w:tcPr>
+            <w:tcW w:type="dxa" w:w="2493"/>
+          </w:tcPr>
+          <w:p>
+            <w:r>
+              <w:rPr>
+                <w:b w:val="0"/>
+                <w:sz w:val="17"/>
+              </w:rPr>
+            </w:r>
+            <w:r>
+              <w:rPr>
+                <w:b w:val="0"/>
+                <w:i w:val="0"/>
+                <w:sz w:val="17"/>
+              </w:rPr>
+              <w:t>3</w:t>
+            </w:r>
+          </w:p>
+        </w:tc>
+        <w:tc>
+          <w:tcPr>
+            <w:tcW w:type="dxa" w:w="2493"/>
+          </w:tcPr>
+          <w:p>
+            <w:r>
+              <w:rPr>
+                <w:b w:val="0"/>
+                <w:sz w:val="17"/>
+              </w:rPr>
+            </w:r>
+            <w:r>
+              <w:rPr>
+                <w:b w:val="0"/>
+                <w:i w:val="0"/>
+                <w:sz w:val="17"/>
+              </w:rPr>
+              <w:t>3: the settings and presets</w:t>
+            </w:r>
+          </w:p>
+        </w:tc>
+        <w:tc>
+          <w:tcPr>
+            <w:tcW w:type="dxa" w:w="2493"/>
+          </w:tcPr>
+          <w:p>
+            <w:r>
+              <w:rPr>
+                <w:b w:val="0"/>
+                <w:sz w:val="17"/>
+              </w:rPr>
+            </w:r>
+            <w:r>
+              <w:rPr>
+                <w:b w:val="0"/>
+                <w:i w:val="0"/>
+                <w:sz w:val="17"/>
+              </w:rPr>
+              <w:t>2</w:t>
+            </w:r>
+          </w:p>
+        </w:tc>
+        <w:tc>
+          <w:tcPr>
+            <w:tcW w:type="dxa" w:w="2493"/>
+          </w:tcPr>
+          <w:p>
+            <w:r>
+              <w:rPr>
+                <w:b w:val="0"/>
+                <w:sz w:val="17"/>
+              </w:rPr>
+            </w:r>
+            <w:r>
+              <w:rPr>
+                <w:b w:val="0"/>
+                <w:i w:val="0"/>
+                <w:sz w:val="17"/>
+              </w:rPr>
+              <w:t>1 to 3, 7</w:t>
+            </w:r>
+          </w:p>
+        </w:tc>
+      </w:tr>
+      <w:tr>
+        <w:trPr>
+          <w:cantSplit/>
+        </w:trPr>
+        <w:tc>
+          <w:tcPr>
+            <w:tcW w:type="dxa" w:w="2493"/>
+          </w:tcPr>
+          <w:p>
+            <w:r>
+              <w:rPr>
+                <w:b w:val="0"/>
+                <w:sz w:val="17"/>
+              </w:rPr>
+            </w:r>
+            <w:r>
+              <w:rPr>
+                <w:b w:val="0"/>
+                <w:i w:val="0"/>
+                <w:sz w:val="17"/>
+              </w:rPr>
+              <w:t>4</w:t>
+            </w:r>
+          </w:p>
+        </w:tc>
+        <w:tc>
+          <w:tcPr>
+            <w:tcW w:type="dxa" w:w="2493"/>
+          </w:tcPr>
+          <w:p>
+            <w:r>
+              <w:rPr>
+                <w:b w:val="0"/>
+                <w:sz w:val="17"/>
+              </w:rPr>
+            </w:r>
+            <w:r>
+              <w:rPr>
+                <w:b w:val="0"/>
+                <w:i w:val="0"/>
+                <w:sz w:val="17"/>
+              </w:rPr>
+              <w:t>5: the separate staging day count, the RBM return on the directive's count</w:t>
+            </w:r>
+          </w:p>
+        </w:tc>
+        <w:tc>
+          <w:tcPr>
+            <w:tcW w:type="dxa" w:w="2493"/>
+          </w:tcPr>
+          <w:p>
+            <w:r>
+              <w:rPr>
+                <w:b w:val="0"/>
+                <w:sz w:val="17"/>
+              </w:rPr>
+            </w:r>
+            <w:r>
+              <w:rPr>
+                <w:b w:val="0"/>
+                <w:i w:val="0"/>
+                <w:sz w:val="17"/>
+              </w:rPr>
+              <w:t>2</w:t>
+            </w:r>
+          </w:p>
+        </w:tc>
+        <w:tc>
+          <w:tcPr>
+            <w:tcW w:type="dxa" w:w="2493"/>
+          </w:tcPr>
+          <w:p>
+            <w:r>
+              <w:rPr>
+                <w:b w:val="0"/>
+                <w:sz w:val="17"/>
+              </w:rPr>
+            </w:r>
+            <w:r>
+              <w:rPr>
+                <w:b w:val="0"/>
+                <w:i w:val="0"/>
+                <w:sz w:val="17"/>
+              </w:rPr>
+              <w:t>6</w:t>
+            </w:r>
+          </w:p>
+        </w:tc>
+      </w:tr>
+      <w:tr>
+        <w:trPr>
+          <w:cantSplit/>
+        </w:trPr>
+        <w:tc>
+          <w:tcPr>
+            <w:tcW w:type="dxa" w:w="2493"/>
+          </w:tcPr>
+          <w:p>
+            <w:r>
+              <w:rPr>
+                <w:b w:val="0"/>
+                <w:sz w:val="17"/>
+              </w:rPr>
+            </w:r>
+            <w:r>
+              <w:rPr>
+                <w:b w:val="0"/>
+                <w:i w:val="0"/>
+                <w:sz w:val="17"/>
+              </w:rPr>
+              <w:t>5</w:t>
+            </w:r>
+          </w:p>
+        </w:tc>
+        <w:tc>
+          <w:tcPr>
+            <w:tcW w:type="dxa" w:w="2493"/>
+          </w:tcPr>
+          <w:p>
+            <w:r>
+              <w:rPr>
+                <w:b w:val="0"/>
+                <w:sz w:val="17"/>
+              </w:rPr>
+            </w:r>
+            <w:r>
+              <w:rPr>
+                <w:b w:val="0"/>
+                <w:i w:val="0"/>
+                <w:sz w:val="17"/>
+              </w:rPr>
+              <w:t>4: the staging comparison run</w:t>
+            </w:r>
+          </w:p>
+        </w:tc>
+        <w:tc>
+          <w:tcPr>
+            <w:tcW w:type="dxa" w:w="2493"/>
+          </w:tcPr>
+          <w:p>
+            <w:r>
+              <w:rPr>
+                <w:b w:val="0"/>
+                <w:sz w:val="17"/>
+              </w:rPr>
+            </w:r>
+            <w:r>
+              <w:rPr>
+                <w:b w:val="0"/>
+                <w:i w:val="0"/>
+                <w:sz w:val="17"/>
+              </w:rPr>
+              <w:t>2</w:t>
+            </w:r>
+          </w:p>
+        </w:tc>
+        <w:tc>
+          <w:tcPr>
+            <w:tcW w:type="dxa" w:w="2493"/>
+          </w:tcPr>
+          <w:p>
+            <w:r>
+              <w:rPr>
+                <w:b w:val="0"/>
+                <w:sz w:val="17"/>
+              </w:rPr>
+            </w:r>
+            <w:r>
+              <w:rPr>
+                <w:b w:val="0"/>
+                <w:i w:val="0"/>
+                <w:sz w:val="17"/>
+              </w:rPr>
+              <w:t>4, 5</w:t>
+            </w:r>
+          </w:p>
+        </w:tc>
+      </w:tr>
+      <w:tr>
+        <w:trPr>
+          <w:cantSplit/>
+        </w:trPr>
+        <w:tc>
+          <w:tcPr>
+            <w:tcW w:type="dxa" w:w="2493"/>
+          </w:tcPr>
+          <w:p>
+            <w:r>
+              <w:rPr>
+                <w:b w:val="0"/>
+                <w:sz w:val="17"/>
+              </w:rPr>
+            </w:r>
+            <w:r>
+              <w:rPr>
+                <w:b/>
+                <w:i w:val="0"/>
+                <w:sz w:val="17"/>
+              </w:rPr>
+              <w:t>M2</w:t>
+            </w:r>
+          </w:p>
+        </w:tc>
+        <w:tc>
+          <w:tcPr>
+            <w:tcW w:type="dxa" w:w="2493"/>
+          </w:tcPr>
+          <w:p>
+            <w:r>
+              <w:rPr>
+                <w:b w:val="0"/>
+                <w:sz w:val="17"/>
+              </w:rPr>
+            </w:r>
+            <w:r>
+              <w:rPr>
+                <w:b/>
+                <w:i w:val="0"/>
+                <w:sz w:val="17"/>
+              </w:rPr>
+              <w:t>Merge and release phase 2</w:t>
+            </w:r>
+            <w:r>
+              <w:rPr>
+                <w:b w:val="0"/>
+                <w:i w:val="0"/>
+                <w:sz w:val="17"/>
+              </w:rPr>
+              <w:t>, then the comparison runs for December 2025 and September 2026 on MAIIC's server</w:t>
+            </w:r>
+          </w:p>
+        </w:tc>
+        <w:tc>
+          <w:tcPr>
+            <w:tcW w:type="dxa" w:w="2493"/>
+          </w:tcPr>
+          <w:p>
+            <w:r>
+              <w:rPr>
+                <w:b w:val="0"/>
+                <w:sz w:val="17"/>
+              </w:rPr>
+            </w:r>
+            <w:r>
+              <w:rPr>
+                <w:b w:val="0"/>
+                <w:i w:val="0"/>
+                <w:sz w:val="17"/>
+              </w:rPr>
+              <w:t>2</w:t>
+            </w:r>
+          </w:p>
+        </w:tc>
+        <w:tc>
+          <w:tcPr>
+            <w:tcW w:type="dxa" w:w="2493"/>
+          </w:tcPr>
+          <w:p>
+            <w:r>
+              <w:rPr>
+                <w:b w:val="0"/>
+                <w:sz w:val="17"/>
+              </w:rPr>
+            </w:r>
+            <w:r>
+              <w:rPr>
+                <w:b w:val="0"/>
+                <w:i w:val="0"/>
+                <w:sz w:val="17"/>
+              </w:rPr>
+              <w:t>1 to 8</w:t>
+            </w:r>
+          </w:p>
+        </w:tc>
+      </w:tr>
+      <w:tr>
+        <w:trPr>
+          <w:cantSplit/>
+        </w:trPr>
+        <w:tc>
+          <w:tcPr>
+            <w:tcW w:type="dxa" w:w="2493"/>
+          </w:tcPr>
+          <w:p>
+            <w:r>
+              <w:rPr>
+                <w:b w:val="0"/>
+                <w:sz w:val="17"/>
+              </w:rPr>
+            </w:r>
+            <w:r>
+              <w:rPr>
+                <w:b w:val="0"/>
+                <w:i w:val="0"/>
+                <w:sz w:val="17"/>
+              </w:rPr>
+              <w:t>6</w:t>
+            </w:r>
+          </w:p>
+        </w:tc>
+        <w:tc>
+          <w:tcPr>
+            <w:tcW w:type="dxa" w:w="2493"/>
+          </w:tcPr>
+          <w:p>
+            <w:r>
+              <w:rPr>
+                <w:b w:val="0"/>
+                <w:sz w:val="17"/>
+              </w:rPr>
+            </w:r>
+            <w:r>
+              <w:rPr>
+                <w:b w:val="0"/>
+                <w:i w:val="0"/>
+                <w:sz w:val="17"/>
+              </w:rPr>
+              <w:t>8.6: fee rulebook control, then the re-approval of the rules in use (decision S9)</w:t>
+            </w:r>
+          </w:p>
+        </w:tc>
+        <w:tc>
+          <w:tcPr>
+            <w:tcW w:type="dxa" w:w="2493"/>
+          </w:tcPr>
+          <w:p>
+            <w:r>
+              <w:rPr>
+                <w:b w:val="0"/>
+                <w:sz w:val="17"/>
+              </w:rPr>
+            </w:r>
+            <w:r>
+              <w:rPr>
+                <w:b w:val="0"/>
+                <w:i w:val="0"/>
+                <w:sz w:val="17"/>
+              </w:rPr>
+              <w:t>3</w:t>
+            </w:r>
+          </w:p>
+        </w:tc>
+        <w:tc>
+          <w:tcPr>
+            <w:tcW w:type="dxa" w:w="2493"/>
+          </w:tcPr>
+          <w:p>
+            <w:r>
+              <w:rPr>
+                <w:b w:val="0"/>
+                <w:sz w:val="17"/>
+              </w:rPr>
+            </w:r>
+            <w:r>
+              <w:rPr>
+                <w:b w:val="0"/>
+                <w:i w:val="0"/>
+                <w:sz w:val="17"/>
+              </w:rPr>
+              <w:t>14</w:t>
+            </w:r>
+          </w:p>
+        </w:tc>
+      </w:tr>
+      <w:tr>
+        <w:trPr>
+          <w:cantSplit/>
+        </w:trPr>
+        <w:tc>
+          <w:tcPr>
+            <w:tcW w:type="dxa" w:w="2493"/>
+          </w:tcPr>
+          <w:p>
+            <w:r>
+              <w:rPr>
+                <w:b w:val="0"/>
+                <w:sz w:val="17"/>
+              </w:rPr>
+            </w:r>
+            <w:r>
+              <w:rPr>
+                <w:b/>
+                <w:i w:val="0"/>
+                <w:sz w:val="17"/>
+              </w:rPr>
+              <w:t>M3</w:t>
+            </w:r>
+          </w:p>
+        </w:tc>
+        <w:tc>
+          <w:tcPr>
+            <w:tcW w:type="dxa" w:w="2493"/>
+          </w:tcPr>
+          <w:p>
+            <w:r>
+              <w:rPr>
+                <w:b w:val="0"/>
+                <w:sz w:val="17"/>
+              </w:rPr>
+            </w:r>
+            <w:r>
+              <w:rPr>
+                <w:b/>
+                <w:i w:val="0"/>
+                <w:sz w:val="17"/>
+              </w:rPr>
+              <w:t>Merge and release phase 3</w:t>
+            </w:r>
+          </w:p>
+        </w:tc>
+        <w:tc>
+          <w:tcPr>
+            <w:tcW w:type="dxa" w:w="2493"/>
+          </w:tcPr>
+          <w:p>
+            <w:r>
+              <w:rPr>
+                <w:b w:val="0"/>
+                <w:sz w:val="17"/>
+              </w:rPr>
+            </w:r>
+            <w:r>
+              <w:rPr>
+                <w:b w:val="0"/>
+                <w:i w:val="0"/>
+                <w:sz w:val="17"/>
+              </w:rPr>
+              <w:t>3</w:t>
+            </w:r>
+          </w:p>
+        </w:tc>
+        <w:tc>
+          <w:tcPr>
+            <w:tcW w:type="dxa" w:w="2493"/>
+          </w:tcPr>
+          <w:p>
+            <w:r>
+              <w:rPr>
+                <w:b w:val="0"/>
+                <w:sz w:val="17"/>
+              </w:rPr>
+            </w:r>
+            <w:r>
+              <w:rPr>
+                <w:b w:val="0"/>
+                <w:i w:val="0"/>
+                <w:sz w:val="17"/>
+              </w:rPr>
+              <w:t>14</w:t>
+            </w:r>
+          </w:p>
+        </w:tc>
+      </w:tr>
+      <w:tr>
+        <w:trPr>
+          <w:cantSplit/>
+        </w:trPr>
+        <w:tc>
+          <w:tcPr>
+            <w:tcW w:type="dxa" w:w="2493"/>
+          </w:tcPr>
+          <w:p>
+            <w:r>
+              <w:rPr>
+                <w:b w:val="0"/>
+                <w:sz w:val="17"/>
+              </w:rPr>
+            </w:r>
+            <w:r>
+              <w:rPr>
+                <w:b w:val="0"/>
+                <w:i w:val="0"/>
+                <w:sz w:val="17"/>
+              </w:rPr>
+              <w:t>7</w:t>
+            </w:r>
+          </w:p>
+        </w:tc>
+        <w:tc>
+          <w:tcPr>
+            <w:tcW w:type="dxa" w:w="2493"/>
+          </w:tcPr>
+          <w:p>
+            <w:r>
+              <w:rPr>
+                <w:b w:val="0"/>
+                <w:sz w:val="17"/>
+              </w:rPr>
+            </w:r>
+            <w:r>
+              <w:rPr>
+                <w:b w:val="0"/>
+                <w:i w:val="0"/>
+                <w:sz w:val="17"/>
+              </w:rPr>
+              <w:t>8.1 to 8.5: the Governance Centre change log</w:t>
+            </w:r>
+          </w:p>
+        </w:tc>
+        <w:tc>
+          <w:tcPr>
+            <w:tcW w:type="dxa" w:w="2493"/>
+          </w:tcPr>
+          <w:p>
+            <w:r>
+              <w:rPr>
+                <w:b w:val="0"/>
+                <w:sz w:val="17"/>
+              </w:rPr>
+            </w:r>
+            <w:r>
+              <w:rPr>
+                <w:b w:val="0"/>
+                <w:i w:val="0"/>
+                <w:sz w:val="17"/>
+              </w:rPr>
+              <w:t>4</w:t>
+            </w:r>
+          </w:p>
+        </w:tc>
+        <w:tc>
+          <w:tcPr>
+            <w:tcW w:type="dxa" w:w="2493"/>
+          </w:tcPr>
+          <w:p>
+            <w:r>
+              <w:rPr>
+                <w:b w:val="0"/>
+                <w:sz w:val="17"/>
+              </w:rPr>
+            </w:r>
+            <w:r>
+              <w:rPr>
+                <w:b w:val="0"/>
+                <w:i w:val="0"/>
+                <w:sz w:val="17"/>
+              </w:rPr>
+              <w:t>9 to 12</w:t>
+            </w:r>
+          </w:p>
+        </w:tc>
+      </w:tr>
+      <w:tr>
+        <w:trPr>
+          <w:cantSplit/>
+        </w:trPr>
+        <w:tc>
+          <w:tcPr>
+            <w:tcW w:type="dxa" w:w="2493"/>
+          </w:tcPr>
+          <w:p>
+            <w:r>
+              <w:rPr>
+                <w:b w:val="0"/>
+                <w:sz w:val="17"/>
+              </w:rPr>
+            </w:r>
+            <w:r>
+              <w:rPr>
+                <w:b w:val="0"/>
+                <w:i w:val="0"/>
+                <w:sz w:val="17"/>
+              </w:rPr>
+              <w:t>8</w:t>
+            </w:r>
+          </w:p>
+        </w:tc>
+        <w:tc>
+          <w:tcPr>
+            <w:tcW w:type="dxa" w:w="2493"/>
+          </w:tcPr>
+          <w:p>
+            <w:r>
+              <w:rPr>
+                <w:b w:val="0"/>
+                <w:sz w:val="17"/>
+              </w:rPr>
+            </w:r>
+            <w:r>
+              <w:rPr>
+                <w:b w:val="0"/>
+                <w:i w:val="0"/>
+                <w:sz w:val="17"/>
+              </w:rPr>
+              <w:t>8.6: the other approvals</w:t>
+            </w:r>
+          </w:p>
+        </w:tc>
+        <w:tc>
+          <w:tcPr>
+            <w:tcW w:type="dxa" w:w="2493"/>
+          </w:tcPr>
+          <w:p>
+            <w:r>
+              <w:rPr>
+                <w:b w:val="0"/>
+                <w:sz w:val="17"/>
+              </w:rPr>
+            </w:r>
+            <w:r>
+              <w:rPr>
+                <w:b w:val="0"/>
+                <w:i w:val="0"/>
+                <w:sz w:val="17"/>
+              </w:rPr>
+              <w:t>4</w:t>
+            </w:r>
+          </w:p>
+        </w:tc>
+        <w:tc>
+          <w:tcPr>
+            <w:tcW w:type="dxa" w:w="2493"/>
+          </w:tcPr>
+          <w:p>
+            <w:r>
+              <w:rPr>
+                <w:b w:val="0"/>
+                <w:sz w:val="17"/>
+              </w:rPr>
+            </w:r>
+            <w:r>
+              <w:rPr>
+                <w:b w:val="0"/>
+                <w:i w:val="0"/>
+                <w:sz w:val="17"/>
+              </w:rPr>
+              <w:t>13</w:t>
+            </w:r>
+          </w:p>
+        </w:tc>
+      </w:tr>
+      <w:tr>
+        <w:trPr>
+          <w:cantSplit/>
+        </w:trPr>
+        <w:tc>
+          <w:tcPr>
+            <w:tcW w:type="dxa" w:w="2493"/>
+          </w:tcPr>
+          <w:p>
+            <w:r>
+              <w:rPr>
+                <w:b w:val="0"/>
+                <w:sz w:val="17"/>
+              </w:rPr>
+            </w:r>
+            <w:r>
+              <w:rPr>
+                <w:b w:val="0"/>
+                <w:i w:val="0"/>
+                <w:sz w:val="17"/>
+              </w:rPr>
+              <w:t>9</w:t>
+            </w:r>
+          </w:p>
+        </w:tc>
+        <w:tc>
+          <w:tcPr>
+            <w:tcW w:type="dxa" w:w="2493"/>
+          </w:tcPr>
+          <w:p>
+            <w:r>
+              <w:rPr>
+                <w:b w:val="0"/>
+                <w:sz w:val="17"/>
+              </w:rPr>
+            </w:r>
+            <w:r>
+              <w:rPr>
+                <w:b w:val="0"/>
+                <w:i w:val="0"/>
+                <w:sz w:val="17"/>
+              </w:rPr>
+              <w:t>8.7: the register of approvals</w:t>
+            </w:r>
+          </w:p>
+        </w:tc>
+        <w:tc>
+          <w:tcPr>
+            <w:tcW w:type="dxa" w:w="2493"/>
+          </w:tcPr>
+          <w:p>
+            <w:r>
+              <w:rPr>
+                <w:b w:val="0"/>
+                <w:sz w:val="17"/>
+              </w:rPr>
+            </w:r>
+            <w:r>
+              <w:rPr>
+                <w:b w:val="0"/>
+                <w:i w:val="0"/>
+                <w:sz w:val="17"/>
+              </w:rPr>
+              <w:t>4</w:t>
+            </w:r>
+          </w:p>
+        </w:tc>
+        <w:tc>
+          <w:tcPr>
+            <w:tcW w:type="dxa" w:w="2493"/>
+          </w:tcPr>
+          <w:p>
+            <w:r>
+              <w:rPr>
+                <w:b w:val="0"/>
+                <w:sz w:val="17"/>
+              </w:rPr>
+            </w:r>
+            <w:r>
+              <w:rPr>
+                <w:b w:val="0"/>
+                <w:i w:val="0"/>
+                <w:sz w:val="17"/>
+              </w:rPr>
+              <w:t>15</w:t>
+            </w:r>
+          </w:p>
+        </w:tc>
+      </w:tr>
+      <w:tr>
+        <w:trPr>
+          <w:cantSplit/>
+        </w:trPr>
+        <w:tc>
+          <w:tcPr>
+            <w:tcW w:type="dxa" w:w="2493"/>
+          </w:tcPr>
+          <w:p>
+            <w:r>
+              <w:rPr>
+                <w:b w:val="0"/>
+                <w:sz w:val="17"/>
+              </w:rPr>
+            </w:r>
+            <w:r>
+              <w:rPr>
+                <w:b w:val="0"/>
+                <w:i w:val="0"/>
+                <w:sz w:val="17"/>
+              </w:rPr>
+              <w:t>10</w:t>
+            </w:r>
+          </w:p>
+        </w:tc>
+        <w:tc>
+          <w:tcPr>
+            <w:tcW w:type="dxa" w:w="2493"/>
+          </w:tcPr>
+          <w:p>
+            <w:r>
+              <w:rPr>
+                <w:b w:val="0"/>
+                <w:sz w:val="17"/>
+              </w:rPr>
+            </w:r>
+            <w:r>
+              <w:rPr>
+                <w:b w:val="0"/>
+                <w:i w:val="0"/>
+                <w:sz w:val="17"/>
+              </w:rPr>
+              <w:t>8.8: the run record</w:t>
+            </w:r>
+          </w:p>
+        </w:tc>
+        <w:tc>
+          <w:tcPr>
+            <w:tcW w:type="dxa" w:w="2493"/>
+          </w:tcPr>
+          <w:p>
+            <w:r>
+              <w:rPr>
+                <w:b w:val="0"/>
+                <w:sz w:val="17"/>
+              </w:rPr>
+            </w:r>
+            <w:r>
+              <w:rPr>
+                <w:b w:val="0"/>
+                <w:i w:val="0"/>
+                <w:sz w:val="17"/>
+              </w:rPr>
+              <w:t>4</w:t>
+            </w:r>
+          </w:p>
+        </w:tc>
+        <w:tc>
+          <w:tcPr>
+            <w:tcW w:type="dxa" w:w="2493"/>
+          </w:tcPr>
+          <w:p>
+            <w:r>
+              <w:rPr>
+                <w:b w:val="0"/>
+                <w:sz w:val="17"/>
+              </w:rPr>
+            </w:r>
+            <w:r>
+              <w:rPr>
+                <w:b w:val="0"/>
+                <w:i w:val="0"/>
+                <w:sz w:val="17"/>
+              </w:rPr>
+              <w:t>16, 17, 19</w:t>
+            </w:r>
+          </w:p>
+        </w:tc>
+      </w:tr>
+      <w:tr>
+        <w:trPr>
+          <w:cantSplit/>
+        </w:trPr>
+        <w:tc>
+          <w:tcPr>
+            <w:tcW w:type="dxa" w:w="2493"/>
+          </w:tcPr>
+          <w:p>
+            <w:r>
+              <w:rPr>
+                <w:b w:val="0"/>
+                <w:sz w:val="17"/>
+              </w:rPr>
+            </w:r>
+            <w:r>
+              <w:rPr>
+                <w:b/>
+                <w:i w:val="0"/>
+                <w:sz w:val="17"/>
+              </w:rPr>
+              <w:t>M4</w:t>
+            </w:r>
+          </w:p>
+        </w:tc>
+        <w:tc>
+          <w:tcPr>
+            <w:tcW w:type="dxa" w:w="2493"/>
+          </w:tcPr>
+          <w:p>
+            <w:r>
+              <w:rPr>
+                <w:b w:val="0"/>
+                <w:sz w:val="17"/>
+              </w:rPr>
+            </w:r>
+            <w:r>
+              <w:rPr>
+                <w:b/>
+                <w:i w:val="0"/>
+                <w:sz w:val="17"/>
+              </w:rPr>
+              <w:t>Merge and release phase 4</w:t>
+            </w:r>
+            <w:r>
+              <w:rPr>
+                <w:b w:val="0"/>
+                <w:i w:val="0"/>
+                <w:sz w:val="17"/>
+              </w:rPr>
+              <w:t>: all 23 acceptance tests, the full test suite and a bootstrap on a fresh database with the nine ties passing</w:t>
+            </w:r>
+          </w:p>
+        </w:tc>
+        <w:tc>
+          <w:tcPr>
+            <w:tcW w:type="dxa" w:w="2493"/>
+          </w:tcPr>
+          <w:p>
+            <w:r>
+              <w:rPr>
+                <w:b w:val="0"/>
+                <w:sz w:val="17"/>
+              </w:rPr>
+            </w:r>
+            <w:r>
+              <w:rPr>
+                <w:b w:val="0"/>
+                <w:i w:val="0"/>
+                <w:sz w:val="17"/>
+              </w:rPr>
+              <w:t>4</w:t>
+            </w:r>
+          </w:p>
+        </w:tc>
+        <w:tc>
+          <w:tcPr>
+            <w:tcW w:type="dxa" w:w="2493"/>
+          </w:tcPr>
+          <w:p>
+            <w:r>
+              <w:rPr>
+                <w:b w:val="0"/>
+                <w:sz w:val="17"/>
+              </w:rPr>
+            </w:r>
+            <w:r>
+              <w:rPr>
+                <w:b w:val="0"/>
+                <w:i w:val="0"/>
+                <w:sz w:val="17"/>
+              </w:rPr>
+              <w:t>All</w:t>
+            </w:r>
+          </w:p>
+        </w:tc>
+      </w:tr>
+    </w:tbl>
+    <w:p/>
+    <w:p>
+      <w:pPr>
+        <w:spacing w:after="120"/>
+        <w:jc w:val="both"/>
+      </w:pPr>
+      <w:r>
+        <w:rPr>
+          <w:b/>
+          <w:i w:val="0"/>
+        </w:rPr>
+        <w:t>Why this way.</w:t>
+      </w:r>
+      <w:r>
+        <w:rPr>
+          <w:b w:val="0"/>
+          <w:i w:val="0"/>
+        </w:rPr>
+        <w:t xml:space="preserve"> Each phase reaches MAIIC's server as soon as it is complete, so the protection of the locked months and UAT mode (phase 1), governed staging (phase 2) and the controlled fee rulebook (phase 3) are in use without waiting for the rest; and each merge is small enough to review on its own.</w:t>
       </w:r>
     </w:p>
     <w:p>

</xml_diff>

<commit_message>
Staging spec: governed staging is phase 1 (merged first); locked-month protection and UAT mode move to phase 2
Co-Authored-By: Claude Opus 5.5 <noreply@anthropic.com>
</commit_message>
<xml_diff>
--- a/docs/MAIIC_Staging_Module_Specification_v1_2026-10-15.docx
+++ b/docs/MAIIC_Staging_Module_Specification_v1_2026-10-15.docx
@@ -11444,7 +11444,7 @@
           <w:b w:val="0"/>
           <w:i w:val="0"/>
         </w:rPr>
-        <w:t>The work is done in four phases, in the order below, so that the parts that protect the locked months and unblock decisions are built first. The build is done on its own branch, and each phase is merged and released when all its sections are complete and confirmed (section 11.1). The sizes are Dupleix's estimates of the build.</w:t>
+        <w:t>The work is done in four phases, in the order below. Governed staging comes first, because it is the purpose of this specification; the protection of locked months and UAT mode follow, then the fee rulebook control, then the rest of the governance record. The build is done on its own branch, and each phase is merged and released when all its sections are complete and confirmed (section 11.1). The sizes are Dupleix's estimates of the build.</w:t>
       </w:r>
     </w:p>
     <w:tbl>
@@ -11607,7 +11607,7 @@
                 <w:i w:val="0"/>
                 <w:sz w:val="17"/>
               </w:rPr>
-              <w:t>1. Protect the locked months, and UAT mode</w:t>
+              <w:t>1. Governed staging</w:t>
             </w:r>
           </w:p>
         </w:tc>
@@ -11628,7 +11628,58 @@
                 <w:i w:val="0"/>
                 <w:sz w:val="17"/>
               </w:rPr>
-              <w:t>The no-back-dating rule: no change to a governed setting or rule takes effect inside a locked month except through reopen-and-restate with documents (decision S10). UAT mode: one maker-checker check for every workflow, the production guard, the UAT seeding, the self-approval label, the banner and the self-approvals report (decision S11). Both touch the governance service and share one release</w:t>
+              <w:t xml:space="preserve">The settings, the presets and their seeding, with single-ladder staging as the default; </w:t>
+            </w:r>
+            <w:r>
+              <w:rPr>
+                <w:rFonts w:ascii="Consolas" w:hAnsi="Consolas"/>
+                <w:b w:val="0"/>
+                <w:i w:val="0"/>
+                <w:sz w:val="17"/>
+              </w:rPr>
+              <w:t>StagingService</w:t>
+            </w:r>
+            <w:r>
+              <w:rPr>
+                <w:b w:val="0"/>
+                <w:i w:val="0"/>
+                <w:sz w:val="17"/>
+              </w:rPr>
+              <w:t xml:space="preserve"> reading every rule from the settings; </w:t>
+            </w:r>
+            <w:r>
+              <w:rPr>
+                <w:rFonts w:ascii="Consolas" w:hAnsi="Consolas"/>
+                <w:b w:val="0"/>
+                <w:i w:val="0"/>
+                <w:sz w:val="17"/>
+              </w:rPr>
+              <w:t>staging_dpd</w:t>
+            </w:r>
+            <w:r>
+              <w:rPr>
+                <w:b w:val="0"/>
+                <w:i w:val="0"/>
+                <w:sz w:val="17"/>
+              </w:rPr>
+              <w:t xml:space="preserve"> beside </w:t>
+            </w:r>
+            <w:r>
+              <w:rPr>
+                <w:rFonts w:ascii="Consolas" w:hAnsi="Consolas"/>
+                <w:b w:val="0"/>
+                <w:i w:val="0"/>
+                <w:sz w:val="17"/>
+              </w:rPr>
+              <w:t>overdue_days</w:t>
+            </w:r>
+            <w:r>
+              <w:rPr>
+                <w:b w:val="0"/>
+                <w:i w:val="0"/>
+                <w:sz w:val="17"/>
+              </w:rPr>
+              <w:t>; the comparison run with its tables, command, panel, export and audit-workbook sheet; then, after the phase is merged and released, the comparison runs for December 2025 and September 2026 on MAIIC's server</w:t>
             </w:r>
           </w:p>
         </w:tc>
@@ -11649,7 +11700,7 @@
                 <w:i w:val="0"/>
                 <w:sz w:val="17"/>
               </w:rPr>
-              <w:t>8.8 item 4, 8.9</w:t>
+              <w:t>3, 4, 5, 6, 7</w:t>
             </w:r>
           </w:p>
         </w:tc>
@@ -11670,7 +11721,7 @@
                 <w:i w:val="0"/>
                 <w:sz w:val="17"/>
               </w:rPr>
-              <w:t>18, 20 to 23</w:t>
+              <w:t>1 to 8</w:t>
             </w:r>
           </w:p>
         </w:tc>
@@ -11691,7 +11742,7 @@
                 <w:i w:val="0"/>
                 <w:sz w:val="17"/>
               </w:rPr>
-              <w:t>About 2 to 2.5 days</w:t>
+              <w:t>About 3 days</w:t>
             </w:r>
           </w:p>
         </w:tc>
@@ -11717,7 +11768,7 @@
                 <w:i w:val="0"/>
                 <w:sz w:val="17"/>
               </w:rPr>
-              <w:t>2. Governed staging</w:t>
+              <w:t>2. Protect the locked months, and UAT mode</w:t>
             </w:r>
           </w:p>
         </w:tc>
@@ -11738,58 +11789,7 @@
                 <w:i w:val="0"/>
                 <w:sz w:val="17"/>
               </w:rPr>
-              <w:t xml:space="preserve">The settings, the presets and their seeding, with single-ladder staging as the default; </w:t>
-            </w:r>
-            <w:r>
-              <w:rPr>
-                <w:rFonts w:ascii="Consolas" w:hAnsi="Consolas"/>
-                <w:b w:val="0"/>
-                <w:i w:val="0"/>
-                <w:sz w:val="17"/>
-              </w:rPr>
-              <w:t>StagingService</w:t>
-            </w:r>
-            <w:r>
-              <w:rPr>
-                <w:b w:val="0"/>
-                <w:i w:val="0"/>
-                <w:sz w:val="17"/>
-              </w:rPr>
-              <w:t xml:space="preserve"> reading every rule from the settings; </w:t>
-            </w:r>
-            <w:r>
-              <w:rPr>
-                <w:rFonts w:ascii="Consolas" w:hAnsi="Consolas"/>
-                <w:b w:val="0"/>
-                <w:i w:val="0"/>
-                <w:sz w:val="17"/>
-              </w:rPr>
-              <w:t>staging_dpd</w:t>
-            </w:r>
-            <w:r>
-              <w:rPr>
-                <w:b w:val="0"/>
-                <w:i w:val="0"/>
-                <w:sz w:val="17"/>
-              </w:rPr>
-              <w:t xml:space="preserve"> beside </w:t>
-            </w:r>
-            <w:r>
-              <w:rPr>
-                <w:rFonts w:ascii="Consolas" w:hAnsi="Consolas"/>
-                <w:b w:val="0"/>
-                <w:i w:val="0"/>
-                <w:sz w:val="17"/>
-              </w:rPr>
-              <w:t>overdue_days</w:t>
-            </w:r>
-            <w:r>
-              <w:rPr>
-                <w:b w:val="0"/>
-                <w:i w:val="0"/>
-                <w:sz w:val="17"/>
-              </w:rPr>
-              <w:t>; the comparison run with its tables, command, panel, export and audit-workbook sheet; then, after the phase is merged and released, the comparison runs for December 2025 and September 2026 on MAIIC's server</w:t>
+              <w:t>The no-back-dating rule: no change to a governed setting or rule takes effect inside a locked month except through reopen-and-restate with documents (decision S10). UAT mode: one maker-checker check for every workflow, the production guard, the UAT seeding, the self-approval label, the banner and the self-approvals report (decision S11). Both touch the governance service and share one release</w:t>
             </w:r>
           </w:p>
         </w:tc>
@@ -11810,7 +11810,7 @@
                 <w:i w:val="0"/>
                 <w:sz w:val="17"/>
               </w:rPr>
-              <w:t>3, 4, 5, 6, 7</w:t>
+              <w:t>8.8 item 4, 8.9</w:t>
             </w:r>
           </w:p>
         </w:tc>
@@ -11831,7 +11831,7 @@
                 <w:i w:val="0"/>
                 <w:sz w:val="17"/>
               </w:rPr>
-              <w:t>1 to 8</w:t>
+              <w:t>18, 20 to 23</w:t>
             </w:r>
           </w:p>
         </w:tc>
@@ -11852,7 +11852,7 @@
                 <w:i w:val="0"/>
                 <w:sz w:val="17"/>
               </w:rPr>
-              <w:t>About 3 days</w:t>
+              <w:t>About 2 to 2.5 days</w:t>
             </w:r>
           </w:p>
         </w:tc>
@@ -12191,7 +12191,7 @@
           <w:b w:val="0"/>
           <w:i w:val="0"/>
         </w:rPr>
-        <w:t>The total is about 11 to 11.5 days of build. The first phase also brings UAT mode, so that once phase 1 is released, testing on MAIIC's server can run without waiting for a second person on each step; the first three phases, about 6 days, bring the protection of locked months, UAT mode, governed staging and the controlled fee rulebook. The fee rulebook joins the shared maker-checker check of UAT mode when phase 3 gives it maker-checker. Not included: the time to resolve the bootstrap's slow final steps seen on 15 October 2026, which must be fixed before the first merge, since every merge and release depends on the bootstrap passing.</w:t>
+        <w:t>The total is about 11 to 11.5 days of build. Governed staging is merged and released after about 3 days; the protection of locked months and UAT mode about 2.5 days later, after which testing on MAIIC's server can run without waiting for a second person on each step; the controlled fee rulebook after about 6 days in all. Until phase 2 is released, a setting can still be back-dated into a locked month (section 8.8), so no governed change should be approved with an effective date inside a locked month in the meantime. The fee rulebook joins the shared maker-checker check of UAT mode when phase 3 gives it maker-checker. Not included: the time to resolve the bootstrap's slow final steps seen on 15 October 2026, which must be fixed before the first merge, since every merge and release depends on the bootstrap passing.</w:t>
       </w:r>
     </w:p>
     <w:p>
@@ -12522,7 +12522,7 @@
                 <w:i w:val="0"/>
                 <w:sz w:val="17"/>
               </w:rPr>
-              <w:t>8.8 item 4: no back-dating into a locked month</w:t>
+              <w:t>3: the settings and presets</w:t>
             </w:r>
           </w:p>
         </w:tc>
@@ -12564,7 +12564,7 @@
                 <w:i w:val="0"/>
                 <w:sz w:val="17"/>
               </w:rPr>
-              <w:t>18</w:t>
+              <w:t>1 to 3, 7</w:t>
             </w:r>
           </w:p>
         </w:tc>
@@ -12611,7 +12611,7 @@
                 <w:i w:val="0"/>
                 <w:sz w:val="17"/>
               </w:rPr>
-              <w:t>8.9: UAT mode</w:t>
+              <w:t>5: the separate staging day count, the RBM return on the directive's count</w:t>
             </w:r>
           </w:p>
         </w:tc>
@@ -12653,7 +12653,7 @@
                 <w:i w:val="0"/>
                 <w:sz w:val="17"/>
               </w:rPr>
-              <w:t>20 to 23</w:t>
+              <w:t>6</w:t>
             </w:r>
           </w:p>
         </w:tc>
@@ -12675,11 +12675,11 @@
             </w:r>
             <w:r>
               <w:rPr>
-                <w:b/>
-                <w:i w:val="0"/>
-                <w:sz w:val="17"/>
-              </w:rPr>
-              <w:t>M1</w:t>
+                <w:b w:val="0"/>
+                <w:i w:val="0"/>
+                <w:sz w:val="17"/>
+              </w:rPr>
+              <w:t>3</w:t>
             </w:r>
           </w:p>
         </w:tc>
@@ -12696,11 +12696,11 @@
             </w:r>
             <w:r>
               <w:rPr>
-                <w:b/>
-                <w:i w:val="0"/>
-                <w:sz w:val="17"/>
-              </w:rPr>
-              <w:t>Merge and release phase 1</w:t>
+                <w:b w:val="0"/>
+                <w:i w:val="0"/>
+                <w:sz w:val="17"/>
+              </w:rPr>
+              <w:t>4: the staging comparison run</w:t>
             </w:r>
           </w:p>
         </w:tc>
@@ -12742,7 +12742,7 @@
                 <w:i w:val="0"/>
                 <w:sz w:val="17"/>
               </w:rPr>
-              <w:t>18, 20 to 23 re-run on the merged code</w:t>
+              <w:t>4, 5</w:t>
             </w:r>
           </w:p>
         </w:tc>
@@ -12764,11 +12764,11 @@
             </w:r>
             <w:r>
               <w:rPr>
-                <w:b w:val="0"/>
-                <w:i w:val="0"/>
-                <w:sz w:val="17"/>
-              </w:rPr>
-              <w:t>3</w:t>
+                <w:b/>
+                <w:i w:val="0"/>
+                <w:sz w:val="17"/>
+              </w:rPr>
+              <w:t>M1</w:t>
             </w:r>
           </w:p>
         </w:tc>
@@ -12785,11 +12785,19 @@
             </w:r>
             <w:r>
               <w:rPr>
-                <w:b w:val="0"/>
-                <w:i w:val="0"/>
-                <w:sz w:val="17"/>
-              </w:rPr>
-              <w:t>3: the settings and presets</w:t>
+                <w:b/>
+                <w:i w:val="0"/>
+                <w:sz w:val="17"/>
+              </w:rPr>
+              <w:t>Merge and release phase 1</w:t>
+            </w:r>
+            <w:r>
+              <w:rPr>
+                <w:b w:val="0"/>
+                <w:i w:val="0"/>
+                <w:sz w:val="17"/>
+              </w:rPr>
+              <w:t>, then the comparison runs for December 2025 and September 2026 on MAIIC's server</w:t>
             </w:r>
           </w:p>
         </w:tc>
@@ -12810,7 +12818,7 @@
                 <w:i w:val="0"/>
                 <w:sz w:val="17"/>
               </w:rPr>
-              <w:t>2</w:t>
+              <w:t>1</w:t>
             </w:r>
           </w:p>
         </w:tc>
@@ -12831,7 +12839,7 @@
                 <w:i w:val="0"/>
                 <w:sz w:val="17"/>
               </w:rPr>
-              <w:t>1 to 3, 7</w:t>
+              <w:t>1 to 8</w:t>
             </w:r>
           </w:p>
         </w:tc>
@@ -12878,7 +12886,7 @@
                 <w:i w:val="0"/>
                 <w:sz w:val="17"/>
               </w:rPr>
-              <w:t>5: the separate staging day count, the RBM return on the directive's count</w:t>
+              <w:t>8.8 item 4: no back-dating into a locked month</w:t>
             </w:r>
           </w:p>
         </w:tc>
@@ -12920,7 +12928,7 @@
                 <w:i w:val="0"/>
                 <w:sz w:val="17"/>
               </w:rPr>
-              <w:t>6</w:t>
+              <w:t>18</w:t>
             </w:r>
           </w:p>
         </w:tc>
@@ -12967,7 +12975,7 @@
                 <w:i w:val="0"/>
                 <w:sz w:val="17"/>
               </w:rPr>
-              <w:t>4: the staging comparison run</w:t>
+              <w:t>8.9: UAT mode</w:t>
             </w:r>
           </w:p>
         </w:tc>
@@ -13009,7 +13017,7 @@
                 <w:i w:val="0"/>
                 <w:sz w:val="17"/>
               </w:rPr>
-              <w:t>4, 5</w:t>
+              <w:t>20 to 23</w:t>
             </w:r>
           </w:p>
         </w:tc>
@@ -13058,14 +13066,6 @@
               </w:rPr>
               <w:t>Merge and release phase 2</w:t>
             </w:r>
-            <w:r>
-              <w:rPr>
-                <w:b w:val="0"/>
-                <w:i w:val="0"/>
-                <w:sz w:val="17"/>
-              </w:rPr>
-              <w:t>, then the comparison runs for December 2025 and September 2026 on MAIIC's server</w:t>
-            </w:r>
           </w:p>
         </w:tc>
         <w:tc>
@@ -13106,7 +13106,7 @@
                 <w:i w:val="0"/>
                 <w:sz w:val="17"/>
               </w:rPr>
-              <w:t>1 to 8</w:t>
+              <w:t>18, 20 to 23 re-run on the merged code</w:t>
             </w:r>
           </w:p>
         </w:tc>
@@ -13761,7 +13761,7 @@
           <w:b w:val="0"/>
           <w:i w:val="0"/>
         </w:rPr>
-        <w:t xml:space="preserve"> Each phase reaches MAIIC's server as soon as it is complete, so the protection of the locked months and UAT mode (phase 1), governed staging (phase 2) and the controlled fee rulebook (phase 3) are in use without waiting for the rest; and each merge is small enough to review on its own.</w:t>
+        <w:t xml:space="preserve"> Each phase reaches MAIIC's server as soon as it is complete, so governed staging (phase 1), the protection of the locked months and UAT mode (phase 2) and the controlled fee rulebook (phase 3) are in use without waiting for the rest; and each merge is small enough to review on its own.</w:t>
       </w:r>
     </w:p>
     <w:p>

</xml_diff>

<commit_message>
Staging spec section 4: how the comparison works out its figures (ECL effect from booked coverage, cure on the months as booked, exact day counts), as decided by Edward on 15 October 2026
Co-Authored-By: Claude Opus 5.5 <noreply@anthropic.com>
</commit_message>
<xml_diff>
--- a/docs/MAIIC_Staging_Module_Specification_v1_2026-10-15.docx
+++ b/docs/MAIIC_Staging_Module_Specification_v1_2026-10-15.docx
@@ -3687,6 +3687,86 @@
           <w:i w:val="0"/>
         </w:rPr>
         <w:t>A summary gives the count and carrying amount moving between each pair of stages, the ECL effect in total and by reason, and the effect on Stage 3 interest. It is on the Staging &amp; SICR Rules screen, it can be exported, and it is shown on each month's audit workbook.</w:t>
+      </w:r>
+    </w:p>
+    <w:p>
+      <w:pPr>
+        <w:spacing w:after="120"/>
+        <w:jc w:val="both"/>
+      </w:pPr>
+      <w:r>
+        <w:rPr>
+          <w:b/>
+          <w:i w:val="0"/>
+        </w:rPr>
+        <w:t>How the figures are worked out</w:t>
+      </w:r>
+      <w:r>
+        <w:rPr>
+          <w:b w:val="0"/>
+          <w:i w:val="0"/>
+        </w:rPr>
+        <w:t xml:space="preserve"> (decided by Edward Mazibuko, 15 October 2026):</w:t>
+      </w:r>
+    </w:p>
+    <w:p>
+      <w:pPr>
+        <w:pStyle w:val="ListBullet"/>
+        <w:jc w:val="both"/>
+      </w:pPr>
+      <w:r>
+        <w:rPr>
+          <w:b/>
+          <w:i w:val="0"/>
+        </w:rPr>
+        <w:t>The ECL effect is an estimate.</w:t>
+      </w:r>
+      <w:r>
+        <w:rPr>
+          <w:b w:val="0"/>
+          <w:i w:val="0"/>
+        </w:rPr>
+        <w:t xml:space="preserve"> The booked ECL exists only at the booked stage, so a loan that moves is given the booked coverage of its new stage: the ECL over EAD of the loans booked in that stage in the same portfolio (or in the whole book, where the portfolio has none), applied to the loan's own EAD. A loan that does not move keeps its booked ECL. This shows the direction and size of the change; it is not a full ECL run, and nothing booked is affected by it.</w:t>
+      </w:r>
+    </w:p>
+    <w:p>
+      <w:pPr>
+        <w:pStyle w:val="ListBullet"/>
+        <w:jc w:val="both"/>
+      </w:pPr>
+      <w:r>
+        <w:rPr>
+          <w:b/>
+          <w:i w:val="0"/>
+        </w:rPr>
+        <w:t>The cure reads the earlier months as booked.</w:t>
+      </w:r>
+      <w:r>
+        <w:rPr>
+          <w:b w:val="0"/>
+          <w:i w:val="0"/>
+        </w:rPr>
+        <w:t xml:space="preserve"> The comparison answers what would change if the policy were adopted from the month compared, and months before adoption stay as booked.</w:t>
+      </w:r>
+    </w:p>
+    <w:p>
+      <w:pPr>
+        <w:pStyle w:val="ListBullet"/>
+        <w:jc w:val="both"/>
+      </w:pPr>
+      <w:r>
+        <w:rPr>
+          <w:b/>
+          <w:i w:val="0"/>
+        </w:rPr>
+        <w:t>The day counts are exact.</w:t>
+      </w:r>
+      <w:r>
+        <w:rPr>
+          <w:b w:val="0"/>
+          <w:i w:val="0"/>
+        </w:rPr>
+        <w:t xml:space="preserve"> The build keeps each loan's component counts (oldest overdue instalment and bucket ageing, each as reported and recounted, and the days since maturity), so any mix of settings is counted exactly, and the reason for a difference is never given to the wrong setting.</w:t>
       </w:r>
     </w:p>
     <w:p>

</xml_diff>

<commit_message>
Staging spec 8.9 brought up to the code before section 5 is built: the 20 maker-checker checks found (6 honour the override, 14 refuse, 2 have none yet), the forward-looking month-end sign-off added to 8.6, APP_ENV=uat on MAIIC's server during UAT (S11), the console switch for an existing database, one audit entry per self-approval, and the override never approving its own setting
Co-Authored-By: Claude Opus 5.5 <noreply@anthropic.com>
</commit_message>
<xml_diff>
--- a/docs/MAIIC_Staging_Module_Specification_v1_2026-10-15.docx
+++ b/docs/MAIIC_Staging_Module_Specification_v1_2026-10-15.docx
@@ -8307,6 +8307,116 @@
                 <w:i w:val="0"/>
                 <w:sz w:val="17"/>
               </w:rPr>
+              <w:t>Forward-looking month-end sign-off</w:t>
+            </w:r>
+          </w:p>
+        </w:tc>
+        <w:tc>
+          <w:tcPr>
+            <w:tcW w:type="dxa" w:w="1994"/>
+          </w:tcPr>
+          <w:p>
+            <w:r>
+              <w:rPr>
+                <w:b w:val="0"/>
+                <w:sz w:val="17"/>
+              </w:rPr>
+            </w:r>
+            <w:r>
+              <w:rPr>
+                <w:b w:val="0"/>
+                <w:i w:val="0"/>
+                <w:sz w:val="17"/>
+              </w:rPr>
+              <w:t>Signing off a month's forward-looking record (route, scenarios, discounted ECL)</w:t>
+            </w:r>
+          </w:p>
+        </w:tc>
+        <w:tc>
+          <w:tcPr>
+            <w:tcW w:type="dxa" w:w="1994"/>
+          </w:tcPr>
+          <w:p>
+            <w:r>
+              <w:rPr>
+                <w:b w:val="0"/>
+                <w:sz w:val="17"/>
+              </w:rPr>
+            </w:r>
+            <w:r>
+              <w:rPr>
+                <w:b w:val="0"/>
+                <w:i w:val="0"/>
+                <w:sz w:val="17"/>
+              </w:rPr>
+              <w:t>Sign off; the person who recorded the month cannot sign it; logged</w:t>
+            </w:r>
+          </w:p>
+        </w:tc>
+        <w:tc>
+          <w:tcPr>
+            <w:tcW w:type="dxa" w:w="1994"/>
+          </w:tcPr>
+          <w:p>
+            <w:r>
+              <w:rPr>
+                <w:b w:val="0"/>
+                <w:sz w:val="17"/>
+              </w:rPr>
+            </w:r>
+            <w:r>
+              <w:rPr>
+                <w:b w:val="0"/>
+                <w:i w:val="0"/>
+                <w:sz w:val="17"/>
+              </w:rPr>
+              <w:t>Reject with a reason; documents; history</w:t>
+            </w:r>
+          </w:p>
+        </w:tc>
+        <w:tc>
+          <w:tcPr>
+            <w:tcW w:type="dxa" w:w="1994"/>
+          </w:tcPr>
+          <w:p>
+            <w:r>
+              <w:rPr>
+                <w:b w:val="0"/>
+                <w:sz w:val="17"/>
+              </w:rPr>
+            </w:r>
+            <w:r>
+              <w:rPr>
+                <w:b w:val="0"/>
+                <w:i w:val="0"/>
+                <w:sz w:val="17"/>
+              </w:rPr>
+              <w:t>Only a commentary where the movement is outside tolerance (already required)</w:t>
+            </w:r>
+          </w:p>
+        </w:tc>
+      </w:tr>
+      <w:tr>
+        <w:trPr>
+          <w:cantSplit/>
+        </w:trPr>
+        <w:tc>
+          <w:tcPr>
+            <w:tcW w:type="dxa" w:w="1994"/>
+          </w:tcPr>
+          <w:p>
+            <w:r>
+              <w:rPr>
+                <w:b w:val="0"/>
+                <w:sz w:val="17"/>
+              </w:rPr>
+            </w:r>
+            <w:r>
+              <w:rPr>
+                <w:b w:val="0"/>
+                <w:i w:val="0"/>
+                <w:sz w:val="17"/>
+              </w:rPr>
               <w:t>Macro data overrides</w:t>
             </w:r>
           </w:p>
@@ -9184,14 +9294,14 @@
           <w:b/>
           <w:i w:val="0"/>
         </w:rPr>
-        <w:t>What exists today.</w:t>
+        <w:t>What exists today</w:t>
       </w:r>
       <w:r>
         <w:rPr>
           <w:b w:val="0"/>
           <w:i w:val="0"/>
         </w:rPr>
-        <w:t xml:space="preserve"> The governed setting </w:t>
+        <w:t xml:space="preserve"> (read from the code on 15 October 2026). The governed setting </w:t>
       </w:r>
       <w:r>
         <w:rPr>
@@ -9235,7 +9345,179 @@
           <w:b w:val="0"/>
           <w:i w:val="0"/>
         </w:rPr>
-        <w:t>) lets a user with the admin role approve their own proposal. Six workflows honour it: Governance Centre settings, the EIR lock, fee classification review, SICR triggers, rate resets and the restructure register. The other workflows of section 8.6 refuse a self-approval whatever the setting says, and the fee rulebook has no maker-checker at all until phase 3. The bootstrap approves its own steps under the label "System Bootstrap (automated data-readiness, not a MAIIC approval)", so checking the month-end results needs no human approvals; the override matters only for testing the screens and workflows themselves.</w:t>
+        <w:t>) lets a user with the admin role approve their own proposal. Each workflow carries its own self-approval check, worded and coded separately:</w:t>
+      </w:r>
+    </w:p>
+    <w:tbl>
+      <w:tblPr>
+        <w:tblStyle w:val="TableGrid"/>
+        <w:tblW w:type="auto" w:w="0"/>
+        <w:tblLook w:firstColumn="1" w:firstRow="1" w:lastColumn="0" w:lastRow="0" w:noHBand="0" w:noVBand="1" w:val="04A0"/>
+      </w:tblPr>
+      <w:tblGrid>
+        <w:gridCol w:w="3324"/>
+        <w:gridCol w:w="3324"/>
+        <w:gridCol w:w="3324"/>
+      </w:tblGrid>
+      <w:tr>
+        <w:trPr>
+          <w:cantSplit/>
+          <w:tblHeader/>
+        </w:trPr>
+        <w:tc>
+          <w:tcPr>
+            <w:tcW w:type="dxa" w:w="3324"/>
+            <w:shd w:val="clear" w:color="auto" w:fill="1B2A41"/>
+          </w:tcPr>
+          <w:p>
+            <w:r>
+              <w:rPr>
+                <w:b/>
+                <w:color w:val="FFFFFF"/>
+                <w:sz w:val="17"/>
+              </w:rPr>
+            </w:r>
+            <w:r>
+              <w:rPr>
+                <w:b/>
+                <w:i w:val="0"/>
+                <w:color w:val="FFFFFF"/>
+                <w:sz w:val="17"/>
+              </w:rPr>
+              <w:t>Honours the override today (6)</w:t>
+            </w:r>
+          </w:p>
+        </w:tc>
+        <w:tc>
+          <w:tcPr>
+            <w:tcW w:type="dxa" w:w="3324"/>
+            <w:shd w:val="clear" w:color="auto" w:fill="1B2A41"/>
+          </w:tcPr>
+          <w:p>
+            <w:r>
+              <w:rPr>
+                <w:b/>
+                <w:color w:val="FFFFFF"/>
+                <w:sz w:val="17"/>
+              </w:rPr>
+            </w:r>
+            <w:r>
+              <w:rPr>
+                <w:b/>
+                <w:i w:val="0"/>
+                <w:color w:val="FFFFFF"/>
+                <w:sz w:val="17"/>
+              </w:rPr>
+              <w:t>Refuses a self-approval whatever the setting (14)</w:t>
+            </w:r>
+          </w:p>
+        </w:tc>
+        <w:tc>
+          <w:tcPr>
+            <w:tcW w:type="dxa" w:w="3324"/>
+            <w:shd w:val="clear" w:color="auto" w:fill="1B2A41"/>
+          </w:tcPr>
+          <w:p>
+            <w:r>
+              <w:rPr>
+                <w:b/>
+                <w:color w:val="FFFFFF"/>
+                <w:sz w:val="17"/>
+              </w:rPr>
+            </w:r>
+            <w:r>
+              <w:rPr>
+                <w:b/>
+                <w:i w:val="0"/>
+                <w:color w:val="FFFFFF"/>
+                <w:sz w:val="17"/>
+              </w:rPr>
+              <w:t>No maker-checker yet (2)</w:t>
+            </w:r>
+          </w:p>
+        </w:tc>
+      </w:tr>
+      <w:tr>
+        <w:trPr>
+          <w:cantSplit/>
+        </w:trPr>
+        <w:tc>
+          <w:tcPr>
+            <w:tcW w:type="dxa" w:w="3324"/>
+          </w:tcPr>
+          <w:p>
+            <w:r>
+              <w:rPr>
+                <w:b w:val="0"/>
+                <w:sz w:val="17"/>
+              </w:rPr>
+            </w:r>
+            <w:r>
+              <w:rPr>
+                <w:b w:val="0"/>
+                <w:i w:val="0"/>
+                <w:sz w:val="17"/>
+              </w:rPr>
+              <w:t>Governance Centre settings; EIR lock; fee classification review; SICR triggers; rate resets; restructure register</w:t>
+            </w:r>
+          </w:p>
+        </w:tc>
+        <w:tc>
+          <w:tcPr>
+            <w:tcW w:type="dxa" w:w="3324"/>
+          </w:tcPr>
+          <w:p>
+            <w:r>
+              <w:rPr>
+                <w:b w:val="0"/>
+                <w:sz w:val="17"/>
+              </w:rPr>
+            </w:r>
+            <w:r>
+              <w:rPr>
+                <w:b w:val="0"/>
+                <w:i w:val="0"/>
+                <w:sz w:val="17"/>
+              </w:rPr>
+              <w:t>Staging thresholds; EIR reopen; period unlock; write-offs; take-on build; loan book build (approve and reject); schedule approval; compliance audit sign-off; scenario sets; forward-looking overlays; forward-looking fits; external forward-looking models; forward-looking month-end sign-off; the legacy regression screen</w:t>
+            </w:r>
+          </w:p>
+        </w:tc>
+        <w:tc>
+          <w:tcPr>
+            <w:tcW w:type="dxa" w:w="3324"/>
+          </w:tcPr>
+          <w:p>
+            <w:r>
+              <w:rPr>
+                <w:b w:val="0"/>
+                <w:sz w:val="17"/>
+              </w:rPr>
+            </w:r>
+            <w:r>
+              <w:rPr>
+                <w:b w:val="0"/>
+                <w:i w:val="0"/>
+                <w:sz w:val="17"/>
+              </w:rPr>
+              <w:t>Fee rulebook (phase 3); macro data overrides (phase 4)</w:t>
+            </w:r>
+          </w:p>
+        </w:tc>
+      </w:tr>
+    </w:tbl>
+    <w:p/>
+    <w:p>
+      <w:pPr>
+        <w:spacing w:after="120"/>
+        <w:jc w:val="both"/>
+      </w:pPr>
+      <w:r>
+        <w:rPr>
+          <w:b w:val="0"/>
+          <w:i w:val="0"/>
+        </w:rPr>
+        <w:t>The bootstrap approves its own steps under the label "System Bootstrap (automated data-readiness, not a MAIIC approval)", so checking the month-end results needs no human approvals; the override matters only for testing the screens and workflows themselves. The bootstrap label stays as it is and is not the override.</w:t>
       </w:r>
     </w:p>
     <w:p>
@@ -9255,7 +9537,23 @@
           <w:b w:val="0"/>
           <w:i w:val="0"/>
         </w:rPr>
-        <w:t xml:space="preserve"> Switching the override on is itself a governed change and needs a second person the first time. Nothing stops it being left on in production. A self-approval is not marked as one. Nothing on screen shows that the two-person rule is relaxed.</w:t>
+        <w:t xml:space="preserve"> Switching the override on is itself a governed change and needs a second person the first time. Nothing stops it being left on in production. A self-approval is not marked as one. Nothing on screen shows that the two-person rule is relaxed. And the installation guide sets </w:t>
+      </w:r>
+      <w:r>
+        <w:rPr>
+          <w:rFonts w:ascii="Consolas" w:hAnsi="Consolas"/>
+          <w:b w:val="0"/>
+          <w:i w:val="0"/>
+          <w:sz w:val="18"/>
+        </w:rPr>
+        <w:t>APP_ENV=production</w:t>
+      </w:r>
+      <w:r>
+        <w:rPr>
+          <w:b w:val="0"/>
+          <w:i w:val="0"/>
+        </w:rPr>
+        <w:t xml:space="preserve"> on MAIIC's server, which is where UAT is run.</w:t>
       </w:r>
     </w:p>
     <w:p>
@@ -9410,7 +9708,7 @@
                 <w:i w:val="0"/>
                 <w:sz w:val="17"/>
               </w:rPr>
-              <w:t xml:space="preserve"> The Governance Centre and every workflow of section 8.6 use one shared check, and each honours the override in the same way</w:t>
+              <w:t xml:space="preserve"> The 20 checks above call one shared check, which decides whether a self-approval is allowed. Each keeps its own message. The fee rulebook and the macro data overrides use the same check when they gain maker-checker (phases 3 and 4)</w:t>
             </w:r>
           </w:p>
         </w:tc>
@@ -9431,7 +9729,7 @@
                 <w:i w:val="0"/>
                 <w:sz w:val="17"/>
               </w:rPr>
-              <w:t>Today 6 of about 20 honour it</w:t>
+              <w:t>Today 6 of 20 honour the override, each in its own way</w:t>
             </w:r>
           </w:p>
         </w:tc>
@@ -9486,7 +9784,7 @@
                 <w:i w:val="0"/>
                 <w:sz w:val="17"/>
               </w:rPr>
-              <w:t xml:space="preserve"> The override can work only when the server's environment file declares a non-production environment (for example </w:t>
+              <w:t xml:space="preserve"> The override can work only when the server's environment file declares a non-production environment (</w:t>
             </w:r>
             <w:r>
               <w:rPr>
@@ -9495,7 +9793,41 @@
                 <w:i w:val="0"/>
                 <w:sz w:val="17"/>
               </w:rPr>
-              <w:t>APP_ENV=uat</w:t>
+              <w:t>APP_ENV</w:t>
+            </w:r>
+            <w:r>
+              <w:rPr>
+                <w:b w:val="0"/>
+                <w:i w:val="0"/>
+                <w:sz w:val="17"/>
+              </w:rPr>
+              <w:t xml:space="preserve"> other than </w:t>
+            </w:r>
+            <w:r>
+              <w:rPr>
+                <w:rFonts w:ascii="Consolas" w:hAnsi="Consolas"/>
+                <w:b w:val="0"/>
+                <w:i w:val="0"/>
+                <w:sz w:val="17"/>
+              </w:rPr>
+              <w:t>production</w:t>
+            </w:r>
+            <w:r>
+              <w:rPr>
+                <w:b w:val="0"/>
+                <w:i w:val="0"/>
+                <w:sz w:val="17"/>
+              </w:rPr>
+              <w:t xml:space="preserve">, for example </w:t>
+            </w:r>
+            <w:r>
+              <w:rPr>
+                <w:rFonts w:ascii="Consolas" w:hAnsi="Consolas"/>
+                <w:b w:val="0"/>
+                <w:i w:val="0"/>
+                <w:sz w:val="17"/>
+              </w:rPr>
+              <w:t>uat</w:t>
             </w:r>
             <w:r>
               <w:rPr>
@@ -9519,7 +9851,39 @@
                 <w:i w:val="0"/>
                 <w:sz w:val="17"/>
               </w:rPr>
-              <w:t xml:space="preserve"> the governed setting allows it. Under a production environment it is refused whatever the setting says, and the option cannot be approved there</w:t>
+              <w:t xml:space="preserve"> the governed setting allows it. Under a production environment a self-approval is refused whatever the setting says, and </w:t>
+            </w:r>
+            <w:r>
+              <w:rPr>
+                <w:b w:val="0"/>
+                <w:i/>
+                <w:sz w:val="17"/>
+              </w:rPr>
+              <w:t>Allowed for administrators</w:t>
+            </w:r>
+            <w:r>
+              <w:rPr>
+                <w:b w:val="0"/>
+                <w:i w:val="0"/>
+                <w:sz w:val="17"/>
+              </w:rPr>
+              <w:t xml:space="preserve"> cannot be proposed or approved there. </w:t>
+            </w:r>
+            <w:r>
+              <w:rPr>
+                <w:b/>
+                <w:i w:val="0"/>
+                <w:sz w:val="17"/>
+              </w:rPr>
+              <w:t>During UAT, MAIIC's server runs with `APP_ENV=uat`; at handover MAIIC ICT sets `APP_ENV=production`</w:t>
+            </w:r>
+            <w:r>
+              <w:rPr>
+                <w:b w:val="0"/>
+                <w:i w:val="0"/>
+                <w:sz w:val="17"/>
+              </w:rPr>
+              <w:t xml:space="preserve"> as the installation guide says (decision S11)</w:t>
             </w:r>
           </w:p>
         </w:tc>
@@ -9587,15 +9951,49 @@
                 <w:i w:val="0"/>
                 <w:sz w:val="17"/>
               </w:rPr>
-              <w:t>Seeded in UAT.</w:t>
-            </w:r>
-            <w:r>
-              <w:rPr>
-                <w:b w:val="0"/>
-                <w:i w:val="0"/>
-                <w:sz w:val="17"/>
-              </w:rPr>
-              <w:t xml:space="preserve"> Installing the UAT environment seeds the override as allowed, labelled as seeded for UAT, so no second person is needed to start</w:t>
+              <w:t>Switched on for UAT without a second person, only from the server.</w:t>
+            </w:r>
+            <w:r>
+              <w:rPr>
+                <w:b w:val="0"/>
+                <w:i w:val="0"/>
+                <w:sz w:val="17"/>
+              </w:rPr>
+              <w:t xml:space="preserve"> A fresh install under a non-production environment seeds the override as allowed, labelled as seeded for UAT. On an existing database (MAIIC's server, where the setting already exists) the console command </w:t>
+            </w:r>
+            <w:r>
+              <w:rPr>
+                <w:rFonts w:ascii="Consolas" w:hAnsi="Consolas"/>
+                <w:b w:val="0"/>
+                <w:i w:val="0"/>
+                <w:sz w:val="17"/>
+              </w:rPr>
+              <w:t>governance:uat-mode on</w:t>
+            </w:r>
+            <w:r>
+              <w:rPr>
+                <w:b w:val="0"/>
+                <w:i w:val="0"/>
+                <w:sz w:val="17"/>
+              </w:rPr>
+              <w:t xml:space="preserve"> writes the approved value, labelled "Switched on for UAT from the server console", audit-logged with the person and the environment. It works only under a non-production environment. </w:t>
+            </w:r>
+            <w:r>
+              <w:rPr>
+                <w:rFonts w:ascii="Consolas" w:hAnsi="Consolas"/>
+                <w:b w:val="0"/>
+                <w:i w:val="0"/>
+                <w:sz w:val="17"/>
+              </w:rPr>
+              <w:t>governance:uat-mode off</w:t>
+            </w:r>
+            <w:r>
+              <w:rPr>
+                <w:b w:val="0"/>
+                <w:i w:val="0"/>
+                <w:sz w:val="17"/>
+              </w:rPr>
+              <w:t xml:space="preserve"> works under any environment</w:t>
             </w:r>
           </w:p>
         </w:tc>
@@ -9616,7 +10014,7 @@
                 <w:i w:val="0"/>
                 <w:sz w:val="17"/>
               </w:rPr>
-              <w:t>Removes the first-switch problem</w:t>
+              <w:t>Removes the first-switch problem; only someone with server access can do it</w:t>
             </w:r>
           </w:p>
         </w:tc>
@@ -9663,15 +10061,15 @@
                 <w:i w:val="0"/>
                 <w:sz w:val="17"/>
               </w:rPr>
-              <w:t>Every self-approval labelled.</w:t>
-            </w:r>
-            <w:r>
-              <w:rPr>
-                <w:b w:val="0"/>
-                <w:i w:val="0"/>
-                <w:sz w:val="17"/>
-              </w:rPr>
-              <w:t xml:space="preserve"> The record and the audit entry say "UAT self-approval (administrator override)", with the override setting in force (the "Override used" event of section 8.2)</w:t>
+              <w:t>Every self-approval recorded as one.</w:t>
+            </w:r>
+            <w:r>
+              <w:rPr>
+                <w:b w:val="0"/>
+                <w:i w:val="0"/>
+                <w:sz w:val="17"/>
+              </w:rPr>
+              <w:t xml:space="preserve"> Each approval made under the override writes one audit entry, "Maker-checker override used", naming the workflow, the record, the person and the setting in force (the "Override used" event of section 8.2). Where the record has an approver label it also carries "UAT self-approval (administrator override)"</w:t>
             </w:r>
           </w:p>
         </w:tc>
@@ -9747,7 +10145,7 @@
                 <w:i w:val="0"/>
                 <w:sz w:val="17"/>
               </w:rPr>
-              <w:t xml:space="preserve"> while the override is in force: </w:t>
+              <w:t xml:space="preserve"> while the override is in force on that server: </w:t>
             </w:r>
             <w:r>
               <w:rPr>
@@ -9831,7 +10229,7 @@
                 <w:i w:val="0"/>
                 <w:sz w:val="17"/>
               </w:rPr>
-              <w:t xml:space="preserve"> of everything decided under the override, by workflow, person and date, exportable</w:t>
+              <w:t xml:space="preserve"> of everything decided under the override, read from those audit entries, by workflow, person and date, exportable</w:t>
             </w:r>
           </w:p>
         </w:tc>
@@ -9907,7 +10305,40 @@
                 <w:i w:val="0"/>
                 <w:sz w:val="17"/>
               </w:rPr>
-              <w:t xml:space="preserve"> The production database starts clean, so UAT approvals never carry into it. If a UAT database were ever promoted to production, every item on the self-approvals report must be re-approved by two people first. Switching the override off is an ordinary governed change with a second person, recorded with the handover sign-off and its documents</w:t>
+              <w:t xml:space="preserve"> The production database starts clean, so UAT approvals never carry into it. If a UAT database were ever promoted to production, every item on the self-approvals report must be re-approved by two people first. Switching the override off is an ordinary governed change with a second person, recorded with the handover sign-off and its documents; </w:t>
+            </w:r>
+            <w:r>
+              <w:rPr>
+                <w:b/>
+                <w:i w:val="0"/>
+                <w:sz w:val="17"/>
+              </w:rPr>
+              <w:t>the override is never used to approve a change to its own setting</w:t>
+            </w:r>
+            <w:r>
+              <w:rPr>
+                <w:b w:val="0"/>
+                <w:i w:val="0"/>
+                <w:sz w:val="17"/>
+              </w:rPr>
+              <w:t xml:space="preserve">. Setting </w:t>
+            </w:r>
+            <w:r>
+              <w:rPr>
+                <w:rFonts w:ascii="Consolas" w:hAnsi="Consolas"/>
+                <w:b w:val="0"/>
+                <w:i w:val="0"/>
+                <w:sz w:val="17"/>
+              </w:rPr>
+              <w:t>APP_ENV=production</w:t>
+            </w:r>
+            <w:r>
+              <w:rPr>
+                <w:b w:val="0"/>
+                <w:i w:val="0"/>
+                <w:sz w:val="17"/>
+              </w:rPr>
+              <w:t xml:space="preserve"> also stops it, whatever the setting says</w:t>
             </w:r>
           </w:p>
         </w:tc>
@@ -11031,7 +11462,41 @@
                 <w:i w:val="0"/>
                 <w:sz w:val="17"/>
               </w:rPr>
-              <w:t>The UAT environment only; the handover sign-off records the switch-off, approved by a second person</w:t>
+              <w:t xml:space="preserve">The UAT environment only: MAIIC's server runs </w:t>
+            </w:r>
+            <w:r>
+              <w:rPr>
+                <w:rFonts w:ascii="Consolas" w:hAnsi="Consolas"/>
+                <w:b w:val="0"/>
+                <w:i w:val="0"/>
+                <w:sz w:val="17"/>
+              </w:rPr>
+              <w:t>APP_ENV=uat</w:t>
+            </w:r>
+            <w:r>
+              <w:rPr>
+                <w:b w:val="0"/>
+                <w:i w:val="0"/>
+                <w:sz w:val="17"/>
+              </w:rPr>
+              <w:t xml:space="preserve"> during UAT and </w:t>
+            </w:r>
+            <w:r>
+              <w:rPr>
+                <w:rFonts w:ascii="Consolas" w:hAnsi="Consolas"/>
+                <w:b w:val="0"/>
+                <w:i w:val="0"/>
+                <w:sz w:val="17"/>
+              </w:rPr>
+              <w:t>APP_ENV=production</w:t>
+            </w:r>
+            <w:r>
+              <w:rPr>
+                <w:b w:val="0"/>
+                <w:i w:val="0"/>
+                <w:sz w:val="17"/>
+              </w:rPr>
+              <w:t xml:space="preserve"> from handover; the handover sign-off records the switch-off, approved by a second person</w:t>
             </w:r>
           </w:p>
         </w:tc>
@@ -11463,7 +11928,23 @@
           <w:b w:val="0"/>
           <w:i w:val="0"/>
         </w:rPr>
-        <w:t xml:space="preserve"> Under a production environment a self-approval is refused even with the setting allowed, and the allowing option cannot be approved.</w:t>
+        <w:t xml:space="preserve"> Under a production environment a self-approval is refused even with the setting allowed, the allowing option cannot be proposed or approved, and </w:t>
+      </w:r>
+      <w:r>
+        <w:rPr>
+          <w:rFonts w:ascii="Consolas" w:hAnsi="Consolas"/>
+          <w:b w:val="0"/>
+          <w:i w:val="0"/>
+          <w:sz w:val="18"/>
+        </w:rPr>
+        <w:t>governance:uat-mode on</w:t>
+      </w:r>
+      <w:r>
+        <w:rPr>
+          <w:b w:val="0"/>
+          <w:i w:val="0"/>
+        </w:rPr>
+        <w:t xml:space="preserve"> is refused.</w:t>
       </w:r>
     </w:p>
     <w:p>
@@ -11503,7 +11984,7 @@
           <w:b w:val="0"/>
           <w:i w:val="0"/>
         </w:rPr>
-        <w:t xml:space="preserve"> Switching the override off needs a second person; afterwards every workflow refuses a self-approval.</w:t>
+        <w:t xml:space="preserve"> Switching the override off needs a second person (the override never approves a change to its own setting); afterwards every workflow refuses a self-approval.</w:t>
       </w:r>
     </w:p>
     <w:p>

</xml_diff>

<commit_message>
Staging spec 8.10: the decisions pack, carrying people's decisions into a fresh database (phase 3a, decisions S12 to S14, acceptance 24 to 28), as asked by Edward on 15 October 2026
Draft for Edward's confirmation of scope before it is built.

Co-Authored-By: Claude Opus 5.5 <noreply@anthropic.com>
</commit_message>
<xml_diff>
--- a/docs/MAIIC_Staging_Module_Specification_v1_2026-10-15.docx
+++ b/docs/MAIIC_Staging_Module_Specification_v1_2026-10-15.docx
@@ -2,45 +2,6 @@
 <file path=word/document.xml><?xml version="1.0" encoding="utf-8"?>
 <w:document xmlns:wpc="http://schemas.microsoft.com/office/word/2010/wordprocessingCanvas" xmlns:mo="http://schemas.microsoft.com/office/mac/office/2008/main" xmlns:mc="http://schemas.openxmlformats.org/markup-compatibility/2006" xmlns:mv="urn:schemas-microsoft-com:mac:vml" xmlns:o="urn:schemas-microsoft-com:office:office" xmlns:r="http://schemas.openxmlformats.org/officeDocument/2006/relationships" xmlns:m="http://schemas.openxmlformats.org/officeDocument/2006/math" xmlns:v="urn:schemas-microsoft-com:vml" xmlns:wp14="http://schemas.microsoft.com/office/word/2010/wordprocessingDrawing" xmlns:wp="http://schemas.openxmlformats.org/drawingml/2006/wordprocessingDrawing" xmlns:w10="urn:schemas-microsoft-com:office:word" xmlns:w="http://schemas.openxmlformats.org/wordprocessingml/2006/main" xmlns:w14="http://schemas.microsoft.com/office/word/2010/wordml" xmlns:wpg="http://schemas.microsoft.com/office/word/2010/wordprocessingGroup" xmlns:wpi="http://schemas.microsoft.com/office/word/2010/wordprocessingInk" xmlns:wne="http://schemas.microsoft.com/office/word/2006/wordml" xmlns:wps="http://schemas.microsoft.com/office/word/2010/wordprocessingShape" mc:Ignorable="w14 wp14">
   <w:body>
-    <w:p>
-      <w:pPr>
-        <w:jc w:val="right"/>
-      </w:pPr>
-      <w:r>
-        <w:drawing>
-          <wp:inline xmlns:a="http://schemas.openxmlformats.org/drawingml/2006/main" xmlns:pic="http://schemas.openxmlformats.org/drawingml/2006/picture">
-            <wp:extent cx="1512000" cy="622847"/>
-            <wp:docPr id="1" name="Picture 1"/>
-            <wp:cNvGraphicFramePr>
-              <a:graphicFrameLocks noChangeAspect="1"/>
-            </wp:cNvGraphicFramePr>
-            <a:graphic>
-              <a:graphicData uri="http://schemas.openxmlformats.org/drawingml/2006/picture">
-                <pic:pic>
-                  <pic:nvPicPr>
-                    <pic:cNvPr id="0" name="Dupleix logo.png"/>
-                    <pic:cNvPicPr/>
-                  </pic:nvPicPr>
-                  <pic:blipFill>
-                    <a:blip r:embed="rId9"/>
-                    <a:stretch>
-                      <a:fillRect/>
-                    </a:stretch>
-                  </pic:blipFill>
-                  <pic:spPr>
-                    <a:xfrm>
-                      <a:off x="0" y="0"/>
-                      <a:ext cx="1512000" cy="622847"/>
-                    </a:xfrm>
-                    <a:prstGeom prst="rect"/>
-                  </pic:spPr>
-                </pic:pic>
-              </a:graphicData>
-            </a:graphic>
-          </wp:inline>
-        </w:drawing>
-      </w:r>
-    </w:p>
     <w:p>
       <w:r>
         <w:rPr>
@@ -105,30 +66,6 @@
       </w:r>
     </w:p>
     <w:p>
-      <w:r>
-        <w:rPr>
-          <w:b/>
-          <w:color w:val="1B2A41"/>
-          <w:sz w:val="26"/>
-        </w:rPr>
-        <w:t>Contents</w:t>
-      </w:r>
-    </w:p>
-    <w:p>
-      <w:r>
-        <w:fldChar w:fldCharType="begin"/>
-        <w:instrText xml:space="preserve">TOC \o "2-3" \h \z \u</w:instrText>
-        <w:fldChar w:fldCharType="separate"/>
-        <w:t>Right-click and choose Update Field if the page numbers do not show.</w:t>
-        <w:fldChar w:fldCharType="end"/>
-      </w:r>
-    </w:p>
-    <w:p>
-      <w:r>
-        <w:br w:type="page"/>
-      </w:r>
-    </w:p>
-    <w:p>
       <w:pPr>
         <w:pStyle w:val="Heading2"/>
       </w:pPr>
@@ -139,7 +76,6 @@
     <w:p>
       <w:pPr>
         <w:spacing w:after="120"/>
-        <w:jc w:val="both"/>
       </w:pPr>
       <w:r>
         <w:rPr>
@@ -152,7 +88,6 @@
     <w:p>
       <w:pPr>
         <w:spacing w:after="120"/>
-        <w:jc w:val="both"/>
       </w:pPr>
       <w:r>
         <w:rPr>
@@ -193,7 +128,6 @@
     <w:p>
       <w:pPr>
         <w:spacing w:after="120"/>
-        <w:jc w:val="both"/>
       </w:pPr>
       <w:r>
         <w:rPr>
@@ -206,7 +140,6 @@
     <w:p>
       <w:pPr>
         <w:pStyle w:val="ListBullet"/>
-        <w:jc w:val="both"/>
       </w:pPr>
       <w:r>
         <w:rPr>
@@ -240,7 +173,6 @@
     <w:p>
       <w:pPr>
         <w:pStyle w:val="ListBullet"/>
-        <w:jc w:val="both"/>
       </w:pPr>
       <w:r>
         <w:rPr>
@@ -290,7 +222,6 @@
     <w:p>
       <w:pPr>
         <w:spacing w:after="120"/>
-        <w:jc w:val="both"/>
       </w:pPr>
       <w:r>
         <w:rPr>
@@ -313,10 +244,6 @@
         <w:gridCol w:w="2493"/>
       </w:tblGrid>
       <w:tr>
-        <w:trPr>
-          <w:cantSplit/>
-          <w:tblHeader/>
-        </w:trPr>
         <w:tc>
           <w:tcPr>
             <w:tcW w:type="dxa" w:w="2493"/>
@@ -415,9 +342,6 @@
         </w:tc>
       </w:tr>
       <w:tr>
-        <w:trPr>
-          <w:cantSplit/>
-        </w:trPr>
         <w:tc>
           <w:tcPr>
             <w:tcW w:type="dxa" w:w="2493"/>
@@ -504,9 +428,6 @@
         </w:tc>
       </w:tr>
       <w:tr>
-        <w:trPr>
-          <w:cantSplit/>
-        </w:trPr>
         <w:tc>
           <w:tcPr>
             <w:tcW w:type="dxa" w:w="2493"/>
@@ -593,9 +514,6 @@
         </w:tc>
       </w:tr>
       <w:tr>
-        <w:trPr>
-          <w:cantSplit/>
-        </w:trPr>
         <w:tc>
           <w:tcPr>
             <w:tcW w:type="dxa" w:w="2493"/>
@@ -682,9 +600,6 @@
         </w:tc>
       </w:tr>
       <w:tr>
-        <w:trPr>
-          <w:cantSplit/>
-        </w:trPr>
         <w:tc>
           <w:tcPr>
             <w:tcW w:type="dxa" w:w="2493"/>
@@ -771,9 +686,6 @@
         </w:tc>
       </w:tr>
       <w:tr>
-        <w:trPr>
-          <w:cantSplit/>
-        </w:trPr>
         <w:tc>
           <w:tcPr>
             <w:tcW w:type="dxa" w:w="2493"/>
@@ -860,9 +772,6 @@
         </w:tc>
       </w:tr>
       <w:tr>
-        <w:trPr>
-          <w:cantSplit/>
-        </w:trPr>
         <w:tc>
           <w:tcPr>
             <w:tcW w:type="dxa" w:w="2493"/>
@@ -949,9 +858,6 @@
         </w:tc>
       </w:tr>
       <w:tr>
-        <w:trPr>
-          <w:cantSplit/>
-        </w:trPr>
         <w:tc>
           <w:tcPr>
             <w:tcW w:type="dxa" w:w="2493"/>
@@ -1042,7 +948,6 @@
     <w:p>
       <w:pPr>
         <w:spacing w:after="120"/>
-        <w:jc w:val="both"/>
       </w:pPr>
       <w:r>
         <w:rPr>
@@ -1063,7 +968,6 @@
     <w:p>
       <w:pPr>
         <w:spacing w:after="120"/>
-        <w:jc w:val="both"/>
       </w:pPr>
       <w:r>
         <w:rPr>
@@ -1084,7 +988,6 @@
     <w:p>
       <w:pPr>
         <w:spacing w:after="120"/>
-        <w:jc w:val="both"/>
       </w:pPr>
       <w:r>
         <w:rPr>
@@ -1097,7 +1000,6 @@
     <w:p>
       <w:pPr>
         <w:pStyle w:val="ListNumber"/>
-        <w:jc w:val="both"/>
       </w:pPr>
       <w:r>
         <w:rPr>
@@ -1117,7 +1019,6 @@
     <w:p>
       <w:pPr>
         <w:pStyle w:val="ListNumber"/>
-        <w:jc w:val="both"/>
       </w:pPr>
       <w:r>
         <w:rPr>
@@ -1137,7 +1038,6 @@
     <w:p>
       <w:pPr>
         <w:pStyle w:val="ListNumber"/>
-        <w:jc w:val="both"/>
       </w:pPr>
       <w:r>
         <w:rPr>
@@ -1157,7 +1057,6 @@
     <w:p>
       <w:pPr>
         <w:pStyle w:val="ListNumber"/>
-        <w:jc w:val="both"/>
       </w:pPr>
       <w:r>
         <w:rPr>
@@ -1177,7 +1076,6 @@
     <w:p>
       <w:pPr>
         <w:pStyle w:val="ListNumber"/>
-        <w:jc w:val="both"/>
       </w:pPr>
       <w:r>
         <w:rPr>
@@ -1197,7 +1095,6 @@
     <w:p>
       <w:pPr>
         <w:spacing w:after="120"/>
-        <w:jc w:val="both"/>
       </w:pPr>
       <w:r>
         <w:rPr>
@@ -1218,7 +1115,6 @@
     <w:p>
       <w:pPr>
         <w:spacing w:after="120"/>
-        <w:jc w:val="both"/>
       </w:pPr>
       <w:r>
         <w:rPr>
@@ -1250,10 +1146,6 @@
         <w:gridCol w:w="1662"/>
       </w:tblGrid>
       <w:tr>
-        <w:trPr>
-          <w:cantSplit/>
-          <w:tblHeader/>
-        </w:trPr>
         <w:tc>
           <w:tcPr>
             <w:tcW w:type="dxa" w:w="1662"/>
@@ -1400,9 +1292,6 @@
         </w:tc>
       </w:tr>
       <w:tr>
-        <w:trPr>
-          <w:cantSplit/>
-        </w:trPr>
         <w:tc>
           <w:tcPr>
             <w:tcW w:type="dxa" w:w="1662"/>
@@ -1540,9 +1429,6 @@
         </w:tc>
       </w:tr>
       <w:tr>
-        <w:trPr>
-          <w:cantSplit/>
-        </w:trPr>
         <w:tc>
           <w:tcPr>
             <w:tcW w:type="dxa" w:w="1662"/>
@@ -1680,9 +1566,6 @@
         </w:tc>
       </w:tr>
       <w:tr>
-        <w:trPr>
-          <w:cantSplit/>
-        </w:trPr>
         <w:tc>
           <w:tcPr>
             <w:tcW w:type="dxa" w:w="1662"/>
@@ -1820,9 +1703,6 @@
         </w:tc>
       </w:tr>
       <w:tr>
-        <w:trPr>
-          <w:cantSplit/>
-        </w:trPr>
         <w:tc>
           <w:tcPr>
             <w:tcW w:type="dxa" w:w="1662"/>
@@ -1968,9 +1848,6 @@
         </w:tc>
       </w:tr>
       <w:tr>
-        <w:trPr>
-          <w:cantSplit/>
-        </w:trPr>
         <w:tc>
           <w:tcPr>
             <w:tcW w:type="dxa" w:w="1662"/>
@@ -2108,9 +1985,6 @@
         </w:tc>
       </w:tr>
       <w:tr>
-        <w:trPr>
-          <w:cantSplit/>
-        </w:trPr>
         <w:tc>
           <w:tcPr>
             <w:tcW w:type="dxa" w:w="1662"/>
@@ -2248,9 +2122,6 @@
         </w:tc>
       </w:tr>
       <w:tr>
-        <w:trPr>
-          <w:cantSplit/>
-        </w:trPr>
         <w:tc>
           <w:tcPr>
             <w:tcW w:type="dxa" w:w="1662"/>
@@ -2388,9 +2259,6 @@
         </w:tc>
       </w:tr>
       <w:tr>
-        <w:trPr>
-          <w:cantSplit/>
-        </w:trPr>
         <w:tc>
           <w:tcPr>
             <w:tcW w:type="dxa" w:w="1662"/>
@@ -2528,9 +2396,6 @@
         </w:tc>
       </w:tr>
       <w:tr>
-        <w:trPr>
-          <w:cantSplit/>
-        </w:trPr>
         <w:tc>
           <w:tcPr>
             <w:tcW w:type="dxa" w:w="1662"/>
@@ -2668,9 +2533,6 @@
         </w:tc>
       </w:tr>
       <w:tr>
-        <w:trPr>
-          <w:cantSplit/>
-        </w:trPr>
         <w:tc>
           <w:tcPr>
             <w:tcW w:type="dxa" w:w="1662"/>
@@ -2808,9 +2670,6 @@
         </w:tc>
       </w:tr>
       <w:tr>
-        <w:trPr>
-          <w:cantSplit/>
-        </w:trPr>
         <w:tc>
           <w:tcPr>
             <w:tcW w:type="dxa" w:w="1662"/>
@@ -2948,9 +2807,6 @@
         </w:tc>
       </w:tr>
       <w:tr>
-        <w:trPr>
-          <w:cantSplit/>
-        </w:trPr>
         <w:tc>
           <w:tcPr>
             <w:tcW w:type="dxa" w:w="1662"/>
@@ -3100,7 +2956,6 @@
     <w:p>
       <w:pPr>
         <w:pStyle w:val="ListBullet"/>
-        <w:jc w:val="both"/>
       </w:pPr>
       <w:r>
         <w:rPr>
@@ -3143,7 +2998,6 @@
     <w:p>
       <w:pPr>
         <w:pStyle w:val="ListBullet"/>
-        <w:jc w:val="both"/>
       </w:pPr>
       <w:r>
         <w:rPr>
@@ -3163,7 +3017,6 @@
     <w:p>
       <w:pPr>
         <w:pStyle w:val="ListBullet"/>
-        <w:jc w:val="both"/>
       </w:pPr>
       <w:r>
         <w:rPr>
@@ -3184,7 +3037,6 @@
     <w:p>
       <w:pPr>
         <w:spacing w:after="120"/>
-        <w:jc w:val="both"/>
       </w:pPr>
       <w:r>
         <w:rPr>
@@ -3197,7 +3049,6 @@
     <w:p>
       <w:pPr>
         <w:pStyle w:val="ListNumber"/>
-        <w:jc w:val="both"/>
       </w:pPr>
       <w:r>
         <w:rPr>
@@ -3224,7 +3075,6 @@
     <w:p>
       <w:pPr>
         <w:pStyle w:val="ListNumber"/>
-        <w:jc w:val="both"/>
       </w:pPr>
       <w:r>
         <w:rPr>
@@ -3237,7 +3087,6 @@
     <w:p>
       <w:pPr>
         <w:pStyle w:val="ListNumber"/>
-        <w:jc w:val="both"/>
       </w:pPr>
       <w:r>
         <w:rPr>
@@ -3250,7 +3099,6 @@
     <w:p>
       <w:pPr>
         <w:pStyle w:val="ListNumber"/>
-        <w:jc w:val="both"/>
       </w:pPr>
       <w:r>
         <w:rPr>
@@ -3271,7 +3119,6 @@
     <w:p>
       <w:pPr>
         <w:spacing w:after="120"/>
-        <w:jc w:val="both"/>
       </w:pPr>
       <w:r>
         <w:rPr>
@@ -3291,7 +3138,6 @@
     <w:p>
       <w:pPr>
         <w:spacing w:after="120"/>
-        <w:jc w:val="both"/>
       </w:pPr>
       <w:r>
         <w:rPr>
@@ -3311,7 +3157,6 @@
     <w:p>
       <w:pPr>
         <w:spacing w:after="120"/>
-        <w:jc w:val="both"/>
       </w:pPr>
       <w:r>
         <w:rPr>
@@ -3339,10 +3184,6 @@
         <w:gridCol w:w="4986"/>
       </w:tblGrid>
       <w:tr>
-        <w:trPr>
-          <w:cantSplit/>
-          <w:tblHeader/>
-        </w:trPr>
         <w:tc>
           <w:tcPr>
             <w:tcW w:type="dxa" w:w="4986"/>
@@ -3393,9 +3234,6 @@
         </w:tc>
       </w:tr>
       <w:tr>
-        <w:trPr>
-          <w:cantSplit/>
-        </w:trPr>
         <w:tc>
           <w:tcPr>
             <w:tcW w:type="dxa" w:w="4986"/>
@@ -3440,9 +3278,6 @@
         </w:tc>
       </w:tr>
       <w:tr>
-        <w:trPr>
-          <w:cantSplit/>
-        </w:trPr>
         <w:tc>
           <w:tcPr>
             <w:tcW w:type="dxa" w:w="4986"/>
@@ -3487,9 +3322,6 @@
         </w:tc>
       </w:tr>
       <w:tr>
-        <w:trPr>
-          <w:cantSplit/>
-        </w:trPr>
         <w:tc>
           <w:tcPr>
             <w:tcW w:type="dxa" w:w="4986"/>
@@ -3534,9 +3366,6 @@
         </w:tc>
       </w:tr>
       <w:tr>
-        <w:trPr>
-          <w:cantSplit/>
-        </w:trPr>
         <w:tc>
           <w:tcPr>
             <w:tcW w:type="dxa" w:w="4986"/>
@@ -3581,9 +3410,6 @@
         </w:tc>
       </w:tr>
       <w:tr>
-        <w:trPr>
-          <w:cantSplit/>
-        </w:trPr>
         <w:tc>
           <w:tcPr>
             <w:tcW w:type="dxa" w:w="4986"/>
@@ -3628,9 +3454,6 @@
         </w:tc>
       </w:tr>
       <w:tr>
-        <w:trPr>
-          <w:cantSplit/>
-        </w:trPr>
         <w:tc>
           <w:tcPr>
             <w:tcW w:type="dxa" w:w="4986"/>
@@ -3679,7 +3502,6 @@
     <w:p>
       <w:pPr>
         <w:spacing w:after="120"/>
-        <w:jc w:val="both"/>
       </w:pPr>
       <w:r>
         <w:rPr>
@@ -3692,7 +3514,6 @@
     <w:p>
       <w:pPr>
         <w:spacing w:after="120"/>
-        <w:jc w:val="both"/>
       </w:pPr>
       <w:r>
         <w:rPr>
@@ -3712,7 +3533,6 @@
     <w:p>
       <w:pPr>
         <w:pStyle w:val="ListBullet"/>
-        <w:jc w:val="both"/>
       </w:pPr>
       <w:r>
         <w:rPr>
@@ -3732,7 +3552,6 @@
     <w:p>
       <w:pPr>
         <w:pStyle w:val="ListBullet"/>
-        <w:jc w:val="both"/>
       </w:pPr>
       <w:r>
         <w:rPr>
@@ -3752,7 +3571,6 @@
     <w:p>
       <w:pPr>
         <w:pStyle w:val="ListBullet"/>
-        <w:jc w:val="both"/>
       </w:pPr>
       <w:r>
         <w:rPr>
@@ -3772,7 +3590,6 @@
     <w:p>
       <w:pPr>
         <w:spacing w:after="120"/>
-        <w:jc w:val="both"/>
       </w:pPr>
       <w:r>
         <w:rPr>
@@ -3800,7 +3617,6 @@
     <w:p>
       <w:pPr>
         <w:spacing w:after="120"/>
-        <w:jc w:val="both"/>
       </w:pPr>
       <w:r>
         <w:rPr>
@@ -3813,7 +3629,6 @@
     <w:p>
       <w:pPr>
         <w:pStyle w:val="ListBullet"/>
-        <w:jc w:val="both"/>
       </w:pPr>
       <w:r>
         <w:rPr>
@@ -3842,7 +3657,6 @@
     <w:p>
       <w:pPr>
         <w:pStyle w:val="ListBullet"/>
-        <w:jc w:val="both"/>
       </w:pPr>
       <w:r>
         <w:rPr>
@@ -3871,7 +3685,6 @@
     <w:p>
       <w:pPr>
         <w:pStyle w:val="ListBullet"/>
-        <w:jc w:val="both"/>
       </w:pPr>
       <w:r>
         <w:rPr>
@@ -3901,10 +3714,6 @@
         <w:gridCol w:w="3324"/>
       </w:tblGrid>
       <w:tr>
-        <w:trPr>
-          <w:cantSplit/>
-          <w:tblHeader/>
-        </w:trPr>
         <w:tc>
           <w:tcPr>
             <w:tcW w:type="dxa" w:w="3324"/>
@@ -3979,9 +3788,6 @@
         </w:tc>
       </w:tr>
       <w:tr>
-        <w:trPr>
-          <w:cantSplit/>
-        </w:trPr>
         <w:tc>
           <w:tcPr>
             <w:tcW w:type="dxa" w:w="3324"/>
@@ -4047,9 +3853,6 @@
         </w:tc>
       </w:tr>
       <w:tr>
-        <w:trPr>
-          <w:cantSplit/>
-        </w:trPr>
         <w:tc>
           <w:tcPr>
             <w:tcW w:type="dxa" w:w="3324"/>
@@ -4115,9 +3918,6 @@
         </w:tc>
       </w:tr>
       <w:tr>
-        <w:trPr>
-          <w:cantSplit/>
-        </w:trPr>
         <w:tc>
           <w:tcPr>
             <w:tcW w:type="dxa" w:w="3324"/>
@@ -4183,9 +3983,6 @@
         </w:tc>
       </w:tr>
       <w:tr>
-        <w:trPr>
-          <w:cantSplit/>
-        </w:trPr>
         <w:tc>
           <w:tcPr>
             <w:tcW w:type="dxa" w:w="3324"/>
@@ -4251,9 +4048,6 @@
         </w:tc>
       </w:tr>
       <w:tr>
-        <w:trPr>
-          <w:cantSplit/>
-        </w:trPr>
         <w:tc>
           <w:tcPr>
             <w:tcW w:type="dxa" w:w="3324"/>
@@ -4319,9 +4113,6 @@
         </w:tc>
       </w:tr>
       <w:tr>
-        <w:trPr>
-          <w:cantSplit/>
-        </w:trPr>
         <w:tc>
           <w:tcPr>
             <w:tcW w:type="dxa" w:w="3324"/>
@@ -4387,9 +4178,6 @@
         </w:tc>
       </w:tr>
       <w:tr>
-        <w:trPr>
-          <w:cantSplit/>
-        </w:trPr>
         <w:tc>
           <w:tcPr>
             <w:tcW w:type="dxa" w:w="3324"/>
@@ -4455,9 +4243,6 @@
         </w:tc>
       </w:tr>
       <w:tr>
-        <w:trPr>
-          <w:cantSplit/>
-        </w:trPr>
         <w:tc>
           <w:tcPr>
             <w:tcW w:type="dxa" w:w="3324"/>
@@ -4523,9 +4308,6 @@
         </w:tc>
       </w:tr>
       <w:tr>
-        <w:trPr>
-          <w:cantSplit/>
-        </w:trPr>
         <w:tc>
           <w:tcPr>
             <w:tcW w:type="dxa" w:w="3324"/>
@@ -4603,7 +4385,6 @@
     <w:p>
       <w:pPr>
         <w:spacing w:after="120"/>
-        <w:jc w:val="both"/>
       </w:pPr>
       <w:r>
         <w:rPr>
@@ -4623,7 +4404,6 @@
     <w:p>
       <w:pPr>
         <w:spacing w:after="120"/>
-        <w:jc w:val="both"/>
       </w:pPr>
       <w:r>
         <w:rPr>
@@ -4691,7 +4471,6 @@
     <w:p>
       <w:pPr>
         <w:spacing w:after="120"/>
-        <w:jc w:val="both"/>
       </w:pPr>
       <w:r>
         <w:rPr>
@@ -4759,7 +4538,6 @@
     <w:p>
       <w:pPr>
         <w:spacing w:after="120"/>
-        <w:jc w:val="both"/>
       </w:pPr>
       <w:r>
         <w:rPr>
@@ -4787,7 +4565,6 @@
     <w:p>
       <w:pPr>
         <w:spacing w:after="120"/>
-        <w:jc w:val="both"/>
       </w:pPr>
       <w:r>
         <w:rPr>
@@ -4844,10 +4621,6 @@
         <w:gridCol w:w="4986"/>
       </w:tblGrid>
       <w:tr>
-        <w:trPr>
-          <w:cantSplit/>
-          <w:tblHeader/>
-        </w:trPr>
         <w:tc>
           <w:tcPr>
             <w:tcW w:type="dxa" w:w="4986"/>
@@ -4898,9 +4671,6 @@
         </w:tc>
       </w:tr>
       <w:tr>
-        <w:trPr>
-          <w:cantSplit/>
-        </w:trPr>
         <w:tc>
           <w:tcPr>
             <w:tcW w:type="dxa" w:w="4986"/>
@@ -4945,9 +4715,6 @@
         </w:tc>
       </w:tr>
       <w:tr>
-        <w:trPr>
-          <w:cantSplit/>
-        </w:trPr>
         <w:tc>
           <w:tcPr>
             <w:tcW w:type="dxa" w:w="4986"/>
@@ -4992,9 +4759,6 @@
         </w:tc>
       </w:tr>
       <w:tr>
-        <w:trPr>
-          <w:cantSplit/>
-        </w:trPr>
         <w:tc>
           <w:tcPr>
             <w:tcW w:type="dxa" w:w="4986"/>
@@ -5039,9 +4803,6 @@
         </w:tc>
       </w:tr>
       <w:tr>
-        <w:trPr>
-          <w:cantSplit/>
-        </w:trPr>
         <w:tc>
           <w:tcPr>
             <w:tcW w:type="dxa" w:w="4986"/>
@@ -5078,9 +4839,6 @@
         </w:tc>
       </w:tr>
       <w:tr>
-        <w:trPr>
-          <w:cantSplit/>
-        </w:trPr>
         <w:tc>
           <w:tcPr>
             <w:tcW w:type="dxa" w:w="4986"/>
@@ -5117,9 +4875,6 @@
         </w:tc>
       </w:tr>
       <w:tr>
-        <w:trPr>
-          <w:cantSplit/>
-        </w:trPr>
         <w:tc>
           <w:tcPr>
             <w:tcW w:type="dxa" w:w="4986"/>
@@ -5168,7 +4923,6 @@
     <w:p>
       <w:pPr>
         <w:spacing w:after="120"/>
-        <w:jc w:val="both"/>
       </w:pPr>
       <w:r>
         <w:rPr>
@@ -5189,10 +4943,6 @@
         <w:gridCol w:w="4986"/>
       </w:tblGrid>
       <w:tr>
-        <w:trPr>
-          <w:cantSplit/>
-          <w:tblHeader/>
-        </w:trPr>
         <w:tc>
           <w:tcPr>
             <w:tcW w:type="dxa" w:w="4986"/>
@@ -5243,9 +4993,6 @@
         </w:tc>
       </w:tr>
       <w:tr>
-        <w:trPr>
-          <w:cantSplit/>
-        </w:trPr>
         <w:tc>
           <w:tcPr>
             <w:tcW w:type="dxa" w:w="4986"/>
@@ -5290,9 +5037,6 @@
         </w:tc>
       </w:tr>
       <w:tr>
-        <w:trPr>
-          <w:cantSplit/>
-        </w:trPr>
         <w:tc>
           <w:tcPr>
             <w:tcW w:type="dxa" w:w="4986"/>
@@ -5337,9 +5081,6 @@
         </w:tc>
       </w:tr>
       <w:tr>
-        <w:trPr>
-          <w:cantSplit/>
-        </w:trPr>
         <w:tc>
           <w:tcPr>
             <w:tcW w:type="dxa" w:w="4986"/>
@@ -5384,9 +5125,6 @@
         </w:tc>
       </w:tr>
       <w:tr>
-        <w:trPr>
-          <w:cantSplit/>
-        </w:trPr>
         <w:tc>
           <w:tcPr>
             <w:tcW w:type="dxa" w:w="4986"/>
@@ -5431,9 +5169,6 @@
         </w:tc>
       </w:tr>
       <w:tr>
-        <w:trPr>
-          <w:cantSplit/>
-        </w:trPr>
         <w:tc>
           <w:tcPr>
             <w:tcW w:type="dxa" w:w="4986"/>
@@ -5486,9 +5221,6 @@
         </w:tc>
       </w:tr>
       <w:tr>
-        <w:trPr>
-          <w:cantSplit/>
-        </w:trPr>
         <w:tc>
           <w:tcPr>
             <w:tcW w:type="dxa" w:w="4986"/>
@@ -5541,9 +5273,6 @@
         </w:tc>
       </w:tr>
       <w:tr>
-        <w:trPr>
-          <w:cantSplit/>
-        </w:trPr>
         <w:tc>
           <w:tcPr>
             <w:tcW w:type="dxa" w:w="4986"/>
@@ -5588,9 +5317,6 @@
         </w:tc>
       </w:tr>
       <w:tr>
-        <w:trPr>
-          <w:cantSplit/>
-        </w:trPr>
         <w:tc>
           <w:tcPr>
             <w:tcW w:type="dxa" w:w="4986"/>
@@ -5647,7 +5373,6 @@
     <w:p>
       <w:pPr>
         <w:pStyle w:val="ListBullet"/>
-        <w:jc w:val="both"/>
       </w:pPr>
       <w:r>
         <w:rPr>
@@ -5667,7 +5392,6 @@
     <w:p>
       <w:pPr>
         <w:pStyle w:val="ListBullet"/>
-        <w:jc w:val="both"/>
       </w:pPr>
       <w:r>
         <w:rPr>
@@ -5719,7 +5443,6 @@
     <w:p>
       <w:pPr>
         <w:pStyle w:val="ListBullet"/>
-        <w:jc w:val="both"/>
       </w:pPr>
       <w:r>
         <w:rPr>
@@ -5739,7 +5462,6 @@
     <w:p>
       <w:pPr>
         <w:pStyle w:val="ListBullet"/>
-        <w:jc w:val="both"/>
       </w:pPr>
       <w:r>
         <w:rPr>
@@ -5789,7 +5511,6 @@
     <w:p>
       <w:pPr>
         <w:pStyle w:val="ListBullet"/>
-        <w:jc w:val="both"/>
       </w:pPr>
       <w:r>
         <w:rPr>
@@ -5817,7 +5538,6 @@
     <w:p>
       <w:pPr>
         <w:spacing w:after="120"/>
-        <w:jc w:val="both"/>
       </w:pPr>
       <w:r>
         <w:rPr>
@@ -5852,7 +5572,6 @@
     <w:p>
       <w:pPr>
         <w:pStyle w:val="ListBullet"/>
-        <w:jc w:val="both"/>
       </w:pPr>
       <w:r>
         <w:rPr>
@@ -5879,7 +5598,6 @@
     <w:p>
       <w:pPr>
         <w:pStyle w:val="ListBullet"/>
-        <w:jc w:val="both"/>
       </w:pPr>
       <w:r>
         <w:rPr>
@@ -5914,7 +5632,6 @@
     <w:p>
       <w:pPr>
         <w:spacing w:after="120"/>
-        <w:jc w:val="both"/>
       </w:pPr>
       <w:r>
         <w:rPr>
@@ -5927,7 +5644,6 @@
     <w:p>
       <w:pPr>
         <w:spacing w:after="120"/>
-        <w:jc w:val="both"/>
       </w:pPr>
       <w:r>
         <w:rPr>
@@ -5951,10 +5667,6 @@
         <w:gridCol w:w="1994"/>
       </w:tblGrid>
       <w:tr>
-        <w:trPr>
-          <w:cantSplit/>
-          <w:tblHeader/>
-        </w:trPr>
         <w:tc>
           <w:tcPr>
             <w:tcW w:type="dxa" w:w="1994"/>
@@ -6077,9 +5789,6 @@
         </w:tc>
       </w:tr>
       <w:tr>
-        <w:trPr>
-          <w:cantSplit/>
-        </w:trPr>
         <w:tc>
           <w:tcPr>
             <w:tcW w:type="dxa" w:w="1994"/>
@@ -6187,9 +5896,6 @@
         </w:tc>
       </w:tr>
       <w:tr>
-        <w:trPr>
-          <w:cantSplit/>
-        </w:trPr>
         <w:tc>
           <w:tcPr>
             <w:tcW w:type="dxa" w:w="1994"/>
@@ -6297,9 +6003,6 @@
         </w:tc>
       </w:tr>
       <w:tr>
-        <w:trPr>
-          <w:cantSplit/>
-        </w:trPr>
         <w:tc>
           <w:tcPr>
             <w:tcW w:type="dxa" w:w="1994"/>
@@ -6431,9 +6134,6 @@
         </w:tc>
       </w:tr>
       <w:tr>
-        <w:trPr>
-          <w:cantSplit/>
-        </w:trPr>
         <w:tc>
           <w:tcPr>
             <w:tcW w:type="dxa" w:w="1994"/>
@@ -6541,9 +6241,6 @@
         </w:tc>
       </w:tr>
       <w:tr>
-        <w:trPr>
-          <w:cantSplit/>
-        </w:trPr>
         <w:tc>
           <w:tcPr>
             <w:tcW w:type="dxa" w:w="1994"/>
@@ -6651,9 +6348,6 @@
         </w:tc>
       </w:tr>
       <w:tr>
-        <w:trPr>
-          <w:cantSplit/>
-        </w:trPr>
         <w:tc>
           <w:tcPr>
             <w:tcW w:type="dxa" w:w="1994"/>
@@ -6761,9 +6455,6 @@
         </w:tc>
       </w:tr>
       <w:tr>
-        <w:trPr>
-          <w:cantSplit/>
-        </w:trPr>
         <w:tc>
           <w:tcPr>
             <w:tcW w:type="dxa" w:w="1994"/>
@@ -6871,9 +6562,6 @@
         </w:tc>
       </w:tr>
       <w:tr>
-        <w:trPr>
-          <w:cantSplit/>
-        </w:trPr>
         <w:tc>
           <w:tcPr>
             <w:tcW w:type="dxa" w:w="1994"/>
@@ -6985,7 +6673,6 @@
     <w:p>
       <w:pPr>
         <w:spacing w:after="120"/>
-        <w:jc w:val="both"/>
       </w:pPr>
       <w:r>
         <w:rPr>
@@ -7009,10 +6696,6 @@
         <w:gridCol w:w="1994"/>
       </w:tblGrid>
       <w:tr>
-        <w:trPr>
-          <w:cantSplit/>
-          <w:tblHeader/>
-        </w:trPr>
         <w:tc>
           <w:tcPr>
             <w:tcW w:type="dxa" w:w="1994"/>
@@ -7135,9 +6818,6 @@
         </w:tc>
       </w:tr>
       <w:tr>
-        <w:trPr>
-          <w:cantSplit/>
-        </w:trPr>
         <w:tc>
           <w:tcPr>
             <w:tcW w:type="dxa" w:w="1994"/>
@@ -7245,9 +6925,6 @@
         </w:tc>
       </w:tr>
       <w:tr>
-        <w:trPr>
-          <w:cantSplit/>
-        </w:trPr>
         <w:tc>
           <w:tcPr>
             <w:tcW w:type="dxa" w:w="1994"/>
@@ -7355,9 +7032,6 @@
         </w:tc>
       </w:tr>
       <w:tr>
-        <w:trPr>
-          <w:cantSplit/>
-        </w:trPr>
         <w:tc>
           <w:tcPr>
             <w:tcW w:type="dxa" w:w="1994"/>
@@ -7473,9 +7147,6 @@
         </w:tc>
       </w:tr>
       <w:tr>
-        <w:trPr>
-          <w:cantSplit/>
-        </w:trPr>
         <w:tc>
           <w:tcPr>
             <w:tcW w:type="dxa" w:w="1994"/>
@@ -7583,9 +7254,6 @@
         </w:tc>
       </w:tr>
       <w:tr>
-        <w:trPr>
-          <w:cantSplit/>
-        </w:trPr>
         <w:tc>
           <w:tcPr>
             <w:tcW w:type="dxa" w:w="1994"/>
@@ -7693,9 +7361,6 @@
         </w:tc>
       </w:tr>
       <w:tr>
-        <w:trPr>
-          <w:cantSplit/>
-        </w:trPr>
         <w:tc>
           <w:tcPr>
             <w:tcW w:type="dxa" w:w="1994"/>
@@ -7807,7 +7472,6 @@
     <w:p>
       <w:pPr>
         <w:spacing w:after="120"/>
-        <w:jc w:val="both"/>
       </w:pPr>
       <w:r>
         <w:rPr>
@@ -7831,10 +7495,6 @@
         <w:gridCol w:w="1994"/>
       </w:tblGrid>
       <w:tr>
-        <w:trPr>
-          <w:cantSplit/>
-          <w:tblHeader/>
-        </w:trPr>
         <w:tc>
           <w:tcPr>
             <w:tcW w:type="dxa" w:w="1994"/>
@@ -7957,9 +7617,6 @@
         </w:tc>
       </w:tr>
       <w:tr>
-        <w:trPr>
-          <w:cantSplit/>
-        </w:trPr>
         <w:tc>
           <w:tcPr>
             <w:tcW w:type="dxa" w:w="1994"/>
@@ -8067,9 +7724,6 @@
         </w:tc>
       </w:tr>
       <w:tr>
-        <w:trPr>
-          <w:cantSplit/>
-        </w:trPr>
         <w:tc>
           <w:tcPr>
             <w:tcW w:type="dxa" w:w="1994"/>
@@ -8177,9 +7831,6 @@
         </w:tc>
       </w:tr>
       <w:tr>
-        <w:trPr>
-          <w:cantSplit/>
-        </w:trPr>
         <w:tc>
           <w:tcPr>
             <w:tcW w:type="dxa" w:w="1994"/>
@@ -8287,9 +7938,6 @@
         </w:tc>
       </w:tr>
       <w:tr>
-        <w:trPr>
-          <w:cantSplit/>
-        </w:trPr>
         <w:tc>
           <w:tcPr>
             <w:tcW w:type="dxa" w:w="1994"/>
@@ -8397,9 +8045,6 @@
         </w:tc>
       </w:tr>
       <w:tr>
-        <w:trPr>
-          <w:cantSplit/>
-        </w:trPr>
         <w:tc>
           <w:tcPr>
             <w:tcW w:type="dxa" w:w="1994"/>
@@ -8519,7 +8164,6 @@
     <w:p>
       <w:pPr>
         <w:spacing w:after="120"/>
-        <w:jc w:val="both"/>
       </w:pPr>
       <w:r>
         <w:rPr>
@@ -8554,7 +8198,6 @@
     <w:p>
       <w:pPr>
         <w:spacing w:after="120"/>
-        <w:jc w:val="both"/>
       </w:pPr>
       <w:r>
         <w:rPr>
@@ -8567,7 +8210,6 @@
     <w:p>
       <w:pPr>
         <w:pStyle w:val="ListBullet"/>
-        <w:jc w:val="both"/>
       </w:pPr>
       <w:r>
         <w:rPr>
@@ -8594,7 +8236,6 @@
     <w:p>
       <w:pPr>
         <w:pStyle w:val="ListBullet"/>
-        <w:jc w:val="both"/>
       </w:pPr>
       <w:r>
         <w:rPr>
@@ -8621,7 +8262,6 @@
     <w:p>
       <w:pPr>
         <w:pStyle w:val="ListBullet"/>
-        <w:jc w:val="both"/>
       </w:pPr>
       <w:r>
         <w:rPr>
@@ -8650,7 +8290,6 @@
     <w:p>
       <w:pPr>
         <w:spacing w:after="120"/>
-        <w:jc w:val="both"/>
       </w:pPr>
       <w:r>
         <w:rPr>
@@ -8672,10 +8311,6 @@
         <w:gridCol w:w="3324"/>
       </w:tblGrid>
       <w:tr>
-        <w:trPr>
-          <w:cantSplit/>
-          <w:tblHeader/>
-        </w:trPr>
         <w:tc>
           <w:tcPr>
             <w:tcW w:type="dxa" w:w="3324"/>
@@ -8750,9 +8385,6 @@
         </w:tc>
       </w:tr>
       <w:tr>
-        <w:trPr>
-          <w:cantSplit/>
-        </w:trPr>
         <w:tc>
           <w:tcPr>
             <w:tcW w:type="dxa" w:w="3324"/>
@@ -8842,9 +8474,6 @@
         </w:tc>
       </w:tr>
       <w:tr>
-        <w:trPr>
-          <w:cantSplit/>
-        </w:trPr>
         <w:tc>
           <w:tcPr>
             <w:tcW w:type="dxa" w:w="3324"/>
@@ -8918,9 +8547,6 @@
         </w:tc>
       </w:tr>
       <w:tr>
-        <w:trPr>
-          <w:cantSplit/>
-        </w:trPr>
         <w:tc>
           <w:tcPr>
             <w:tcW w:type="dxa" w:w="3324"/>
@@ -8994,9 +8620,6 @@
         </w:tc>
       </w:tr>
       <w:tr>
-        <w:trPr>
-          <w:cantSplit/>
-        </w:trPr>
         <w:tc>
           <w:tcPr>
             <w:tcW w:type="dxa" w:w="3324"/>
@@ -9070,9 +8693,6 @@
         </w:tc>
       </w:tr>
       <w:tr>
-        <w:trPr>
-          <w:cantSplit/>
-        </w:trPr>
         <w:tc>
           <w:tcPr>
             <w:tcW w:type="dxa" w:w="3324"/>
@@ -9146,9 +8766,6 @@
         </w:tc>
       </w:tr>
       <w:tr>
-        <w:trPr>
-          <w:cantSplit/>
-        </w:trPr>
         <w:tc>
           <w:tcPr>
             <w:tcW w:type="dxa" w:w="3324"/>
@@ -9226,7 +8843,6 @@
     <w:p>
       <w:pPr>
         <w:spacing w:after="120"/>
-        <w:jc w:val="both"/>
       </w:pPr>
       <w:r>
         <w:rPr>
@@ -9246,7 +8862,6 @@
     <w:p>
       <w:pPr>
         <w:spacing w:after="120"/>
-        <w:jc w:val="both"/>
       </w:pPr>
       <w:r>
         <w:rPr>
@@ -9274,7 +8889,6 @@
     <w:p>
       <w:pPr>
         <w:spacing w:after="120"/>
-        <w:jc w:val="both"/>
       </w:pPr>
       <w:r>
         <w:rPr>
@@ -9287,7 +8901,6 @@
     <w:p>
       <w:pPr>
         <w:spacing w:after="120"/>
-        <w:jc w:val="both"/>
       </w:pPr>
       <w:r>
         <w:rPr>
@@ -9360,10 +8973,6 @@
         <w:gridCol w:w="3324"/>
       </w:tblGrid>
       <w:tr>
-        <w:trPr>
-          <w:cantSplit/>
-          <w:tblHeader/>
-        </w:trPr>
         <w:tc>
           <w:tcPr>
             <w:tcW w:type="dxa" w:w="3324"/>
@@ -9438,9 +9047,6 @@
         </w:tc>
       </w:tr>
       <w:tr>
-        <w:trPr>
-          <w:cantSplit/>
-        </w:trPr>
         <w:tc>
           <w:tcPr>
             <w:tcW w:type="dxa" w:w="3324"/>
@@ -9510,7 +9116,6 @@
     <w:p>
       <w:pPr>
         <w:spacing w:after="120"/>
-        <w:jc w:val="both"/>
       </w:pPr>
       <w:r>
         <w:rPr>
@@ -9523,7 +9128,6 @@
     <w:p>
       <w:pPr>
         <w:spacing w:after="120"/>
-        <w:jc w:val="both"/>
       </w:pPr>
       <w:r>
         <w:rPr>
@@ -9559,7 +9163,6 @@
     <w:p>
       <w:pPr>
         <w:spacing w:after="120"/>
-        <w:jc w:val="both"/>
       </w:pPr>
       <w:r>
         <w:rPr>
@@ -9581,10 +9184,6 @@
         <w:gridCol w:w="3324"/>
       </w:tblGrid>
       <w:tr>
-        <w:trPr>
-          <w:cantSplit/>
-          <w:tblHeader/>
-        </w:trPr>
         <w:tc>
           <w:tcPr>
             <w:tcW w:type="dxa" w:w="3324"/>
@@ -9659,9 +9258,6 @@
         </w:tc>
       </w:tr>
       <w:tr>
-        <w:trPr>
-          <w:cantSplit/>
-        </w:trPr>
         <w:tc>
           <w:tcPr>
             <w:tcW w:type="dxa" w:w="3324"/>
@@ -9735,9 +9331,6 @@
         </w:tc>
       </w:tr>
       <w:tr>
-        <w:trPr>
-          <w:cantSplit/>
-        </w:trPr>
         <w:tc>
           <w:tcPr>
             <w:tcW w:type="dxa" w:w="3324"/>
@@ -9910,9 +9503,6 @@
         </w:tc>
       </w:tr>
       <w:tr>
-        <w:trPr>
-          <w:cantSplit/>
-        </w:trPr>
         <w:tc>
           <w:tcPr>
             <w:tcW w:type="dxa" w:w="3324"/>
@@ -10020,9 +9610,6 @@
         </w:tc>
       </w:tr>
       <w:tr>
-        <w:trPr>
-          <w:cantSplit/>
-        </w:trPr>
         <w:tc>
           <w:tcPr>
             <w:tcW w:type="dxa" w:w="3324"/>
@@ -10096,9 +9683,6 @@
         </w:tc>
       </w:tr>
       <w:tr>
-        <w:trPr>
-          <w:cantSplit/>
-        </w:trPr>
         <w:tc>
           <w:tcPr>
             <w:tcW w:type="dxa" w:w="3324"/>
@@ -10180,9 +9764,6 @@
         </w:tc>
       </w:tr>
       <w:tr>
-        <w:trPr>
-          <w:cantSplit/>
-        </w:trPr>
         <w:tc>
           <w:tcPr>
             <w:tcW w:type="dxa" w:w="3324"/>
@@ -10256,9 +9837,6 @@
         </w:tc>
       </w:tr>
       <w:tr>
-        <w:trPr>
-          <w:cantSplit/>
-        </w:trPr>
         <w:tc>
           <w:tcPr>
             <w:tcW w:type="dxa" w:w="3324"/>
@@ -10366,6 +9944,1059 @@
       </w:tr>
     </w:tbl>
     <w:p/>
+    <w:p>
+      <w:pPr>
+        <w:pStyle w:val="Heading3"/>
+      </w:pPr>
+      <w:r>
+        <w:t>8.10 Decisions carried into a fresh database (the decisions pack)</w:t>
+      </w:r>
+    </w:p>
+    <w:p>
+      <w:pPr>
+        <w:spacing w:after="120"/>
+      </w:pPr>
+      <w:r>
+        <w:rPr>
+          <w:b/>
+          <w:i w:val="0"/>
+        </w:rPr>
+        <w:t>Why.</w:t>
+      </w:r>
+      <w:r>
+        <w:rPr>
+          <w:b w:val="0"/>
+          <w:i w:val="0"/>
+        </w:rPr>
+        <w:t xml:space="preserve"> The bootstrap rebuilds a database from files: the E-Banker packs, the take-on workbook, the trial balances and the models. It cannot rebuild what people decided in the system, because those decisions are in no file. By 15 October 2026 MAIIC's database held decisions of that kind: 277 fee lines reviewed under maker-checker, 113 EIRs locked by Edward, Finance's 2025 fee workbook and its integral-column re-import, the fee source precedence set to Finance first (proposal 68), the correction of loans 077 and 110 (6 fee lines moved, loan 110 reopened and both EIRs locked again), and the user accounts. A fresh bootstrap would lose all of them. The decisions pack carries them.</w:t>
+      </w:r>
+    </w:p>
+    <w:p>
+      <w:pPr>
+        <w:spacing w:after="120"/>
+      </w:pPr>
+      <w:r>
+        <w:rPr>
+          <w:b/>
+          <w:i w:val="0"/>
+        </w:rPr>
+        <w:t>What it is.</w:t>
+      </w:r>
+      <w:r>
+        <w:rPr>
+          <w:b w:val="0"/>
+          <w:i w:val="0"/>
+        </w:rPr>
+        <w:t xml:space="preserve"> A folder, </w:t>
+      </w:r>
+      <w:r>
+        <w:rPr>
+          <w:rFonts w:ascii="Consolas" w:hAnsi="Consolas"/>
+          <w:b w:val="0"/>
+          <w:i w:val="0"/>
+          <w:sz w:val="18"/>
+        </w:rPr>
+        <w:t>docs/bootstrap/decisions/&lt;date&gt;/</w:t>
+      </w:r>
+      <w:r>
+        <w:rPr>
+          <w:b w:val="0"/>
+          <w:i w:val="0"/>
+        </w:rPr>
+        <w:t>, committed beside the E-Banker packs. It holds one file per kind of decision, any source file a decision was made on (Finance's fee workbook), and a manifest with each file's SHA-256 and a tie-out of what the source database held. It is written by an export from one database and replayed into a fresh one by the bootstrap.</w:t>
+      </w:r>
+    </w:p>
+    <w:p>
+      <w:pPr>
+        <w:spacing w:after="120"/>
+      </w:pPr>
+      <w:r>
+        <w:rPr>
+          <w:b/>
+          <w:i w:val="0"/>
+        </w:rPr>
+        <w:t>Export.</w:t>
+      </w:r>
+      <w:r>
+        <w:rPr>
+          <w:b w:val="0"/>
+          <w:i w:val="0"/>
+        </w:rPr>
+        <w:t xml:space="preserve"> </w:t>
+      </w:r>
+      <w:r>
+        <w:rPr>
+          <w:rFonts w:ascii="Consolas" w:hAnsi="Consolas"/>
+          <w:b w:val="0"/>
+          <w:i w:val="0"/>
+          <w:sz w:val="18"/>
+        </w:rPr>
+        <w:t>decisions:export</w:t>
+      </w:r>
+      <w:r>
+        <w:rPr>
+          <w:b w:val="0"/>
+          <w:i w:val="0"/>
+        </w:rPr>
+        <w:t xml:space="preserve"> reads a database and writes the pack. It writes nothing to the database it reads. It is run on MAIIC's server by MAIIC ICT or Edward, never by Dupleix on MAIIC's database. Every row is named by its business key, never by a database id, because a fresh load numbers its rows differently:</w:t>
+      </w:r>
+    </w:p>
+    <w:tbl>
+      <w:tblPr>
+        <w:tblStyle w:val="TableGrid"/>
+        <w:tblW w:type="auto" w:w="0"/>
+        <w:tblLook w:firstColumn="1" w:firstRow="1" w:lastColumn="0" w:lastRow="0" w:noHBand="0" w:noVBand="1" w:val="04A0"/>
+      </w:tblPr>
+      <w:tblGrid>
+        <w:gridCol w:w="3324"/>
+        <w:gridCol w:w="3324"/>
+        <w:gridCol w:w="3324"/>
+      </w:tblGrid>
+      <w:tr>
+        <w:tc>
+          <w:tcPr>
+            <w:tcW w:type="dxa" w:w="3324"/>
+            <w:shd w:val="clear" w:color="auto" w:fill="1B2A41"/>
+          </w:tcPr>
+          <w:p>
+            <w:r>
+              <w:rPr>
+                <w:b/>
+                <w:color w:val="FFFFFF"/>
+                <w:sz w:val="17"/>
+              </w:rPr>
+            </w:r>
+            <w:r>
+              <w:rPr>
+                <w:b/>
+                <w:i w:val="0"/>
+                <w:color w:val="FFFFFF"/>
+                <w:sz w:val="17"/>
+              </w:rPr>
+              <w:t>Decision</w:t>
+            </w:r>
+          </w:p>
+        </w:tc>
+        <w:tc>
+          <w:tcPr>
+            <w:tcW w:type="dxa" w:w="3324"/>
+            <w:shd w:val="clear" w:color="auto" w:fill="1B2A41"/>
+          </w:tcPr>
+          <w:p>
+            <w:r>
+              <w:rPr>
+                <w:b/>
+                <w:color w:val="FFFFFF"/>
+                <w:sz w:val="17"/>
+              </w:rPr>
+            </w:r>
+            <w:r>
+              <w:rPr>
+                <w:b/>
+                <w:i w:val="0"/>
+                <w:color w:val="FFFFFF"/>
+                <w:sz w:val="17"/>
+              </w:rPr>
+              <w:t>Business key</w:t>
+            </w:r>
+          </w:p>
+        </w:tc>
+        <w:tc>
+          <w:tcPr>
+            <w:tcW w:type="dxa" w:w="3324"/>
+            <w:shd w:val="clear" w:color="auto" w:fill="1B2A41"/>
+          </w:tcPr>
+          <w:p>
+            <w:r>
+              <w:rPr>
+                <w:b/>
+                <w:color w:val="FFFFFF"/>
+                <w:sz w:val="17"/>
+              </w:rPr>
+            </w:r>
+            <w:r>
+              <w:rPr>
+                <w:b/>
+                <w:i w:val="0"/>
+                <w:color w:val="FFFFFF"/>
+                <w:sz w:val="17"/>
+              </w:rPr>
+              <w:t>What is carried</w:t>
+            </w:r>
+          </w:p>
+        </w:tc>
+      </w:tr>
+      <w:tr>
+        <w:tc>
+          <w:tcPr>
+            <w:tcW w:type="dxa" w:w="3324"/>
+          </w:tcPr>
+          <w:p>
+            <w:r>
+              <w:rPr>
+                <w:b w:val="0"/>
+                <w:sz w:val="17"/>
+              </w:rPr>
+            </w:r>
+            <w:r>
+              <w:rPr>
+                <w:b w:val="0"/>
+                <w:i w:val="0"/>
+                <w:sz w:val="17"/>
+              </w:rPr>
+              <w:t>Fee line classified and reviewed</w:t>
+            </w:r>
+          </w:p>
+        </w:tc>
+        <w:tc>
+          <w:tcPr>
+            <w:tcW w:type="dxa" w:w="3324"/>
+          </w:tcPr>
+          <w:p>
+            <w:r>
+              <w:rPr>
+                <w:b w:val="0"/>
+                <w:sz w:val="17"/>
+              </w:rPr>
+            </w:r>
+            <w:r>
+              <w:rPr>
+                <w:b w:val="0"/>
+                <w:i w:val="0"/>
+                <w:sz w:val="17"/>
+              </w:rPr>
+              <w:t>The line's source system and source transaction id; for a Finance workbook line without them, loan, fee type, amount, date and description</w:t>
+            </w:r>
+          </w:p>
+        </w:tc>
+        <w:tc>
+          <w:tcPr>
+            <w:tcW w:type="dxa" w:w="3324"/>
+          </w:tcPr>
+          <w:p>
+            <w:r>
+              <w:rPr>
+                <w:b w:val="0"/>
+                <w:sz w:val="17"/>
+              </w:rPr>
+            </w:r>
+            <w:r>
+              <w:rPr>
+                <w:b w:val="0"/>
+                <w:i w:val="0"/>
+                <w:sz w:val="17"/>
+              </w:rPr>
+              <w:t>Integral or not, the cash-flow direction, the reason, the rule applied, who classified it and when, who reviewed it and when</w:t>
+            </w:r>
+          </w:p>
+        </w:tc>
+      </w:tr>
+      <w:tr>
+        <w:tc>
+          <w:tcPr>
+            <w:tcW w:type="dxa" w:w="3324"/>
+          </w:tcPr>
+          <w:p>
+            <w:r>
+              <w:rPr>
+                <w:b w:val="0"/>
+                <w:sz w:val="17"/>
+              </w:rPr>
+            </w:r>
+            <w:r>
+              <w:rPr>
+                <w:b w:val="0"/>
+                <w:i w:val="0"/>
+                <w:sz w:val="17"/>
+              </w:rPr>
+              <w:t>Fee line moved to another loan</w:t>
+            </w:r>
+          </w:p>
+        </w:tc>
+        <w:tc>
+          <w:tcPr>
+            <w:tcW w:type="dxa" w:w="3324"/>
+          </w:tcPr>
+          <w:p>
+            <w:r>
+              <w:rPr>
+                <w:b w:val="0"/>
+                <w:sz w:val="17"/>
+              </w:rPr>
+            </w:r>
+            <w:r>
+              <w:rPr>
+                <w:b w:val="0"/>
+                <w:i w:val="0"/>
+                <w:sz w:val="17"/>
+              </w:rPr>
+              <w:t>The line's key and its original loan and date</w:t>
+            </w:r>
+          </w:p>
+        </w:tc>
+        <w:tc>
+          <w:tcPr>
+            <w:tcW w:type="dxa" w:w="3324"/>
+          </w:tcPr>
+          <w:p>
+            <w:r>
+              <w:rPr>
+                <w:b w:val="0"/>
+                <w:sz w:val="17"/>
+              </w:rPr>
+            </w:r>
+            <w:r>
+              <w:rPr>
+                <w:b w:val="0"/>
+                <w:i w:val="0"/>
+                <w:sz w:val="17"/>
+              </w:rPr>
+              <w:t>The new loan, the new date, the reason, who moved it and when</w:t>
+            </w:r>
+          </w:p>
+        </w:tc>
+      </w:tr>
+      <w:tr>
+        <w:tc>
+          <w:tcPr>
+            <w:tcW w:type="dxa" w:w="3324"/>
+          </w:tcPr>
+          <w:p>
+            <w:r>
+              <w:rPr>
+                <w:b w:val="0"/>
+                <w:sz w:val="17"/>
+              </w:rPr>
+            </w:r>
+            <w:r>
+              <w:rPr>
+                <w:b w:val="0"/>
+                <w:i w:val="0"/>
+                <w:sz w:val="17"/>
+              </w:rPr>
+              <w:t>Overlapping fee lines kept separate or treated as one</w:t>
+            </w:r>
+          </w:p>
+        </w:tc>
+        <w:tc>
+          <w:tcPr>
+            <w:tcW w:type="dxa" w:w="3324"/>
+          </w:tcPr>
+          <w:p>
+            <w:r>
+              <w:rPr>
+                <w:b w:val="0"/>
+                <w:sz w:val="17"/>
+              </w:rPr>
+            </w:r>
+            <w:r>
+              <w:rPr>
+                <w:b w:val="0"/>
+                <w:i w:val="0"/>
+                <w:sz w:val="17"/>
+              </w:rPr>
+              <w:t>Both lines' keys</w:t>
+            </w:r>
+          </w:p>
+        </w:tc>
+        <w:tc>
+          <w:tcPr>
+            <w:tcW w:type="dxa" w:w="3324"/>
+          </w:tcPr>
+          <w:p>
+            <w:r>
+              <w:rPr>
+                <w:b w:val="0"/>
+                <w:sz w:val="17"/>
+              </w:rPr>
+            </w:r>
+            <w:r>
+              <w:rPr>
+                <w:b w:val="0"/>
+                <w:i w:val="0"/>
+                <w:sz w:val="17"/>
+              </w:rPr>
+              <w:t>The decision, the reason, who decided</w:t>
+            </w:r>
+          </w:p>
+        </w:tc>
+      </w:tr>
+      <w:tr>
+        <w:tc>
+          <w:tcPr>
+            <w:tcW w:type="dxa" w:w="3324"/>
+          </w:tcPr>
+          <w:p>
+            <w:r>
+              <w:rPr>
+                <w:b w:val="0"/>
+                <w:sz w:val="17"/>
+              </w:rPr>
+            </w:r>
+            <w:r>
+              <w:rPr>
+                <w:b w:val="0"/>
+                <w:i w:val="0"/>
+                <w:sz w:val="17"/>
+              </w:rPr>
+              <w:t>Held GL fee tied to a loan, or dismissed</w:t>
+            </w:r>
+          </w:p>
+        </w:tc>
+        <w:tc>
+          <w:tcPr>
+            <w:tcW w:type="dxa" w:w="3324"/>
+          </w:tcPr>
+          <w:p>
+            <w:r>
+              <w:rPr>
+                <w:b w:val="0"/>
+                <w:sz w:val="17"/>
+              </w:rPr>
+            </w:r>
+            <w:r>
+              <w:rPr>
+                <w:b w:val="0"/>
+                <w:i w:val="0"/>
+                <w:sz w:val="17"/>
+              </w:rPr>
+              <w:t>The GL posting's voucher and the loan</w:t>
+            </w:r>
+          </w:p>
+        </w:tc>
+        <w:tc>
+          <w:tcPr>
+            <w:tcW w:type="dxa" w:w="3324"/>
+          </w:tcPr>
+          <w:p>
+            <w:r>
+              <w:rPr>
+                <w:b w:val="0"/>
+                <w:sz w:val="17"/>
+              </w:rPr>
+            </w:r>
+            <w:r>
+              <w:rPr>
+                <w:b w:val="0"/>
+                <w:i w:val="0"/>
+                <w:sz w:val="17"/>
+              </w:rPr>
+              <w:t>Who tied or dismissed it, the reason</w:t>
+            </w:r>
+          </w:p>
+        </w:tc>
+      </w:tr>
+      <w:tr>
+        <w:tc>
+          <w:tcPr>
+            <w:tcW w:type="dxa" w:w="3324"/>
+          </w:tcPr>
+          <w:p>
+            <w:r>
+              <w:rPr>
+                <w:b w:val="0"/>
+                <w:sz w:val="17"/>
+              </w:rPr>
+            </w:r>
+            <w:r>
+              <w:rPr>
+                <w:b w:val="0"/>
+                <w:i w:val="0"/>
+                <w:sz w:val="17"/>
+              </w:rPr>
+              <w:t>Finance fee workbook loaded</w:t>
+            </w:r>
+          </w:p>
+        </w:tc>
+        <w:tc>
+          <w:tcPr>
+            <w:tcW w:type="dxa" w:w="3324"/>
+          </w:tcPr>
+          <w:p>
+            <w:r>
+              <w:rPr>
+                <w:b w:val="0"/>
+                <w:sz w:val="17"/>
+              </w:rPr>
+            </w:r>
+            <w:r>
+              <w:rPr>
+                <w:b w:val="0"/>
+                <w:i w:val="0"/>
+                <w:sz w:val="17"/>
+              </w:rPr>
+              <w:t>The workbook file itself and its SHA-256</w:t>
+            </w:r>
+          </w:p>
+        </w:tc>
+        <w:tc>
+          <w:tcPr>
+            <w:tcW w:type="dxa" w:w="3324"/>
+          </w:tcPr>
+          <w:p>
+            <w:r>
+              <w:rPr>
+                <w:b w:val="0"/>
+                <w:sz w:val="17"/>
+              </w:rPr>
+            </w:r>
+            <w:r>
+              <w:rPr>
+                <w:b w:val="0"/>
+                <w:i w:val="0"/>
+                <w:sz w:val="17"/>
+              </w:rPr>
+              <w:t>Who loaded it, when, and the months it covers</w:t>
+            </w:r>
+          </w:p>
+        </w:tc>
+      </w:tr>
+      <w:tr>
+        <w:tc>
+          <w:tcPr>
+            <w:tcW w:type="dxa" w:w="3324"/>
+          </w:tcPr>
+          <w:p>
+            <w:r>
+              <w:rPr>
+                <w:b w:val="0"/>
+                <w:sz w:val="17"/>
+              </w:rPr>
+            </w:r>
+            <w:r>
+              <w:rPr>
+                <w:b w:val="0"/>
+                <w:i w:val="0"/>
+                <w:sz w:val="17"/>
+              </w:rPr>
+              <w:t>Governance setting approved by people</w:t>
+            </w:r>
+          </w:p>
+        </w:tc>
+        <w:tc>
+          <w:tcPr>
+            <w:tcW w:type="dxa" w:w="3324"/>
+          </w:tcPr>
+          <w:p>
+            <w:r>
+              <w:rPr>
+                <w:b w:val="0"/>
+                <w:sz w:val="17"/>
+              </w:rPr>
+            </w:r>
+            <w:r>
+              <w:rPr>
+                <w:b w:val="0"/>
+                <w:i w:val="0"/>
+                <w:sz w:val="17"/>
+              </w:rPr>
+              <w:t>Key, value and effective date</w:t>
+            </w:r>
+          </w:p>
+        </w:tc>
+        <w:tc>
+          <w:tcPr>
+            <w:tcW w:type="dxa" w:w="3324"/>
+          </w:tcPr>
+          <w:p>
+            <w:r>
+              <w:rPr>
+                <w:b w:val="0"/>
+                <w:sz w:val="17"/>
+              </w:rPr>
+            </w:r>
+            <w:r>
+              <w:rPr>
+                <w:b w:val="0"/>
+                <w:i w:val="0"/>
+                <w:sz w:val="17"/>
+              </w:rPr>
+              <w:t>Who proposed it, who approved it, when, and the reason</w:t>
+            </w:r>
+          </w:p>
+        </w:tc>
+      </w:tr>
+      <w:tr>
+        <w:tc>
+          <w:tcPr>
+            <w:tcW w:type="dxa" w:w="3324"/>
+          </w:tcPr>
+          <w:p>
+            <w:r>
+              <w:rPr>
+                <w:b w:val="0"/>
+                <w:sz w:val="17"/>
+              </w:rPr>
+            </w:r>
+            <w:r>
+              <w:rPr>
+                <w:b w:val="0"/>
+                <w:i w:val="0"/>
+                <w:sz w:val="17"/>
+              </w:rPr>
+              <w:t>Fee rule approved by people</w:t>
+            </w:r>
+          </w:p>
+        </w:tc>
+        <w:tc>
+          <w:tcPr>
+            <w:tcW w:type="dxa" w:w="3324"/>
+          </w:tcPr>
+          <w:p>
+            <w:r>
+              <w:rPr>
+                <w:b w:val="0"/>
+                <w:sz w:val="17"/>
+              </w:rPr>
+            </w:r>
+            <w:r>
+              <w:rPr>
+                <w:b w:val="0"/>
+                <w:i w:val="0"/>
+                <w:sz w:val="17"/>
+              </w:rPr>
+              <w:t>The rule's name and wording</w:t>
+            </w:r>
+          </w:p>
+        </w:tc>
+        <w:tc>
+          <w:tcPr>
+            <w:tcW w:type="dxa" w:w="3324"/>
+          </w:tcPr>
+          <w:p>
+            <w:r>
+              <w:rPr>
+                <w:b w:val="0"/>
+                <w:sz w:val="17"/>
+              </w:rPr>
+            </w:r>
+            <w:r>
+              <w:rPr>
+                <w:b w:val="0"/>
+                <w:i w:val="0"/>
+                <w:sz w:val="17"/>
+              </w:rPr>
+              <w:t>Who wrote it, who approved it, the reason</w:t>
+            </w:r>
+          </w:p>
+        </w:tc>
+      </w:tr>
+      <w:tr>
+        <w:tc>
+          <w:tcPr>
+            <w:tcW w:type="dxa" w:w="3324"/>
+          </w:tcPr>
+          <w:p>
+            <w:r>
+              <w:rPr>
+                <w:b w:val="0"/>
+                <w:sz w:val="17"/>
+              </w:rPr>
+            </w:r>
+            <w:r>
+              <w:rPr>
+                <w:b w:val="0"/>
+                <w:i w:val="0"/>
+                <w:sz w:val="17"/>
+              </w:rPr>
+              <w:t>EIR locked by a person</w:t>
+            </w:r>
+          </w:p>
+        </w:tc>
+        <w:tc>
+          <w:tcPr>
+            <w:tcW w:type="dxa" w:w="3324"/>
+          </w:tcPr>
+          <w:p>
+            <w:r>
+              <w:rPr>
+                <w:b w:val="0"/>
+                <w:sz w:val="17"/>
+              </w:rPr>
+            </w:r>
+            <w:r>
+              <w:rPr>
+                <w:b w:val="0"/>
+                <w:i w:val="0"/>
+                <w:sz w:val="17"/>
+              </w:rPr>
+              <w:t>The loan</w:t>
+            </w:r>
+          </w:p>
+        </w:tc>
+        <w:tc>
+          <w:tcPr>
+            <w:tcW w:type="dxa" w:w="3324"/>
+          </w:tcPr>
+          <w:p>
+            <w:r>
+              <w:rPr>
+                <w:b w:val="0"/>
+                <w:sz w:val="17"/>
+              </w:rPr>
+            </w:r>
+            <w:r>
+              <w:rPr>
+                <w:b w:val="0"/>
+                <w:i w:val="0"/>
+                <w:sz w:val="17"/>
+              </w:rPr>
+              <w:t>Who calculated it, who locked it, when, the locked rate and a fingerprint of the cash flows it was solved on</w:t>
+            </w:r>
+          </w:p>
+        </w:tc>
+      </w:tr>
+      <w:tr>
+        <w:tc>
+          <w:tcPr>
+            <w:tcW w:type="dxa" w:w="3324"/>
+          </w:tcPr>
+          <w:p>
+            <w:r>
+              <w:rPr>
+                <w:b w:val="0"/>
+                <w:sz w:val="17"/>
+              </w:rPr>
+            </w:r>
+            <w:r>
+              <w:rPr>
+                <w:b w:val="0"/>
+                <w:i w:val="0"/>
+                <w:sz w:val="17"/>
+              </w:rPr>
+              <w:t>EIR reopen request</w:t>
+            </w:r>
+          </w:p>
+        </w:tc>
+        <w:tc>
+          <w:tcPr>
+            <w:tcW w:type="dxa" w:w="3324"/>
+          </w:tcPr>
+          <w:p>
+            <w:r>
+              <w:rPr>
+                <w:b w:val="0"/>
+                <w:sz w:val="17"/>
+              </w:rPr>
+            </w:r>
+            <w:r>
+              <w:rPr>
+                <w:b w:val="0"/>
+                <w:i w:val="0"/>
+                <w:sz w:val="17"/>
+              </w:rPr>
+              <w:t>The loan and the request date</w:t>
+            </w:r>
+          </w:p>
+        </w:tc>
+        <w:tc>
+          <w:tcPr>
+            <w:tcW w:type="dxa" w:w="3324"/>
+          </w:tcPr>
+          <w:p>
+            <w:r>
+              <w:rPr>
+                <w:b w:val="0"/>
+                <w:sz w:val="17"/>
+              </w:rPr>
+            </w:r>
+            <w:r>
+              <w:rPr>
+                <w:b w:val="0"/>
+                <w:i w:val="0"/>
+                <w:sz w:val="17"/>
+              </w:rPr>
+              <w:t>The request and its decision, carried as history</w:t>
+            </w:r>
+          </w:p>
+        </w:tc>
+      </w:tr>
+      <w:tr>
+        <w:tc>
+          <w:tcPr>
+            <w:tcW w:type="dxa" w:w="3324"/>
+          </w:tcPr>
+          <w:p>
+            <w:r>
+              <w:rPr>
+                <w:b w:val="0"/>
+                <w:sz w:val="17"/>
+              </w:rPr>
+            </w:r>
+            <w:r>
+              <w:rPr>
+                <w:b w:val="0"/>
+                <w:i w:val="0"/>
+                <w:sz w:val="17"/>
+              </w:rPr>
+              <w:t>User</w:t>
+            </w:r>
+          </w:p>
+        </w:tc>
+        <w:tc>
+          <w:tcPr>
+            <w:tcW w:type="dxa" w:w="3324"/>
+          </w:tcPr>
+          <w:p>
+            <w:r>
+              <w:rPr>
+                <w:b w:val="0"/>
+                <w:sz w:val="17"/>
+              </w:rPr>
+            </w:r>
+            <w:r>
+              <w:rPr>
+                <w:b w:val="0"/>
+                <w:i w:val="0"/>
+                <w:sz w:val="17"/>
+              </w:rPr>
+              <w:t>E-mail</w:t>
+            </w:r>
+          </w:p>
+        </w:tc>
+        <w:tc>
+          <w:tcPr>
+            <w:tcW w:type="dxa" w:w="3324"/>
+          </w:tcPr>
+          <w:p>
+            <w:r>
+              <w:rPr>
+                <w:b w:val="0"/>
+                <w:sz w:val="17"/>
+              </w:rPr>
+            </w:r>
+            <w:r>
+              <w:rPr>
+                <w:b w:val="0"/>
+                <w:i w:val="0"/>
+                <w:sz w:val="17"/>
+              </w:rPr>
+              <w:t>Name, roles and direct permissions; never the password or the two-factor secret</w:t>
+            </w:r>
+          </w:p>
+        </w:tc>
+      </w:tr>
+    </w:tbl>
+    <w:p/>
+    <w:p>
+      <w:pPr>
+        <w:spacing w:after="120"/>
+      </w:pPr>
+      <w:r>
+        <w:rPr>
+          <w:b w:val="0"/>
+          <w:i w:val="0"/>
+        </w:rPr>
+        <w:t>Every person is carried by e-mail and matched to the user of the same e-mail in the fresh database.</w:t>
+      </w:r>
+    </w:p>
+    <w:p>
+      <w:pPr>
+        <w:spacing w:after="120"/>
+      </w:pPr>
+      <w:r>
+        <w:rPr>
+          <w:b/>
+          <w:i w:val="0"/>
+        </w:rPr>
+        <w:t>Replay.</w:t>
+      </w:r>
+      <w:r>
+        <w:rPr>
+          <w:b w:val="0"/>
+          <w:i w:val="0"/>
+        </w:rPr>
+        <w:t xml:space="preserve"> </w:t>
+      </w:r>
+      <w:r>
+        <w:rPr>
+          <w:rFonts w:ascii="Consolas" w:hAnsi="Consolas"/>
+          <w:b w:val="0"/>
+          <w:i w:val="0"/>
+          <w:sz w:val="18"/>
+        </w:rPr>
+        <w:t>eir:bootstrap --with-decisions=&lt;date&gt;</w:t>
+      </w:r>
+      <w:r>
+        <w:rPr>
+          <w:b w:val="0"/>
+          <w:i w:val="0"/>
+        </w:rPr>
+        <w:t xml:space="preserve"> replays the pack in two places:</w:t>
+      </w:r>
+    </w:p>
+    <w:p>
+      <w:pPr>
+        <w:pStyle w:val="ListNumber"/>
+      </w:pPr>
+      <w:r>
+        <w:rPr>
+          <w:b/>
+          <w:i w:val="0"/>
+        </w:rPr>
+        <w:t>After the fee build, before the schedules are approved:</w:t>
+      </w:r>
+      <w:r>
+        <w:rPr>
+          <w:b w:val="0"/>
+          <w:i w:val="0"/>
+        </w:rPr>
+        <w:t xml:space="preserve"> the users; the governance settings; the fee rules; Finance's workbook, loaded through the normal import with its tie-out; the overlap decisions, held-fee ties and dismissals; the fee moves; then the classifications and reviews. The fee source precedence is then applied once to the result.</w:t>
+      </w:r>
+    </w:p>
+    <w:p>
+      <w:pPr>
+        <w:pStyle w:val="ListNumber"/>
+      </w:pPr>
+      <w:r>
+        <w:rPr>
+          <w:b/>
+          <w:i w:val="0"/>
+        </w:rPr>
+        <w:t>In place of the bootstrap's own lock, for the loans the pack names:</w:t>
+      </w:r>
+      <w:r>
+        <w:rPr>
+          <w:b w:val="0"/>
+          <w:i w:val="0"/>
+        </w:rPr>
+        <w:t xml:space="preserve"> the EIR is calculated and locked under the person who locked it in the source database, but only if the rate and the cash-flow fingerprint come out the same. Every other loan is locked under the System Bootstrap label as today.</w:t>
+      </w:r>
+    </w:p>
+    <w:p>
+      <w:pPr>
+        <w:spacing w:after="120"/>
+      </w:pPr>
+      <w:r>
+        <w:rPr>
+          <w:b w:val="0"/>
+          <w:i w:val="0"/>
+        </w:rPr>
+        <w:t>A reopen request is not executed again. In the source database it reopened an EIR so that fee lines could be moved. In the replay the lines are moved before any EIR is locked, so the request is carried as history on the loan.</w:t>
+      </w:r>
+    </w:p>
+    <w:p>
+      <w:pPr>
+        <w:spacing w:after="120"/>
+      </w:pPr>
+      <w:r>
+        <w:rPr>
+          <w:b/>
+          <w:i w:val="0"/>
+        </w:rPr>
+        <w:t>Labelled as carried, never as new.</w:t>
+      </w:r>
+      <w:r>
+        <w:rPr>
+          <w:b w:val="0"/>
+          <w:i w:val="0"/>
+        </w:rPr>
+        <w:t xml:space="preserve"> Each replayed decision keeps its original person and date on the record. Each writes one audit entry, </w:t>
+      </w:r>
+      <w:r>
+        <w:rPr>
+          <w:b w:val="0"/>
+          <w:i/>
+        </w:rPr>
+        <w:t>"Carried from &lt;database&gt; by the decisions pack of &lt;date&gt;"</w:t>
+      </w:r>
+      <w:r>
+        <w:rPr>
+          <w:b w:val="0"/>
+          <w:i w:val="0"/>
+        </w:rPr>
+        <w:t>, naming the original person and date. It never carries the System Bootstrap label, because it was a person's decision and not an automated one. A decision the source database recorded as a UAT self-approval is carried with that label, and section 8.9 item 7 still applies to it.</w:t>
+      </w:r>
+    </w:p>
+    <w:p>
+      <w:pPr>
+        <w:spacing w:after="120"/>
+      </w:pPr>
+      <w:r>
+        <w:rPr>
+          <w:b/>
+          <w:i w:val="0"/>
+        </w:rPr>
+        <w:t>What does not match is listed, never forced.</w:t>
+      </w:r>
+      <w:r>
+        <w:rPr>
+          <w:b w:val="0"/>
+          <w:i w:val="0"/>
+        </w:rPr>
+        <w:t xml:space="preserve"> A decision whose row is not found in the fresh database, or whose row differs, is not applied and goes on the replay report with the reason. For example: a fee line the new code builds differently, a workbook whose tie-out fails, or an EIR whose rate or cash flows differ. The line stays pending, or the EIR stays calculated and unlocked, for a person to decide again. The report is written to the bootstrap output and to </w:t>
+      </w:r>
+      <w:r>
+        <w:rPr>
+          <w:rFonts w:ascii="Consolas" w:hAnsi="Consolas"/>
+          <w:b w:val="0"/>
+          <w:i w:val="0"/>
+          <w:sz w:val="18"/>
+        </w:rPr>
+        <w:t>storage/app/decisions/replay-&lt;date&gt;.csv</w:t>
+      </w:r>
+      <w:r>
+        <w:rPr>
+          <w:b w:val="0"/>
+          <w:i w:val="0"/>
+        </w:rPr>
+        <w:t>.</w:t>
+      </w:r>
+    </w:p>
+    <w:p>
+      <w:pPr>
+        <w:spacing w:after="120"/>
+      </w:pPr>
+      <w:r>
+        <w:rPr>
+          <w:b/>
+          <w:i w:val="0"/>
+        </w:rPr>
+        <w:t>Not carried, because the engines recompute them:</w:t>
+      </w:r>
+      <w:r>
+        <w:rPr>
+          <w:b w:val="0"/>
+          <w:i w:val="0"/>
+        </w:rPr>
+        <w:t xml:space="preserve"> the stages, the Stage 3 history, the ECL, the revenue, the amortisation and every other figure derived from the data and the decisions.</w:t>
+      </w:r>
+    </w:p>
+    <w:p>
+      <w:pPr>
+        <w:spacing w:after="120"/>
+      </w:pPr>
+      <w:r>
+        <w:rPr>
+          <w:b/>
+          <w:i w:val="0"/>
+        </w:rPr>
+        <w:t>The checks.</w:t>
+      </w:r>
+      <w:r>
+        <w:rPr>
+          <w:b w:val="0"/>
+          <w:i w:val="0"/>
+        </w:rPr>
+        <w:t xml:space="preserve"> The bootstrap without </w:t>
+      </w:r>
+      <w:r>
+        <w:rPr>
+          <w:rFonts w:ascii="Consolas" w:hAnsi="Consolas"/>
+          <w:b w:val="0"/>
+          <w:i w:val="0"/>
+          <w:sz w:val="18"/>
+        </w:rPr>
+        <w:t>--with-decisions</w:t>
+      </w:r>
+      <w:r>
+        <w:rPr>
+          <w:b w:val="0"/>
+          <w:i w:val="0"/>
+        </w:rPr>
+        <w:t xml:space="preserve"> is unchanged, and its verify checks and golden values stay as they are. A bootstrap with a pack ends with a tie-out against the pack's manifest: reviewed fee lines, locked EIRs, each locked rate, the governance settings and the users. Each must equal the source database, or be named on the replay report. The verify checks of a bootstrap with a pack are recorded beside the golden values as a second set, since people's decisions move the EIR and the figures that follow it.</w:t>
+      </w:r>
+    </w:p>
     <w:p>
       <w:pPr>
         <w:pStyle w:val="Heading2"/>
@@ -10387,10 +11018,6 @@
         <w:gridCol w:w="2493"/>
       </w:tblGrid>
       <w:tr>
-        <w:trPr>
-          <w:cantSplit/>
-          <w:tblHeader/>
-        </w:trPr>
         <w:tc>
           <w:tcPr>
             <w:tcW w:type="dxa" w:w="2493"/>
@@ -10489,9 +11116,6 @@
         </w:tc>
       </w:tr>
       <w:tr>
-        <w:trPr>
-          <w:cantSplit/>
-        </w:trPr>
         <w:tc>
           <w:tcPr>
             <w:tcW w:type="dxa" w:w="2493"/>
@@ -10578,9 +11202,6 @@
         </w:tc>
       </w:tr>
       <w:tr>
-        <w:trPr>
-          <w:cantSplit/>
-        </w:trPr>
         <w:tc>
           <w:tcPr>
             <w:tcW w:type="dxa" w:w="2493"/>
@@ -10667,9 +11288,6 @@
         </w:tc>
       </w:tr>
       <w:tr>
-        <w:trPr>
-          <w:cantSplit/>
-        </w:trPr>
         <w:tc>
           <w:tcPr>
             <w:tcW w:type="dxa" w:w="2493"/>
@@ -10756,9 +11374,6 @@
         </w:tc>
       </w:tr>
       <w:tr>
-        <w:trPr>
-          <w:cantSplit/>
-        </w:trPr>
         <w:tc>
           <w:tcPr>
             <w:tcW w:type="dxa" w:w="2493"/>
@@ -10845,9 +11460,6 @@
         </w:tc>
       </w:tr>
       <w:tr>
-        <w:trPr>
-          <w:cantSplit/>
-        </w:trPr>
         <w:tc>
           <w:tcPr>
             <w:tcW w:type="dxa" w:w="2493"/>
@@ -10934,9 +11546,6 @@
         </w:tc>
       </w:tr>
       <w:tr>
-        <w:trPr>
-          <w:cantSplit/>
-        </w:trPr>
         <w:tc>
           <w:tcPr>
             <w:tcW w:type="dxa" w:w="2493"/>
@@ -11023,9 +11632,6 @@
         </w:tc>
       </w:tr>
       <w:tr>
-        <w:trPr>
-          <w:cantSplit/>
-        </w:trPr>
         <w:tc>
           <w:tcPr>
             <w:tcW w:type="dxa" w:w="2493"/>
@@ -11112,9 +11718,6 @@
         </w:tc>
       </w:tr>
       <w:tr>
-        <w:trPr>
-          <w:cantSplit/>
-        </w:trPr>
         <w:tc>
           <w:tcPr>
             <w:tcW w:type="dxa" w:w="2493"/>
@@ -11201,9 +11804,6 @@
         </w:tc>
       </w:tr>
       <w:tr>
-        <w:trPr>
-          <w:cantSplit/>
-        </w:trPr>
         <w:tc>
           <w:tcPr>
             <w:tcW w:type="dxa" w:w="2493"/>
@@ -11290,9 +11890,6 @@
         </w:tc>
       </w:tr>
       <w:tr>
-        <w:trPr>
-          <w:cantSplit/>
-        </w:trPr>
         <w:tc>
           <w:tcPr>
             <w:tcW w:type="dxa" w:w="2493"/>
@@ -11379,9 +11976,6 @@
         </w:tc>
       </w:tr>
       <w:tr>
-        <w:trPr>
-          <w:cantSplit/>
-        </w:trPr>
         <w:tc>
           <w:tcPr>
             <w:tcW w:type="dxa" w:w="2493"/>
@@ -11497,6 +12091,264 @@
                 <w:sz w:val="17"/>
               </w:rPr>
               <w:t xml:space="preserve"> from handover; the handover sign-off records the switch-off, approved by a second person</w:t>
+            </w:r>
+          </w:p>
+        </w:tc>
+      </w:tr>
+      <w:tr>
+        <w:tc>
+          <w:tcPr>
+            <w:tcW w:type="dxa" w:w="2493"/>
+          </w:tcPr>
+          <w:p>
+            <w:r>
+              <w:rPr>
+                <w:b w:val="0"/>
+                <w:sz w:val="17"/>
+              </w:rPr>
+            </w:r>
+            <w:r>
+              <w:rPr>
+                <w:b w:val="0"/>
+                <w:i w:val="0"/>
+                <w:sz w:val="17"/>
+              </w:rPr>
+              <w:t>S12</w:t>
+            </w:r>
+          </w:p>
+        </w:tc>
+        <w:tc>
+          <w:tcPr>
+            <w:tcW w:type="dxa" w:w="2493"/>
+          </w:tcPr>
+          <w:p>
+            <w:r>
+              <w:rPr>
+                <w:b w:val="0"/>
+                <w:sz w:val="17"/>
+              </w:rPr>
+            </w:r>
+            <w:r>
+              <w:rPr>
+                <w:b w:val="0"/>
+                <w:i w:val="0"/>
+                <w:sz w:val="17"/>
+              </w:rPr>
+              <w:t>Where the decisions pack is kept</w:t>
+            </w:r>
+          </w:p>
+        </w:tc>
+        <w:tc>
+          <w:tcPr>
+            <w:tcW w:type="dxa" w:w="2493"/>
+          </w:tcPr>
+          <w:p>
+            <w:r>
+              <w:rPr>
+                <w:b w:val="0"/>
+                <w:sz w:val="17"/>
+              </w:rPr>
+            </w:r>
+            <w:r>
+              <w:rPr>
+                <w:b w:val="0"/>
+                <w:i w:val="0"/>
+                <w:sz w:val="17"/>
+              </w:rPr>
+              <w:t>MAIIC ICT, with Edward</w:t>
+            </w:r>
+          </w:p>
+        </w:tc>
+        <w:tc>
+          <w:tcPr>
+            <w:tcW w:type="dxa" w:w="2493"/>
+          </w:tcPr>
+          <w:p>
+            <w:r>
+              <w:rPr>
+                <w:b w:val="0"/>
+                <w:sz w:val="17"/>
+              </w:rPr>
+            </w:r>
+            <w:r>
+              <w:rPr>
+                <w:b w:val="0"/>
+                <w:i w:val="0"/>
+                <w:sz w:val="17"/>
+              </w:rPr>
+              <w:t>In the project repository beside the E-Banker packs, which already hold MAIIC's data; never with passwords or two-factor secrets</w:t>
+            </w:r>
+          </w:p>
+        </w:tc>
+      </w:tr>
+      <w:tr>
+        <w:tc>
+          <w:tcPr>
+            <w:tcW w:type="dxa" w:w="2493"/>
+          </w:tcPr>
+          <w:p>
+            <w:r>
+              <w:rPr>
+                <w:b w:val="0"/>
+                <w:sz w:val="17"/>
+              </w:rPr>
+            </w:r>
+            <w:r>
+              <w:rPr>
+                <w:b w:val="0"/>
+                <w:i w:val="0"/>
+                <w:sz w:val="17"/>
+              </w:rPr>
+              <w:t>S13</w:t>
+            </w:r>
+          </w:p>
+        </w:tc>
+        <w:tc>
+          <w:tcPr>
+            <w:tcW w:type="dxa" w:w="2493"/>
+          </w:tcPr>
+          <w:p>
+            <w:r>
+              <w:rPr>
+                <w:b w:val="0"/>
+                <w:sz w:val="17"/>
+              </w:rPr>
+            </w:r>
+            <w:r>
+              <w:rPr>
+                <w:b w:val="0"/>
+                <w:i w:val="0"/>
+                <w:sz w:val="17"/>
+              </w:rPr>
+              <w:t>How carried users sign in for the first time</w:t>
+            </w:r>
+          </w:p>
+        </w:tc>
+        <w:tc>
+          <w:tcPr>
+            <w:tcW w:type="dxa" w:w="2493"/>
+          </w:tcPr>
+          <w:p>
+            <w:r>
+              <w:rPr>
+                <w:b w:val="0"/>
+                <w:sz w:val="17"/>
+              </w:rPr>
+            </w:r>
+            <w:r>
+              <w:rPr>
+                <w:b w:val="0"/>
+                <w:i w:val="0"/>
+                <w:sz w:val="17"/>
+              </w:rPr>
+              <w:t>MAIIC ICT</w:t>
+            </w:r>
+          </w:p>
+        </w:tc>
+        <w:tc>
+          <w:tcPr>
+            <w:tcW w:type="dxa" w:w="2493"/>
+          </w:tcPr>
+          <w:p>
+            <w:r>
+              <w:rPr>
+                <w:b w:val="0"/>
+                <w:sz w:val="17"/>
+              </w:rPr>
+            </w:r>
+            <w:r>
+              <w:rPr>
+                <w:b w:val="0"/>
+                <w:i w:val="0"/>
+                <w:sz w:val="17"/>
+              </w:rPr>
+              <w:t>Each sets a new password through the reset link; no password is carried</w:t>
+            </w:r>
+          </w:p>
+        </w:tc>
+      </w:tr>
+      <w:tr>
+        <w:tc>
+          <w:tcPr>
+            <w:tcW w:type="dxa" w:w="2493"/>
+          </w:tcPr>
+          <w:p>
+            <w:r>
+              <w:rPr>
+                <w:b w:val="0"/>
+                <w:sz w:val="17"/>
+              </w:rPr>
+            </w:r>
+            <w:r>
+              <w:rPr>
+                <w:b w:val="0"/>
+                <w:i w:val="0"/>
+                <w:sz w:val="17"/>
+              </w:rPr>
+              <w:t>S14</w:t>
+            </w:r>
+          </w:p>
+        </w:tc>
+        <w:tc>
+          <w:tcPr>
+            <w:tcW w:type="dxa" w:w="2493"/>
+          </w:tcPr>
+          <w:p>
+            <w:r>
+              <w:rPr>
+                <w:b w:val="0"/>
+                <w:sz w:val="17"/>
+              </w:rPr>
+            </w:r>
+            <w:r>
+              <w:rPr>
+                <w:b w:val="0"/>
+                <w:i w:val="0"/>
+                <w:sz w:val="17"/>
+              </w:rPr>
+              <w:t>Who runs the export on MAIIC's server, and when</w:t>
+            </w:r>
+          </w:p>
+        </w:tc>
+        <w:tc>
+          <w:tcPr>
+            <w:tcW w:type="dxa" w:w="2493"/>
+          </w:tcPr>
+          <w:p>
+            <w:r>
+              <w:rPr>
+                <w:b w:val="0"/>
+                <w:sz w:val="17"/>
+              </w:rPr>
+            </w:r>
+            <w:r>
+              <w:rPr>
+                <w:b w:val="0"/>
+                <w:i w:val="0"/>
+                <w:sz w:val="17"/>
+              </w:rPr>
+              <w:t>MAIIC ICT, with Edward</w:t>
+            </w:r>
+          </w:p>
+        </w:tc>
+        <w:tc>
+          <w:tcPr>
+            <w:tcW w:type="dxa" w:w="2493"/>
+          </w:tcPr>
+          <w:p>
+            <w:r>
+              <w:rPr>
+                <w:b w:val="0"/>
+                <w:sz w:val="17"/>
+              </w:rPr>
+            </w:r>
+            <w:r>
+              <w:rPr>
+                <w:b w:val="0"/>
+                <w:i w:val="0"/>
+                <w:sz w:val="17"/>
+              </w:rPr>
+              <w:t>MAIIC ICT, read-only, before any fresh bootstrap that is to replace a database people have worked in</w:t>
             </w:r>
           </w:p>
         </w:tc>
@@ -11514,7 +12366,6 @@
     <w:p>
       <w:pPr>
         <w:pStyle w:val="ListNumber"/>
-        <w:jc w:val="both"/>
       </w:pPr>
       <w:r>
         <w:rPr>
@@ -11534,7 +12385,6 @@
     <w:p>
       <w:pPr>
         <w:pStyle w:val="ListNumber"/>
-        <w:jc w:val="both"/>
       </w:pPr>
       <w:r>
         <w:rPr>
@@ -11554,7 +12404,6 @@
     <w:p>
       <w:pPr>
         <w:pStyle w:val="ListNumber"/>
-        <w:jc w:val="both"/>
       </w:pPr>
       <w:r>
         <w:rPr>
@@ -11574,7 +12423,6 @@
     <w:p>
       <w:pPr>
         <w:pStyle w:val="ListNumber"/>
-        <w:jc w:val="both"/>
       </w:pPr>
       <w:r>
         <w:rPr>
@@ -11594,7 +12442,6 @@
     <w:p>
       <w:pPr>
         <w:pStyle w:val="ListNumber"/>
-        <w:jc w:val="both"/>
       </w:pPr>
       <w:r>
         <w:rPr>
@@ -11614,7 +12461,6 @@
     <w:p>
       <w:pPr>
         <w:pStyle w:val="ListNumber"/>
-        <w:jc w:val="both"/>
       </w:pPr>
       <w:r>
         <w:rPr>
@@ -11634,7 +12480,6 @@
     <w:p>
       <w:pPr>
         <w:pStyle w:val="ListNumber"/>
-        <w:jc w:val="both"/>
       </w:pPr>
       <w:r>
         <w:rPr>
@@ -11654,7 +12499,6 @@
     <w:p>
       <w:pPr>
         <w:pStyle w:val="ListNumber"/>
-        <w:jc w:val="both"/>
       </w:pPr>
       <w:r>
         <w:rPr>
@@ -11674,7 +12518,6 @@
     <w:p>
       <w:pPr>
         <w:pStyle w:val="ListNumber"/>
-        <w:jc w:val="both"/>
       </w:pPr>
       <w:r>
         <w:rPr>
@@ -11694,7 +12537,6 @@
     <w:p>
       <w:pPr>
         <w:pStyle w:val="ListNumber"/>
-        <w:jc w:val="both"/>
       </w:pPr>
       <w:r>
         <w:rPr>
@@ -11714,7 +12556,6 @@
     <w:p>
       <w:pPr>
         <w:pStyle w:val="ListNumber"/>
-        <w:jc w:val="both"/>
       </w:pPr>
       <w:r>
         <w:rPr>
@@ -11734,7 +12575,6 @@
     <w:p>
       <w:pPr>
         <w:pStyle w:val="ListNumber"/>
-        <w:jc w:val="both"/>
       </w:pPr>
       <w:r>
         <w:rPr>
@@ -11754,7 +12594,6 @@
     <w:p>
       <w:pPr>
         <w:pStyle w:val="ListNumber"/>
-        <w:jc w:val="both"/>
       </w:pPr>
       <w:r>
         <w:rPr>
@@ -11774,7 +12613,6 @@
     <w:p>
       <w:pPr>
         <w:pStyle w:val="ListNumber"/>
-        <w:jc w:val="both"/>
       </w:pPr>
       <w:r>
         <w:rPr>
@@ -11794,7 +12632,6 @@
     <w:p>
       <w:pPr>
         <w:pStyle w:val="ListNumber"/>
-        <w:jc w:val="both"/>
       </w:pPr>
       <w:r>
         <w:rPr>
@@ -11814,7 +12651,6 @@
     <w:p>
       <w:pPr>
         <w:pStyle w:val="ListNumber"/>
-        <w:jc w:val="both"/>
       </w:pPr>
       <w:r>
         <w:rPr>
@@ -11834,7 +12670,6 @@
     <w:p>
       <w:pPr>
         <w:pStyle w:val="ListNumber"/>
-        <w:jc w:val="both"/>
       </w:pPr>
       <w:r>
         <w:rPr>
@@ -11854,7 +12689,6 @@
     <w:p>
       <w:pPr>
         <w:pStyle w:val="ListNumber"/>
-        <w:jc w:val="both"/>
       </w:pPr>
       <w:r>
         <w:rPr>
@@ -11874,7 +12708,6 @@
     <w:p>
       <w:pPr>
         <w:pStyle w:val="ListNumber"/>
-        <w:jc w:val="both"/>
       </w:pPr>
       <w:r>
         <w:rPr>
@@ -11894,7 +12727,6 @@
     <w:p>
       <w:pPr>
         <w:pStyle w:val="ListNumber"/>
-        <w:jc w:val="both"/>
       </w:pPr>
       <w:r>
         <w:rPr>
@@ -11914,7 +12746,6 @@
     <w:p>
       <w:pPr>
         <w:pStyle w:val="ListNumber"/>
-        <w:jc w:val="both"/>
       </w:pPr>
       <w:r>
         <w:rPr>
@@ -11950,7 +12781,6 @@
     <w:p>
       <w:pPr>
         <w:pStyle w:val="ListNumber"/>
-        <w:jc w:val="both"/>
       </w:pPr>
       <w:r>
         <w:rPr>
@@ -11970,7 +12800,6 @@
     <w:p>
       <w:pPr>
         <w:pStyle w:val="ListNumber"/>
-        <w:jc w:val="both"/>
       </w:pPr>
       <w:r>
         <w:rPr>
@@ -11989,6 +12818,117 @@
     </w:p>
     <w:p>
       <w:pPr>
+        <w:pStyle w:val="ListNumber"/>
+      </w:pPr>
+      <w:r>
+        <w:rPr>
+          <w:b/>
+          <w:i w:val="0"/>
+        </w:rPr>
+        <w:t>Export writes nothing.</w:t>
+      </w:r>
+      <w:r>
+        <w:rPr>
+          <w:b w:val="0"/>
+          <w:i w:val="0"/>
+        </w:rPr>
+        <w:t xml:space="preserve"> </w:t>
+      </w:r>
+      <w:r>
+        <w:rPr>
+          <w:rFonts w:ascii="Consolas" w:hAnsi="Consolas"/>
+          <w:b w:val="0"/>
+          <w:i w:val="0"/>
+          <w:sz w:val="18"/>
+        </w:rPr>
+        <w:t>decisions:export</w:t>
+      </w:r>
+      <w:r>
+        <w:rPr>
+          <w:b w:val="0"/>
+          <w:i w:val="0"/>
+        </w:rPr>
+        <w:t xml:space="preserve"> leaves the database it reads unchanged, and its pack holds no database id, no password and no two-factor secret.</w:t>
+      </w:r>
+    </w:p>
+    <w:p>
+      <w:pPr>
+        <w:pStyle w:val="ListNumber"/>
+      </w:pPr>
+      <w:r>
+        <w:rPr>
+          <w:b/>
+          <w:i w:val="0"/>
+        </w:rPr>
+        <w:t>Replay reproduces.</w:t>
+      </w:r>
+      <w:r>
+        <w:rPr>
+          <w:b w:val="0"/>
+          <w:i w:val="0"/>
+        </w:rPr>
+        <w:t xml:space="preserve"> A fresh bootstrap with a pack exported from a database ends with the same reviewed fee lines, locked EIRs and locked rates, governance settings and users as that database, or names each difference on the replay report.</w:t>
+      </w:r>
+    </w:p>
+    <w:p>
+      <w:pPr>
+        <w:pStyle w:val="ListNumber"/>
+      </w:pPr>
+      <w:r>
+        <w:rPr>
+          <w:b/>
+          <w:i w:val="0"/>
+        </w:rPr>
+        <w:t>Carried, not new.</w:t>
+      </w:r>
+      <w:r>
+        <w:rPr>
+          <w:b w:val="0"/>
+          <w:i w:val="0"/>
+        </w:rPr>
+        <w:t xml:space="preserve"> Every replayed decision keeps its original person and date, carries the decisions-pack audit entry, and never the System Bootstrap label.</w:t>
+      </w:r>
+    </w:p>
+    <w:p>
+      <w:pPr>
+        <w:pStyle w:val="ListNumber"/>
+      </w:pPr>
+      <w:r>
+        <w:rPr>
+          <w:b/>
+          <w:i w:val="0"/>
+        </w:rPr>
+        <w:t>Nothing forced.</w:t>
+      </w:r>
+      <w:r>
+        <w:rPr>
+          <w:b w:val="0"/>
+          <w:i w:val="0"/>
+        </w:rPr>
+        <w:t xml:space="preserve"> A decision whose row is missing or different in the fresh database is left undecided and listed with its reason.</w:t>
+      </w:r>
+    </w:p>
+    <w:p>
+      <w:pPr>
+        <w:pStyle w:val="ListNumber"/>
+      </w:pPr>
+      <w:r>
+        <w:rPr>
+          <w:b/>
+          <w:i w:val="0"/>
+        </w:rPr>
+        <w:t>No pack, no change.</w:t>
+      </w:r>
+      <w:r>
+        <w:rPr>
+          <w:b w:val="0"/>
+          <w:i w:val="0"/>
+        </w:rPr>
+        <w:t xml:space="preserve"> A bootstrap without a pack gives the same verify results as before the pack was built.</w:t>
+      </w:r>
+    </w:p>
+    <w:p>
+      <w:pPr>
         <w:pStyle w:val="Heading2"/>
       </w:pPr>
       <w:r>
@@ -11998,14 +12938,13 @@
     <w:p>
       <w:pPr>
         <w:spacing w:after="120"/>
-        <w:jc w:val="both"/>
       </w:pPr>
       <w:r>
         <w:rPr>
           <w:b w:val="0"/>
           <w:i w:val="0"/>
         </w:rPr>
-        <w:t>The work is done in four phases, in the order below. Governed staging comes first, because it is the purpose of this specification; the protection of locked months and UAT mode follow, then the fee rulebook control, then the rest of the governance record. The build is done on its own branch, and each phase is merged and released when all its sections are complete and confirmed (section 11.1). The sizes are Dupleix's estimates of the build.</w:t>
+        <w:t>The work is done in five phases, in the order below. Governed staging comes first, because it is the purpose of this specification; the protection of locked months and UAT mode follow, then the fee rulebook control, then the rest of the governance record. The build is done on its own branch, and each phase is merged and released when all its sections are complete and confirmed (section 11.1). The sizes are Dupleix's estimates of the build.</w:t>
       </w:r>
     </w:p>
     <w:tbl>
@@ -12022,10 +12961,6 @@
         <w:gridCol w:w="1994"/>
       </w:tblGrid>
       <w:tr>
-        <w:trPr>
-          <w:cantSplit/>
-          <w:tblHeader/>
-        </w:trPr>
         <w:tc>
           <w:tcPr>
             <w:tcW w:type="dxa" w:w="1994"/>
@@ -12148,9 +13083,6 @@
         </w:tc>
       </w:tr>
       <w:tr>
-        <w:trPr>
-          <w:cantSplit/>
-        </w:trPr>
         <w:tc>
           <w:tcPr>
             <w:tcW w:type="dxa" w:w="1994"/>
@@ -12309,9 +13241,6 @@
         </w:tc>
       </w:tr>
       <w:tr>
-        <w:trPr>
-          <w:cantSplit/>
-        </w:trPr>
         <w:tc>
           <w:tcPr>
             <w:tcW w:type="dxa" w:w="1994"/>
@@ -12419,9 +13348,6 @@
         </w:tc>
       </w:tr>
       <w:tr>
-        <w:trPr>
-          <w:cantSplit/>
-        </w:trPr>
         <w:tc>
           <w:tcPr>
             <w:tcW w:type="dxa" w:w="1994"/>
@@ -12529,9 +13455,6 @@
         </w:tc>
       </w:tr>
       <w:tr>
-        <w:trPr>
-          <w:cantSplit/>
-        </w:trPr>
         <w:tc>
           <w:tcPr>
             <w:tcW w:type="dxa" w:w="1994"/>
@@ -12549,7 +13472,7 @@
                 <w:i w:val="0"/>
                 <w:sz w:val="17"/>
               </w:rPr>
-              <w:t>4. The governance and audit record</w:t>
+              <w:t>3a. Decisions pack</w:t>
             </w:r>
           </w:p>
         </w:tc>
@@ -12570,7 +13493,7 @@
                 <w:i w:val="0"/>
                 <w:sz w:val="17"/>
               </w:rPr>
-              <w:t>The Governance Centre change log (reject and withdraw, seeding entries, supporting documents on private storage, required evidence, history view, append-only chained log); the other approvals on the same log and document store, and the Approvals view; the run record, run numbers on result rows, run of record at lock, the two reports and re-performance</w:t>
+              <w:t>The export and the replay of section 8.10, the replay report and the tie-out; then an export from MAIIC's database by MAIIC ICT and a bootstrap with it on a throw-away database, to show the decisions carried</w:t>
             </w:r>
           </w:p>
         </w:tc>
@@ -12591,7 +13514,7 @@
                 <w:i w:val="0"/>
                 <w:sz w:val="17"/>
               </w:rPr>
-              <w:t>8.1 to 8.5, 8.6, 8.7, 8.8</w:t>
+              <w:t>8.10</w:t>
             </w:r>
           </w:p>
         </w:tc>
@@ -12612,7 +13535,7 @@
                 <w:i w:val="0"/>
                 <w:sz w:val="17"/>
               </w:rPr>
-              <w:t>9 to 13, 15 to 17, 19</w:t>
+              <w:t>24 to 28</w:t>
             </w:r>
           </w:p>
         </w:tc>
@@ -12633,15 +13556,119 @@
                 <w:i w:val="0"/>
                 <w:sz w:val="17"/>
               </w:rPr>
-              <w:t>About 5.5 days</w:t>
+              <w:t>About 1 to 1.5 days</w:t>
             </w:r>
           </w:p>
         </w:tc>
       </w:tr>
       <w:tr>
-        <w:trPr>
-          <w:cantSplit/>
-        </w:trPr>
+        <w:tc>
+          <w:tcPr>
+            <w:tcW w:type="dxa" w:w="1994"/>
+          </w:tcPr>
+          <w:p>
+            <w:r>
+              <w:rPr>
+                <w:b w:val="0"/>
+                <w:sz w:val="17"/>
+              </w:rPr>
+            </w:r>
+            <w:r>
+              <w:rPr>
+                <w:b/>
+                <w:i w:val="0"/>
+                <w:sz w:val="17"/>
+              </w:rPr>
+              <w:t>4. The governance and audit record</w:t>
+            </w:r>
+          </w:p>
+        </w:tc>
+        <w:tc>
+          <w:tcPr>
+            <w:tcW w:type="dxa" w:w="1994"/>
+          </w:tcPr>
+          <w:p>
+            <w:r>
+              <w:rPr>
+                <w:b w:val="0"/>
+                <w:sz w:val="17"/>
+              </w:rPr>
+            </w:r>
+            <w:r>
+              <w:rPr>
+                <w:b w:val="0"/>
+                <w:i w:val="0"/>
+                <w:sz w:val="17"/>
+              </w:rPr>
+              <w:t>The Governance Centre change log (reject and withdraw, seeding entries, supporting documents on private storage, required evidence, history view, append-only chained log); the other approvals on the same log and document store, and the Approvals view; the run record, run numbers on result rows, run of record at lock, the two reports and re-performance</w:t>
+            </w:r>
+          </w:p>
+        </w:tc>
+        <w:tc>
+          <w:tcPr>
+            <w:tcW w:type="dxa" w:w="1994"/>
+          </w:tcPr>
+          <w:p>
+            <w:r>
+              <w:rPr>
+                <w:b w:val="0"/>
+                <w:sz w:val="17"/>
+              </w:rPr>
+            </w:r>
+            <w:r>
+              <w:rPr>
+                <w:b w:val="0"/>
+                <w:i w:val="0"/>
+                <w:sz w:val="17"/>
+              </w:rPr>
+              <w:t>8.1 to 8.5, 8.6, 8.7, 8.8</w:t>
+            </w:r>
+          </w:p>
+        </w:tc>
+        <w:tc>
+          <w:tcPr>
+            <w:tcW w:type="dxa" w:w="1994"/>
+          </w:tcPr>
+          <w:p>
+            <w:r>
+              <w:rPr>
+                <w:b w:val="0"/>
+                <w:sz w:val="17"/>
+              </w:rPr>
+            </w:r>
+            <w:r>
+              <w:rPr>
+                <w:b w:val="0"/>
+                <w:i w:val="0"/>
+                <w:sz w:val="17"/>
+              </w:rPr>
+              <w:t>9 to 13, 15 to 17, 19</w:t>
+            </w:r>
+          </w:p>
+        </w:tc>
+        <w:tc>
+          <w:tcPr>
+            <w:tcW w:type="dxa" w:w="1994"/>
+          </w:tcPr>
+          <w:p>
+            <w:r>
+              <w:rPr>
+                <w:b w:val="0"/>
+                <w:sz w:val="17"/>
+              </w:rPr>
+            </w:r>
+            <w:r>
+              <w:rPr>
+                <w:b w:val="0"/>
+                <w:i w:val="0"/>
+                <w:sz w:val="17"/>
+              </w:rPr>
+              <w:t>About 5.5 days</w:t>
+            </w:r>
+          </w:p>
+        </w:tc>
+      </w:tr>
+      <w:tr>
         <w:tc>
           <w:tcPr>
             <w:tcW w:type="dxa" w:w="1994"/>
@@ -12745,14 +13772,13 @@
     <w:p>
       <w:pPr>
         <w:spacing w:after="120"/>
-        <w:jc w:val="both"/>
       </w:pPr>
       <w:r>
         <w:rPr>
           <w:b w:val="0"/>
           <w:i w:val="0"/>
         </w:rPr>
-        <w:t>The total is about 11 to 11.5 days of build. Governed staging is merged and released after about 3 days; the protection of locked months and UAT mode about 2.5 days later, after which testing on MAIIC's server can run without waiting for a second person on each step; the controlled fee rulebook after about 6 days in all. Until phase 2 is released, a setting can still be back-dated into a locked month (section 8.8), so no governed change should be approved with an effective date inside a locked month in the meantime. The fee rulebook joins the shared maker-checker check of UAT mode when phase 3 gives it maker-checker. Not included: the time to resolve the bootstrap's slow final steps seen on 15 October 2026, which must be fixed before the first merge, since every merge and release depends on the bootstrap passing.</w:t>
+        <w:t>The total is about 12 to 13 days of build, with the decisions pack (phase 3a, added on 15 October 2026). Governed staging is merged and released after about 3 days; the protection of locked months and UAT mode about 2.5 days later, after which testing on MAIIC's server can run without waiting for a second person on each step; the controlled fee rulebook after about 6 days in all. Until phase 2 is released, a setting can still be back-dated into a locked month (section 8.8), so no governed change should be approved with an effective date inside a locked month in the meantime. The fee rulebook joins the shared maker-checker check of UAT mode when phase 3 gives it maker-checker. Not included: the time to resolve the bootstrap's slow final steps seen on 15 October 2026, which must be fixed before the first merge, since every merge and release depends on the bootstrap passing.</w:t>
       </w:r>
     </w:p>
     <w:p>
@@ -12766,7 +13792,6 @@
     <w:p>
       <w:pPr>
         <w:spacing w:after="120"/>
-        <w:jc w:val="both"/>
       </w:pPr>
       <w:r>
         <w:rPr>
@@ -12818,7 +13843,6 @@
     <w:p>
       <w:pPr>
         <w:spacing w:after="120"/>
-        <w:jc w:val="both"/>
       </w:pPr>
       <w:r>
         <w:rPr>
@@ -12838,7 +13862,6 @@
     <w:p>
       <w:pPr>
         <w:spacing w:after="120"/>
-        <w:jc w:val="both"/>
       </w:pPr>
       <w:r>
         <w:rPr>
@@ -12858,7 +13881,6 @@
     <w:p>
       <w:pPr>
         <w:spacing w:after="120"/>
-        <w:jc w:val="both"/>
       </w:pPr>
       <w:r>
         <w:rPr>
@@ -12910,7 +13932,6 @@
     <w:p>
       <w:pPr>
         <w:spacing w:after="120"/>
-        <w:jc w:val="both"/>
       </w:pPr>
       <w:r>
         <w:rPr>
@@ -12940,10 +13961,6 @@
         <w:gridCol w:w="2493"/>
       </w:tblGrid>
       <w:tr>
-        <w:trPr>
-          <w:cantSplit/>
-          <w:tblHeader/>
-        </w:trPr>
         <w:tc>
           <w:tcPr>
             <w:tcW w:type="dxa" w:w="2493"/>
@@ -13042,9 +14059,6 @@
         </w:tc>
       </w:tr>
       <w:tr>
-        <w:trPr>
-          <w:cantSplit/>
-        </w:trPr>
         <w:tc>
           <w:tcPr>
             <w:tcW w:type="dxa" w:w="2493"/>
@@ -13131,9 +14145,6 @@
         </w:tc>
       </w:tr>
       <w:tr>
-        <w:trPr>
-          <w:cantSplit/>
-        </w:trPr>
         <w:tc>
           <w:tcPr>
             <w:tcW w:type="dxa" w:w="2493"/>
@@ -13220,9 +14231,6 @@
         </w:tc>
       </w:tr>
       <w:tr>
-        <w:trPr>
-          <w:cantSplit/>
-        </w:trPr>
         <w:tc>
           <w:tcPr>
             <w:tcW w:type="dxa" w:w="2493"/>
@@ -13309,9 +14317,6 @@
         </w:tc>
       </w:tr>
       <w:tr>
-        <w:trPr>
-          <w:cantSplit/>
-        </w:trPr>
         <w:tc>
           <w:tcPr>
             <w:tcW w:type="dxa" w:w="2493"/>
@@ -13406,9 +14411,6 @@
         </w:tc>
       </w:tr>
       <w:tr>
-        <w:trPr>
-          <w:cantSplit/>
-        </w:trPr>
         <w:tc>
           <w:tcPr>
             <w:tcW w:type="dxa" w:w="2493"/>
@@ -13495,9 +14497,6 @@
         </w:tc>
       </w:tr>
       <w:tr>
-        <w:trPr>
-          <w:cantSplit/>
-        </w:trPr>
         <w:tc>
           <w:tcPr>
             <w:tcW w:type="dxa" w:w="2493"/>
@@ -13584,9 +14583,6 @@
         </w:tc>
       </w:tr>
       <w:tr>
-        <w:trPr>
-          <w:cantSplit/>
-        </w:trPr>
         <w:tc>
           <w:tcPr>
             <w:tcW w:type="dxa" w:w="2493"/>
@@ -13673,9 +14669,6 @@
         </w:tc>
       </w:tr>
       <w:tr>
-        <w:trPr>
-          <w:cantSplit/>
-        </w:trPr>
         <w:tc>
           <w:tcPr>
             <w:tcW w:type="dxa" w:w="2493"/>
@@ -13762,9 +14755,6 @@
         </w:tc>
       </w:tr>
       <w:tr>
-        <w:trPr>
-          <w:cantSplit/>
-        </w:trPr>
         <w:tc>
           <w:tcPr>
             <w:tcW w:type="dxa" w:w="2493"/>
@@ -13851,9 +14841,6 @@
         </w:tc>
       </w:tr>
       <w:tr>
-        <w:trPr>
-          <w:cantSplit/>
-        </w:trPr>
         <w:tc>
           <w:tcPr>
             <w:tcW w:type="dxa" w:w="2493"/>
@@ -13871,7 +14858,7 @@
                 <w:i w:val="0"/>
                 <w:sz w:val="17"/>
               </w:rPr>
-              <w:t>7</w:t>
+              <w:t>6a</w:t>
             </w:r>
           </w:p>
         </w:tc>
@@ -13892,7 +14879,7 @@
                 <w:i w:val="0"/>
                 <w:sz w:val="17"/>
               </w:rPr>
-              <w:t>8.1 to 8.5: the Governance Centre change log</w:t>
+              <w:t>8.10: the decisions pack</w:t>
             </w:r>
           </w:p>
         </w:tc>
@@ -13913,7 +14900,7 @@
                 <w:i w:val="0"/>
                 <w:sz w:val="17"/>
               </w:rPr>
-              <w:t>4</w:t>
+              <w:t>3a</w:t>
             </w:r>
           </w:p>
         </w:tc>
@@ -13934,15 +14921,12 @@
                 <w:i w:val="0"/>
                 <w:sz w:val="17"/>
               </w:rPr>
-              <w:t>9 to 12</w:t>
+              <w:t>24 to 28</w:t>
             </w:r>
           </w:p>
         </w:tc>
       </w:tr>
       <w:tr>
-        <w:trPr>
-          <w:cantSplit/>
-        </w:trPr>
         <w:tc>
           <w:tcPr>
             <w:tcW w:type="dxa" w:w="2493"/>
@@ -13956,11 +14940,11 @@
             </w:r>
             <w:r>
               <w:rPr>
-                <w:b w:val="0"/>
-                <w:i w:val="0"/>
-                <w:sz w:val="17"/>
-              </w:rPr>
-              <w:t>8</w:t>
+                <w:b/>
+                <w:i w:val="0"/>
+                <w:sz w:val="17"/>
+              </w:rPr>
+              <w:t>M3a</w:t>
             </w:r>
           </w:p>
         </w:tc>
@@ -13977,11 +14961,19 @@
             </w:r>
             <w:r>
               <w:rPr>
-                <w:b w:val="0"/>
-                <w:i w:val="0"/>
-                <w:sz w:val="17"/>
-              </w:rPr>
-              <w:t>8.6: the other approvals</w:t>
+                <w:b/>
+                <w:i w:val="0"/>
+                <w:sz w:val="17"/>
+              </w:rPr>
+              <w:t>Merge and release phase 3a</w:t>
+            </w:r>
+            <w:r>
+              <w:rPr>
+                <w:b w:val="0"/>
+                <w:i w:val="0"/>
+                <w:sz w:val="17"/>
+              </w:rPr>
+              <w:t>, then MAIIC's export and a bootstrap with it on a throw-away database</w:t>
             </w:r>
           </w:p>
         </w:tc>
@@ -14002,7 +14994,7 @@
                 <w:i w:val="0"/>
                 <w:sz w:val="17"/>
               </w:rPr>
-              <w:t>4</w:t>
+              <w:t>3a</w:t>
             </w:r>
           </w:p>
         </w:tc>
@@ -14023,15 +15015,12 @@
                 <w:i w:val="0"/>
                 <w:sz w:val="17"/>
               </w:rPr>
-              <w:t>13</w:t>
+              <w:t>24 to 28</w:t>
             </w:r>
           </w:p>
         </w:tc>
       </w:tr>
       <w:tr>
-        <w:trPr>
-          <w:cantSplit/>
-        </w:trPr>
         <w:tc>
           <w:tcPr>
             <w:tcW w:type="dxa" w:w="2493"/>
@@ -14049,7 +15038,7 @@
                 <w:i w:val="0"/>
                 <w:sz w:val="17"/>
               </w:rPr>
-              <w:t>9</w:t>
+              <w:t>7</w:t>
             </w:r>
           </w:p>
         </w:tc>
@@ -14070,7 +15059,7 @@
                 <w:i w:val="0"/>
                 <w:sz w:val="17"/>
               </w:rPr>
-              <w:t>8.7: the register of approvals</w:t>
+              <w:t>8.1 to 8.5: the Governance Centre change log</w:t>
             </w:r>
           </w:p>
         </w:tc>
@@ -14112,15 +15101,12 @@
                 <w:i w:val="0"/>
                 <w:sz w:val="17"/>
               </w:rPr>
-              <w:t>15</w:t>
+              <w:t>9 to 12</w:t>
             </w:r>
           </w:p>
         </w:tc>
       </w:tr>
       <w:tr>
-        <w:trPr>
-          <w:cantSplit/>
-        </w:trPr>
         <w:tc>
           <w:tcPr>
             <w:tcW w:type="dxa" w:w="2493"/>
@@ -14138,7 +15124,7 @@
                 <w:i w:val="0"/>
                 <w:sz w:val="17"/>
               </w:rPr>
-              <w:t>10</w:t>
+              <w:t>8</w:t>
             </w:r>
           </w:p>
         </w:tc>
@@ -14159,7 +15145,7 @@
                 <w:i w:val="0"/>
                 <w:sz w:val="17"/>
               </w:rPr>
-              <w:t>8.8: the run record</w:t>
+              <w:t>8.6: the other approvals</w:t>
             </w:r>
           </w:p>
         </w:tc>
@@ -14201,15 +15187,12 @@
                 <w:i w:val="0"/>
                 <w:sz w:val="17"/>
               </w:rPr>
-              <w:t>16, 17, 19</w:t>
+              <w:t>13</w:t>
             </w:r>
           </w:p>
         </w:tc>
       </w:tr>
       <w:tr>
-        <w:trPr>
-          <w:cantSplit/>
-        </w:trPr>
         <w:tc>
           <w:tcPr>
             <w:tcW w:type="dxa" w:w="2493"/>
@@ -14223,6 +15206,178 @@
             </w:r>
             <w:r>
               <w:rPr>
+                <w:b w:val="0"/>
+                <w:i w:val="0"/>
+                <w:sz w:val="17"/>
+              </w:rPr>
+              <w:t>9</w:t>
+            </w:r>
+          </w:p>
+        </w:tc>
+        <w:tc>
+          <w:tcPr>
+            <w:tcW w:type="dxa" w:w="2493"/>
+          </w:tcPr>
+          <w:p>
+            <w:r>
+              <w:rPr>
+                <w:b w:val="0"/>
+                <w:sz w:val="17"/>
+              </w:rPr>
+            </w:r>
+            <w:r>
+              <w:rPr>
+                <w:b w:val="0"/>
+                <w:i w:val="0"/>
+                <w:sz w:val="17"/>
+              </w:rPr>
+              <w:t>8.7: the register of approvals</w:t>
+            </w:r>
+          </w:p>
+        </w:tc>
+        <w:tc>
+          <w:tcPr>
+            <w:tcW w:type="dxa" w:w="2493"/>
+          </w:tcPr>
+          <w:p>
+            <w:r>
+              <w:rPr>
+                <w:b w:val="0"/>
+                <w:sz w:val="17"/>
+              </w:rPr>
+            </w:r>
+            <w:r>
+              <w:rPr>
+                <w:b w:val="0"/>
+                <w:i w:val="0"/>
+                <w:sz w:val="17"/>
+              </w:rPr>
+              <w:t>4</w:t>
+            </w:r>
+          </w:p>
+        </w:tc>
+        <w:tc>
+          <w:tcPr>
+            <w:tcW w:type="dxa" w:w="2493"/>
+          </w:tcPr>
+          <w:p>
+            <w:r>
+              <w:rPr>
+                <w:b w:val="0"/>
+                <w:sz w:val="17"/>
+              </w:rPr>
+            </w:r>
+            <w:r>
+              <w:rPr>
+                <w:b w:val="0"/>
+                <w:i w:val="0"/>
+                <w:sz w:val="17"/>
+              </w:rPr>
+              <w:t>15</w:t>
+            </w:r>
+          </w:p>
+        </w:tc>
+      </w:tr>
+      <w:tr>
+        <w:tc>
+          <w:tcPr>
+            <w:tcW w:type="dxa" w:w="2493"/>
+          </w:tcPr>
+          <w:p>
+            <w:r>
+              <w:rPr>
+                <w:b w:val="0"/>
+                <w:sz w:val="17"/>
+              </w:rPr>
+            </w:r>
+            <w:r>
+              <w:rPr>
+                <w:b w:val="0"/>
+                <w:i w:val="0"/>
+                <w:sz w:val="17"/>
+              </w:rPr>
+              <w:t>10</w:t>
+            </w:r>
+          </w:p>
+        </w:tc>
+        <w:tc>
+          <w:tcPr>
+            <w:tcW w:type="dxa" w:w="2493"/>
+          </w:tcPr>
+          <w:p>
+            <w:r>
+              <w:rPr>
+                <w:b w:val="0"/>
+                <w:sz w:val="17"/>
+              </w:rPr>
+            </w:r>
+            <w:r>
+              <w:rPr>
+                <w:b w:val="0"/>
+                <w:i w:val="0"/>
+                <w:sz w:val="17"/>
+              </w:rPr>
+              <w:t>8.8: the run record</w:t>
+            </w:r>
+          </w:p>
+        </w:tc>
+        <w:tc>
+          <w:tcPr>
+            <w:tcW w:type="dxa" w:w="2493"/>
+          </w:tcPr>
+          <w:p>
+            <w:r>
+              <w:rPr>
+                <w:b w:val="0"/>
+                <w:sz w:val="17"/>
+              </w:rPr>
+            </w:r>
+            <w:r>
+              <w:rPr>
+                <w:b w:val="0"/>
+                <w:i w:val="0"/>
+                <w:sz w:val="17"/>
+              </w:rPr>
+              <w:t>4</w:t>
+            </w:r>
+          </w:p>
+        </w:tc>
+        <w:tc>
+          <w:tcPr>
+            <w:tcW w:type="dxa" w:w="2493"/>
+          </w:tcPr>
+          <w:p>
+            <w:r>
+              <w:rPr>
+                <w:b w:val="0"/>
+                <w:sz w:val="17"/>
+              </w:rPr>
+            </w:r>
+            <w:r>
+              <w:rPr>
+                <w:b w:val="0"/>
+                <w:i w:val="0"/>
+                <w:sz w:val="17"/>
+              </w:rPr>
+              <w:t>16, 17, 19</w:t>
+            </w:r>
+          </w:p>
+        </w:tc>
+      </w:tr>
+      <w:tr>
+        <w:tc>
+          <w:tcPr>
+            <w:tcW w:type="dxa" w:w="2493"/>
+          </w:tcPr>
+          <w:p>
+            <w:r>
+              <w:rPr>
+                <w:b w:val="0"/>
+                <w:sz w:val="17"/>
+              </w:rPr>
+            </w:r>
+            <w:r>
+              <w:rPr>
                 <w:b/>
                 <w:i w:val="0"/>
                 <w:sz w:val="17"/>
@@ -14256,7 +15411,7 @@
                 <w:i w:val="0"/>
                 <w:sz w:val="17"/>
               </w:rPr>
-              <w:t>: all 23 acceptance tests, the full test suite and a bootstrap on a fresh database with the verify checks passing</w:t>
+              <w:t>: all 28 acceptance tests, the full test suite and a bootstrap on a fresh database with the verify checks passing</w:t>
             </w:r>
           </w:p>
         </w:tc>
@@ -14308,7 +15463,6 @@
     <w:p>
       <w:pPr>
         <w:spacing w:after="120"/>
-        <w:jc w:val="both"/>
       </w:pPr>
       <w:r>
         <w:rPr>
@@ -14344,10 +15498,6 @@
         <w:gridCol w:w="4986"/>
       </w:tblGrid>
       <w:tr>
-        <w:trPr>
-          <w:cantSplit/>
-          <w:tblHeader/>
-        </w:trPr>
         <w:tc>
           <w:tcPr>
             <w:tcW w:type="dxa" w:w="4986"/>
@@ -14398,9 +15548,6 @@
         </w:tc>
       </w:tr>
       <w:tr>
-        <w:trPr>
-          <w:cantSplit/>
-        </w:trPr>
         <w:tc>
           <w:tcPr>
             <w:tcW w:type="dxa" w:w="4986"/>
@@ -14445,9 +15592,6 @@
         </w:tc>
       </w:tr>
       <w:tr>
-        <w:trPr>
-          <w:cantSplit/>
-        </w:trPr>
         <w:tc>
           <w:tcPr>
             <w:tcW w:type="dxa" w:w="4986"/>
@@ -14492,9 +15636,6 @@
         </w:tc>
       </w:tr>
       <w:tr>
-        <w:trPr>
-          <w:cantSplit/>
-        </w:trPr>
         <w:tc>
           <w:tcPr>
             <w:tcW w:type="dxa" w:w="4986"/>
@@ -14539,9 +15680,6 @@
         </w:tc>
       </w:tr>
       <w:tr>
-        <w:trPr>
-          <w:cantSplit/>
-        </w:trPr>
         <w:tc>
           <w:tcPr>
             <w:tcW w:type="dxa" w:w="4986"/>
@@ -14586,9 +15724,6 @@
         </w:tc>
       </w:tr>
       <w:tr>
-        <w:trPr>
-          <w:cantSplit/>
-        </w:trPr>
         <w:tc>
           <w:tcPr>
             <w:tcW w:type="dxa" w:w="4986"/>
@@ -14633,9 +15768,6 @@
         </w:tc>
       </w:tr>
       <w:tr>
-        <w:trPr>
-          <w:cantSplit/>
-        </w:trPr>
         <w:tc>
           <w:tcPr>
             <w:tcW w:type="dxa" w:w="4986"/>
@@ -14680,9 +15812,6 @@
         </w:tc>
       </w:tr>
       <w:tr>
-        <w:trPr>
-          <w:cantSplit/>
-        </w:trPr>
         <w:tc>
           <w:tcPr>
             <w:tcW w:type="dxa" w:w="4986"/>
@@ -14727,9 +15856,6 @@
         </w:tc>
       </w:tr>
       <w:tr>
-        <w:trPr>
-          <w:cantSplit/>
-        </w:trPr>
         <w:tc>
           <w:tcPr>
             <w:tcW w:type="dxa" w:w="4986"/>
@@ -14774,9 +15900,6 @@
         </w:tc>
       </w:tr>
       <w:tr>
-        <w:trPr>
-          <w:cantSplit/>
-        </w:trPr>
         <w:tc>
           <w:tcPr>
             <w:tcW w:type="dxa" w:w="4986"/>
@@ -14821,9 +15944,6 @@
         </w:tc>
       </w:tr>
       <w:tr>
-        <w:trPr>
-          <w:cantSplit/>
-        </w:trPr>
         <w:tc>
           <w:tcPr>
             <w:tcW w:type="dxa" w:w="4986"/>
@@ -14868,9 +15988,6 @@
         </w:tc>
       </w:tr>
       <w:tr>
-        <w:trPr>
-          <w:cantSplit/>
-        </w:trPr>
         <w:tc>
           <w:tcPr>
             <w:tcW w:type="dxa" w:w="4986"/>
@@ -14915,9 +16032,6 @@
         </w:tc>
       </w:tr>
       <w:tr>
-        <w:trPr>
-          <w:cantSplit/>
-        </w:trPr>
         <w:tc>
           <w:tcPr>
             <w:tcW w:type="dxa" w:w="4986"/>
@@ -14962,9 +16076,6 @@
         </w:tc>
       </w:tr>
       <w:tr>
-        <w:trPr>
-          <w:cantSplit/>
-        </w:trPr>
         <w:tc>
           <w:tcPr>
             <w:tcW w:type="dxa" w:w="4986"/>
@@ -15009,9 +16120,6 @@
         </w:tc>
       </w:tr>
       <w:tr>
-        <w:trPr>
-          <w:cantSplit/>
-        </w:trPr>
         <w:tc>
           <w:tcPr>
             <w:tcW w:type="dxa" w:w="4986"/>
@@ -15056,9 +16164,6 @@
         </w:tc>
       </w:tr>
       <w:tr>
-        <w:trPr>
-          <w:cantSplit/>
-        </w:trPr>
         <w:tc>
           <w:tcPr>
             <w:tcW w:type="dxa" w:w="4986"/>
@@ -15103,9 +16208,6 @@
         </w:tc>
       </w:tr>
       <w:tr>
-        <w:trPr>
-          <w:cantSplit/>
-        </w:trPr>
         <w:tc>
           <w:tcPr>
             <w:tcW w:type="dxa" w:w="4986"/>
@@ -15150,9 +16252,6 @@
         </w:tc>
       </w:tr>
       <w:tr>
-        <w:trPr>
-          <w:cantSplit/>
-        </w:trPr>
         <w:tc>
           <w:tcPr>
             <w:tcW w:type="dxa" w:w="4986"/>

</xml_diff>